<commit_message>
Actualizado CFA con hallazgos corregidos
</commit_message>
<xml_diff>
--- a/fuentes/CFA1_82220017_DU.docx
+++ b/fuentes/CFA1_82220017_DU.docx
@@ -186,10 +186,10 @@
         <mc:AlternateContent>
           <mc:Choice Requires="wps">
             <w:drawing>
-              <wp:anchor distT="45720" distB="45720" distL="114300" distR="114300" simplePos="0" relativeHeight="251662336" behindDoc="0" locked="0" layoutInCell="1" allowOverlap="1" wp14:anchorId="2E2DABF6" wp14:editId="20D4A1E1">
+              <wp:anchor distT="45720" distB="45720" distL="114300" distR="114300" simplePos="0" relativeHeight="251662336" behindDoc="0" locked="0" layoutInCell="1" allowOverlap="1" wp14:anchorId="2E2DABF6" wp14:editId="0CAE9288">
                 <wp:simplePos x="0" y="0"/>
                 <wp:positionH relativeFrom="column">
-                  <wp:posOffset>-91440</wp:posOffset>
+                  <wp:posOffset>-180340</wp:posOffset>
                 </wp:positionH>
                 <wp:positionV relativeFrom="paragraph">
                   <wp:posOffset>425450</wp:posOffset>
@@ -273,7 +273,7 @@
                 <v:stroke joinstyle="miter"/>
                 <v:path gradientshapeok="t" o:connecttype="rect"/>
               </v:shapetype>
-              <v:shape id="Cuadro de texto 2" o:spid="_x0000_s1026" type="#_x0000_t202" alt="&quot;&quot;" style="position:absolute;left:0;text-align:left;margin-left:-7.2pt;margin-top:33.5pt;width:488.95pt;height:143.25pt;z-index:251662336;visibility:visible;mso-wrap-style:square;mso-width-percent:0;mso-height-percent:0;mso-wrap-distance-left:9pt;mso-wrap-distance-top:3.6pt;mso-wrap-distance-right:9pt;mso-wrap-distance-bottom:3.6pt;mso-position-horizontal:absolute;mso-position-horizontal-relative:text;mso-position-vertical:absolute;mso-position-vertical-relative:text;mso-width-percent:0;mso-height-percent:0;mso-width-relative:margin;mso-height-relative:margin;v-text-anchor:top" o:gfxdata="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" filled="f" stroked="f">
+              <v:shape id="Cuadro de texto 2" o:spid="_x0000_s1026" type="#_x0000_t202" alt="&quot;&quot;" style="position:absolute;left:0;text-align:left;margin-left:-14.2pt;margin-top:33.5pt;width:488.95pt;height:143.25pt;z-index:251662336;visibility:visible;mso-wrap-style:square;mso-width-percent:0;mso-height-percent:0;mso-wrap-distance-left:9pt;mso-wrap-distance-top:3.6pt;mso-wrap-distance-right:9pt;mso-wrap-distance-bottom:3.6pt;mso-position-horizontal:absolute;mso-position-horizontal-relative:text;mso-position-vertical:absolute;mso-position-vertical-relative:text;mso-width-percent:0;mso-height-percent:0;mso-width-relative:margin;mso-height-relative:margin;v-text-anchor:top" o:gfxdata="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" filled="f" stroked="f">
                 <v:textbox>
                   <w:txbxContent>
                     <w:p>
@@ -529,7 +529,7 @@
           <w:r>
             <w:fldChar w:fldCharType="separate"/>
           </w:r>
-          <w:hyperlink w:anchor="_Toc207661903" w:history="1">
+          <w:hyperlink w:anchor="_Toc207960359" w:history="1">
             <w:r>
               <w:rPr>
                 <w:rStyle w:val="Hipervnculo"/>
@@ -556,7 +556,7 @@
                 <w:noProof/>
                 <w:webHidden/>
               </w:rPr>
-              <w:instrText xml:space="preserve"> PAGEREF _Toc207661903 \h </w:instrText>
+              <w:instrText xml:space="preserve"> PAGEREF _Toc207960359 \h </w:instrText>
             </w:r>
             <w:r>
               <w:rPr>
@@ -602,7 +602,7 @@
               <w:lang w:eastAsia="es-MX"/>
             </w:rPr>
           </w:pPr>
-          <w:hyperlink w:anchor="_Toc207661904" w:history="1">
+          <w:hyperlink w:anchor="_Toc207960360" w:history="1">
             <w:r>
               <w:rPr>
                 <w:rStyle w:val="Hipervnculo"/>
@@ -646,7 +646,7 @@
                 <w:noProof/>
                 <w:webHidden/>
               </w:rPr>
-              <w:instrText xml:space="preserve"> PAGEREF _Toc207661904 \h </w:instrText>
+              <w:instrText xml:space="preserve"> PAGEREF _Toc207960360 \h </w:instrText>
             </w:r>
             <w:r>
               <w:rPr>
@@ -688,7 +688,7 @@
               <w:lang w:eastAsia="es-MX"/>
             </w:rPr>
           </w:pPr>
-          <w:hyperlink w:anchor="_Toc207661905" w:history="1">
+          <w:hyperlink w:anchor="_Toc207960361" w:history="1">
             <w:r>
               <w:rPr>
                 <w:rStyle w:val="Hipervnculo"/>
@@ -732,7 +732,7 @@
                 <w:noProof/>
                 <w:webHidden/>
               </w:rPr>
-              <w:instrText xml:space="preserve"> PAGEREF _Toc207661905 \h </w:instrText>
+              <w:instrText xml:space="preserve"> PAGEREF _Toc207960361 \h </w:instrText>
             </w:r>
             <w:r>
               <w:rPr>
@@ -774,7 +774,7 @@
               <w:lang w:eastAsia="es-MX"/>
             </w:rPr>
           </w:pPr>
-          <w:hyperlink w:anchor="_Toc207661906" w:history="1">
+          <w:hyperlink w:anchor="_Toc207960362" w:history="1">
             <w:r>
               <w:rPr>
                 <w:rStyle w:val="Hipervnculo"/>
@@ -818,7 +818,7 @@
                 <w:noProof/>
                 <w:webHidden/>
               </w:rPr>
-              <w:instrText xml:space="preserve"> PAGEREF _Toc207661906 \h </w:instrText>
+              <w:instrText xml:space="preserve"> PAGEREF _Toc207960362 \h </w:instrText>
             </w:r>
             <w:r>
               <w:rPr>
@@ -860,7 +860,7 @@
               <w:lang w:eastAsia="es-MX"/>
             </w:rPr>
           </w:pPr>
-          <w:hyperlink w:anchor="_Toc207661907" w:history="1">
+          <w:hyperlink w:anchor="_Toc207960363" w:history="1">
             <w:r>
               <w:rPr>
                 <w:rStyle w:val="Hipervnculo"/>
@@ -904,7 +904,7 @@
                 <w:noProof/>
                 <w:webHidden/>
               </w:rPr>
-              <w:instrText xml:space="preserve"> PAGEREF _Toc207661907 \h </w:instrText>
+              <w:instrText xml:space="preserve"> PAGEREF _Toc207960363 \h </w:instrText>
             </w:r>
             <w:r>
               <w:rPr>
@@ -946,7 +946,7 @@
               <w:lang w:eastAsia="es-MX"/>
             </w:rPr>
           </w:pPr>
-          <w:hyperlink w:anchor="_Toc207661908" w:history="1">
+          <w:hyperlink w:anchor="_Toc207960364" w:history="1">
             <w:r>
               <w:rPr>
                 <w:rStyle w:val="Hipervnculo"/>
@@ -973,7 +973,7 @@
                 <w:noProof/>
                 <w:webHidden/>
               </w:rPr>
-              <w:instrText xml:space="preserve"> PAGEREF _Toc207661908 \h </w:instrText>
+              <w:instrText xml:space="preserve"> PAGEREF _Toc207960364 \h </w:instrText>
             </w:r>
             <w:r>
               <w:rPr>
@@ -1015,7 +1015,7 @@
               <w:lang w:eastAsia="es-MX"/>
             </w:rPr>
           </w:pPr>
-          <w:hyperlink w:anchor="_Toc207661909" w:history="1">
+          <w:hyperlink w:anchor="_Toc207960365" w:history="1">
             <w:r>
               <w:rPr>
                 <w:rStyle w:val="Hipervnculo"/>
@@ -1042,7 +1042,7 @@
                 <w:noProof/>
                 <w:webHidden/>
               </w:rPr>
-              <w:instrText xml:space="preserve"> PAGEREF _Toc207661909 \h </w:instrText>
+              <w:instrText xml:space="preserve"> PAGEREF _Toc207960365 \h </w:instrText>
             </w:r>
             <w:r>
               <w:rPr>
@@ -1088,7 +1088,7 @@
               <w:lang w:eastAsia="es-MX"/>
             </w:rPr>
           </w:pPr>
-          <w:hyperlink w:anchor="_Toc207661910" w:history="1">
+          <w:hyperlink w:anchor="_Toc207960366" w:history="1">
             <w:r>
               <w:rPr>
                 <w:rStyle w:val="Hipervnculo"/>
@@ -1132,7 +1132,7 @@
                 <w:noProof/>
                 <w:webHidden/>
               </w:rPr>
-              <w:instrText xml:space="preserve"> PAGEREF _Toc207661910 \h </w:instrText>
+              <w:instrText xml:space="preserve"> PAGEREF _Toc207960366 \h </w:instrText>
             </w:r>
             <w:r>
               <w:rPr>
@@ -1174,7 +1174,7 @@
               <w:lang w:eastAsia="es-MX"/>
             </w:rPr>
           </w:pPr>
-          <w:hyperlink w:anchor="_Toc207661911" w:history="1">
+          <w:hyperlink w:anchor="_Toc207960367" w:history="1">
             <w:r>
               <w:rPr>
                 <w:rStyle w:val="Hipervnculo"/>
@@ -1201,7 +1201,7 @@
                 <w:noProof/>
                 <w:webHidden/>
               </w:rPr>
-              <w:instrText xml:space="preserve"> PAGEREF _Toc207661911 \h </w:instrText>
+              <w:instrText xml:space="preserve"> PAGEREF _Toc207960367 \h </w:instrText>
             </w:r>
             <w:r>
               <w:rPr>
@@ -1243,7 +1243,7 @@
               <w:lang w:eastAsia="es-MX"/>
             </w:rPr>
           </w:pPr>
-          <w:hyperlink w:anchor="_Toc207661912" w:history="1">
+          <w:hyperlink w:anchor="_Toc207960368" w:history="1">
             <w:r>
               <w:rPr>
                 <w:rStyle w:val="Hipervnculo"/>
@@ -1270,7 +1270,7 @@
                 <w:noProof/>
                 <w:webHidden/>
               </w:rPr>
-              <w:instrText xml:space="preserve"> PAGEREF _Toc207661912 \h </w:instrText>
+              <w:instrText xml:space="preserve"> PAGEREF _Toc207960368 \h </w:instrText>
             </w:r>
             <w:r>
               <w:rPr>
@@ -1312,7 +1312,7 @@
               <w:lang w:eastAsia="es-MX"/>
             </w:rPr>
           </w:pPr>
-          <w:hyperlink w:anchor="_Toc207661913" w:history="1">
+          <w:hyperlink w:anchor="_Toc207960369" w:history="1">
             <w:r>
               <w:rPr>
                 <w:rStyle w:val="Hipervnculo"/>
@@ -1339,7 +1339,7 @@
                 <w:noProof/>
                 <w:webHidden/>
               </w:rPr>
-              <w:instrText xml:space="preserve"> PAGEREF _Toc207661913 \h </w:instrText>
+              <w:instrText xml:space="preserve"> PAGEREF _Toc207960369 \h </w:instrText>
             </w:r>
             <w:r>
               <w:rPr>
@@ -1381,7 +1381,7 @@
               <w:lang w:eastAsia="es-MX"/>
             </w:rPr>
           </w:pPr>
-          <w:hyperlink w:anchor="_Toc207661914" w:history="1">
+          <w:hyperlink w:anchor="_Toc207960370" w:history="1">
             <w:r>
               <w:rPr>
                 <w:rStyle w:val="Hipervnculo"/>
@@ -1408,7 +1408,7 @@
                 <w:noProof/>
                 <w:webHidden/>
               </w:rPr>
-              <w:instrText xml:space="preserve"> PAGEREF _Toc207661914 \h </w:instrText>
+              <w:instrText xml:space="preserve"> PAGEREF _Toc207960370 \h </w:instrText>
             </w:r>
             <w:r>
               <w:rPr>
@@ -1454,7 +1454,7 @@
               <w:lang w:eastAsia="es-MX"/>
             </w:rPr>
           </w:pPr>
-          <w:hyperlink w:anchor="_Toc207661915" w:history="1">
+          <w:hyperlink w:anchor="_Toc207960371" w:history="1">
             <w:r>
               <w:rPr>
                 <w:rStyle w:val="Hipervnculo"/>
@@ -1501,7 +1501,7 @@
                 <w:noProof/>
                 <w:webHidden/>
               </w:rPr>
-              <w:instrText xml:space="preserve"> PAGEREF _Toc207661915 \h </w:instrText>
+              <w:instrText xml:space="preserve"> PAGEREF _Toc207960371 \h </w:instrText>
             </w:r>
             <w:r>
               <w:rPr>
@@ -1543,7 +1543,7 @@
               <w:lang w:eastAsia="es-MX"/>
             </w:rPr>
           </w:pPr>
-          <w:hyperlink w:anchor="_Toc207661916" w:history="1">
+          <w:hyperlink w:anchor="_Toc207960372" w:history="1">
             <w:r>
               <w:rPr>
                 <w:rStyle w:val="Hipervnculo"/>
@@ -1570,7 +1570,7 @@
                 <w:noProof/>
                 <w:webHidden/>
               </w:rPr>
-              <w:instrText xml:space="preserve"> PAGEREF _Toc207661916 \h </w:instrText>
+              <w:instrText xml:space="preserve"> PAGEREF _Toc207960372 \h </w:instrText>
             </w:r>
             <w:r>
               <w:rPr>
@@ -1612,7 +1612,7 @@
               <w:lang w:eastAsia="es-MX"/>
             </w:rPr>
           </w:pPr>
-          <w:hyperlink w:anchor="_Toc207661917" w:history="1">
+          <w:hyperlink w:anchor="_Toc207960373" w:history="1">
             <w:r>
               <w:rPr>
                 <w:rStyle w:val="Hipervnculo"/>
@@ -1639,7 +1639,7 @@
                 <w:noProof/>
                 <w:webHidden/>
               </w:rPr>
-              <w:instrText xml:space="preserve"> PAGEREF _Toc207661917 \h </w:instrText>
+              <w:instrText xml:space="preserve"> PAGEREF _Toc207960373 \h </w:instrText>
             </w:r>
             <w:r>
               <w:rPr>
@@ -1681,7 +1681,7 @@
               <w:lang w:eastAsia="es-MX"/>
             </w:rPr>
           </w:pPr>
-          <w:hyperlink w:anchor="_Toc207661918" w:history="1">
+          <w:hyperlink w:anchor="_Toc207960374" w:history="1">
             <w:r>
               <w:rPr>
                 <w:rStyle w:val="Hipervnculo"/>
@@ -1708,7 +1708,7 @@
                 <w:noProof/>
                 <w:webHidden/>
               </w:rPr>
-              <w:instrText xml:space="preserve"> PAGEREF _Toc207661918 \h </w:instrText>
+              <w:instrText xml:space="preserve"> PAGEREF _Toc207960374 \h </w:instrText>
             </w:r>
             <w:r>
               <w:rPr>
@@ -1754,7 +1754,7 @@
               <w:lang w:eastAsia="es-MX"/>
             </w:rPr>
           </w:pPr>
-          <w:hyperlink w:anchor="_Toc207661919" w:history="1">
+          <w:hyperlink w:anchor="_Toc207960375" w:history="1">
             <w:r>
               <w:rPr>
                 <w:rStyle w:val="Hipervnculo"/>
@@ -1798,7 +1798,7 @@
                 <w:noProof/>
                 <w:webHidden/>
               </w:rPr>
-              <w:instrText xml:space="preserve"> PAGEREF _Toc207661919 \h </w:instrText>
+              <w:instrText xml:space="preserve"> PAGEREF _Toc207960375 \h </w:instrText>
             </w:r>
             <w:r>
               <w:rPr>
@@ -1840,7 +1840,7 @@
               <w:lang w:eastAsia="es-MX"/>
             </w:rPr>
           </w:pPr>
-          <w:hyperlink w:anchor="_Toc207661920" w:history="1">
+          <w:hyperlink w:anchor="_Toc207960376" w:history="1">
             <w:r>
               <w:rPr>
                 <w:rStyle w:val="Hipervnculo"/>
@@ -1867,7 +1867,7 @@
                 <w:noProof/>
                 <w:webHidden/>
               </w:rPr>
-              <w:instrText xml:space="preserve"> PAGEREF _Toc207661920 \h </w:instrText>
+              <w:instrText xml:space="preserve"> PAGEREF _Toc207960376 \h </w:instrText>
             </w:r>
             <w:r>
               <w:rPr>
@@ -1909,7 +1909,7 @@
               <w:lang w:eastAsia="es-MX"/>
             </w:rPr>
           </w:pPr>
-          <w:hyperlink w:anchor="_Toc207661921" w:history="1">
+          <w:hyperlink w:anchor="_Toc207960377" w:history="1">
             <w:r>
               <w:rPr>
                 <w:rStyle w:val="Hipervnculo"/>
@@ -1936,7 +1936,7 @@
                 <w:noProof/>
                 <w:webHidden/>
               </w:rPr>
-              <w:instrText xml:space="preserve"> PAGEREF _Toc207661921 \h </w:instrText>
+              <w:instrText xml:space="preserve"> PAGEREF _Toc207960377 \h </w:instrText>
             </w:r>
             <w:r>
               <w:rPr>
@@ -1978,7 +1978,7 @@
               <w:lang w:eastAsia="es-MX"/>
             </w:rPr>
           </w:pPr>
-          <w:hyperlink w:anchor="_Toc207661922" w:history="1">
+          <w:hyperlink w:anchor="_Toc207960378" w:history="1">
             <w:r>
               <w:rPr>
                 <w:rStyle w:val="Hipervnculo"/>
@@ -2005,7 +2005,7 @@
                 <w:noProof/>
                 <w:webHidden/>
               </w:rPr>
-              <w:instrText xml:space="preserve"> PAGEREF _Toc207661922 \h </w:instrText>
+              <w:instrText xml:space="preserve"> PAGEREF _Toc207960378 \h </w:instrText>
             </w:r>
             <w:r>
               <w:rPr>
@@ -2047,7 +2047,7 @@
               <w:lang w:eastAsia="es-MX"/>
             </w:rPr>
           </w:pPr>
-          <w:hyperlink w:anchor="_Toc207661923" w:history="1">
+          <w:hyperlink w:anchor="_Toc207960379" w:history="1">
             <w:r>
               <w:rPr>
                 <w:rStyle w:val="Hipervnculo"/>
@@ -2074,7 +2074,7 @@
                 <w:noProof/>
                 <w:webHidden/>
               </w:rPr>
-              <w:instrText xml:space="preserve"> PAGEREF _Toc207661923 \h </w:instrText>
+              <w:instrText xml:space="preserve"> PAGEREF _Toc207960379 \h </w:instrText>
             </w:r>
             <w:r>
               <w:rPr>
@@ -2116,7 +2116,7 @@
               <w:lang w:eastAsia="es-MX"/>
             </w:rPr>
           </w:pPr>
-          <w:hyperlink w:anchor="_Toc207661924" w:history="1">
+          <w:hyperlink w:anchor="_Toc207960380" w:history="1">
             <w:r>
               <w:rPr>
                 <w:rStyle w:val="Hipervnculo"/>
@@ -2143,7 +2143,7 @@
                 <w:noProof/>
                 <w:webHidden/>
               </w:rPr>
-              <w:instrText xml:space="preserve"> PAGEREF _Toc207661924 \h </w:instrText>
+              <w:instrText xml:space="preserve"> PAGEREF _Toc207960380 \h </w:instrText>
             </w:r>
             <w:r>
               <w:rPr>
@@ -2185,7 +2185,7 @@
               <w:lang w:eastAsia="es-MX"/>
             </w:rPr>
           </w:pPr>
-          <w:hyperlink w:anchor="_Toc207661925" w:history="1">
+          <w:hyperlink w:anchor="_Toc207960381" w:history="1">
             <w:r>
               <w:rPr>
                 <w:rStyle w:val="Hipervnculo"/>
@@ -2212,7 +2212,7 @@
                 <w:noProof/>
                 <w:webHidden/>
               </w:rPr>
-              <w:instrText xml:space="preserve"> PAGEREF _Toc207661925 \h </w:instrText>
+              <w:instrText xml:space="preserve"> PAGEREF _Toc207960381 \h </w:instrText>
             </w:r>
             <w:r>
               <w:rPr>
@@ -2258,7 +2258,7 @@
               <w:lang w:eastAsia="es-MX"/>
             </w:rPr>
           </w:pPr>
-          <w:hyperlink w:anchor="_Toc207661926" w:history="1">
+          <w:hyperlink w:anchor="_Toc207960382" w:history="1">
             <w:r>
               <w:rPr>
                 <w:rStyle w:val="Hipervnculo"/>
@@ -2302,7 +2302,7 @@
                 <w:noProof/>
                 <w:webHidden/>
               </w:rPr>
-              <w:instrText xml:space="preserve"> PAGEREF _Toc207661926 \h </w:instrText>
+              <w:instrText xml:space="preserve"> PAGEREF _Toc207960382 \h </w:instrText>
             </w:r>
             <w:r>
               <w:rPr>
@@ -2344,7 +2344,7 @@
               <w:lang w:eastAsia="es-MX"/>
             </w:rPr>
           </w:pPr>
-          <w:hyperlink w:anchor="_Toc207661927" w:history="1">
+          <w:hyperlink w:anchor="_Toc207960383" w:history="1">
             <w:r>
               <w:rPr>
                 <w:rStyle w:val="Hipervnculo"/>
@@ -2371,7 +2371,7 @@
                 <w:noProof/>
                 <w:webHidden/>
               </w:rPr>
-              <w:instrText xml:space="preserve"> PAGEREF _Toc207661927 \h </w:instrText>
+              <w:instrText xml:space="preserve"> PAGEREF _Toc207960383 \h </w:instrText>
             </w:r>
             <w:r>
               <w:rPr>
@@ -2413,7 +2413,7 @@
               <w:lang w:eastAsia="es-MX"/>
             </w:rPr>
           </w:pPr>
-          <w:hyperlink w:anchor="_Toc207661928" w:history="1">
+          <w:hyperlink w:anchor="_Toc207960384" w:history="1">
             <w:r>
               <w:rPr>
                 <w:rStyle w:val="Hipervnculo"/>
@@ -2440,7 +2440,7 @@
                 <w:noProof/>
                 <w:webHidden/>
               </w:rPr>
-              <w:instrText xml:space="preserve"> PAGEREF _Toc207661928 \h </w:instrText>
+              <w:instrText xml:space="preserve"> PAGEREF _Toc207960384 \h </w:instrText>
             </w:r>
             <w:r>
               <w:rPr>
@@ -2482,7 +2482,7 @@
               <w:lang w:eastAsia="es-MX"/>
             </w:rPr>
           </w:pPr>
-          <w:hyperlink w:anchor="_Toc207661929" w:history="1">
+          <w:hyperlink w:anchor="_Toc207960385" w:history="1">
             <w:r>
               <w:rPr>
                 <w:rStyle w:val="Hipervnculo"/>
@@ -2509,7 +2509,7 @@
                 <w:noProof/>
                 <w:webHidden/>
               </w:rPr>
-              <w:instrText xml:space="preserve"> PAGEREF _Toc207661929 \h </w:instrText>
+              <w:instrText xml:space="preserve"> PAGEREF _Toc207960385 \h </w:instrText>
             </w:r>
             <w:r>
               <w:rPr>
@@ -2551,7 +2551,7 @@
               <w:lang w:eastAsia="es-MX"/>
             </w:rPr>
           </w:pPr>
-          <w:hyperlink w:anchor="_Toc207661930" w:history="1">
+          <w:hyperlink w:anchor="_Toc207960386" w:history="1">
             <w:r>
               <w:rPr>
                 <w:rStyle w:val="Hipervnculo"/>
@@ -2578,7 +2578,7 @@
                 <w:noProof/>
                 <w:webHidden/>
               </w:rPr>
-              <w:instrText xml:space="preserve"> PAGEREF _Toc207661930 \h </w:instrText>
+              <w:instrText xml:space="preserve"> PAGEREF _Toc207960386 \h </w:instrText>
             </w:r>
             <w:r>
               <w:rPr>
@@ -2623,7 +2623,7 @@
               <w:lang w:eastAsia="es-MX"/>
             </w:rPr>
           </w:pPr>
-          <w:hyperlink w:anchor="_Toc207661931" w:history="1">
+          <w:hyperlink w:anchor="_Toc207960387" w:history="1">
             <w:r>
               <w:rPr>
                 <w:rStyle w:val="Hipervnculo"/>
@@ -2650,7 +2650,7 @@
                 <w:noProof/>
                 <w:webHidden/>
               </w:rPr>
-              <w:instrText xml:space="preserve"> PAGEREF _Toc207661931 \h </w:instrText>
+              <w:instrText xml:space="preserve"> PAGEREF _Toc207960387 \h </w:instrText>
             </w:r>
             <w:r>
               <w:rPr>
@@ -2695,7 +2695,7 @@
               <w:lang w:eastAsia="es-MX"/>
             </w:rPr>
           </w:pPr>
-          <w:hyperlink w:anchor="_Toc207661932" w:history="1">
+          <w:hyperlink w:anchor="_Toc207960388" w:history="1">
             <w:r>
               <w:rPr>
                 <w:rStyle w:val="Hipervnculo"/>
@@ -2722,7 +2722,7 @@
                 <w:noProof/>
                 <w:webHidden/>
               </w:rPr>
-              <w:instrText xml:space="preserve"> PAGEREF _Toc207661932 \h </w:instrText>
+              <w:instrText xml:space="preserve"> PAGEREF _Toc207960388 \h </w:instrText>
             </w:r>
             <w:r>
               <w:rPr>
@@ -2767,7 +2767,7 @@
               <w:lang w:eastAsia="es-MX"/>
             </w:rPr>
           </w:pPr>
-          <w:hyperlink w:anchor="_Toc207661933" w:history="1">
+          <w:hyperlink w:anchor="_Toc207960389" w:history="1">
             <w:r>
               <w:rPr>
                 <w:rStyle w:val="Hipervnculo"/>
@@ -2794,7 +2794,7 @@
                 <w:noProof/>
                 <w:webHidden/>
               </w:rPr>
-              <w:instrText xml:space="preserve"> PAGEREF _Toc207661933 \h </w:instrText>
+              <w:instrText xml:space="preserve"> PAGEREF _Toc207960389 \h </w:instrText>
             </w:r>
             <w:r>
               <w:rPr>
@@ -2839,7 +2839,7 @@
               <w:lang w:eastAsia="es-MX"/>
             </w:rPr>
           </w:pPr>
-          <w:hyperlink w:anchor="_Toc207661934" w:history="1">
+          <w:hyperlink w:anchor="_Toc207960390" w:history="1">
             <w:r>
               <w:rPr>
                 <w:rStyle w:val="Hipervnculo"/>
@@ -2866,7 +2866,7 @@
                 <w:noProof/>
                 <w:webHidden/>
               </w:rPr>
-              <w:instrText xml:space="preserve"> PAGEREF _Toc207661934 \h </w:instrText>
+              <w:instrText xml:space="preserve"> PAGEREF _Toc207960390 \h </w:instrText>
             </w:r>
             <w:r>
               <w:rPr>
@@ -2911,7 +2911,7 @@
               <w:lang w:eastAsia="es-MX"/>
             </w:rPr>
           </w:pPr>
-          <w:hyperlink w:anchor="_Toc207661935" w:history="1">
+          <w:hyperlink w:anchor="_Toc207960391" w:history="1">
             <w:r>
               <w:rPr>
                 <w:rStyle w:val="Hipervnculo"/>
@@ -2938,7 +2938,7 @@
                 <w:noProof/>
                 <w:webHidden/>
               </w:rPr>
-              <w:instrText xml:space="preserve"> PAGEREF _Toc207661935 \h </w:instrText>
+              <w:instrText xml:space="preserve"> PAGEREF _Toc207960391 \h </w:instrText>
             </w:r>
             <w:r>
               <w:rPr>
@@ -2995,7 +2995,7 @@
       <w:pPr>
         <w:pStyle w:val="Titulosgenerales"/>
       </w:pPr>
-      <w:bookmarkStart w:id="0" w:name="_Toc207661903"/>
+      <w:bookmarkStart w:id="0" w:name="_Toc207960359"/>
       <w:r>
         <w:lastRenderedPageBreak/>
         <w:t>Introducción</w:t>
@@ -3040,6 +3040,7 @@
       </w:pPr>
       <w:r>
         <w:rPr>
+          <w:noProof/>
           <w:lang w:val="es-419"/>
         </w:rPr>
         <w:drawing>
@@ -3234,12 +3235,31 @@
       <w:pPr>
         <w:pStyle w:val="Ttulo1"/>
       </w:pPr>
-      <w:bookmarkStart w:id="1" w:name="_Toc207661904"/>
+      <w:bookmarkStart w:id="1" w:name="_Toc207960360"/>
       <w:r>
         <w:lastRenderedPageBreak/>
         <w:t>Transporte terrestre</w:t>
       </w:r>
       <w:bookmarkEnd w:id="1"/>
+    </w:p>
+    <w:p>
+      <w:pPr>
+        <w:rPr>
+          <w:lang w:val="es-419" w:eastAsia="es-CO"/>
+        </w:rPr>
+      </w:pPr>
+      <w:r>
+        <w:rPr>
+          <w:lang w:val="es-419" w:eastAsia="es-CO"/>
+        </w:rPr>
+        <w:t>S</w:t>
+      </w:r>
+      <w:r>
+        <w:rPr>
+          <w:lang w:val="es-419" w:eastAsia="es-CO"/>
+        </w:rPr>
+        <w:t>e define como el conjunto de sistemas, infraestructuras y operaciones destinadas al desplazamiento de personas, mercancías y recursos a través de vías carreteras y ferroviarias. Su análisis se orienta al estudio de parámetros operativos como capacidad vehicular, tiempos de tránsito, trazabilidad de rutas, control de carga, eficiencia en la distribución y cumplimiento de normativas de seguridad vial.</w:t>
+      </w:r>
     </w:p>
     <w:p>
       <w:pPr>
@@ -3252,7 +3272,7 @@
           <w:rFonts w:eastAsia="Times New Roman"/>
         </w:rPr>
       </w:pPr>
-      <w:bookmarkStart w:id="2" w:name="_Toc207661905"/>
+      <w:bookmarkStart w:id="2" w:name="_Toc207960361"/>
       <w:r>
         <w:t>Historia del transporte terrestre</w:t>
       </w:r>
@@ -3373,6 +3393,7 @@
       </w:pPr>
       <w:r>
         <w:rPr>
+          <w:noProof/>
           <w:lang w:val="es-419" w:eastAsia="es-CO"/>
         </w:rPr>
         <w:drawing>
@@ -3435,54 +3456,17 @@
           <w:lang w:val="es-419"/>
         </w:rPr>
       </w:pPr>
-      <w:r>
-        <w:rPr>
-          <w:b/>
-          <w:bCs/>
-          <w:lang w:val="es-419"/>
-        </w:rPr>
-        <w:fldChar w:fldCharType="begin"/>
-      </w:r>
-      <w:r>
-        <w:rPr>
-          <w:b/>
-          <w:bCs/>
-          <w:lang w:val="es-419"/>
-        </w:rPr>
-        <w:instrText>HYPERLINK "https://www.youtube.com/watch?v=ZAysiezOSYQ"</w:instrText>
-      </w:r>
-      <w:r>
-        <w:rPr>
-          <w:b/>
-          <w:bCs/>
-          <w:lang w:val="es-419"/>
-        </w:rPr>
-      </w:r>
-      <w:r>
-        <w:rPr>
-          <w:b/>
-          <w:bCs/>
-          <w:lang w:val="es-419"/>
-        </w:rPr>
-        <w:fldChar w:fldCharType="separate"/>
-      </w:r>
-      <w:r>
-        <w:rPr>
-          <w:rStyle w:val="Hipervnculo"/>
-          <w:b/>
-          <w:bCs/>
-          <w:lang w:val="es-419"/>
-        </w:rPr>
-        <w:t>Enlace de reproducción del video</w:t>
-      </w:r>
-      <w:r>
-        <w:rPr>
-          <w:b/>
-          <w:bCs/>
-          <w:lang w:val="es-419"/>
-        </w:rPr>
-        <w:fldChar w:fldCharType="end"/>
-      </w:r>
+      <w:hyperlink r:id="rId16" w:history="1">
+        <w:r>
+          <w:rPr>
+            <w:rStyle w:val="Hipervnculo"/>
+            <w:b/>
+            <w:bCs/>
+            <w:lang w:val="es-419"/>
+          </w:rPr>
+          <w:t>Enlace de reproducción del video</w:t>
+        </w:r>
+      </w:hyperlink>
       <w:r>
         <w:rPr>
           <w:b/>
@@ -3534,14 +3518,7 @@
                 <w:b/>
                 <w:lang w:val="es-419"/>
               </w:rPr>
-              <w:t xml:space="preserve"> </w:t>
-            </w:r>
-            <w:r>
-              <w:rPr>
-                <w:b/>
-                <w:lang w:val="es-419"/>
-              </w:rPr>
-              <w:t>Historia de los medios de transportes terrestres</w:t>
+              <w:t xml:space="preserve"> Historia de los medios de transportes terrestres</w:t>
             </w:r>
           </w:p>
         </w:tc>
@@ -4702,28 +4679,7 @@
               <w:t xml:space="preserve">era fácil de conducir y mantener </w:t>
             </w:r>
             <w:r>
-              <w:t>e hizo asequible</w:t>
-            </w:r>
-            <w:r>
-              <w:t xml:space="preserve"> </w:t>
-            </w:r>
-            <w:r>
-              <w:t>el automóvil a mucha gente</w:t>
-            </w:r>
-            <w:r>
-              <w:t>,</w:t>
-            </w:r>
-            <w:r>
-              <w:t xml:space="preserve"> se hacía en</w:t>
-            </w:r>
-            <w:r>
-              <w:t xml:space="preserve"> </w:t>
-            </w:r>
-            <w:r>
-              <w:t>cadena y se vendieron más de 15 millones</w:t>
-            </w:r>
-            <w:r>
-              <w:t xml:space="preserve"> </w:t>
+              <w:t xml:space="preserve">e hizo asequible el automóvil a mucha gente, se hacía en cadena y se vendieron más de 15 millones </w:t>
             </w:r>
             <w:r>
               <w:t xml:space="preserve">de unidades. </w:t>
@@ -4838,7 +4794,7 @@
           <w:numId w:val="7"/>
         </w:numPr>
       </w:pPr>
-      <w:bookmarkStart w:id="3" w:name="_Toc207661906"/>
+      <w:bookmarkStart w:id="3" w:name="_Toc207960362"/>
       <w:r>
         <w:t>Concepto del transporte terrestre</w:t>
       </w:r>
@@ -4868,7 +4824,7 @@
           <w:numId w:val="7"/>
         </w:numPr>
       </w:pPr>
-      <w:bookmarkStart w:id="4" w:name="_Toc207661907"/>
+      <w:bookmarkStart w:id="4" w:name="_Toc207960363"/>
       <w:r>
         <w:t>Tipología del transporte terrestre</w:t>
       </w:r>
@@ -5105,7 +5061,7 @@
       <w:pPr>
         <w:pStyle w:val="Ttulo2"/>
       </w:pPr>
-      <w:bookmarkStart w:id="5" w:name="_Toc207661908"/>
+      <w:bookmarkStart w:id="5" w:name="_Toc207960364"/>
       <w:r>
         <w:t>1.4 Normativa</w:t>
       </w:r>
@@ -5151,20 +5107,10 @@
           <w:b/>
           <w:bCs/>
         </w:rPr>
-        <w:t>Licenciamiento y habilitación</w:t>
-      </w:r>
-      <w:r>
-        <w:rPr>
-          <w:b/>
-          <w:bCs/>
-        </w:rPr>
-        <w:t>:</w:t>
-      </w:r>
-      <w:r>
-        <w:t xml:space="preserve"> r</w:t>
-      </w:r>
-      <w:r>
-        <w:t>equisitos que deben cumplir empresas o personas para operar legalmente (licencias de conducción, tarjetas de operación, permisos de transporte especial, etc.).</w:t>
+        <w:t>Licenciamiento y habilitación:</w:t>
+      </w:r>
+      <w:r>
+        <w:t xml:space="preserve"> requisitos que deben cumplir empresas o personas para operar legalmente (licencias de conducción, tarjetas de operación, permisos de transporte especial, etc.).</w:t>
       </w:r>
     </w:p>
     <w:p>
@@ -5180,20 +5126,10 @@
           <w:b/>
           <w:bCs/>
         </w:rPr>
-        <w:t>Condiciones técnicas y mecánicas</w:t>
-      </w:r>
-      <w:r>
-        <w:rPr>
-          <w:b/>
-          <w:bCs/>
-        </w:rPr>
-        <w:t>:</w:t>
-      </w:r>
-      <w:r>
-        <w:t xml:space="preserve"> e</w:t>
-      </w:r>
-      <w:r>
-        <w:t>xigencias relacionadas con el estado del vehículo, revisiones técnico-mecánicas, sistemas de seguridad y equipamiento.</w:t>
+        <w:t>Condiciones técnicas y mecánicas:</w:t>
+      </w:r>
+      <w:r>
+        <w:t xml:space="preserve"> exigencias relacionadas con el estado del vehículo, revisiones técnico-mecánicas, sistemas de seguridad y equipamiento.</w:t>
       </w:r>
     </w:p>
     <w:p>
@@ -5313,10 +5249,7 @@
         <w:t xml:space="preserve">: </w:t>
       </w:r>
       <w:r>
-        <w:t>c</w:t>
-      </w:r>
-      <w:r>
-        <w:t>alles, avenidas urbanas y rutas locales a cargo de alcaldías o secretarías de movilidad.</w:t>
+        <w:t>calles, avenidas urbanas y rutas locales a cargo de alcaldías o secretarías de movilidad.</w:t>
       </w:r>
     </w:p>
     <w:p>
@@ -5379,7 +5312,7 @@
       <w:pPr>
         <w:pStyle w:val="Ttulo2"/>
       </w:pPr>
-      <w:bookmarkStart w:id="6" w:name="_Toc207661909"/>
+      <w:bookmarkStart w:id="6" w:name="_Toc207960365"/>
       <w:r>
         <w:lastRenderedPageBreak/>
         <w:t>1.5 Medios de transporte</w:t>
@@ -5532,6 +5465,9 @@
         <w:pStyle w:val="Figura"/>
       </w:pPr>
       <w:r>
+        <w:rPr>
+          <w:noProof/>
+        </w:rPr>
         <w:drawing>
           <wp:inline distT="0" distB="0" distL="0" distR="0" wp14:anchorId="42E0DA27" wp14:editId="01D9EEFA">
             <wp:extent cx="5688326" cy="1690754"/>
@@ -5548,7 +5484,7 @@
                     <pic:cNvPicPr/>
                   </pic:nvPicPr>
                   <pic:blipFill>
-                    <a:blip r:embed="rId16"/>
+                    <a:blip r:embed="rId17"/>
                     <a:stretch>
                       <a:fillRect/>
                     </a:stretch>
@@ -5655,13 +5591,7 @@
         <w:t>Camiones de carga:</w:t>
       </w:r>
       <w:r>
-        <w:t xml:space="preserve"> son esenciales para el transporte p</w:t>
-      </w:r>
-      <w:r>
-        <w:t>ú</w:t>
-      </w:r>
-      <w:r>
-        <w:t>blico de mercancías.</w:t>
+        <w:t xml:space="preserve"> son esenciales para el transporte público de mercancías.</w:t>
       </w:r>
     </w:p>
     <w:p>
@@ -5720,7 +5650,7 @@
           <w:lang w:val="es-419"/>
         </w:rPr>
       </w:pPr>
-      <w:bookmarkStart w:id="7" w:name="_Toc207661910"/>
+      <w:bookmarkStart w:id="7" w:name="_Toc207960366"/>
       <w:r>
         <w:rPr>
           <w:rStyle w:val="Extranjerismo"/>
@@ -5734,9 +5664,28 @@
     </w:p>
     <w:p>
       <w:pPr>
+        <w:rPr>
+          <w:lang w:val="es-419" w:eastAsia="es-CO"/>
+        </w:rPr>
+      </w:pPr>
+      <w:r>
+        <w:rPr>
+          <w:lang w:val="es-419" w:eastAsia="es-CO"/>
+        </w:rPr>
+        <w:t>L</w:t>
+      </w:r>
+      <w:r>
+        <w:rPr>
+          <w:lang w:val="es-419" w:eastAsia="es-CO"/>
+        </w:rPr>
+        <w:t>a infraestructura vial no solo cumple una función estructural dentro del sistema de transporte terrestre, sino que también se integra como un componente estratégico en la planificación logística y la competitividad de los territorios.</w:t>
+      </w:r>
+    </w:p>
+    <w:p>
+      <w:pPr>
         <w:pStyle w:val="Ttulo2"/>
       </w:pPr>
-      <w:bookmarkStart w:id="8" w:name="_Toc207661911"/>
+      <w:bookmarkStart w:id="8" w:name="_Toc207960367"/>
       <w:r>
         <w:t xml:space="preserve">2.1 </w:t>
       </w:r>
@@ -5765,7 +5714,7 @@
       <w:pPr>
         <w:pStyle w:val="Ttulo2"/>
       </w:pPr>
-      <w:bookmarkStart w:id="9" w:name="_Toc207661912"/>
+      <w:bookmarkStart w:id="9" w:name="_Toc207960368"/>
       <w:r>
         <w:t xml:space="preserve">2.2 </w:t>
       </w:r>
@@ -5802,10 +5751,19 @@
       </w:pPr>
       <w:r>
         <w:rPr>
+          <w:b/>
+          <w:bCs/>
           <w:szCs w:val="28"/>
           <w:lang w:val="es-419" w:eastAsia="es-CO"/>
         </w:rPr>
-        <w:t>Ejemplos de la jurisdicción en Colombia:</w:t>
+        <w:t>Ejemplos de la jurisdicción en Colombia</w:t>
+      </w:r>
+      <w:r>
+        <w:rPr>
+          <w:szCs w:val="28"/>
+          <w:lang w:val="es-419" w:eastAsia="es-CO"/>
+        </w:rPr>
+        <w:t>:</w:t>
       </w:r>
     </w:p>
     <w:p>
@@ -5821,23 +5779,14 @@
           <w:b/>
           <w:bCs/>
         </w:rPr>
-        <w:t>Jurisdicción nacional</w:t>
-      </w:r>
-      <w:r>
-        <w:rPr>
-          <w:b/>
-          <w:bCs/>
-        </w:rPr>
-        <w:t>:</w:t>
+        <w:lastRenderedPageBreak/>
+        <w:t>Jurisdicción nacional:</w:t>
       </w:r>
       <w:r>
         <w:t xml:space="preserve"> </w:t>
       </w:r>
       <w:r>
-        <w:t>v</w:t>
-      </w:r>
-      <w:r>
-        <w:t>ías nacionales a cargo del Instituto Nacional de Vías (INVIAS) o la Agencia Nacional de Infraestructura (ANI).</w:t>
+        <w:t>vías nacionales a cargo del Instituto Nacional de Vías (INVIAS) o la Agencia Nacional de Infraestructura (ANI).</w:t>
       </w:r>
     </w:p>
     <w:p>
@@ -5853,17 +5802,13 @@
           <w:b/>
           <w:bCs/>
         </w:rPr>
-        <w:lastRenderedPageBreak/>
         <w:t>Jurisdicción departamental</w:t>
       </w:r>
       <w:r>
         <w:t xml:space="preserve">: </w:t>
       </w:r>
       <w:r>
-        <w:t>v</w:t>
-      </w:r>
-      <w:r>
-        <w:t>ías y corredores gestionados por las gobernaciones o secretarías de infraestructura departamental.</w:t>
+        <w:t>vías y corredores gestionados por las gobernaciones o secretarías de infraestructura departamental.</w:t>
       </w:r>
     </w:p>
     <w:p>
@@ -5879,30 +5824,20 @@
           <w:b/>
           <w:bCs/>
         </w:rPr>
-        <w:t>Jurisdicción municipal o distrital</w:t>
-      </w:r>
-      <w:r>
-        <w:rPr>
-          <w:b/>
-          <w:bCs/>
-        </w:rPr>
-        <w:t>:</w:t>
+        <w:t>Jurisdicción municipal o distrital:</w:t>
       </w:r>
       <w:r>
         <w:t xml:space="preserve"> </w:t>
       </w:r>
       <w:r>
-        <w:t>c</w:t>
-      </w:r>
-      <w:r>
-        <w:t>alles, avenidas urbanas y rutas locales a cargo de alcaldías o secretarías de movilidad.</w:t>
+        <w:t>calles, avenidas urbanas y rutas locales a cargo de alcaldías o secretarías de movilidad.</w:t>
       </w:r>
     </w:p>
     <w:p>
       <w:pPr>
         <w:pStyle w:val="Ttulo2"/>
       </w:pPr>
-      <w:bookmarkStart w:id="10" w:name="_Toc207661913"/>
+      <w:bookmarkStart w:id="10" w:name="_Toc207960369"/>
       <w:r>
         <w:t>2.3 Riesgos viales en el e</w:t>
       </w:r>
@@ -6090,7 +6025,6 @@
           <w:b/>
           <w:bCs/>
         </w:rPr>
-        <w:lastRenderedPageBreak/>
         <w:t>Cruces inseguros</w:t>
       </w:r>
       <w:r>
@@ -6207,7 +6141,7 @@
       <w:pPr>
         <w:pStyle w:val="Ttulo2"/>
       </w:pPr>
-      <w:bookmarkStart w:id="11" w:name="_Toc207661914"/>
+      <w:bookmarkStart w:id="11" w:name="_Toc207960370"/>
       <w:r>
         <w:t>2.4 Clases y aspectos técnicos de vías</w:t>
       </w:r>
@@ -6259,10 +6193,7 @@
         <w:t>Vías nacionales</w:t>
       </w:r>
       <w:r>
-        <w:t>: i</w:t>
-      </w:r>
-      <w:r>
-        <w:t>nterconectan departamentos, regiones y grandes centros urbanos. Son responsabilidad del gobierno nacional y están diseñadas para alto flujo y velocidad.</w:t>
+        <w:t>: interconectan departamentos, regiones y grandes centros urbanos. Son responsabilidad del gobierno nacional y están diseñadas para alto flujo y velocidad.</w:t>
       </w:r>
     </w:p>
     <w:p>
@@ -6278,33 +6209,16 @@
           <w:b/>
           <w:bCs/>
         </w:rPr>
-        <w:t>Vías</w:t>
-      </w:r>
-      <w:r>
-        <w:rPr>
-          <w:b/>
-          <w:bCs/>
-        </w:rPr>
+        <w:t>Vías departamentales</w:t>
+      </w:r>
+      <w:r>
+        <w:t>:</w:t>
+      </w:r>
+      <w:r>
         <w:t xml:space="preserve"> </w:t>
       </w:r>
       <w:r>
-        <w:rPr>
-          <w:b/>
-          <w:bCs/>
-        </w:rPr>
-        <w:t>departamentales</w:t>
-      </w:r>
-      <w:r>
-        <w:t>:</w:t>
-      </w:r>
-      <w:r>
-        <w:t xml:space="preserve"> </w:t>
-      </w:r>
-      <w:r>
-        <w:t>c</w:t>
-      </w:r>
-      <w:r>
-        <w:t>onectan municipios dentro de un mismo departamento. Su mantenimiento recae en los gobiernos departamentales.</w:t>
+        <w:t>conectan municipios dentro de un mismo departamento. Su mantenimiento recae en los gobiernos departamentales.</w:t>
       </w:r>
     </w:p>
     <w:p>
@@ -6320,20 +6234,10 @@
           <w:b/>
           <w:bCs/>
         </w:rPr>
-        <w:t>Vías municipales o urbanas</w:t>
-      </w:r>
-      <w:r>
-        <w:rPr>
-          <w:b/>
-          <w:bCs/>
-        </w:rPr>
-        <w:t>:</w:t>
-      </w:r>
-      <w:r>
-        <w:t xml:space="preserve"> c</w:t>
-      </w:r>
-      <w:r>
-        <w:t>onectan barrios, zonas locales o rurales. Son competencia de las alcaldías.</w:t>
+        <w:t>Vías municipales o urbanas:</w:t>
+      </w:r>
+      <w:r>
+        <w:t xml:space="preserve"> conectan barrios, zonas locales o rurales. Son competencia de las alcaldías.</w:t>
       </w:r>
     </w:p>
     <w:p>
@@ -6349,35 +6253,25 @@
           <w:b/>
           <w:bCs/>
         </w:rPr>
-        <w:t>Vías terciarias o rurales</w:t>
-      </w:r>
-      <w:r>
+        <w:lastRenderedPageBreak/>
+        <w:t>Vías terciarias o rurales:</w:t>
+      </w:r>
+      <w:r>
+        <w:t xml:space="preserve"> comunican veredas, zonas productivas y rurales. Generalmente de bajo volumen vehicular y menor especificación técnica.</w:t>
+      </w:r>
+    </w:p>
+    <w:p>
+      <w:pPr>
         <w:rPr>
           <w:b/>
           <w:bCs/>
         </w:rPr>
-        <w:t>:</w:t>
-      </w:r>
-      <w:r>
-        <w:t xml:space="preserve"> c</w:t>
-      </w:r>
-      <w:r>
-        <w:t>omunican veredas, zonas productivas y rurales. Generalmente de bajo volumen vehicular y menor especificación técnica.</w:t>
-      </w:r>
-    </w:p>
-    <w:p>
-      <w:pPr>
+      </w:pPr>
+      <w:r>
         <w:rPr>
           <w:b/>
           <w:bCs/>
         </w:rPr>
-      </w:pPr>
-      <w:r>
-        <w:rPr>
-          <w:b/>
-          <w:bCs/>
-        </w:rPr>
-        <w:lastRenderedPageBreak/>
         <w:t>Aspectos técnicos de las vías</w:t>
       </w:r>
     </w:p>
@@ -6420,20 +6314,10 @@
           <w:b/>
           <w:bCs/>
         </w:rPr>
-        <w:t>Tipo de superficie</w:t>
-      </w:r>
-      <w:r>
-        <w:rPr>
-          <w:b/>
-          <w:bCs/>
-        </w:rPr>
-        <w:t>:</w:t>
-      </w:r>
-      <w:r>
-        <w:t xml:space="preserve"> </w:t>
-      </w:r>
-      <w:r>
-        <w:t>pavimentada (asfalto, concreto) o sin pavimentar (balastro, tierra).</w:t>
+        <w:t>Tipo de superficie:</w:t>
+      </w:r>
+      <w:r>
+        <w:t xml:space="preserve"> pavimentada (asfalto, concreto) o sin pavimentar (balastro, tierra).</w:t>
       </w:r>
     </w:p>
     <w:p>
@@ -6449,20 +6333,10 @@
           <w:b/>
           <w:bCs/>
         </w:rPr>
-        <w:t>Ancho de calzada y carriles</w:t>
-      </w:r>
-      <w:r>
-        <w:rPr>
-          <w:b/>
-          <w:bCs/>
-        </w:rPr>
-        <w:t>:</w:t>
-      </w:r>
-      <w:r>
-        <w:t xml:space="preserve"> </w:t>
-      </w:r>
-      <w:r>
-        <w:t>definido según el tipo de vía y volumen vehicular.</w:t>
+        <w:t>Ancho de calzada y carriles:</w:t>
+      </w:r>
+      <w:r>
+        <w:t xml:space="preserve"> definido según el tipo de vía y volumen vehicular.</w:t>
       </w:r>
     </w:p>
     <w:p>
@@ -6478,23 +6352,10 @@
           <w:b/>
           <w:bCs/>
         </w:rPr>
-        <w:t>Pendientes, curvas y peraltes</w:t>
-      </w:r>
-      <w:r>
-        <w:rPr>
-          <w:b/>
-          <w:bCs/>
-        </w:rPr>
-        <w:t>:</w:t>
-      </w:r>
-      <w:r>
-        <w:t xml:space="preserve"> </w:t>
-      </w:r>
-      <w:r>
-        <w:t>influyen en la seguridad y velocidad del tránsit</w:t>
-      </w:r>
-      <w:r>
-        <w:t>o.</w:t>
+        <w:t>Pendientes, curvas y peraltes:</w:t>
+      </w:r>
+      <w:r>
+        <w:t xml:space="preserve"> influyen en la seguridad y velocidad del tránsito.</w:t>
       </w:r>
     </w:p>
     <w:p>
@@ -6510,23 +6371,10 @@
           <w:b/>
           <w:bCs/>
         </w:rPr>
-        <w:t>Drenajes y obras hidráulicas</w:t>
-      </w:r>
-      <w:r>
-        <w:rPr>
-          <w:b/>
-          <w:bCs/>
-        </w:rPr>
-        <w:t>:</w:t>
-      </w:r>
-      <w:r>
-        <w:t xml:space="preserve"> </w:t>
-      </w:r>
-      <w:r>
-        <w:t>permiten el manejo adecuado de aguas lluvias para proteger la vía</w:t>
-      </w:r>
-      <w:r>
-        <w:t>.</w:t>
+        <w:t>Drenajes y obras hidráulicas:</w:t>
+      </w:r>
+      <w:r>
+        <w:t xml:space="preserve"> permiten el manejo adecuado de aguas lluvias para proteger la vía.</w:t>
       </w:r>
     </w:p>
     <w:p>
@@ -6542,20 +6390,10 @@
           <w:b/>
           <w:bCs/>
         </w:rPr>
-        <w:t>Señalización vial</w:t>
-      </w:r>
-      <w:r>
-        <w:rPr>
-          <w:b/>
-          <w:bCs/>
-        </w:rPr>
-        <w:t xml:space="preserve">: </w:t>
-      </w:r>
-      <w:r>
-        <w:t>vertical y horizontal, indispensable para la orientación y seguridad del usuario</w:t>
-      </w:r>
-      <w:r>
-        <w:t xml:space="preserve">. </w:t>
+        <w:t xml:space="preserve">Señalización vial: </w:t>
+      </w:r>
+      <w:r>
+        <w:t xml:space="preserve">vertical y horizontal, indispensable para la orientación y seguridad del usuario. </w:t>
       </w:r>
     </w:p>
     <w:p>
@@ -6596,7 +6434,7 @@
           <w:shd w:val="clear" w:color="auto" w:fill="FFFFFF"/>
         </w:rPr>
       </w:pPr>
-      <w:bookmarkStart w:id="12" w:name="_Toc207661915"/>
+      <w:bookmarkStart w:id="12" w:name="_Toc207960371"/>
       <w:r>
         <w:rPr>
           <w:bdr w:val="none" w:sz="0" w:space="0" w:color="auto" w:frame="1"/>
@@ -6637,7 +6475,7 @@
       <w:pPr>
         <w:pStyle w:val="Ttulo2"/>
       </w:pPr>
-      <w:bookmarkStart w:id="13" w:name="_Toc207661916"/>
+      <w:bookmarkStart w:id="13" w:name="_Toc207960372"/>
       <w:r>
         <w:t>3.1 Principios y valores ciudadanos</w:t>
       </w:r>
@@ -6660,27 +6498,13 @@
           <w:bCs/>
           <w:lang w:val="es-419" w:eastAsia="es-CO"/>
         </w:rPr>
-        <w:t>Respeto a la vida</w:t>
-      </w:r>
-      <w:r>
-        <w:rPr>
-          <w:b/>
-          <w:bCs/>
-          <w:lang w:val="es-419" w:eastAsia="es-CO"/>
-        </w:rPr>
-        <w:t>:</w:t>
-      </w:r>
-      <w:r>
-        <w:rPr>
-          <w:lang w:val="es-419" w:eastAsia="es-CO"/>
-        </w:rPr>
-        <w:t xml:space="preserve"> p</w:t>
-      </w:r>
-      <w:r>
-        <w:rPr>
-          <w:lang w:val="es-419" w:eastAsia="es-CO"/>
-        </w:rPr>
-        <w:t>rioriza la integridad y bienestar de todas las personas en la vía.</w:t>
+        <w:t>Respeto a la vida:</w:t>
+      </w:r>
+      <w:r>
+        <w:rPr>
+          <w:lang w:val="es-419" w:eastAsia="es-CO"/>
+        </w:rPr>
+        <w:t xml:space="preserve"> prioriza la integridad y bienestar de todas las personas en la vía.</w:t>
       </w:r>
     </w:p>
     <w:p>
@@ -6700,27 +6524,13 @@
           <w:bCs/>
           <w:lang w:val="es-419" w:eastAsia="es-CO"/>
         </w:rPr>
-        <w:t>Legalidad</w:t>
-      </w:r>
-      <w:r>
-        <w:rPr>
-          <w:b/>
-          <w:bCs/>
-          <w:lang w:val="es-419" w:eastAsia="es-CO"/>
-        </w:rPr>
-        <w:t xml:space="preserve">: </w:t>
-      </w:r>
-      <w:r>
-        <w:rPr>
-          <w:lang w:val="es-419" w:eastAsia="es-CO"/>
-        </w:rPr>
-        <w:t>p</w:t>
-      </w:r>
-      <w:r>
-        <w:rPr>
-          <w:lang w:val="es-419" w:eastAsia="es-CO"/>
-        </w:rPr>
-        <w:t>romueve el cumplimiento de las normas de tránsito.</w:t>
+        <w:t xml:space="preserve">Legalidad: </w:t>
+      </w:r>
+      <w:r>
+        <w:rPr>
+          <w:lang w:val="es-419" w:eastAsia="es-CO"/>
+        </w:rPr>
+        <w:t>promueve el cumplimiento de las normas de tránsito.</w:t>
       </w:r>
     </w:p>
     <w:p>
@@ -6740,27 +6550,13 @@
           <w:bCs/>
           <w:lang w:val="es-419" w:eastAsia="es-CO"/>
         </w:rPr>
-        <w:t>Responsabilidad</w:t>
-      </w:r>
-      <w:r>
-        <w:rPr>
-          <w:b/>
-          <w:bCs/>
-          <w:lang w:val="es-419" w:eastAsia="es-CO"/>
-        </w:rPr>
-        <w:t xml:space="preserve">: </w:t>
-      </w:r>
-      <w:r>
-        <w:rPr>
-          <w:lang w:val="es-419" w:eastAsia="es-CO"/>
-        </w:rPr>
-        <w:t>c</w:t>
-      </w:r>
-      <w:r>
-        <w:rPr>
-          <w:lang w:val="es-419" w:eastAsia="es-CO"/>
-        </w:rPr>
-        <w:t>ada usuario es responsable de su comportamiento en la vía.</w:t>
+        <w:t xml:space="preserve">Responsabilidad: </w:t>
+      </w:r>
+      <w:r>
+        <w:rPr>
+          <w:lang w:val="es-419" w:eastAsia="es-CO"/>
+        </w:rPr>
+        <w:t>cada usuario es responsable de su comportamiento en la vía.</w:t>
       </w:r>
     </w:p>
     <w:p>
@@ -6780,15 +6576,7 @@
           <w:bCs/>
           <w:lang w:val="es-419" w:eastAsia="es-CO"/>
         </w:rPr>
-        <w:t>S</w:t>
-      </w:r>
-      <w:r>
-        <w:rPr>
-          <w:b/>
-          <w:bCs/>
-          <w:lang w:val="es-419" w:eastAsia="es-CO"/>
-        </w:rPr>
-        <w:t>olidaridad</w:t>
+        <w:t>Solidaridad</w:t>
       </w:r>
       <w:r>
         <w:rPr>
@@ -6859,15 +6647,7 @@
           <w:lang w:val="es-419" w:eastAsia="es-CO"/>
         </w:rPr>
         <w:lastRenderedPageBreak/>
-        <w:t>Tolerancia</w:t>
-      </w:r>
-      <w:r>
-        <w:rPr>
-          <w:b/>
-          <w:bCs/>
-          <w:lang w:val="es-419" w:eastAsia="es-CO"/>
-        </w:rPr>
-        <w:t xml:space="preserve">: </w:t>
+        <w:t xml:space="preserve">Tolerancia: </w:t>
       </w:r>
       <w:r>
         <w:rPr>
@@ -6899,15 +6679,7 @@
           <w:bCs/>
           <w:lang w:val="es-419" w:eastAsia="es-CO"/>
         </w:rPr>
-        <w:t>Honestidad</w:t>
-      </w:r>
-      <w:r>
-        <w:rPr>
-          <w:b/>
-          <w:bCs/>
-          <w:lang w:val="es-419" w:eastAsia="es-CO"/>
-        </w:rPr>
-        <w:t xml:space="preserve">: </w:t>
+        <w:t xml:space="preserve">Honestidad: </w:t>
       </w:r>
       <w:r>
         <w:rPr>
@@ -6939,15 +6711,7 @@
           <w:bCs/>
           <w:lang w:val="es-419" w:eastAsia="es-CO"/>
         </w:rPr>
-        <w:t>Cooperación</w:t>
-      </w:r>
-      <w:r>
-        <w:rPr>
-          <w:b/>
-          <w:bCs/>
-          <w:lang w:val="es-419" w:eastAsia="es-CO"/>
-        </w:rPr>
-        <w:t>:</w:t>
+        <w:t>Cooperación:</w:t>
       </w:r>
       <w:r>
         <w:rPr>
@@ -6966,7 +6730,7 @@
       <w:pPr>
         <w:pStyle w:val="Ttulo2"/>
       </w:pPr>
-      <w:bookmarkStart w:id="14" w:name="_Toc207661917"/>
+      <w:bookmarkStart w:id="14" w:name="_Toc207960373"/>
       <w:r>
         <w:t>3.2 Convivencia vial</w:t>
       </w:r>
@@ -7002,7 +6766,7 @@
       <w:pPr>
         <w:pStyle w:val="Ttulo2"/>
       </w:pPr>
-      <w:bookmarkStart w:id="15" w:name="_Toc207661918"/>
+      <w:bookmarkStart w:id="15" w:name="_Toc207960374"/>
       <w:r>
         <w:t>3.3 Hábitos durante el desplazamiento por las vías como conductor, peatón o pasajero</w:t>
       </w:r>
@@ -7060,7 +6824,7 @@
       <w:pPr>
         <w:pStyle w:val="Ttulo1"/>
       </w:pPr>
-      <w:bookmarkStart w:id="16" w:name="_Toc207661919"/>
+      <w:bookmarkStart w:id="16" w:name="_Toc207960375"/>
       <w:r>
         <w:lastRenderedPageBreak/>
         <w:t>Código nacional de tránsito</w:t>
@@ -7254,27 +7018,13 @@
           <w:bCs/>
           <w:lang w:eastAsia="es-CO"/>
         </w:rPr>
-        <w:t>Reglamentarias</w:t>
-      </w:r>
-      <w:r>
-        <w:rPr>
-          <w:b/>
-          <w:bCs/>
+        <w:t>Reglamentarias:</w:t>
+      </w:r>
+      <w:r>
+        <w:rPr>
           <w:lang w:eastAsia="es-CO"/>
         </w:rPr>
-        <w:t>:</w:t>
-      </w:r>
-      <w:r>
-        <w:rPr>
-          <w:lang w:eastAsia="es-CO"/>
-        </w:rPr>
-        <w:t xml:space="preserve"> e</w:t>
-      </w:r>
-      <w:r>
-        <w:rPr>
-          <w:lang w:eastAsia="es-CO"/>
-        </w:rPr>
-        <w:t>stas indican obligaciones o prohibiciones. Por ejemplo: límites de velocidad o señal de pare.</w:t>
+        <w:t xml:space="preserve"> estas indican obligaciones o prohibiciones. Por ejemplo: límites de velocidad o señal de pare.</w:t>
       </w:r>
     </w:p>
     <w:p>
@@ -7294,27 +7044,13 @@
           <w:bCs/>
           <w:lang w:eastAsia="es-CO"/>
         </w:rPr>
-        <w:t>Preventivas</w:t>
-      </w:r>
-      <w:r>
-        <w:rPr>
-          <w:b/>
-          <w:bCs/>
+        <w:t xml:space="preserve">Preventivas: </w:t>
+      </w:r>
+      <w:r>
+        <w:rPr>
           <w:lang w:eastAsia="es-CO"/>
         </w:rPr>
-        <w:t xml:space="preserve">: </w:t>
-      </w:r>
-      <w:r>
-        <w:rPr>
-          <w:lang w:eastAsia="es-CO"/>
-        </w:rPr>
-        <w:t>e</w:t>
-      </w:r>
-      <w:r>
-        <w:rPr>
-          <w:lang w:eastAsia="es-CO"/>
-        </w:rPr>
-        <w:t>llas son alertas sobre posibles peligros o condiciones especiales en la vía, curvas, zonas escolares o intersecciones.</w:t>
+        <w:t>ellas son alertas sobre posibles peligros o condiciones especiales en la vía, curvas, zonas escolares o intersecciones.</w:t>
       </w:r>
     </w:p>
     <w:p>
@@ -7334,27 +7070,13 @@
           <w:bCs/>
           <w:lang w:eastAsia="es-CO"/>
         </w:rPr>
-        <w:t>Informativas</w:t>
-      </w:r>
-      <w:r>
-        <w:rPr>
-          <w:b/>
-          <w:bCs/>
+        <w:t>Informativas:</w:t>
+      </w:r>
+      <w:r>
+        <w:rPr>
           <w:lang w:eastAsia="es-CO"/>
         </w:rPr>
-        <w:t>:</w:t>
-      </w:r>
-      <w:r>
-        <w:rPr>
-          <w:lang w:eastAsia="es-CO"/>
-        </w:rPr>
-        <w:t xml:space="preserve"> b</w:t>
-      </w:r>
-      <w:r>
-        <w:rPr>
-          <w:lang w:eastAsia="es-CO"/>
-        </w:rPr>
-        <w:t>rindan datos como direcciones, nombres de calles, hospitales, establecimientos de servicios, etc.</w:t>
+        <w:t xml:space="preserve"> brindan datos como direcciones, nombres de calles, hospitales, establecimientos de servicios, etc.</w:t>
       </w:r>
     </w:p>
     <w:p>
@@ -7374,34 +7096,20 @@
           <w:bCs/>
           <w:lang w:eastAsia="es-CO"/>
         </w:rPr>
-        <w:t>Transitorias</w:t>
-      </w:r>
-      <w:r>
-        <w:rPr>
-          <w:b/>
-          <w:bCs/>
+        <w:t>Transitorias:</w:t>
+      </w:r>
+      <w:r>
+        <w:rPr>
           <w:lang w:eastAsia="es-CO"/>
         </w:rPr>
-        <w:t>:</w:t>
-      </w:r>
-      <w:r>
-        <w:rPr>
-          <w:lang w:eastAsia="es-CO"/>
-        </w:rPr>
-        <w:t xml:space="preserve"> s</w:t>
-      </w:r>
-      <w:r>
-        <w:rPr>
-          <w:lang w:eastAsia="es-CO"/>
-        </w:rPr>
-        <w:t xml:space="preserve">on señales temporales que se utilizan en zonas de obras o mantenimiento vial. </w:t>
+        <w:t xml:space="preserve"> son señales temporales que se utilizan en zonas de obras o mantenimiento vial. </w:t>
       </w:r>
     </w:p>
     <w:p>
       <w:pPr>
         <w:pStyle w:val="Ttulo2"/>
       </w:pPr>
-      <w:bookmarkStart w:id="17" w:name="_Toc207661920"/>
+      <w:bookmarkStart w:id="17" w:name="_Toc207960376"/>
       <w:r>
         <w:t>4.1 Principios</w:t>
       </w:r>
@@ -7578,7 +7286,7 @@
       <w:pPr>
         <w:pStyle w:val="Ttulo2"/>
       </w:pPr>
-      <w:bookmarkStart w:id="18" w:name="_Toc207661921"/>
+      <w:bookmarkStart w:id="18" w:name="_Toc207960377"/>
       <w:r>
         <w:t>4.2 Autoridades</w:t>
       </w:r>
@@ -7614,27 +7322,13 @@
           <w:bCs/>
           <w:lang w:val="es-419" w:eastAsia="es-CO"/>
         </w:rPr>
-        <w:t>El Ministerio de Transporte</w:t>
-      </w:r>
-      <w:r>
-        <w:rPr>
-          <w:b/>
-          <w:bCs/>
-          <w:lang w:val="es-419" w:eastAsia="es-CO"/>
-        </w:rPr>
-        <w:t xml:space="preserve">: </w:t>
-      </w:r>
-      <w:r>
-        <w:rPr>
-          <w:lang w:val="es-419" w:eastAsia="es-CO"/>
-        </w:rPr>
-        <w:t>e</w:t>
-      </w:r>
-      <w:r>
-        <w:rPr>
-          <w:lang w:val="es-419" w:eastAsia="es-CO"/>
-        </w:rPr>
-        <w:t>ntidad rectora del tránsito en el país, encargada de formular políticas, reglamentar la normatividad y coordinar el sistema nacional.</w:t>
+        <w:t xml:space="preserve">El Ministerio de Transporte: </w:t>
+      </w:r>
+      <w:r>
+        <w:rPr>
+          <w:lang w:val="es-419" w:eastAsia="es-CO"/>
+        </w:rPr>
+        <w:t>entidad rectora del tránsito en el país, encargada de formular políticas, reglamentar la normatividad y coordinar el sistema nacional.</w:t>
       </w:r>
     </w:p>
     <w:p>
@@ -7654,27 +7348,13 @@
           <w:bCs/>
           <w:lang w:val="es-419" w:eastAsia="es-CO"/>
         </w:rPr>
-        <w:t>Los organismos de tránsito</w:t>
-      </w:r>
-      <w:r>
-        <w:rPr>
-          <w:b/>
-          <w:bCs/>
-          <w:lang w:val="es-419" w:eastAsia="es-CO"/>
-        </w:rPr>
-        <w:t>:</w:t>
-      </w:r>
-      <w:r>
-        <w:rPr>
-          <w:lang w:val="es-419" w:eastAsia="es-CO"/>
-        </w:rPr>
-        <w:t xml:space="preserve"> d</w:t>
-      </w:r>
-      <w:r>
-        <w:rPr>
-          <w:lang w:val="es-419" w:eastAsia="es-CO"/>
-        </w:rPr>
-        <w:t>ependencias municipales, distritales o departamentales responsables del control directo en cada jurisdicción (por ejemplo, Secretaría de Movilidad).</w:t>
+        <w:t>Los organismos de tránsito:</w:t>
+      </w:r>
+      <w:r>
+        <w:rPr>
+          <w:lang w:val="es-419" w:eastAsia="es-CO"/>
+        </w:rPr>
+        <w:t xml:space="preserve"> dependencias municipales, distritales o departamentales responsables del control directo en cada jurisdicción (por ejemplo, Secretaría de Movilidad).</w:t>
       </w:r>
     </w:p>
     <w:p>
@@ -7694,27 +7374,13 @@
           <w:bCs/>
           <w:lang w:val="es-419" w:eastAsia="es-CO"/>
         </w:rPr>
-        <w:t>La Policía Nacional (Dirección de Tránsito y Transporte)</w:t>
-      </w:r>
-      <w:r>
-        <w:rPr>
-          <w:b/>
-          <w:bCs/>
-          <w:lang w:val="es-419" w:eastAsia="es-CO"/>
-        </w:rPr>
-        <w:t>:</w:t>
-      </w:r>
-      <w:r>
-        <w:rPr>
-          <w:lang w:val="es-419" w:eastAsia="es-CO"/>
-        </w:rPr>
-        <w:t xml:space="preserve"> a</w:t>
-      </w:r>
-      <w:r>
-        <w:rPr>
-          <w:lang w:val="es-419" w:eastAsia="es-CO"/>
-        </w:rPr>
-        <w:t>utoridad encargada del control operativo del tránsito en las vías nacionales y en municipios sin organismo propio.</w:t>
+        <w:t>La Policía Nacional (Dirección de Tránsito y Transporte):</w:t>
+      </w:r>
+      <w:r>
+        <w:rPr>
+          <w:lang w:val="es-419" w:eastAsia="es-CO"/>
+        </w:rPr>
+        <w:t xml:space="preserve"> autoridad encargada del control operativo del tránsito en las vías nacionales y en municipios sin organismo propio.</w:t>
       </w:r>
     </w:p>
     <w:p>
@@ -7735,27 +7401,13 @@
           <w:lang w:val="es-419" w:eastAsia="es-CO"/>
         </w:rPr>
         <w:lastRenderedPageBreak/>
-        <w:t>Los alcaldes y gobernadores</w:t>
-      </w:r>
-      <w:r>
-        <w:rPr>
-          <w:b/>
-          <w:bCs/>
-          <w:lang w:val="es-419" w:eastAsia="es-CO"/>
-        </w:rPr>
-        <w:t>:</w:t>
-      </w:r>
-      <w:r>
-        <w:rPr>
-          <w:lang w:val="es-419" w:eastAsia="es-CO"/>
-        </w:rPr>
-        <w:t xml:space="preserve"> c</w:t>
-      </w:r>
-      <w:r>
-        <w:rPr>
-          <w:lang w:val="es-419" w:eastAsia="es-CO"/>
-        </w:rPr>
-        <w:t>omo primeras autoridades en su territorio, pueden establecer medidas de regulación del tránsito local conforme a la ley.</w:t>
+        <w:t>Los alcaldes y gobernadores:</w:t>
+      </w:r>
+      <w:r>
+        <w:rPr>
+          <w:lang w:val="es-419" w:eastAsia="es-CO"/>
+        </w:rPr>
+        <w:t xml:space="preserve"> como primeras autoridades en su territorio, pueden establecer medidas de regulación del tránsito local conforme a la ley.</w:t>
       </w:r>
     </w:p>
     <w:p>
@@ -7775,34 +7427,20 @@
           <w:bCs/>
           <w:lang w:val="es-419" w:eastAsia="es-CO"/>
         </w:rPr>
-        <w:t>Inspectores de tránsito o agentes de tránsito</w:t>
-      </w:r>
-      <w:r>
-        <w:rPr>
-          <w:b/>
-          <w:bCs/>
-          <w:lang w:val="es-419" w:eastAsia="es-CO"/>
-        </w:rPr>
-        <w:t>:</w:t>
-      </w:r>
-      <w:r>
-        <w:rPr>
-          <w:lang w:val="es-419" w:eastAsia="es-CO"/>
-        </w:rPr>
-        <w:t xml:space="preserve"> f</w:t>
-      </w:r>
-      <w:r>
-        <w:rPr>
-          <w:lang w:val="es-419" w:eastAsia="es-CO"/>
-        </w:rPr>
-        <w:t>uncionarios que aplican directamente la normatividad, imponen comparendos y desarrollan labores pedagógicas y preventivas.</w:t>
+        <w:t>Inspectores de tránsito o agentes de tránsito:</w:t>
+      </w:r>
+      <w:r>
+        <w:rPr>
+          <w:lang w:val="es-419" w:eastAsia="es-CO"/>
+        </w:rPr>
+        <w:t xml:space="preserve"> funcionarios que aplican directamente la normatividad, imponen comparendos y desarrollan labores pedagógicas y preventivas.</w:t>
       </w:r>
     </w:p>
     <w:p>
       <w:pPr>
         <w:pStyle w:val="Ttulo2"/>
       </w:pPr>
-      <w:bookmarkStart w:id="19" w:name="_Toc207661922"/>
+      <w:bookmarkStart w:id="19" w:name="_Toc207960378"/>
       <w:r>
         <w:t>4.3 Registro de información</w:t>
       </w:r>
@@ -7851,7 +7489,7 @@
       <w:pPr>
         <w:pStyle w:val="Ttulo2"/>
       </w:pPr>
-      <w:bookmarkStart w:id="20" w:name="_Toc207661923"/>
+      <w:bookmarkStart w:id="20" w:name="_Toc207960379"/>
       <w:r>
         <w:t>4.4 Licencias</w:t>
       </w:r>
@@ -7874,7 +7512,7 @@
       <w:pPr>
         <w:pStyle w:val="Ttulo2"/>
       </w:pPr>
-      <w:bookmarkStart w:id="21" w:name="_Toc207661924"/>
+      <w:bookmarkStart w:id="21" w:name="_Toc207960380"/>
       <w:r>
         <w:lastRenderedPageBreak/>
         <w:t>4.5 Condiciones del vehículo</w:t>
@@ -9013,6 +8651,10 @@
     <w:p>
       <w:pPr>
         <w:pStyle w:val="Figura"/>
+        <w:rPr>
+          <w:b w:val="0"/>
+          <w:bCs w:val="0"/>
+        </w:rPr>
       </w:pPr>
       <w:r>
         <w:lastRenderedPageBreak/>
@@ -9051,10 +8693,10 @@
           <w:lang w:val="es-419" w:eastAsia="es-CO"/>
         </w:rPr>
         <w:drawing>
-          <wp:inline distT="0" distB="0" distL="0" distR="0" wp14:anchorId="651E1CD7" wp14:editId="7C184DD3">
-            <wp:extent cx="5135945" cy="2690037"/>
-            <wp:effectExtent l="0" t="0" r="0" b="2540"/>
-            <wp:docPr id="663637938" name="Imagen 1" descr="En la figura 2 se muestra un diagrama de la estructura la normativa vial y sus diferentes componentes a saber:&#10;Licencias y condiciones del vehículo:  documentos que acreditan la operación segura del vehículo.Registro de información de conductores: base de datos de conductores, vehículos y licencias. Autoridades: organismos encargados de regular y hacer cumplir las normas de transito.Código de tránsito y transporte: regula la movilidad en as vías públicas para garantizar la seguridad y eficiencia.Principios del código de tránsito: guía la seguridad vial, la protección de la vida y la convivencia ciudadana."/>
+          <wp:inline distT="0" distB="0" distL="0" distR="0" wp14:anchorId="28643F92" wp14:editId="5DB8594D">
+            <wp:extent cx="5580549" cy="2922905"/>
+            <wp:effectExtent l="0" t="0" r="0" b="0"/>
+            <wp:docPr id="835985186" name="Imagen 1" descr="En la figura 2 se muestra un diagrama de la estructura la normativa vial y sus diferentes componentes a saber:&#10;Licencias y condiciones del vehículo:  documentos que acreditan la operación segura del vehículo.&#10;Registro de información de conductores: base de datos de conductores, vehículos y licencias. &#10;Autoridades: organismos encargados de regular y hacer cumplir las normas de transito.&#10;Código de tránsito y transporte: regula la movilidad en as vías públicas para garantizar la seguridad y eficiencia.&#10;Principios del código de tránsito: guía la seguridad vial, la protección de la vida y la convivencia ciudadana."/>
             <wp:cNvGraphicFramePr>
               <a:graphicFrameLocks xmlns:a="http://schemas.openxmlformats.org/drawingml/2006/main" noChangeAspect="1"/>
             </wp:cNvGraphicFramePr>
@@ -9062,11 +8704,11 @@
               <a:graphicData uri="http://schemas.openxmlformats.org/drawingml/2006/picture">
                 <pic:pic xmlns:pic="http://schemas.openxmlformats.org/drawingml/2006/picture">
                   <pic:nvPicPr>
-                    <pic:cNvPr id="663637938" name="Imagen 1" descr="En la figura 2 se muestra un diagrama de la estructura la normativa vial y sus diferentes componentes a saber:&#10;Licencias y condiciones del vehículo:  documentos que acreditan la operación segura del vehículo.Registro de información de conductores: base de datos de conductores, vehículos y licencias. Autoridades: organismos encargados de regular y hacer cumplir las normas de transito.Código de tránsito y transporte: regula la movilidad en as vías públicas para garantizar la seguridad y eficiencia.Principios del código de tránsito: guía la seguridad vial, la protección de la vida y la convivencia ciudadana."/>
+                    <pic:cNvPr id="835985186" name="Imagen 1" descr="En la figura 2 se muestra un diagrama de la estructura la normativa vial y sus diferentes componentes a saber:&#10;Licencias y condiciones del vehículo:  documentos que acreditan la operación segura del vehículo.&#10;Registro de información de conductores: base de datos de conductores, vehículos y licencias. &#10;Autoridades: organismos encargados de regular y hacer cumplir las normas de transito.&#10;Código de tránsito y transporte: regula la movilidad en as vías públicas para garantizar la seguridad y eficiencia.&#10;Principios del código de tránsito: guía la seguridad vial, la protección de la vida y la convivencia ciudadana."/>
                     <pic:cNvPicPr/>
                   </pic:nvPicPr>
                   <pic:blipFill>
-                    <a:blip r:embed="rId17"/>
+                    <a:blip r:embed="rId18"/>
                     <a:stretch>
                       <a:fillRect/>
                     </a:stretch>
@@ -9074,7 +8716,7 @@
                   <pic:spPr>
                     <a:xfrm>
                       <a:off x="0" y="0"/>
-                      <a:ext cx="5199227" cy="2723182"/>
+                      <a:ext cx="5598426" cy="2932268"/>
                     </a:xfrm>
                     <a:prstGeom prst="rect">
                       <a:avLst/>
@@ -9095,26 +8737,6 @@
       </w:pPr>
       <w:r>
         <w:rPr>
-          <w:highlight w:val="yellow"/>
-          <w:lang w:val="es-419" w:eastAsia="es-CO"/>
-        </w:rPr>
-        <w:t>CAMBIAR IMAGEN</w:t>
-      </w:r>
-      <w:r>
-        <w:rPr>
-          <w:lang w:val="es-419" w:eastAsia="es-CO"/>
-        </w:rPr>
-        <w:t xml:space="preserve"> </w:t>
-      </w:r>
-    </w:p>
-    <w:p>
-      <w:pPr>
-        <w:rPr>
-          <w:lang w:val="es-419" w:eastAsia="es-CO"/>
-        </w:rPr>
-      </w:pPr>
-      <w:r>
-        <w:rPr>
           <w:lang w:val="es-419" w:eastAsia="es-CO"/>
         </w:rPr>
         <w:t xml:space="preserve">En la figura </w:t>
@@ -9358,7 +8980,7 @@
       <w:pPr>
         <w:pStyle w:val="Ttulo2"/>
       </w:pPr>
-      <w:bookmarkStart w:id="22" w:name="_Toc207661925"/>
+      <w:bookmarkStart w:id="22" w:name="_Toc207960381"/>
       <w:r>
         <w:lastRenderedPageBreak/>
         <w:t>4.6 Seguros y responsabilidades del vehículo</w:t>
@@ -10259,7 +9881,7 @@
       <w:pPr>
         <w:pStyle w:val="Ttulo1"/>
       </w:pPr>
-      <w:bookmarkStart w:id="23" w:name="_Toc207661926"/>
+      <w:bookmarkStart w:id="23" w:name="_Toc207960382"/>
       <w:r>
         <w:lastRenderedPageBreak/>
         <w:t>Estatutos nacionales de transporte</w:t>
@@ -10350,7 +9972,7 @@
       <w:pPr>
         <w:pStyle w:val="Ttulo2"/>
       </w:pPr>
-      <w:bookmarkStart w:id="24" w:name="_Toc207661927"/>
+      <w:bookmarkStart w:id="24" w:name="_Toc207960383"/>
       <w:r>
         <w:t>5.1 Normas según transporte</w:t>
       </w:r>
@@ -11155,44 +10777,89 @@
       <w:pPr>
         <w:pStyle w:val="Ttulo2"/>
       </w:pPr>
-      <w:bookmarkStart w:id="25" w:name="_Toc207661928"/>
+      <w:bookmarkStart w:id="25" w:name="_Toc207960384"/>
       <w:r>
         <w:t>5.2 Límite de velocidad</w:t>
       </w:r>
       <w:bookmarkEnd w:id="25"/>
     </w:p>
     <w:p>
-      <w:r>
-        <w:t>•</w:t>
-      </w:r>
-      <w:r>
-        <w:tab/>
-        <w:t>Vías urbanas: máx. 60 km/h</w:t>
-      </w:r>
-      <w:r>
-        <w:t>.</w:t>
+      <w:pPr>
+        <w:pStyle w:val="Prrafodelista"/>
+        <w:numPr>
+          <w:ilvl w:val="0"/>
+          <w:numId w:val="223"/>
+        </w:numPr>
+        <w:rPr>
+          <w:lang w:val="es-419" w:eastAsia="es-CO"/>
+        </w:rPr>
+      </w:pPr>
+      <w:r>
+        <w:rPr>
+          <w:b/>
+          <w:bCs/>
+          <w:lang w:val="es-419" w:eastAsia="es-CO"/>
+        </w:rPr>
+        <w:t>Vías urbanas</w:t>
+      </w:r>
+      <w:r>
+        <w:rPr>
+          <w:lang w:val="es-419" w:eastAsia="es-CO"/>
+        </w:rPr>
+        <w:t>: máx. 60 km/h.</w:t>
       </w:r>
     </w:p>
     <w:p>
-      <w:r>
-        <w:lastRenderedPageBreak/>
-        <w:t>•</w:t>
-      </w:r>
-      <w:r>
-        <w:tab/>
-        <w:t>Zonas escolares y residenciales: máx. 30 km/h</w:t>
-      </w:r>
-      <w:r>
-        <w:t>.</w:t>
+      <w:pPr>
+        <w:pStyle w:val="Prrafodelista"/>
+        <w:numPr>
+          <w:ilvl w:val="0"/>
+          <w:numId w:val="223"/>
+        </w:numPr>
+        <w:rPr>
+          <w:lang w:val="es-419" w:eastAsia="es-CO"/>
+        </w:rPr>
+      </w:pPr>
+      <w:r>
+        <w:rPr>
+          <w:b/>
+          <w:bCs/>
+          <w:lang w:val="es-419" w:eastAsia="es-CO"/>
+        </w:rPr>
+        <w:t>Zonas escolares y residenciales</w:t>
+      </w:r>
+      <w:r>
+        <w:rPr>
+          <w:lang w:val="es-419" w:eastAsia="es-CO"/>
+        </w:rPr>
+        <w:t>: máx. 30 km/h.</w:t>
       </w:r>
     </w:p>
     <w:p>
-      <w:r>
-        <w:t>•</w:t>
-      </w:r>
-      <w:r>
-        <w:tab/>
-        <w:t>Carreteras nacionales: máx. 80-100 km/h Estos pueden modificarse según señalización oficial.</w:t>
+      <w:pPr>
+        <w:pStyle w:val="Prrafodelista"/>
+        <w:numPr>
+          <w:ilvl w:val="0"/>
+          <w:numId w:val="223"/>
+        </w:numPr>
+        <w:rPr>
+          <w:lang w:val="es-419" w:eastAsia="es-CO"/>
+        </w:rPr>
+      </w:pPr>
+      <w:r>
+        <w:rPr>
+          <w:b/>
+          <w:bCs/>
+          <w:lang w:val="es-419" w:eastAsia="es-CO"/>
+        </w:rPr>
+        <w:lastRenderedPageBreak/>
+        <w:t>Carreteras nacionales</w:t>
+      </w:r>
+      <w:r>
+        <w:rPr>
+          <w:lang w:val="es-419" w:eastAsia="es-CO"/>
+        </w:rPr>
+        <w:t>: máx. 80-100 km/h Estos pueden modificarse según señalización oficial.</w:t>
       </w:r>
     </w:p>
     <w:p>
@@ -11207,7 +10874,7 @@
       <w:pPr>
         <w:pStyle w:val="Ttulo2"/>
       </w:pPr>
-      <w:bookmarkStart w:id="26" w:name="_Toc207661929"/>
+      <w:bookmarkStart w:id="26" w:name="_Toc207960385"/>
       <w:r>
         <w:t>5.3 Tipos de infracción</w:t>
       </w:r>
@@ -11261,7 +10928,7 @@
       <w:pPr>
         <w:pStyle w:val="Ttulo2"/>
       </w:pPr>
-      <w:bookmarkStart w:id="27" w:name="_Toc207661930"/>
+      <w:bookmarkStart w:id="27" w:name="_Toc207960386"/>
       <w:r>
         <w:t>5.4 Sanciones</w:t>
       </w:r>
@@ -11282,17 +10949,33 @@
     </w:p>
     <w:p>
       <w:pPr>
-        <w:rPr>
-          <w:lang w:val="es-419" w:eastAsia="es-CO"/>
-        </w:rPr>
-      </w:pPr>
+        <w:spacing w:before="0" w:after="160" w:line="259" w:lineRule="auto"/>
+        <w:ind w:firstLine="0"/>
+        <w:rPr>
+          <w:lang w:val="es-419" w:eastAsia="es-CO"/>
+        </w:rPr>
+      </w:pPr>
+      <w:r>
+        <w:rPr>
+          <w:lang w:val="es-419" w:eastAsia="es-CO"/>
+        </w:rPr>
+        <w:br w:type="page"/>
+      </w:r>
     </w:p>
     <w:p>
       <w:pPr>
-        <w:rPr>
-          <w:lang w:val="es-419" w:eastAsia="es-CO"/>
-        </w:rPr>
-      </w:pPr>
+        <w:pStyle w:val="Video"/>
+        <w:rPr>
+          <w:lang w:val="es-419" w:eastAsia="es-CO"/>
+        </w:rPr>
+      </w:pPr>
+      <w:r>
+        <w:rPr>
+          <w:lang w:val="es-419" w:eastAsia="es-CO"/>
+        </w:rPr>
+        <w:lastRenderedPageBreak/>
+        <w:t>Tránsito y seguridad vial</w:t>
+      </w:r>
     </w:p>
     <w:p>
       <w:pPr>
@@ -11300,30 +10983,9 @@
           <w:lang w:val="es-419" w:eastAsia="es-CO"/>
         </w:rPr>
       </w:pPr>
-    </w:p>
-    <w:p>
-      <w:pPr>
-        <w:pStyle w:val="Video"/>
-        <w:rPr>
-          <w:lang w:val="es-419" w:eastAsia="es-CO"/>
-        </w:rPr>
-      </w:pPr>
-      <w:r>
-        <w:rPr>
-          <w:lang w:val="es-419" w:eastAsia="es-CO"/>
-        </w:rPr>
-        <w:lastRenderedPageBreak/>
-        <w:t>Tránsito y seguridad vial</w:t>
-      </w:r>
-    </w:p>
-    <w:p>
-      <w:pPr>
-        <w:rPr>
-          <w:lang w:val="es-419" w:eastAsia="es-CO"/>
-        </w:rPr>
-      </w:pPr>
-      <w:r>
-        <w:rPr>
+      <w:r>
+        <w:rPr>
+          <w:noProof/>
           <w:lang w:val="es-419" w:eastAsia="es-CO"/>
         </w:rPr>
         <w:drawing>
@@ -11354,7 +11016,7 @@
                     <pic:cNvPicPr/>
                   </pic:nvPicPr>
                   <pic:blipFill>
-                    <a:blip r:embed="rId18"/>
+                    <a:blip r:embed="rId19"/>
                     <a:stretch>
                       <a:fillRect/>
                     </a:stretch>
@@ -11384,7 +11046,7 @@
           <w:lang w:val="es-419" w:eastAsia="es-CO"/>
         </w:rPr>
       </w:pPr>
-      <w:hyperlink r:id="rId19" w:history="1">
+      <w:hyperlink r:id="rId20" w:history="1">
         <w:r>
           <w:rPr>
             <w:rStyle w:val="Hipervnculo"/>
@@ -11580,7 +11242,7 @@
       <w:pPr>
         <w:pStyle w:val="Titulosgenerales"/>
       </w:pPr>
-      <w:bookmarkStart w:id="28" w:name="_Toc207661931"/>
+      <w:bookmarkStart w:id="28" w:name="_Toc207960387"/>
       <w:r>
         <w:lastRenderedPageBreak/>
         <w:t>Síntesis</w:t>
@@ -11655,7 +11317,7 @@
                     <pic:cNvPicPr/>
                   </pic:nvPicPr>
                   <pic:blipFill>
-                    <a:blip r:embed="rId20"/>
+                    <a:blip r:embed="rId21"/>
                     <a:stretch>
                       <a:fillRect/>
                     </a:stretch>
@@ -11688,7 +11350,7 @@
       <w:pPr>
         <w:pStyle w:val="Titulosgenerales"/>
       </w:pPr>
-      <w:bookmarkStart w:id="29" w:name="_Toc207661932"/>
+      <w:bookmarkStart w:id="29" w:name="_Toc207960388"/>
       <w:r>
         <w:lastRenderedPageBreak/>
         <w:t>Glosario</w:t>
@@ -12091,7 +11753,23 @@
           <w:szCs w:val="28"/>
           <w:lang w:val="es-419"/>
         </w:rPr>
-        <w:t>el INVÍAS (Instituto Nacional de Vías) es una entidad pública del orden nacional, adscrita al Ministerio de Transporte de Colombia, encargada de planificar, construir, conservar y administrar la infraestructura vial no concesionada del país, especialmente las vías terciarias, secundarias y algunas troncales nacionales.</w:t>
+        <w:t>el INV</w:t>
+      </w:r>
+      <w:r>
+        <w:rPr>
+          <w:rFonts w:ascii="Calibri" w:hAnsi="Calibri" w:cs="Calibri"/>
+          <w:szCs w:val="28"/>
+          <w:lang w:val="es-419"/>
+        </w:rPr>
+        <w:t>I</w:t>
+      </w:r>
+      <w:r>
+        <w:rPr>
+          <w:rFonts w:ascii="Calibri" w:hAnsi="Calibri" w:cs="Calibri"/>
+          <w:szCs w:val="28"/>
+          <w:lang w:val="es-419"/>
+        </w:rPr>
+        <w:t>AS (Instituto Nacional de Vías) es una entidad pública del orden nacional, adscrita al Ministerio de Transporte de Colombia, encargada de planificar, construir, conservar y administrar la infraestructura vial no concesionada del país, especialmente las vías terciarias, secundarias y algunas troncales nacionales.</w:t>
       </w:r>
     </w:p>
     <w:p>
@@ -12299,7 +11977,7 @@
       <w:pPr>
         <w:pStyle w:val="Titulosgenerales"/>
       </w:pPr>
-      <w:bookmarkStart w:id="30" w:name="_Toc207661933"/>
+      <w:bookmarkStart w:id="30" w:name="_Toc207960389"/>
       <w:r>
         <w:lastRenderedPageBreak/>
         <w:t>Material complementario</w:t>
@@ -12463,7 +12141,7 @@
               </w:rPr>
               <w:t xml:space="preserve">Álvarez, J. L. (s.f.). Carreteras inteligentes: Qué son y cómo funcionan [Video]. Tuteorica.com. </w:t>
             </w:r>
-            <w:hyperlink r:id="rId21" w:tgtFrame="_new" w:history="1">
+            <w:hyperlink r:id="rId22" w:tgtFrame="_new" w:history="1">
               <w:r>
                 <w:rPr>
                   <w:rStyle w:val="Hipervnculo"/>
@@ -12520,7 +12198,7 @@
                 <w:szCs w:val="28"/>
               </w:rPr>
             </w:pPr>
-            <w:hyperlink r:id="rId22">
+            <w:hyperlink r:id="rId23">
               <w:r>
                 <w:rPr>
                   <w:rStyle w:val="Hipervnculo"/>
@@ -12615,7 +12293,7 @@
                 <w:lang w:val="es-419" w:eastAsia="es-CO"/>
               </w:rPr>
             </w:pPr>
-            <w:hyperlink r:id="rId23" w:history="1">
+            <w:hyperlink r:id="rId24" w:history="1">
               <w:r>
                 <w:rPr>
                   <w:rStyle w:val="Hipervnculo"/>
@@ -12730,7 +12408,7 @@
                 <w:lang w:val="es-419" w:eastAsia="es-CO"/>
               </w:rPr>
             </w:pPr>
-            <w:hyperlink r:id="rId24" w:history="1">
+            <w:hyperlink r:id="rId25" w:history="1">
               <w:r>
                 <w:rPr>
                   <w:rStyle w:val="Hipervnculo"/>
@@ -12764,7 +12442,7 @@
       <w:pPr>
         <w:pStyle w:val="Titulosgenerales"/>
       </w:pPr>
-      <w:bookmarkStart w:id="31" w:name="_Toc207661934"/>
+      <w:bookmarkStart w:id="31" w:name="_Toc207960390"/>
       <w:r>
         <w:lastRenderedPageBreak/>
         <w:t>Referencias bibliográficas</w:t>
@@ -12875,9 +12553,55 @@
       <w:r>
         <w:rPr>
           <w:rStyle w:val="Extranjerismo"/>
+          <w:lang w:val="es-CO" w:eastAsia="es-CO"/>
+        </w:rPr>
+        <w:t xml:space="preserve">). </w:t>
+      </w:r>
+      <w:r>
+        <w:rPr>
+          <w:rStyle w:val="Extranjerismo"/>
           <w:lang w:eastAsia="es-CO"/>
         </w:rPr>
-        <w:t>). The Transportation Experience: Policy, Planning, and Deployment. Oxford University Press.</w:t>
+        <w:t xml:space="preserve">The Transportation Experience: Policy, Planning, and Deployment. </w:t>
+      </w:r>
+      <w:r>
+        <w:rPr>
+          <w:rStyle w:val="Extranjerismo"/>
+          <w:lang w:val="es-CO" w:eastAsia="es-CO"/>
+        </w:rPr>
+        <w:t xml:space="preserve">Oxford </w:t>
+      </w:r>
+      <w:proofErr w:type="spellStart"/>
+      <w:r>
+        <w:rPr>
+          <w:rStyle w:val="Extranjerismo"/>
+          <w:lang w:val="es-CO" w:eastAsia="es-CO"/>
+        </w:rPr>
+        <w:t>University</w:t>
+      </w:r>
+      <w:proofErr w:type="spellEnd"/>
+      <w:r>
+        <w:rPr>
+          <w:rStyle w:val="Extranjerismo"/>
+          <w:lang w:val="es-CO" w:eastAsia="es-CO"/>
+        </w:rPr>
+        <w:t xml:space="preserve"> </w:t>
+      </w:r>
+      <w:proofErr w:type="spellStart"/>
+      <w:r>
+        <w:rPr>
+          <w:rStyle w:val="Extranjerismo"/>
+          <w:lang w:val="es-CO" w:eastAsia="es-CO"/>
+        </w:rPr>
+        <w:t>Press</w:t>
+      </w:r>
+      <w:proofErr w:type="spellEnd"/>
+      <w:r>
+        <w:rPr>
+          <w:rStyle w:val="Extranjerismo"/>
+          <w:lang w:val="es-CO" w:eastAsia="es-CO"/>
+        </w:rPr>
+        <w:t>.</w:t>
       </w:r>
     </w:p>
     <w:p>
@@ -12924,7 +12648,7 @@
         </w:rPr>
         <w:t xml:space="preserve">ONU. (2020). Plan Mundial para el Decenio de Acción para la Seguridad Vial 2021-2030. </w:t>
       </w:r>
-      <w:hyperlink r:id="rId25" w:history="1">
+      <w:hyperlink r:id="rId26" w:history="1">
         <w:r>
           <w:rPr>
             <w:rStyle w:val="Hipervnculo"/>
@@ -12970,23 +12694,21 @@
           <w:color w:val="000000" w:themeColor="text1"/>
           <w:lang w:eastAsia="es-CO"/>
         </w:rPr>
-        <w:t xml:space="preserve">Organización Panamericana de la Salud. (2020). Seguridad vial: herramientas para la prevención de lesiones por tránsito en América </w:t>
-      </w:r>
-      <w:proofErr w:type="spellStart"/>
+        <w:t>Organización Panamericana de la Salud. (2020). Seguridad vial: herramientas para la prevención de lesiones por tránsito en América Latina.</w:t>
+      </w:r>
       <w:r>
         <w:rPr>
           <w:color w:val="000000" w:themeColor="text1"/>
           <w:lang w:eastAsia="es-CO"/>
         </w:rPr>
-        <w:t>Latina.https</w:t>
-      </w:r>
-      <w:proofErr w:type="spellEnd"/>
+        <w:t xml:space="preserve"> </w:t>
+      </w:r>
       <w:r>
         <w:rPr>
           <w:color w:val="000000" w:themeColor="text1"/>
           <w:lang w:eastAsia="es-CO"/>
         </w:rPr>
-        <w:t>://www.paho.org.</w:t>
+        <w:t>https://www.paho.org.</w:t>
       </w:r>
     </w:p>
     <w:p>
@@ -13084,14 +12806,35 @@
           <w:color w:val="000000" w:themeColor="text1"/>
           <w:lang w:val="en-US" w:eastAsia="es-CO"/>
         </w:rPr>
-        <w:t>Rodriguez, J.-P. (2020</w:t>
+        <w:t>Rodr</w:t>
+      </w:r>
+      <w:r>
+        <w:rPr>
+          <w:color w:val="000000" w:themeColor="text1"/>
+          <w:lang w:val="en-US" w:eastAsia="es-CO"/>
+        </w:rPr>
+        <w:t>í</w:t>
+      </w:r>
+      <w:r>
+        <w:rPr>
+          <w:color w:val="000000" w:themeColor="text1"/>
+          <w:lang w:val="en-US" w:eastAsia="es-CO"/>
+        </w:rPr>
+        <w:t>guez, J.-P. (2020</w:t>
       </w:r>
       <w:r>
         <w:rPr>
           <w:rStyle w:val="Extranjerismo"/>
           <w:lang w:eastAsia="es-CO"/>
         </w:rPr>
-        <w:t>). The Geography of Transport Systems (5th ed.). Routledge</w:t>
+        <w:t xml:space="preserve">). The Geography of Transport Systems (5th ed.). </w:t>
+      </w:r>
+      <w:r>
+        <w:rPr>
+          <w:rStyle w:val="Extranjerismo"/>
+          <w:lang w:val="es-CO" w:eastAsia="es-CO"/>
+        </w:rPr>
+        <w:t>Routledge</w:t>
       </w:r>
       <w:r>
         <w:rPr>
@@ -13105,7 +12848,7 @@
       <w:pPr>
         <w:rPr>
           <w:color w:val="000000" w:themeColor="text1"/>
-          <w:lang w:eastAsia="es-CO"/>
+          <w:lang w:val="en-US" w:eastAsia="es-CO"/>
         </w:rPr>
       </w:pPr>
       <w:r>
@@ -13113,7 +12856,30 @@
           <w:color w:val="000000" w:themeColor="text1"/>
           <w:lang w:eastAsia="es-CO"/>
         </w:rPr>
-        <w:t>Sánchez, R. (2019). Movilidad urbana sostenible: Conceptos, planificación y gestión. Editorial Reverté.</w:t>
+        <w:t xml:space="preserve">Sánchez, R. (2019). Movilidad urbana sostenible: Conceptos, planificación y gestión. </w:t>
+      </w:r>
+      <w:r>
+        <w:rPr>
+          <w:color w:val="000000" w:themeColor="text1"/>
+          <w:lang w:val="en-US" w:eastAsia="es-CO"/>
+        </w:rPr>
+        <w:t xml:space="preserve">Editorial </w:t>
+      </w:r>
+      <w:proofErr w:type="spellStart"/>
+      <w:r>
+        <w:rPr>
+          <w:color w:val="000000" w:themeColor="text1"/>
+          <w:lang w:val="en-US" w:eastAsia="es-CO"/>
+        </w:rPr>
+        <w:t>Reverté</w:t>
+      </w:r>
+      <w:proofErr w:type="spellEnd"/>
+      <w:r>
+        <w:rPr>
+          <w:color w:val="000000" w:themeColor="text1"/>
+          <w:lang w:val="en-US" w:eastAsia="es-CO"/>
+        </w:rPr>
+        <w:t>.</w:t>
       </w:r>
     </w:p>
     <w:p>
@@ -13134,7 +12900,7 @@
       <w:pPr>
         <w:pStyle w:val="Titulosgenerales"/>
       </w:pPr>
-      <w:bookmarkStart w:id="32" w:name="_Toc207661935"/>
+      <w:bookmarkStart w:id="32" w:name="_Toc207960391"/>
       <w:r>
         <w:lastRenderedPageBreak/>
         <w:t>C</w:t>
@@ -13464,7 +13230,21 @@
                 <w:sz w:val="28"/>
                 <w:szCs w:val="28"/>
               </w:rPr>
-              <w:t>Yasmin Andreina Maldonado Escobar</w:t>
+              <w:t>Yasm</w:t>
+            </w:r>
+            <w:r>
+              <w:rPr>
+                <w:sz w:val="28"/>
+                <w:szCs w:val="28"/>
+              </w:rPr>
+              <w:t>í</w:t>
+            </w:r>
+            <w:r>
+              <w:rPr>
+                <w:sz w:val="28"/>
+                <w:szCs w:val="28"/>
+              </w:rPr>
+              <w:t>n Andreina Maldonado Escobar</w:t>
             </w:r>
           </w:p>
         </w:tc>
@@ -14042,7 +13822,23 @@
                 <w:sz w:val="28"/>
                 <w:szCs w:val="28"/>
               </w:rPr>
-              <w:t>Jonathan Adie Villafañe</w:t>
+              <w:t>Jonathan Adi</w:t>
+            </w:r>
+            <w:r>
+              <w:rPr>
+                <w:rFonts w:cs="Calibri"/>
+                <w:sz w:val="28"/>
+                <w:szCs w:val="28"/>
+              </w:rPr>
+              <w:t>é</w:t>
+            </w:r>
+            <w:r>
+              <w:rPr>
+                <w:rFonts w:cs="Calibri"/>
+                <w:sz w:val="28"/>
+                <w:szCs w:val="28"/>
+              </w:rPr>
+              <w:t xml:space="preserve"> Villafañe</w:t>
             </w:r>
           </w:p>
         </w:tc>
@@ -14181,8 +13977,8 @@
       </w:pPr>
     </w:p>
     <w:sectPr>
-      <w:headerReference w:type="default" r:id="rId26"/>
-      <w:footerReference w:type="default" r:id="rId27"/>
+      <w:headerReference w:type="default" r:id="rId27"/>
+      <w:footerReference w:type="default" r:id="rId28"/>
       <w:pgSz w:w="12240" w:h="15840"/>
       <w:pgMar w:top="1701" w:right="1134" w:bottom="1134" w:left="1134" w:header="709" w:footer="737" w:gutter="0"/>
       <w:pgNumType w:start="1"/>
@@ -40610,6 +40406,7 @@
   <w:style w:type="character" w:default="1" w:styleId="Fuentedeprrafopredeter">
     <w:name w:val="Default Paragraph Font"/>
     <w:uiPriority w:val="1"/>
+    <w:semiHidden/>
     <w:unhideWhenUsed/>
   </w:style>
   <w:style w:type="table" w:default="1" w:styleId="Tablanormal">
@@ -41763,30 +41560,35 @@
 </file>
 
 <file path=customXml/item1.xml><?xml version="1.0" encoding="utf-8"?>
-<ct:contentTypeSchema xmlns:ct="http://schemas.microsoft.com/office/2006/metadata/contentType" xmlns:ma="http://schemas.microsoft.com/office/2006/metadata/properties/metaAttributes" ct:_="" ma:_="" ma:contentTypeName="Documento" ma:contentTypeID="0x01010049282E1EDBE9234EA9E6D38F720E265F" ma:contentTypeVersion="15" ma:contentTypeDescription="Crear nuevo documento." ma:contentTypeScope="" ma:versionID="b31c7aa9eaf043a08b87120b3c4916e3">
-  <xsd:schema xmlns:xsd="http://www.w3.org/2001/XMLSchema" xmlns:xs="http://www.w3.org/2001/XMLSchema" xmlns:p="http://schemas.microsoft.com/office/2006/metadata/properties" xmlns:ns2="cb45339b-ced9-4d0d-8f64-77573914d53b" xmlns:ns3="43a3ca16-9c26-4813-b83f-4aec9927b43f" targetNamespace="http://schemas.microsoft.com/office/2006/metadata/properties" ma:root="true" ma:fieldsID="3533d065b04d75c457075bc55f1f5315" ns2:_="" ns3:_="">
-    <xsd:import namespace="cb45339b-ced9-4d0d-8f64-77573914d53b"/>
-    <xsd:import namespace="43a3ca16-9c26-4813-b83f-4aec9927b43f"/>
+<?mso-contentType ?>
+<FormTemplates xmlns="http://schemas.microsoft.com/sharepoint/v3/contenttype/forms">
+  <Display>DocumentLibraryForm</Display>
+  <Edit>DocumentLibraryForm</Edit>
+  <New>DocumentLibraryForm</New>
+</FormTemplates>
+</file>
+
+<file path=customXml/item2.xml><?xml version="1.0" encoding="utf-8"?>
+<ct:contentTypeSchema xmlns:ct="http://schemas.microsoft.com/office/2006/metadata/contentType" xmlns:ma="http://schemas.microsoft.com/office/2006/metadata/properties/metaAttributes" ct:_="" ma:_="" ma:contentTypeName="Documento" ma:contentTypeID="0x010100FC2B1768DD5A774EB396CCAB0DE361C1" ma:contentTypeVersion="11" ma:contentTypeDescription="Crear nuevo documento." ma:contentTypeScope="" ma:versionID="e4c9e5a511fbaffd8485e537f9595e10">
+  <xsd:schema xmlns:xsd="http://www.w3.org/2001/XMLSchema" xmlns:xs="http://www.w3.org/2001/XMLSchema" xmlns:p="http://schemas.microsoft.com/office/2006/metadata/properties" xmlns:ns2="a70d3c18-0869-45a1-9f75-4b4b8f0f32be" xmlns:ns3="adccf511-daff-4bcb-9072-914cedbf4c7e" targetNamespace="http://schemas.microsoft.com/office/2006/metadata/properties" ma:root="true" ma:fieldsID="bbeeb7fdd5dcda06cd18867ba2c601ed" ns2:_="" ns3:_="">
+    <xsd:import namespace="a70d3c18-0869-45a1-9f75-4b4b8f0f32be"/>
+    <xsd:import namespace="adccf511-daff-4bcb-9072-914cedbf4c7e"/>
     <xsd:element name="properties">
       <xsd:complexType>
         <xsd:sequence>
           <xsd:element name="documentManagement">
             <xsd:complexType>
               <xsd:all>
-                <xsd:element ref="ns2:SharedWithUsers" minOccurs="0"/>
-                <xsd:element ref="ns2:SharedWithDetails" minOccurs="0"/>
-                <xsd:element ref="ns3:MediaServiceMetadata" minOccurs="0"/>
-                <xsd:element ref="ns3:MediaServiceFastMetadata" minOccurs="0"/>
-                <xsd:element ref="ns3:MediaServiceDateTaken" minOccurs="0"/>
-                <xsd:element ref="ns3:MediaServiceObjectDetectorVersions" minOccurs="0"/>
-                <xsd:element ref="ns3:MediaLengthInSeconds" minOccurs="0"/>
-                <xsd:element ref="ns3:MediaServiceLocation" minOccurs="0"/>
-                <xsd:element ref="ns3:MediaServiceGenerationTime" minOccurs="0"/>
-                <xsd:element ref="ns3:MediaServiceEventHashCode" minOccurs="0"/>
-                <xsd:element ref="ns3:lcf76f155ced4ddcb4097134ff3c332f" minOccurs="0"/>
-                <xsd:element ref="ns2:TaxCatchAll" minOccurs="0"/>
-                <xsd:element ref="ns3:MediaServiceOCR" minOccurs="0"/>
-                <xsd:element ref="ns3:MediaServiceSearchProperties" minOccurs="0"/>
+                <xsd:element ref="ns2:MediaServiceMetadata" minOccurs="0"/>
+                <xsd:element ref="ns2:MediaServiceFastMetadata" minOccurs="0"/>
+                <xsd:element ref="ns2:MediaServiceSearchProperties" minOccurs="0"/>
+                <xsd:element ref="ns2:MediaServiceDateTaken" minOccurs="0"/>
+                <xsd:element ref="ns2:MediaServiceGenerationTime" minOccurs="0"/>
+                <xsd:element ref="ns2:MediaServiceEventHashCode" minOccurs="0"/>
+                <xsd:element ref="ns2:MediaLengthInSeconds" minOccurs="0"/>
+                <xsd:element ref="ns2:lcf76f155ced4ddcb4097134ff3c332f" minOccurs="0"/>
+                <xsd:element ref="ns3:TaxCatchAll" minOccurs="0"/>
+                <xsd:element ref="ns2:MediaServiceOCR" minOccurs="0"/>
               </xsd:all>
             </xsd:complexType>
           </xsd:element>
@@ -41794,36 +41596,63 @@
       </xsd:complexType>
     </xsd:element>
   </xsd:schema>
-  <xsd:schema xmlns:xsd="http://www.w3.org/2001/XMLSchema" xmlns:xs="http://www.w3.org/2001/XMLSchema" xmlns:dms="http://schemas.microsoft.com/office/2006/documentManagement/types" xmlns:pc="http://schemas.microsoft.com/office/infopath/2007/PartnerControls" targetNamespace="cb45339b-ced9-4d0d-8f64-77573914d53b" elementFormDefault="qualified">
+  <xsd:schema xmlns:xsd="http://www.w3.org/2001/XMLSchema" xmlns:xs="http://www.w3.org/2001/XMLSchema" xmlns:dms="http://schemas.microsoft.com/office/2006/documentManagement/types" xmlns:pc="http://schemas.microsoft.com/office/infopath/2007/PartnerControls" targetNamespace="a70d3c18-0869-45a1-9f75-4b4b8f0f32be" elementFormDefault="qualified">
     <xsd:import namespace="http://schemas.microsoft.com/office/2006/documentManagement/types"/>
     <xsd:import namespace="http://schemas.microsoft.com/office/infopath/2007/PartnerControls"/>
-    <xsd:element name="SharedWithUsers" ma:index="8" nillable="true" ma:displayName="Compartido con" ma:internalName="SharedWithUsers" ma:readOnly="true">
+    <xsd:element name="MediaServiceMetadata" ma:index="8" nillable="true" ma:displayName="MediaServiceMetadata" ma:hidden="true" ma:internalName="MediaServiceMetadata" ma:readOnly="true">
+      <xsd:simpleType>
+        <xsd:restriction base="dms:Note"/>
+      </xsd:simpleType>
+    </xsd:element>
+    <xsd:element name="MediaServiceFastMetadata" ma:index="9" nillable="true" ma:displayName="MediaServiceFastMetadata" ma:hidden="true" ma:internalName="MediaServiceFastMetadata" ma:readOnly="true">
+      <xsd:simpleType>
+        <xsd:restriction base="dms:Note"/>
+      </xsd:simpleType>
+    </xsd:element>
+    <xsd:element name="MediaServiceSearchProperties" ma:index="10" nillable="true" ma:displayName="MediaServiceSearchProperties" ma:hidden="true" ma:internalName="MediaServiceSearchProperties" ma:readOnly="true">
+      <xsd:simpleType>
+        <xsd:restriction base="dms:Note"/>
+      </xsd:simpleType>
+    </xsd:element>
+    <xsd:element name="MediaServiceDateTaken" ma:index="11" nillable="true" ma:displayName="MediaServiceDateTaken" ma:hidden="true" ma:indexed="true" ma:internalName="MediaServiceDateTaken" ma:readOnly="true">
+      <xsd:simpleType>
+        <xsd:restriction base="dms:Text"/>
+      </xsd:simpleType>
+    </xsd:element>
+    <xsd:element name="MediaServiceGenerationTime" ma:index="12" nillable="true" ma:displayName="MediaServiceGenerationTime" ma:hidden="true" ma:internalName="MediaServiceGenerationTime" ma:readOnly="true">
+      <xsd:simpleType>
+        <xsd:restriction base="dms:Text"/>
+      </xsd:simpleType>
+    </xsd:element>
+    <xsd:element name="MediaServiceEventHashCode" ma:index="13" nillable="true" ma:displayName="MediaServiceEventHashCode" ma:hidden="true" ma:internalName="MediaServiceEventHashCode" ma:readOnly="true">
+      <xsd:simpleType>
+        <xsd:restriction base="dms:Text"/>
+      </xsd:simpleType>
+    </xsd:element>
+    <xsd:element name="MediaLengthInSeconds" ma:index="14" nillable="true" ma:displayName="MediaLengthInSeconds" ma:hidden="true" ma:internalName="MediaLengthInSeconds" ma:readOnly="true">
+      <xsd:simpleType>
+        <xsd:restriction base="dms:Unknown"/>
+      </xsd:simpleType>
+    </xsd:element>
+    <xsd:element name="lcf76f155ced4ddcb4097134ff3c332f" ma:index="16" nillable="true" ma:taxonomy="true" ma:internalName="lcf76f155ced4ddcb4097134ff3c332f" ma:taxonomyFieldName="MediaServiceImageTags" ma:displayName="Etiquetas de imagen" ma:readOnly="false" ma:fieldId="{5cf76f15-5ced-4ddc-b409-7134ff3c332f}" ma:taxonomyMulti="true" ma:sspId="d33c8c81-5745-4931-bcc4-c2aeafe86780" ma:termSetId="09814cd3-568e-fe90-9814-8d621ff8fb84" ma:anchorId="fba54fb3-c3e1-fe81-a776-ca4b69148c4d" ma:open="true" ma:isKeyword="false">
       <xsd:complexType>
-        <xsd:complexContent>
-          <xsd:extension base="dms:UserMulti">
-            <xsd:sequence>
-              <xsd:element name="UserInfo" minOccurs="0" maxOccurs="unbounded">
-                <xsd:complexType>
-                  <xsd:sequence>
-                    <xsd:element name="DisplayName" type="xsd:string" minOccurs="0"/>
-                    <xsd:element name="AccountId" type="dms:UserId" minOccurs="0" nillable="true"/>
-                    <xsd:element name="AccountType" type="xsd:string" minOccurs="0"/>
-                  </xsd:sequence>
-                </xsd:complexType>
-              </xsd:element>
-            </xsd:sequence>
-          </xsd:extension>
-        </xsd:complexContent>
+        <xsd:sequence>
+          <xsd:element ref="pc:Terms" minOccurs="0" maxOccurs="1"/>
+        </xsd:sequence>
       </xsd:complexType>
     </xsd:element>
-    <xsd:element name="SharedWithDetails" ma:index="9" nillable="true" ma:displayName="Detalles de uso compartido" ma:internalName="SharedWithDetails" ma:readOnly="true">
+    <xsd:element name="MediaServiceOCR" ma:index="18" nillable="true" ma:displayName="Extracted Text" ma:internalName="MediaServiceOCR" ma:readOnly="true">
       <xsd:simpleType>
         <xsd:restriction base="dms:Note">
           <xsd:maxLength value="255"/>
         </xsd:restriction>
       </xsd:simpleType>
     </xsd:element>
-    <xsd:element name="TaxCatchAll" ma:index="20" nillable="true" ma:displayName="Taxonomy Catch All Column" ma:hidden="true" ma:list="{2f40a149-578b-41a1-8845-c88bc1831770}" ma:internalName="TaxCatchAll" ma:showField="CatchAllData" ma:web="cb45339b-ced9-4d0d-8f64-77573914d53b">
+  </xsd:schema>
+  <xsd:schema xmlns:xsd="http://www.w3.org/2001/XMLSchema" xmlns:xs="http://www.w3.org/2001/XMLSchema" xmlns:dms="http://schemas.microsoft.com/office/2006/documentManagement/types" xmlns:pc="http://schemas.microsoft.com/office/infopath/2007/PartnerControls" targetNamespace="adccf511-daff-4bcb-9072-914cedbf4c7e" elementFormDefault="qualified">
+    <xsd:import namespace="http://schemas.microsoft.com/office/2006/documentManagement/types"/>
+    <xsd:import namespace="http://schemas.microsoft.com/office/infopath/2007/PartnerControls"/>
+    <xsd:element name="TaxCatchAll" ma:index="17" nillable="true" ma:displayName="Taxonomy Catch All Column" ma:hidden="true" ma:list="{d55fdbc5-1632-489d-aeea-ba6fd7407963}" ma:internalName="TaxCatchAll" ma:showField="CatchAllData" ma:web="adccf511-daff-4bcb-9072-914cedbf4c7e">
       <xsd:complexType>
         <xsd:complexContent>
           <xsd:extension base="dms:MultiChoiceLookup">
@@ -41833,69 +41662,6 @@
           </xsd:extension>
         </xsd:complexContent>
       </xsd:complexType>
-    </xsd:element>
-  </xsd:schema>
-  <xsd:schema xmlns:xsd="http://www.w3.org/2001/XMLSchema" xmlns:xs="http://www.w3.org/2001/XMLSchema" xmlns:dms="http://schemas.microsoft.com/office/2006/documentManagement/types" xmlns:pc="http://schemas.microsoft.com/office/infopath/2007/PartnerControls" targetNamespace="43a3ca16-9c26-4813-b83f-4aec9927b43f" elementFormDefault="qualified">
-    <xsd:import namespace="http://schemas.microsoft.com/office/2006/documentManagement/types"/>
-    <xsd:import namespace="http://schemas.microsoft.com/office/infopath/2007/PartnerControls"/>
-    <xsd:element name="MediaServiceMetadata" ma:index="10" nillable="true" ma:displayName="MediaServiceMetadata" ma:hidden="true" ma:internalName="MediaServiceMetadata" ma:readOnly="true">
-      <xsd:simpleType>
-        <xsd:restriction base="dms:Note"/>
-      </xsd:simpleType>
-    </xsd:element>
-    <xsd:element name="MediaServiceFastMetadata" ma:index="11" nillable="true" ma:displayName="MediaServiceFastMetadata" ma:hidden="true" ma:internalName="MediaServiceFastMetadata" ma:readOnly="true">
-      <xsd:simpleType>
-        <xsd:restriction base="dms:Note"/>
-      </xsd:simpleType>
-    </xsd:element>
-    <xsd:element name="MediaServiceDateTaken" ma:index="12" nillable="true" ma:displayName="MediaServiceDateTaken" ma:hidden="true" ma:indexed="true" ma:internalName="MediaServiceDateTaken" ma:readOnly="true">
-      <xsd:simpleType>
-        <xsd:restriction base="dms:Text"/>
-      </xsd:simpleType>
-    </xsd:element>
-    <xsd:element name="MediaServiceObjectDetectorVersions" ma:index="13" nillable="true" ma:displayName="MediaServiceObjectDetectorVersions" ma:hidden="true" ma:indexed="true" ma:internalName="MediaServiceObjectDetectorVersions" ma:readOnly="true">
-      <xsd:simpleType>
-        <xsd:restriction base="dms:Text"/>
-      </xsd:simpleType>
-    </xsd:element>
-    <xsd:element name="MediaLengthInSeconds" ma:index="14" nillable="true" ma:displayName="MediaLengthInSeconds" ma:hidden="true" ma:internalName="MediaLengthInSeconds" ma:readOnly="true">
-      <xsd:simpleType>
-        <xsd:restriction base="dms:Unknown"/>
-      </xsd:simpleType>
-    </xsd:element>
-    <xsd:element name="MediaServiceLocation" ma:index="15" nillable="true" ma:displayName="Location" ma:indexed="true" ma:internalName="MediaServiceLocation" ma:readOnly="true">
-      <xsd:simpleType>
-        <xsd:restriction base="dms:Text"/>
-      </xsd:simpleType>
-    </xsd:element>
-    <xsd:element name="MediaServiceGenerationTime" ma:index="16" nillable="true" ma:displayName="MediaServiceGenerationTime" ma:hidden="true" ma:internalName="MediaServiceGenerationTime" ma:readOnly="true">
-      <xsd:simpleType>
-        <xsd:restriction base="dms:Text"/>
-      </xsd:simpleType>
-    </xsd:element>
-    <xsd:element name="MediaServiceEventHashCode" ma:index="17" nillable="true" ma:displayName="MediaServiceEventHashCode" ma:hidden="true" ma:internalName="MediaServiceEventHashCode" ma:readOnly="true">
-      <xsd:simpleType>
-        <xsd:restriction base="dms:Text"/>
-      </xsd:simpleType>
-    </xsd:element>
-    <xsd:element name="lcf76f155ced4ddcb4097134ff3c332f" ma:index="19" nillable="true" ma:taxonomy="true" ma:internalName="lcf76f155ced4ddcb4097134ff3c332f" ma:taxonomyFieldName="MediaServiceImageTags" ma:displayName="Etiquetas de imagen" ma:readOnly="false" ma:fieldId="{5cf76f15-5ced-4ddc-b409-7134ff3c332f}" ma:taxonomyMulti="true" ma:sspId="d33c8c81-5745-4931-bcc4-c2aeafe86780" ma:termSetId="09814cd3-568e-fe90-9814-8d621ff8fb84" ma:anchorId="fba54fb3-c3e1-fe81-a776-ca4b69148c4d" ma:open="true" ma:isKeyword="false">
-      <xsd:complexType>
-        <xsd:sequence>
-          <xsd:element ref="pc:Terms" minOccurs="0" maxOccurs="1"/>
-        </xsd:sequence>
-      </xsd:complexType>
-    </xsd:element>
-    <xsd:element name="MediaServiceOCR" ma:index="21" nillable="true" ma:displayName="Extracted Text" ma:internalName="MediaServiceOCR" ma:readOnly="true">
-      <xsd:simpleType>
-        <xsd:restriction base="dms:Note">
-          <xsd:maxLength value="255"/>
-        </xsd:restriction>
-      </xsd:simpleType>
-    </xsd:element>
-    <xsd:element name="MediaServiceSearchProperties" ma:index="22" nillable="true" ma:displayName="MediaServiceSearchProperties" ma:hidden="true" ma:internalName="MediaServiceSearchProperties" ma:readOnly="true">
-      <xsd:simpleType>
-        <xsd:restriction base="dms:Note"/>
-      </xsd:simpleType>
     </xsd:element>
   </xsd:schema>
   <xsd:schema xmlns="http://schemas.openxmlformats.org/package/2006/metadata/core-properties" xmlns:xsd="http://www.w3.org/2001/XMLSchema" xmlns:xsi="http://www.w3.org/2001/XMLSchema-instance" xmlns:dc="http://purl.org/dc/elements/1.1/" xmlns:dcterms="http://purl.org/dc/terms/" xmlns:odoc="http://schemas.microsoft.com/internal/obd" targetNamespace="http://schemas.openxmlformats.org/package/2006/metadata/core-properties" elementFormDefault="qualified" attributeFormDefault="unqualified" blockDefault="#all">
@@ -41997,50 +41763,22 @@
 </ct:contentTypeSchema>
 </file>
 
-<file path=customXml/item2.xml><?xml version="1.0" encoding="utf-8"?>
-<?mso-contentType ?>
-<FormTemplates xmlns="http://schemas.microsoft.com/sharepoint/v3/contenttype/forms">
-  <Display>DocumentLibraryForm</Display>
-  <Edit>DocumentLibraryForm</Edit>
-  <New>DocumentLibraryForm</New>
-</FormTemplates>
+<file path=customXml/item3.xml><?xml version="1.0" encoding="utf-8"?>
+<b:Sources xmlns:b="http://schemas.openxmlformats.org/officeDocument/2006/bibliography" xmlns="http://schemas.openxmlformats.org/officeDocument/2006/bibliography" SelectedStyle="\APASixthEditionOfficeOnline.xsl" StyleName="APA" Version="6"/>
 </file>
 
-<file path=customXml/item3.xml><?xml version="1.0" encoding="utf-8"?>
+<file path=customXml/item4.xml><?xml version="1.0" encoding="utf-8"?>
 <p:properties xmlns:p="http://schemas.microsoft.com/office/2006/metadata/properties" xmlns:xsi="http://www.w3.org/2001/XMLSchema-instance" xmlns:pc="http://schemas.microsoft.com/office/infopath/2007/PartnerControls">
   <documentManagement>
-    <TaxCatchAll xmlns="cb45339b-ced9-4d0d-8f64-77573914d53b" xsi:nil="true"/>
-    <lcf76f155ced4ddcb4097134ff3c332f xmlns="43a3ca16-9c26-4813-b83f-4aec9927b43f">
+    <TaxCatchAll xmlns="adccf511-daff-4bcb-9072-914cedbf4c7e" xsi:nil="true"/>
+    <lcf76f155ced4ddcb4097134ff3c332f xmlns="a70d3c18-0869-45a1-9f75-4b4b8f0f32be">
       <Terms xmlns="http://schemas.microsoft.com/office/infopath/2007/PartnerControls"/>
     </lcf76f155ced4ddcb4097134ff3c332f>
   </documentManagement>
 </p:properties>
 </file>
 
-<file path=customXml/item4.xml><?xml version="1.0" encoding="utf-8"?>
-<b:Sources xmlns:b="http://schemas.openxmlformats.org/officeDocument/2006/bibliography" xmlns="http://schemas.openxmlformats.org/officeDocument/2006/bibliography" SelectedStyle="\APASixthEditionOfficeOnline.xsl" StyleName="APA" Version="6"/>
-</file>
-
 <file path=customXml/itemProps1.xml><?xml version="1.0" encoding="utf-8"?>
-<ds:datastoreItem xmlns:ds="http://schemas.openxmlformats.org/officeDocument/2006/customXml" ds:itemID="{DF43E046-DB0C-42D1-8C73-AE38B52F1ED7}">
-  <ds:schemaRefs>
-    <ds:schemaRef ds:uri="http://schemas.microsoft.com/office/2006/metadata/contentType"/>
-    <ds:schemaRef ds:uri="http://schemas.microsoft.com/office/2006/metadata/properties/metaAttributes"/>
-    <ds:schemaRef ds:uri="http://www.w3.org/2001/XMLSchema"/>
-    <ds:schemaRef ds:uri="http://schemas.microsoft.com/office/2006/metadata/properties"/>
-    <ds:schemaRef ds:uri="cb45339b-ced9-4d0d-8f64-77573914d53b"/>
-    <ds:schemaRef ds:uri="43a3ca16-9c26-4813-b83f-4aec9927b43f"/>
-    <ds:schemaRef ds:uri="http://schemas.microsoft.com/office/2006/documentManagement/types"/>
-    <ds:schemaRef ds:uri="http://schemas.microsoft.com/office/infopath/2007/PartnerControls"/>
-    <ds:schemaRef ds:uri="http://schemas.openxmlformats.org/package/2006/metadata/core-properties"/>
-    <ds:schemaRef ds:uri="http://purl.org/dc/elements/1.1/"/>
-    <ds:schemaRef ds:uri="http://purl.org/dc/terms/"/>
-    <ds:schemaRef ds:uri="http://schemas.microsoft.com/internal/obd"/>
-  </ds:schemaRefs>
-</ds:datastoreItem>
-</file>
-
-<file path=customXml/itemProps2.xml><?xml version="1.0" encoding="utf-8"?>
 <ds:datastoreItem xmlns:ds="http://schemas.openxmlformats.org/officeDocument/2006/customXml" ds:itemID="{81CBDEC1-3B00-44ED-AD36-0268077980BA}">
   <ds:schemaRefs>
     <ds:schemaRef ds:uri="http://schemas.microsoft.com/sharepoint/v3/contenttype/forms"/>
@@ -42048,7 +41786,19 @@
 </ds:datastoreItem>
 </file>
 
+<file path=customXml/itemProps2.xml><?xml version="1.0" encoding="utf-8"?>
+<ds:datastoreItem xmlns:ds="http://schemas.openxmlformats.org/officeDocument/2006/customXml" ds:itemID="{AC0E2878-6D7F-4273-865E-A5CF6E7E80D3}"/>
+</file>
+
 <file path=customXml/itemProps3.xml><?xml version="1.0" encoding="utf-8"?>
+<ds:datastoreItem xmlns:ds="http://schemas.openxmlformats.org/officeDocument/2006/customXml" ds:itemID="{E8AB44A3-7C62-4BD2-82ED-8ABC209970FA}">
+  <ds:schemaRefs>
+    <ds:schemaRef ds:uri="http://schemas.openxmlformats.org/officeDocument/2006/bibliography"/>
+  </ds:schemaRefs>
+</ds:datastoreItem>
+</file>
+
+<file path=customXml/itemProps4.xml><?xml version="1.0" encoding="utf-8"?>
 <ds:datastoreItem xmlns:ds="http://schemas.openxmlformats.org/officeDocument/2006/customXml" ds:itemID="{6929C9FE-9F22-4B98-96EF-1B541B3BD0B2}">
   <ds:schemaRefs>
     <ds:schemaRef ds:uri="http://schemas.microsoft.com/office/2006/metadata/properties"/>
@@ -42057,12 +41807,4 @@
     <ds:schemaRef ds:uri="43a3ca16-9c26-4813-b83f-4aec9927b43f"/>
   </ds:schemaRefs>
 </ds:datastoreItem>
-</file>
-
-<file path=customXml/itemProps4.xml><?xml version="1.0" encoding="utf-8"?>
-<ds:datastoreItem xmlns:ds="http://schemas.openxmlformats.org/officeDocument/2006/customXml" ds:itemID="{E8AB44A3-7C62-4BD2-82ED-8ABC209970FA}">
-  <ds:schemaRefs>
-    <ds:schemaRef ds:uri="http://schemas.openxmlformats.org/officeDocument/2006/bibliography"/>
-  </ds:schemaRefs>
-</ds:datastoreItem>
 </file>
</xml_diff>

<commit_message>
Ajustados hallazgos de red y actualizado DU
</commit_message>
<xml_diff>
--- a/fuentes/CFA1_82220017_DU.docx
+++ b/fuentes/CFA1_82220017_DU.docx
@@ -407,7 +407,21 @@
           <w:bCs/>
           <w:szCs w:val="28"/>
         </w:rPr>
-        <w:t>La movilidad inteligente integra tecnologías para optimizar el transporte, promoviendo eficiencia, sostenibilidad y accesibilidad. Junto con la circulación segura, basada en sistemas inteligentes y cultura vial, mejora la convivencia entre usuarios, reduce accidentes y el impacto ambiental. Ambas conforman un modelo integral que transforma el transporte en un sistema moderno, seguro y enfocado en el bienestar de la sociedad</w:t>
+        <w:t>La movilidad inteligente integra tecnologías para optimizar el transporte, promoviendo eficiencia, sostenibilidad y accesibilidad</w:t>
+      </w:r>
+      <w:r>
+        <w:rPr>
+          <w:bCs/>
+          <w:szCs w:val="28"/>
+        </w:rPr>
+        <w:t>; j</w:t>
+      </w:r>
+      <w:r>
+        <w:rPr>
+          <w:bCs/>
+          <w:szCs w:val="28"/>
+        </w:rPr>
+        <w:t>unto con la circulación segura, basada en sistemas inteligentes y cultura vial, mejora la convivencia entre usuarios, reduce accidentes y el impacto ambiental. Ambas conforman un modelo integral que transforma el transporte en un sistema moderno, seguro y enfocado en el bienestar de la sociedad</w:t>
       </w:r>
       <w:r>
         <w:rPr>
@@ -529,7 +543,7 @@
           <w:r>
             <w:fldChar w:fldCharType="separate"/>
           </w:r>
-          <w:hyperlink w:anchor="_Toc207960359" w:history="1">
+          <w:hyperlink w:anchor="_Toc208571172" w:history="1">
             <w:r>
               <w:rPr>
                 <w:rStyle w:val="Hipervnculo"/>
@@ -556,7 +570,7 @@
                 <w:noProof/>
                 <w:webHidden/>
               </w:rPr>
-              <w:instrText xml:space="preserve"> PAGEREF _Toc207960359 \h </w:instrText>
+              <w:instrText xml:space="preserve"> PAGEREF _Toc208571172 \h </w:instrText>
             </w:r>
             <w:r>
               <w:rPr>
@@ -602,7 +616,7 @@
               <w:lang w:eastAsia="es-MX"/>
             </w:rPr>
           </w:pPr>
-          <w:hyperlink w:anchor="_Toc207960360" w:history="1">
+          <w:hyperlink w:anchor="_Toc208571173" w:history="1">
             <w:r>
               <w:rPr>
                 <w:rStyle w:val="Hipervnculo"/>
@@ -646,7 +660,7 @@
                 <w:noProof/>
                 <w:webHidden/>
               </w:rPr>
-              <w:instrText xml:space="preserve"> PAGEREF _Toc207960360 \h </w:instrText>
+              <w:instrText xml:space="preserve"> PAGEREF _Toc208571173 \h </w:instrText>
             </w:r>
             <w:r>
               <w:rPr>
@@ -688,7 +702,7 @@
               <w:lang w:eastAsia="es-MX"/>
             </w:rPr>
           </w:pPr>
-          <w:hyperlink w:anchor="_Toc207960361" w:history="1">
+          <w:hyperlink w:anchor="_Toc208571174" w:history="1">
             <w:r>
               <w:rPr>
                 <w:rStyle w:val="Hipervnculo"/>
@@ -732,7 +746,7 @@
                 <w:noProof/>
                 <w:webHidden/>
               </w:rPr>
-              <w:instrText xml:space="preserve"> PAGEREF _Toc207960361 \h </w:instrText>
+              <w:instrText xml:space="preserve"> PAGEREF _Toc208571174 \h </w:instrText>
             </w:r>
             <w:r>
               <w:rPr>
@@ -774,7 +788,7 @@
               <w:lang w:eastAsia="es-MX"/>
             </w:rPr>
           </w:pPr>
-          <w:hyperlink w:anchor="_Toc207960362" w:history="1">
+          <w:hyperlink w:anchor="_Toc208571175" w:history="1">
             <w:r>
               <w:rPr>
                 <w:rStyle w:val="Hipervnculo"/>
@@ -818,7 +832,7 @@
                 <w:noProof/>
                 <w:webHidden/>
               </w:rPr>
-              <w:instrText xml:space="preserve"> PAGEREF _Toc207960362 \h </w:instrText>
+              <w:instrText xml:space="preserve"> PAGEREF _Toc208571175 \h </w:instrText>
             </w:r>
             <w:r>
               <w:rPr>
@@ -860,7 +874,7 @@
               <w:lang w:eastAsia="es-MX"/>
             </w:rPr>
           </w:pPr>
-          <w:hyperlink w:anchor="_Toc207960363" w:history="1">
+          <w:hyperlink w:anchor="_Toc208571176" w:history="1">
             <w:r>
               <w:rPr>
                 <w:rStyle w:val="Hipervnculo"/>
@@ -904,7 +918,7 @@
                 <w:noProof/>
                 <w:webHidden/>
               </w:rPr>
-              <w:instrText xml:space="preserve"> PAGEREF _Toc207960363 \h </w:instrText>
+              <w:instrText xml:space="preserve"> PAGEREF _Toc208571176 \h </w:instrText>
             </w:r>
             <w:r>
               <w:rPr>
@@ -946,7 +960,7 @@
               <w:lang w:eastAsia="es-MX"/>
             </w:rPr>
           </w:pPr>
-          <w:hyperlink w:anchor="_Toc207960364" w:history="1">
+          <w:hyperlink w:anchor="_Toc208571177" w:history="1">
             <w:r>
               <w:rPr>
                 <w:rStyle w:val="Hipervnculo"/>
@@ -973,7 +987,7 @@
                 <w:noProof/>
                 <w:webHidden/>
               </w:rPr>
-              <w:instrText xml:space="preserve"> PAGEREF _Toc207960364 \h </w:instrText>
+              <w:instrText xml:space="preserve"> PAGEREF _Toc208571177 \h </w:instrText>
             </w:r>
             <w:r>
               <w:rPr>
@@ -1015,7 +1029,7 @@
               <w:lang w:eastAsia="es-MX"/>
             </w:rPr>
           </w:pPr>
-          <w:hyperlink w:anchor="_Toc207960365" w:history="1">
+          <w:hyperlink w:anchor="_Toc208571178" w:history="1">
             <w:r>
               <w:rPr>
                 <w:rStyle w:val="Hipervnculo"/>
@@ -1042,7 +1056,7 @@
                 <w:noProof/>
                 <w:webHidden/>
               </w:rPr>
-              <w:instrText xml:space="preserve"> PAGEREF _Toc207960365 \h </w:instrText>
+              <w:instrText xml:space="preserve"> PAGEREF _Toc208571178 \h </w:instrText>
             </w:r>
             <w:r>
               <w:rPr>
@@ -1088,7 +1102,7 @@
               <w:lang w:eastAsia="es-MX"/>
             </w:rPr>
           </w:pPr>
-          <w:hyperlink w:anchor="_Toc207960366" w:history="1">
+          <w:hyperlink w:anchor="_Toc208571179" w:history="1">
             <w:r>
               <w:rPr>
                 <w:rStyle w:val="Hipervnculo"/>
@@ -1132,7 +1146,7 @@
                 <w:noProof/>
                 <w:webHidden/>
               </w:rPr>
-              <w:instrText xml:space="preserve"> PAGEREF _Toc207960366 \h </w:instrText>
+              <w:instrText xml:space="preserve"> PAGEREF _Toc208571179 \h </w:instrText>
             </w:r>
             <w:r>
               <w:rPr>
@@ -1174,7 +1188,7 @@
               <w:lang w:eastAsia="es-MX"/>
             </w:rPr>
           </w:pPr>
-          <w:hyperlink w:anchor="_Toc207960367" w:history="1">
+          <w:hyperlink w:anchor="_Toc208571180" w:history="1">
             <w:r>
               <w:rPr>
                 <w:rStyle w:val="Hipervnculo"/>
@@ -1201,7 +1215,7 @@
                 <w:noProof/>
                 <w:webHidden/>
               </w:rPr>
-              <w:instrText xml:space="preserve"> PAGEREF _Toc207960367 \h </w:instrText>
+              <w:instrText xml:space="preserve"> PAGEREF _Toc208571180 \h </w:instrText>
             </w:r>
             <w:r>
               <w:rPr>
@@ -1243,7 +1257,7 @@
               <w:lang w:eastAsia="es-MX"/>
             </w:rPr>
           </w:pPr>
-          <w:hyperlink w:anchor="_Toc207960368" w:history="1">
+          <w:hyperlink w:anchor="_Toc208571181" w:history="1">
             <w:r>
               <w:rPr>
                 <w:rStyle w:val="Hipervnculo"/>
@@ -1270,7 +1284,7 @@
                 <w:noProof/>
                 <w:webHidden/>
               </w:rPr>
-              <w:instrText xml:space="preserve"> PAGEREF _Toc207960368 \h </w:instrText>
+              <w:instrText xml:space="preserve"> PAGEREF _Toc208571181 \h </w:instrText>
             </w:r>
             <w:r>
               <w:rPr>
@@ -1312,7 +1326,7 @@
               <w:lang w:eastAsia="es-MX"/>
             </w:rPr>
           </w:pPr>
-          <w:hyperlink w:anchor="_Toc207960369" w:history="1">
+          <w:hyperlink w:anchor="_Toc208571182" w:history="1">
             <w:r>
               <w:rPr>
                 <w:rStyle w:val="Hipervnculo"/>
@@ -1339,7 +1353,7 @@
                 <w:noProof/>
                 <w:webHidden/>
               </w:rPr>
-              <w:instrText xml:space="preserve"> PAGEREF _Toc207960369 \h </w:instrText>
+              <w:instrText xml:space="preserve"> PAGEREF _Toc208571182 \h </w:instrText>
             </w:r>
             <w:r>
               <w:rPr>
@@ -1381,7 +1395,7 @@
               <w:lang w:eastAsia="es-MX"/>
             </w:rPr>
           </w:pPr>
-          <w:hyperlink w:anchor="_Toc207960370" w:history="1">
+          <w:hyperlink w:anchor="_Toc208571183" w:history="1">
             <w:r>
               <w:rPr>
                 <w:rStyle w:val="Hipervnculo"/>
@@ -1408,7 +1422,7 @@
                 <w:noProof/>
                 <w:webHidden/>
               </w:rPr>
-              <w:instrText xml:space="preserve"> PAGEREF _Toc207960370 \h </w:instrText>
+              <w:instrText xml:space="preserve"> PAGEREF _Toc208571183 \h </w:instrText>
             </w:r>
             <w:r>
               <w:rPr>
@@ -1454,7 +1468,7 @@
               <w:lang w:eastAsia="es-MX"/>
             </w:rPr>
           </w:pPr>
-          <w:hyperlink w:anchor="_Toc207960371" w:history="1">
+          <w:hyperlink w:anchor="_Toc208571184" w:history="1">
             <w:r>
               <w:rPr>
                 <w:rStyle w:val="Hipervnculo"/>
@@ -1501,7 +1515,7 @@
                 <w:noProof/>
                 <w:webHidden/>
               </w:rPr>
-              <w:instrText xml:space="preserve"> PAGEREF _Toc207960371 \h </w:instrText>
+              <w:instrText xml:space="preserve"> PAGEREF _Toc208571184 \h </w:instrText>
             </w:r>
             <w:r>
               <w:rPr>
@@ -1543,7 +1557,7 @@
               <w:lang w:eastAsia="es-MX"/>
             </w:rPr>
           </w:pPr>
-          <w:hyperlink w:anchor="_Toc207960372" w:history="1">
+          <w:hyperlink w:anchor="_Toc208571185" w:history="1">
             <w:r>
               <w:rPr>
                 <w:rStyle w:val="Hipervnculo"/>
@@ -1570,7 +1584,7 @@
                 <w:noProof/>
                 <w:webHidden/>
               </w:rPr>
-              <w:instrText xml:space="preserve"> PAGEREF _Toc207960372 \h </w:instrText>
+              <w:instrText xml:space="preserve"> PAGEREF _Toc208571185 \h </w:instrText>
             </w:r>
             <w:r>
               <w:rPr>
@@ -1612,7 +1626,7 @@
               <w:lang w:eastAsia="es-MX"/>
             </w:rPr>
           </w:pPr>
-          <w:hyperlink w:anchor="_Toc207960373" w:history="1">
+          <w:hyperlink w:anchor="_Toc208571186" w:history="1">
             <w:r>
               <w:rPr>
                 <w:rStyle w:val="Hipervnculo"/>
@@ -1639,7 +1653,7 @@
                 <w:noProof/>
                 <w:webHidden/>
               </w:rPr>
-              <w:instrText xml:space="preserve"> PAGEREF _Toc207960373 \h </w:instrText>
+              <w:instrText xml:space="preserve"> PAGEREF _Toc208571186 \h </w:instrText>
             </w:r>
             <w:r>
               <w:rPr>
@@ -1681,7 +1695,7 @@
               <w:lang w:eastAsia="es-MX"/>
             </w:rPr>
           </w:pPr>
-          <w:hyperlink w:anchor="_Toc207960374" w:history="1">
+          <w:hyperlink w:anchor="_Toc208571187" w:history="1">
             <w:r>
               <w:rPr>
                 <w:rStyle w:val="Hipervnculo"/>
@@ -1708,7 +1722,7 @@
                 <w:noProof/>
                 <w:webHidden/>
               </w:rPr>
-              <w:instrText xml:space="preserve"> PAGEREF _Toc207960374 \h </w:instrText>
+              <w:instrText xml:space="preserve"> PAGEREF _Toc208571187 \h </w:instrText>
             </w:r>
             <w:r>
               <w:rPr>
@@ -1754,7 +1768,7 @@
               <w:lang w:eastAsia="es-MX"/>
             </w:rPr>
           </w:pPr>
-          <w:hyperlink w:anchor="_Toc207960375" w:history="1">
+          <w:hyperlink w:anchor="_Toc208571188" w:history="1">
             <w:r>
               <w:rPr>
                 <w:rStyle w:val="Hipervnculo"/>
@@ -1798,7 +1812,7 @@
                 <w:noProof/>
                 <w:webHidden/>
               </w:rPr>
-              <w:instrText xml:space="preserve"> PAGEREF _Toc207960375 \h </w:instrText>
+              <w:instrText xml:space="preserve"> PAGEREF _Toc208571188 \h </w:instrText>
             </w:r>
             <w:r>
               <w:rPr>
@@ -1840,7 +1854,7 @@
               <w:lang w:eastAsia="es-MX"/>
             </w:rPr>
           </w:pPr>
-          <w:hyperlink w:anchor="_Toc207960376" w:history="1">
+          <w:hyperlink w:anchor="_Toc208571189" w:history="1">
             <w:r>
               <w:rPr>
                 <w:rStyle w:val="Hipervnculo"/>
@@ -1867,7 +1881,7 @@
                 <w:noProof/>
                 <w:webHidden/>
               </w:rPr>
-              <w:instrText xml:space="preserve"> PAGEREF _Toc207960376 \h </w:instrText>
+              <w:instrText xml:space="preserve"> PAGEREF _Toc208571189 \h </w:instrText>
             </w:r>
             <w:r>
               <w:rPr>
@@ -1909,7 +1923,7 @@
               <w:lang w:eastAsia="es-MX"/>
             </w:rPr>
           </w:pPr>
-          <w:hyperlink w:anchor="_Toc207960377" w:history="1">
+          <w:hyperlink w:anchor="_Toc208571190" w:history="1">
             <w:r>
               <w:rPr>
                 <w:rStyle w:val="Hipervnculo"/>
@@ -1936,7 +1950,7 @@
                 <w:noProof/>
                 <w:webHidden/>
               </w:rPr>
-              <w:instrText xml:space="preserve"> PAGEREF _Toc207960377 \h </w:instrText>
+              <w:instrText xml:space="preserve"> PAGEREF _Toc208571190 \h </w:instrText>
             </w:r>
             <w:r>
               <w:rPr>
@@ -1978,7 +1992,7 @@
               <w:lang w:eastAsia="es-MX"/>
             </w:rPr>
           </w:pPr>
-          <w:hyperlink w:anchor="_Toc207960378" w:history="1">
+          <w:hyperlink w:anchor="_Toc208571191" w:history="1">
             <w:r>
               <w:rPr>
                 <w:rStyle w:val="Hipervnculo"/>
@@ -2005,7 +2019,7 @@
                 <w:noProof/>
                 <w:webHidden/>
               </w:rPr>
-              <w:instrText xml:space="preserve"> PAGEREF _Toc207960378 \h </w:instrText>
+              <w:instrText xml:space="preserve"> PAGEREF _Toc208571191 \h </w:instrText>
             </w:r>
             <w:r>
               <w:rPr>
@@ -2047,7 +2061,7 @@
               <w:lang w:eastAsia="es-MX"/>
             </w:rPr>
           </w:pPr>
-          <w:hyperlink w:anchor="_Toc207960379" w:history="1">
+          <w:hyperlink w:anchor="_Toc208571192" w:history="1">
             <w:r>
               <w:rPr>
                 <w:rStyle w:val="Hipervnculo"/>
@@ -2074,7 +2088,7 @@
                 <w:noProof/>
                 <w:webHidden/>
               </w:rPr>
-              <w:instrText xml:space="preserve"> PAGEREF _Toc207960379 \h </w:instrText>
+              <w:instrText xml:space="preserve"> PAGEREF _Toc208571192 \h </w:instrText>
             </w:r>
             <w:r>
               <w:rPr>
@@ -2116,7 +2130,7 @@
               <w:lang w:eastAsia="es-MX"/>
             </w:rPr>
           </w:pPr>
-          <w:hyperlink w:anchor="_Toc207960380" w:history="1">
+          <w:hyperlink w:anchor="_Toc208571193" w:history="1">
             <w:r>
               <w:rPr>
                 <w:rStyle w:val="Hipervnculo"/>
@@ -2143,7 +2157,7 @@
                 <w:noProof/>
                 <w:webHidden/>
               </w:rPr>
-              <w:instrText xml:space="preserve"> PAGEREF _Toc207960380 \h </w:instrText>
+              <w:instrText xml:space="preserve"> PAGEREF _Toc208571193 \h </w:instrText>
             </w:r>
             <w:r>
               <w:rPr>
@@ -2185,7 +2199,7 @@
               <w:lang w:eastAsia="es-MX"/>
             </w:rPr>
           </w:pPr>
-          <w:hyperlink w:anchor="_Toc207960381" w:history="1">
+          <w:hyperlink w:anchor="_Toc208571194" w:history="1">
             <w:r>
               <w:rPr>
                 <w:rStyle w:val="Hipervnculo"/>
@@ -2212,7 +2226,7 @@
                 <w:noProof/>
                 <w:webHidden/>
               </w:rPr>
-              <w:instrText xml:space="preserve"> PAGEREF _Toc207960381 \h </w:instrText>
+              <w:instrText xml:space="preserve"> PAGEREF _Toc208571194 \h </w:instrText>
             </w:r>
             <w:r>
               <w:rPr>
@@ -2258,7 +2272,7 @@
               <w:lang w:eastAsia="es-MX"/>
             </w:rPr>
           </w:pPr>
-          <w:hyperlink w:anchor="_Toc207960382" w:history="1">
+          <w:hyperlink w:anchor="_Toc208571195" w:history="1">
             <w:r>
               <w:rPr>
                 <w:rStyle w:val="Hipervnculo"/>
@@ -2302,7 +2316,7 @@
                 <w:noProof/>
                 <w:webHidden/>
               </w:rPr>
-              <w:instrText xml:space="preserve"> PAGEREF _Toc207960382 \h </w:instrText>
+              <w:instrText xml:space="preserve"> PAGEREF _Toc208571195 \h </w:instrText>
             </w:r>
             <w:r>
               <w:rPr>
@@ -2344,7 +2358,7 @@
               <w:lang w:eastAsia="es-MX"/>
             </w:rPr>
           </w:pPr>
-          <w:hyperlink w:anchor="_Toc207960383" w:history="1">
+          <w:hyperlink w:anchor="_Toc208571196" w:history="1">
             <w:r>
               <w:rPr>
                 <w:rStyle w:val="Hipervnculo"/>
@@ -2371,7 +2385,7 @@
                 <w:noProof/>
                 <w:webHidden/>
               </w:rPr>
-              <w:instrText xml:space="preserve"> PAGEREF _Toc207960383 \h </w:instrText>
+              <w:instrText xml:space="preserve"> PAGEREF _Toc208571196 \h </w:instrText>
             </w:r>
             <w:r>
               <w:rPr>
@@ -2413,7 +2427,7 @@
               <w:lang w:eastAsia="es-MX"/>
             </w:rPr>
           </w:pPr>
-          <w:hyperlink w:anchor="_Toc207960384" w:history="1">
+          <w:hyperlink w:anchor="_Toc208571197" w:history="1">
             <w:r>
               <w:rPr>
                 <w:rStyle w:val="Hipervnculo"/>
@@ -2440,7 +2454,7 @@
                 <w:noProof/>
                 <w:webHidden/>
               </w:rPr>
-              <w:instrText xml:space="preserve"> PAGEREF _Toc207960384 \h </w:instrText>
+              <w:instrText xml:space="preserve"> PAGEREF _Toc208571197 \h </w:instrText>
             </w:r>
             <w:r>
               <w:rPr>
@@ -2482,7 +2496,7 @@
               <w:lang w:eastAsia="es-MX"/>
             </w:rPr>
           </w:pPr>
-          <w:hyperlink w:anchor="_Toc207960385" w:history="1">
+          <w:hyperlink w:anchor="_Toc208571198" w:history="1">
             <w:r>
               <w:rPr>
                 <w:rStyle w:val="Hipervnculo"/>
@@ -2509,7 +2523,7 @@
                 <w:noProof/>
                 <w:webHidden/>
               </w:rPr>
-              <w:instrText xml:space="preserve"> PAGEREF _Toc207960385 \h </w:instrText>
+              <w:instrText xml:space="preserve"> PAGEREF _Toc208571198 \h </w:instrText>
             </w:r>
             <w:r>
               <w:rPr>
@@ -2551,7 +2565,7 @@
               <w:lang w:eastAsia="es-MX"/>
             </w:rPr>
           </w:pPr>
-          <w:hyperlink w:anchor="_Toc207960386" w:history="1">
+          <w:hyperlink w:anchor="_Toc208571199" w:history="1">
             <w:r>
               <w:rPr>
                 <w:rStyle w:val="Hipervnculo"/>
@@ -2578,7 +2592,7 @@
                 <w:noProof/>
                 <w:webHidden/>
               </w:rPr>
-              <w:instrText xml:space="preserve"> PAGEREF _Toc207960386 \h </w:instrText>
+              <w:instrText xml:space="preserve"> PAGEREF _Toc208571199 \h </w:instrText>
             </w:r>
             <w:r>
               <w:rPr>
@@ -2623,7 +2637,7 @@
               <w:lang w:eastAsia="es-MX"/>
             </w:rPr>
           </w:pPr>
-          <w:hyperlink w:anchor="_Toc207960387" w:history="1">
+          <w:hyperlink w:anchor="_Toc208571200" w:history="1">
             <w:r>
               <w:rPr>
                 <w:rStyle w:val="Hipervnculo"/>
@@ -2650,7 +2664,7 @@
                 <w:noProof/>
                 <w:webHidden/>
               </w:rPr>
-              <w:instrText xml:space="preserve"> PAGEREF _Toc207960387 \h </w:instrText>
+              <w:instrText xml:space="preserve"> PAGEREF _Toc208571200 \h </w:instrText>
             </w:r>
             <w:r>
               <w:rPr>
@@ -2695,7 +2709,7 @@
               <w:lang w:eastAsia="es-MX"/>
             </w:rPr>
           </w:pPr>
-          <w:hyperlink w:anchor="_Toc207960388" w:history="1">
+          <w:hyperlink w:anchor="_Toc208571201" w:history="1">
             <w:r>
               <w:rPr>
                 <w:rStyle w:val="Hipervnculo"/>
@@ -2722,7 +2736,7 @@
                 <w:noProof/>
                 <w:webHidden/>
               </w:rPr>
-              <w:instrText xml:space="preserve"> PAGEREF _Toc207960388 \h </w:instrText>
+              <w:instrText xml:space="preserve"> PAGEREF _Toc208571201 \h </w:instrText>
             </w:r>
             <w:r>
               <w:rPr>
@@ -2767,7 +2781,7 @@
               <w:lang w:eastAsia="es-MX"/>
             </w:rPr>
           </w:pPr>
-          <w:hyperlink w:anchor="_Toc207960389" w:history="1">
+          <w:hyperlink w:anchor="_Toc208571202" w:history="1">
             <w:r>
               <w:rPr>
                 <w:rStyle w:val="Hipervnculo"/>
@@ -2794,7 +2808,7 @@
                 <w:noProof/>
                 <w:webHidden/>
               </w:rPr>
-              <w:instrText xml:space="preserve"> PAGEREF _Toc207960389 \h </w:instrText>
+              <w:instrText xml:space="preserve"> PAGEREF _Toc208571202 \h </w:instrText>
             </w:r>
             <w:r>
               <w:rPr>
@@ -2839,7 +2853,7 @@
               <w:lang w:eastAsia="es-MX"/>
             </w:rPr>
           </w:pPr>
-          <w:hyperlink w:anchor="_Toc207960390" w:history="1">
+          <w:hyperlink w:anchor="_Toc208571203" w:history="1">
             <w:r>
               <w:rPr>
                 <w:rStyle w:val="Hipervnculo"/>
@@ -2866,7 +2880,7 @@
                 <w:noProof/>
                 <w:webHidden/>
               </w:rPr>
-              <w:instrText xml:space="preserve"> PAGEREF _Toc207960390 \h </w:instrText>
+              <w:instrText xml:space="preserve"> PAGEREF _Toc208571203 \h </w:instrText>
             </w:r>
             <w:r>
               <w:rPr>
@@ -2911,7 +2925,7 @@
               <w:lang w:eastAsia="es-MX"/>
             </w:rPr>
           </w:pPr>
-          <w:hyperlink w:anchor="_Toc207960391" w:history="1">
+          <w:hyperlink w:anchor="_Toc208571204" w:history="1">
             <w:r>
               <w:rPr>
                 <w:rStyle w:val="Hipervnculo"/>
@@ -2938,7 +2952,7 @@
                 <w:noProof/>
                 <w:webHidden/>
               </w:rPr>
-              <w:instrText xml:space="preserve"> PAGEREF _Toc207960391 \h </w:instrText>
+              <w:instrText xml:space="preserve"> PAGEREF _Toc208571204 \h </w:instrText>
             </w:r>
             <w:r>
               <w:rPr>
@@ -2995,7 +3009,7 @@
       <w:pPr>
         <w:pStyle w:val="Titulosgenerales"/>
       </w:pPr>
-      <w:bookmarkStart w:id="0" w:name="_Toc207960359"/>
+      <w:bookmarkStart w:id="0" w:name="_Toc208571172"/>
       <w:r>
         <w:lastRenderedPageBreak/>
         <w:t>Introducción</w:t>
@@ -3004,7 +3018,28 @@
     </w:p>
     <w:p>
       <w:r>
-        <w:t>La transformación de las ciudades actuales y el crecimiento constante de la población han generado nuevos desafíos en cuanto a la forma en que nos desplazamos. En este sentido, la movilidad inteligente y la circulación segura se presentan como ejes fundamentales para mejorar la calidad de vida urbana, reducir los impactos ambientales y garantizar la seguridad de todos los actores viales. Este componente formativo tiene como propósito brindar los conocimientos necesarios para comprender y aplicar estrategias innovadoras que integren tecnología, sostenibilidad y responsabilidad ciudadana en los sistemas de transporte, promoviendo entornos más eficientes, accesibles y seguros para la comunidad. al aprendiz de fundamentos que le permitan interpretar su realidad empresarial con mayor claridad y proyección</w:t>
+        <w:t>La transformación de las ciudades actuales y el crecimiento constante de la población han generado nuevos desafíos en cuanto a la forma en que nos desplazamos. En este sentido, la movilidad inteligente y la circulación segura se presentan como ejes fundamentales para mejorar la calidad de vida urbana, reducir los impactos ambientales y garantizar la seguridad de todos los actores viales. Este componente formativo tiene como propósito brindar los conocimientos necesarios para comprender y aplicar estrategias innovadoras que integren tecnología, sostenibilidad y responsabilidad ciudadana</w:t>
+      </w:r>
+      <w:r>
+        <w:t xml:space="preserve"> </w:t>
+      </w:r>
+      <w:r>
+        <w:t xml:space="preserve">en los sistemas de transporte, promoviendo entornos más eficientes, accesibles y seguros para la comunidad. </w:t>
+      </w:r>
+      <w:r>
+        <w:t>Así</w:t>
+      </w:r>
+      <w:r>
+        <w:t xml:space="preserve"> </w:t>
+      </w:r>
+      <w:r>
+        <w:t>mismo, busca dotar al aprendiz</w:t>
+      </w:r>
+      <w:r>
+        <w:t xml:space="preserve"> </w:t>
+      </w:r>
+      <w:r>
+        <w:t>al aprendiz de fundamentos que le permitan interpretar su realidad empresarial con mayor claridad y proyección</w:t>
       </w:r>
       <w:r>
         <w:t>.</w:t>
@@ -3157,7 +3192,6 @@
                 <w:b/>
                 <w:lang w:val="es-419"/>
               </w:rPr>
-              <w:lastRenderedPageBreak/>
               <w:t>Síntesis del video:</w:t>
             </w:r>
             <w:r>
@@ -3235,7 +3269,7 @@
       <w:pPr>
         <w:pStyle w:val="Ttulo1"/>
       </w:pPr>
-      <w:bookmarkStart w:id="1" w:name="_Toc207960360"/>
+      <w:bookmarkStart w:id="1" w:name="_Toc208571173"/>
       <w:r>
         <w:lastRenderedPageBreak/>
         <w:t>Transporte terrestre</w:t>
@@ -3272,7 +3306,7 @@
           <w:rFonts w:eastAsia="Times New Roman"/>
         </w:rPr>
       </w:pPr>
-      <w:bookmarkStart w:id="2" w:name="_Toc207960361"/>
+      <w:bookmarkStart w:id="2" w:name="_Toc208571174"/>
       <w:r>
         <w:t>Historia del transporte terrestre</w:t>
       </w:r>
@@ -3285,13 +3319,30 @@
     </w:p>
     <w:p>
       <w:r>
-        <w:t>Durante la Revolución Industrial la necesidad de mover más carga hizo que el transporte tuviese una transformación radical con la invención de la locomotora de vapor, posteriormente, el automóvil y el avión, que permitieron la conexiones más rápidas y globales (Rodr</w:t>
-      </w:r>
-      <w:r>
-        <w:t>í</w:t>
-      </w:r>
-      <w:r>
-        <w:t>guez). En la actualidad, el transporte continúa evolucionando gracias a la digitalización, la electrificación y la movilidad inteligente, orientada a mejorar la eficiencia y sostenibilidad de los sistemas de desplazamiento.</w:t>
+        <w:t xml:space="preserve">Durante la Revolución Industrial la necesidad de mover más carga hizo que el transporte tuviese una transformación radical con la invención de la locomotora de vapor, posteriormente, el automóvil y el avión, que permitieron la conexiones más rápidas y </w:t>
+      </w:r>
+      <w:r>
+        <w:t>globales (</w:t>
+      </w:r>
+      <w:r>
+        <w:rPr>
+          <w:color w:val="000000" w:themeColor="text1"/>
+          <w:lang w:eastAsia="es-CO"/>
+        </w:rPr>
+        <w:t>Rodríguez, J.-P. (2020</w:t>
+      </w:r>
+      <w:r>
+        <w:rPr>
+          <w:rStyle w:val="Extranjerismo"/>
+          <w:lang w:val="es-CO" w:eastAsia="es-CO"/>
+        </w:rPr>
+        <w:t>)</w:t>
+      </w:r>
+      <w:r>
+        <w:t>).</w:t>
+      </w:r>
+      <w:r>
+        <w:t xml:space="preserve"> En la actualidad, el transporte continúa evolucionando gracias a la digitalización, la electrificación y la movilidad inteligente, orientada a mejorar la eficiencia y sostenibilidad de los sistemas de desplazamiento.</w:t>
       </w:r>
     </w:p>
     <w:p>
@@ -4794,7 +4845,7 @@
           <w:numId w:val="7"/>
         </w:numPr>
       </w:pPr>
-      <w:bookmarkStart w:id="3" w:name="_Toc207960362"/>
+      <w:bookmarkStart w:id="3" w:name="_Toc208571175"/>
       <w:r>
         <w:t>Concepto del transporte terrestre</w:t>
       </w:r>
@@ -4824,7 +4875,7 @@
           <w:numId w:val="7"/>
         </w:numPr>
       </w:pPr>
-      <w:bookmarkStart w:id="4" w:name="_Toc207960363"/>
+      <w:bookmarkStart w:id="4" w:name="_Toc208571176"/>
       <w:r>
         <w:t>Tipología del transporte terrestre</w:t>
       </w:r>
@@ -5061,7 +5112,7 @@
       <w:pPr>
         <w:pStyle w:val="Ttulo2"/>
       </w:pPr>
-      <w:bookmarkStart w:id="5" w:name="_Toc207960364"/>
+      <w:bookmarkStart w:id="5" w:name="_Toc208571177"/>
       <w:r>
         <w:t>1.4 Normativa</w:t>
       </w:r>
@@ -5312,7 +5363,7 @@
       <w:pPr>
         <w:pStyle w:val="Ttulo2"/>
       </w:pPr>
-      <w:bookmarkStart w:id="6" w:name="_Toc207960365"/>
+      <w:bookmarkStart w:id="6" w:name="_Toc208571178"/>
       <w:r>
         <w:lastRenderedPageBreak/>
         <w:t>1.5 Medios de transporte</w:t>
@@ -5650,7 +5701,7 @@
           <w:lang w:val="es-419"/>
         </w:rPr>
       </w:pPr>
-      <w:bookmarkStart w:id="7" w:name="_Toc207960366"/>
+      <w:bookmarkStart w:id="7" w:name="_Toc208571179"/>
       <w:r>
         <w:rPr>
           <w:rStyle w:val="Extranjerismo"/>
@@ -5685,7 +5736,7 @@
       <w:pPr>
         <w:pStyle w:val="Ttulo2"/>
       </w:pPr>
-      <w:bookmarkStart w:id="8" w:name="_Toc207960367"/>
+      <w:bookmarkStart w:id="8" w:name="_Toc208571180"/>
       <w:r>
         <w:t xml:space="preserve">2.1 </w:t>
       </w:r>
@@ -5714,7 +5765,7 @@
       <w:pPr>
         <w:pStyle w:val="Ttulo2"/>
       </w:pPr>
-      <w:bookmarkStart w:id="9" w:name="_Toc207960368"/>
+      <w:bookmarkStart w:id="9" w:name="_Toc208571181"/>
       <w:r>
         <w:t xml:space="preserve">2.2 </w:t>
       </w:r>
@@ -5745,6 +5796,13 @@
     <w:p>
       <w:pPr>
         <w:rPr>
+          <w:lang w:val="es-419" w:eastAsia="es-CO"/>
+        </w:rPr>
+      </w:pPr>
+    </w:p>
+    <w:p>
+      <w:pPr>
+        <w:rPr>
           <w:szCs w:val="28"/>
           <w:lang w:val="es-419" w:eastAsia="es-CO"/>
         </w:rPr>
@@ -5756,6 +5814,7 @@
           <w:szCs w:val="28"/>
           <w:lang w:val="es-419" w:eastAsia="es-CO"/>
         </w:rPr>
+        <w:lastRenderedPageBreak/>
         <w:t>Ejemplos de la jurisdicción en Colombia</w:t>
       </w:r>
       <w:r>
@@ -5779,7 +5838,6 @@
           <w:b/>
           <w:bCs/>
         </w:rPr>
-        <w:lastRenderedPageBreak/>
         <w:t>Jurisdicción nacional:</w:t>
       </w:r>
       <w:r>
@@ -5837,7 +5895,7 @@
       <w:pPr>
         <w:pStyle w:val="Ttulo2"/>
       </w:pPr>
-      <w:bookmarkStart w:id="10" w:name="_Toc207960369"/>
+      <w:bookmarkStart w:id="10" w:name="_Toc208571182"/>
       <w:r>
         <w:t>2.3 Riesgos viales en el e</w:t>
       </w:r>
@@ -5988,6 +6046,7 @@
           <w:b/>
           <w:bCs/>
         </w:rPr>
+        <w:lastRenderedPageBreak/>
         <w:t>Condiciones climáticas adversas</w:t>
       </w:r>
       <w:r>
@@ -6001,15 +6060,16 @@
         <w:t xml:space="preserve"> </w:t>
       </w:r>
       <w:r>
-        <w:t>lluvias intensas, neblina, granizo o deslizamientos que afectan la transitabilidad.</w:t>
-      </w:r>
-    </w:p>
-    <w:p>
-      <w:pPr>
-        <w:rPr>
-          <w:lang w:val="es-419" w:eastAsia="es-CO"/>
-        </w:rPr>
-      </w:pPr>
+        <w:t xml:space="preserve">lluvias intensas, neblina, granizo o deslizamientos que afectan la </w:t>
+      </w:r>
+      <w:proofErr w:type="spellStart"/>
+      <w:r>
+        <w:t>transitabilidad</w:t>
+      </w:r>
+      <w:proofErr w:type="spellEnd"/>
+      <w:r>
+        <w:t>.</w:t>
+      </w:r>
     </w:p>
     <w:p>
       <w:pPr>
@@ -6141,7 +6201,7 @@
       <w:pPr>
         <w:pStyle w:val="Ttulo2"/>
       </w:pPr>
-      <w:bookmarkStart w:id="11" w:name="_Toc207960370"/>
+      <w:bookmarkStart w:id="11" w:name="_Toc208571183"/>
       <w:r>
         <w:t>2.4 Clases y aspectos técnicos de vías</w:t>
       </w:r>
@@ -6434,7 +6494,7 @@
           <w:shd w:val="clear" w:color="auto" w:fill="FFFFFF"/>
         </w:rPr>
       </w:pPr>
-      <w:bookmarkStart w:id="12" w:name="_Toc207960371"/>
+      <w:bookmarkStart w:id="12" w:name="_Toc208571184"/>
       <w:r>
         <w:rPr>
           <w:bdr w:val="none" w:sz="0" w:space="0" w:color="auto" w:frame="1"/>
@@ -6475,7 +6535,7 @@
       <w:pPr>
         <w:pStyle w:val="Ttulo2"/>
       </w:pPr>
-      <w:bookmarkStart w:id="13" w:name="_Toc207960372"/>
+      <w:bookmarkStart w:id="13" w:name="_Toc208571185"/>
       <w:r>
         <w:t>3.1 Principios y valores ciudadanos</w:t>
       </w:r>
@@ -6730,7 +6790,7 @@
       <w:pPr>
         <w:pStyle w:val="Ttulo2"/>
       </w:pPr>
-      <w:bookmarkStart w:id="14" w:name="_Toc207960373"/>
+      <w:bookmarkStart w:id="14" w:name="_Toc208571186"/>
       <w:r>
         <w:t>3.2 Convivencia vial</w:t>
       </w:r>
@@ -6766,7 +6826,7 @@
       <w:pPr>
         <w:pStyle w:val="Ttulo2"/>
       </w:pPr>
-      <w:bookmarkStart w:id="15" w:name="_Toc207960374"/>
+      <w:bookmarkStart w:id="15" w:name="_Toc208571187"/>
       <w:r>
         <w:t>3.3 Hábitos durante el desplazamiento por las vías como conductor, peatón o pasajero</w:t>
       </w:r>
@@ -6824,7 +6884,7 @@
       <w:pPr>
         <w:pStyle w:val="Ttulo1"/>
       </w:pPr>
-      <w:bookmarkStart w:id="16" w:name="_Toc207960375"/>
+      <w:bookmarkStart w:id="16" w:name="_Toc208571188"/>
       <w:r>
         <w:lastRenderedPageBreak/>
         <w:t>Código nacional de tránsito</w:t>
@@ -7109,7 +7169,7 @@
       <w:pPr>
         <w:pStyle w:val="Ttulo2"/>
       </w:pPr>
-      <w:bookmarkStart w:id="17" w:name="_Toc207960376"/>
+      <w:bookmarkStart w:id="17" w:name="_Toc208571189"/>
       <w:r>
         <w:t>4.1 Principios</w:t>
       </w:r>
@@ -7286,7 +7346,7 @@
       <w:pPr>
         <w:pStyle w:val="Ttulo2"/>
       </w:pPr>
-      <w:bookmarkStart w:id="18" w:name="_Toc207960377"/>
+      <w:bookmarkStart w:id="18" w:name="_Toc208571190"/>
       <w:r>
         <w:t>4.2 Autoridades</w:t>
       </w:r>
@@ -7440,7 +7500,7 @@
       <w:pPr>
         <w:pStyle w:val="Ttulo2"/>
       </w:pPr>
-      <w:bookmarkStart w:id="19" w:name="_Toc207960378"/>
+      <w:bookmarkStart w:id="19" w:name="_Toc208571191"/>
       <w:r>
         <w:t>4.3 Registro de información</w:t>
       </w:r>
@@ -7489,7 +7549,7 @@
       <w:pPr>
         <w:pStyle w:val="Ttulo2"/>
       </w:pPr>
-      <w:bookmarkStart w:id="20" w:name="_Toc207960379"/>
+      <w:bookmarkStart w:id="20" w:name="_Toc208571192"/>
       <w:r>
         <w:t>4.4 Licencias</w:t>
       </w:r>
@@ -7512,7 +7572,7 @@
       <w:pPr>
         <w:pStyle w:val="Ttulo2"/>
       </w:pPr>
-      <w:bookmarkStart w:id="21" w:name="_Toc207960380"/>
+      <w:bookmarkStart w:id="21" w:name="_Toc208571193"/>
       <w:r>
         <w:lastRenderedPageBreak/>
         <w:t>4.5 Condiciones del vehículo</w:t>
@@ -7735,7 +7795,31 @@
         <w:rPr>
           <w:lang w:val="es-419" w:eastAsia="es-CO"/>
         </w:rPr>
-        <w:t xml:space="preserve">El sistema de dirección permite controlar la trayectoria del vehículo, guiando las ruedas delanteras mediante el volante. Asegura maniobrabilidad, estabilidad y seguridad, e incluye mecanismos mecánicos, hidráulicos o eléctricos según el tipo de vehículo. Ésta compuesto por: </w:t>
+        <w:t xml:space="preserve">El sistema de dirección permite controlar la trayectoria del vehículo, guiando las ruedas delanteras mediante el volante. Asegura maniobrabilidad, estabilidad y seguridad, e incluye mecanismos mecánicos, hidráulicos o eléctricos según el tipo de vehículo. </w:t>
+      </w:r>
+      <w:r>
+        <w:rPr>
+          <w:lang w:val="es-419" w:eastAsia="es-CO"/>
+        </w:rPr>
+        <w:t>E</w:t>
+      </w:r>
+      <w:r>
+        <w:rPr>
+          <w:lang w:val="es-419" w:eastAsia="es-CO"/>
+        </w:rPr>
+        <w:t>st</w:t>
+      </w:r>
+      <w:r>
+        <w:rPr>
+          <w:lang w:val="es-419" w:eastAsia="es-CO"/>
+        </w:rPr>
+        <w:t>á</w:t>
+      </w:r>
+      <w:r>
+        <w:rPr>
+          <w:lang w:val="es-419" w:eastAsia="es-CO"/>
+        </w:rPr>
+        <w:t xml:space="preserve"> compuesto por: </w:t>
       </w:r>
     </w:p>
     <w:p>
@@ -8690,6 +8774,7 @@
       </w:pPr>
       <w:r>
         <w:rPr>
+          <w:noProof/>
           <w:lang w:val="es-419" w:eastAsia="es-CO"/>
         </w:rPr>
         <w:drawing>
@@ -8980,7 +9065,7 @@
       <w:pPr>
         <w:pStyle w:val="Ttulo2"/>
       </w:pPr>
-      <w:bookmarkStart w:id="22" w:name="_Toc207960381"/>
+      <w:bookmarkStart w:id="22" w:name="_Toc208571194"/>
       <w:r>
         <w:lastRenderedPageBreak/>
         <w:t>4.6 Seguros y responsabilidades del vehículo</w:t>
@@ -9881,7 +9966,7 @@
       <w:pPr>
         <w:pStyle w:val="Ttulo1"/>
       </w:pPr>
-      <w:bookmarkStart w:id="23" w:name="_Toc207960382"/>
+      <w:bookmarkStart w:id="23" w:name="_Toc208571195"/>
       <w:r>
         <w:lastRenderedPageBreak/>
         <w:t>Estatutos nacionales de transporte</w:t>
@@ -9972,7 +10057,7 @@
       <w:pPr>
         <w:pStyle w:val="Ttulo2"/>
       </w:pPr>
-      <w:bookmarkStart w:id="24" w:name="_Toc207960383"/>
+      <w:bookmarkStart w:id="24" w:name="_Toc208571196"/>
       <w:r>
         <w:t>5.1 Normas según transporte</w:t>
       </w:r>
@@ -10777,7 +10862,7 @@
       <w:pPr>
         <w:pStyle w:val="Ttulo2"/>
       </w:pPr>
-      <w:bookmarkStart w:id="25" w:name="_Toc207960384"/>
+      <w:bookmarkStart w:id="25" w:name="_Toc208571197"/>
       <w:r>
         <w:t>5.2 Límite de velocidad</w:t>
       </w:r>
@@ -10874,7 +10959,7 @@
       <w:pPr>
         <w:pStyle w:val="Ttulo2"/>
       </w:pPr>
-      <w:bookmarkStart w:id="26" w:name="_Toc207960385"/>
+      <w:bookmarkStart w:id="26" w:name="_Toc208571198"/>
       <w:r>
         <w:t>5.3 Tipos de infracción</w:t>
       </w:r>
@@ -10928,7 +11013,7 @@
       <w:pPr>
         <w:pStyle w:val="Ttulo2"/>
       </w:pPr>
-      <w:bookmarkStart w:id="27" w:name="_Toc207960386"/>
+      <w:bookmarkStart w:id="27" w:name="_Toc208571199"/>
       <w:r>
         <w:t>5.4 Sanciones</w:t>
       </w:r>
@@ -11242,7 +11327,7 @@
       <w:pPr>
         <w:pStyle w:val="Titulosgenerales"/>
       </w:pPr>
-      <w:bookmarkStart w:id="28" w:name="_Toc207960387"/>
+      <w:bookmarkStart w:id="28" w:name="_Toc208571200"/>
       <w:r>
         <w:lastRenderedPageBreak/>
         <w:t>Síntesis</w:t>
@@ -11350,7 +11435,7 @@
       <w:pPr>
         <w:pStyle w:val="Titulosgenerales"/>
       </w:pPr>
-      <w:bookmarkStart w:id="29" w:name="_Toc207960388"/>
+      <w:bookmarkStart w:id="29" w:name="_Toc208571201"/>
       <w:r>
         <w:lastRenderedPageBreak/>
         <w:t>Glosario</w:t>
@@ -11977,7 +12062,7 @@
       <w:pPr>
         <w:pStyle w:val="Titulosgenerales"/>
       </w:pPr>
-      <w:bookmarkStart w:id="30" w:name="_Toc207960389"/>
+      <w:bookmarkStart w:id="30" w:name="_Toc208571202"/>
       <w:r>
         <w:lastRenderedPageBreak/>
         <w:t>Material complementario</w:t>
@@ -12442,7 +12527,7 @@
       <w:pPr>
         <w:pStyle w:val="Titulosgenerales"/>
       </w:pPr>
-      <w:bookmarkStart w:id="31" w:name="_Toc207960390"/>
+      <w:bookmarkStart w:id="31" w:name="_Toc208571203"/>
       <w:r>
         <w:lastRenderedPageBreak/>
         <w:t>Referencias bibliográficas</w:t>
@@ -12900,7 +12985,7 @@
       <w:pPr>
         <w:pStyle w:val="Titulosgenerales"/>
       </w:pPr>
-      <w:bookmarkStart w:id="32" w:name="_Toc207960391"/>
+      <w:bookmarkStart w:id="32" w:name="_Toc208571204"/>
       <w:r>
         <w:lastRenderedPageBreak/>
         <w:t>C</w:t>
@@ -41569,6 +41654,21 @@
 </file>
 
 <file path=customXml/item2.xml><?xml version="1.0" encoding="utf-8"?>
+<p:properties xmlns:p="http://schemas.microsoft.com/office/2006/metadata/properties" xmlns:xsi="http://www.w3.org/2001/XMLSchema-instance" xmlns:pc="http://schemas.microsoft.com/office/infopath/2007/PartnerControls">
+  <documentManagement>
+    <TaxCatchAll xmlns="adccf511-daff-4bcb-9072-914cedbf4c7e" xsi:nil="true"/>
+    <lcf76f155ced4ddcb4097134ff3c332f xmlns="a70d3c18-0869-45a1-9f75-4b4b8f0f32be">
+      <Terms xmlns="http://schemas.microsoft.com/office/infopath/2007/PartnerControls"/>
+    </lcf76f155ced4ddcb4097134ff3c332f>
+  </documentManagement>
+</p:properties>
+</file>
+
+<file path=customXml/item3.xml><?xml version="1.0" encoding="utf-8"?>
+<b:Sources xmlns:b="http://schemas.openxmlformats.org/officeDocument/2006/bibliography" xmlns="http://schemas.openxmlformats.org/officeDocument/2006/bibliography" SelectedStyle="\APASixthEditionOfficeOnline.xsl" StyleName="APA" Version="6"/>
+</file>
+
+<file path=customXml/item4.xml><?xml version="1.0" encoding="utf-8"?>
 <ct:contentTypeSchema xmlns:ct="http://schemas.microsoft.com/office/2006/metadata/contentType" xmlns:ma="http://schemas.microsoft.com/office/2006/metadata/properties/metaAttributes" ct:_="" ma:_="" ma:contentTypeName="Documento" ma:contentTypeID="0x010100FC2B1768DD5A774EB396CCAB0DE361C1" ma:contentTypeVersion="11" ma:contentTypeDescription="Crear nuevo documento." ma:contentTypeScope="" ma:versionID="e4c9e5a511fbaffd8485e537f9595e10">
   <xsd:schema xmlns:xsd="http://www.w3.org/2001/XMLSchema" xmlns:xs="http://www.w3.org/2001/XMLSchema" xmlns:p="http://schemas.microsoft.com/office/2006/metadata/properties" xmlns:ns2="a70d3c18-0869-45a1-9f75-4b4b8f0f32be" xmlns:ns3="adccf511-daff-4bcb-9072-914cedbf4c7e" targetNamespace="http://schemas.microsoft.com/office/2006/metadata/properties" ma:root="true" ma:fieldsID="bbeeb7fdd5dcda06cd18867ba2c601ed" ns2:_="" ns3:_="">
     <xsd:import namespace="a70d3c18-0869-45a1-9f75-4b4b8f0f32be"/>
@@ -41763,21 +41863,6 @@
 </ct:contentTypeSchema>
 </file>
 
-<file path=customXml/item3.xml><?xml version="1.0" encoding="utf-8"?>
-<b:Sources xmlns:b="http://schemas.openxmlformats.org/officeDocument/2006/bibliography" xmlns="http://schemas.openxmlformats.org/officeDocument/2006/bibliography" SelectedStyle="\APASixthEditionOfficeOnline.xsl" StyleName="APA" Version="6"/>
-</file>
-
-<file path=customXml/item4.xml><?xml version="1.0" encoding="utf-8"?>
-<p:properties xmlns:p="http://schemas.microsoft.com/office/2006/metadata/properties" xmlns:xsi="http://www.w3.org/2001/XMLSchema-instance" xmlns:pc="http://schemas.microsoft.com/office/infopath/2007/PartnerControls">
-  <documentManagement>
-    <TaxCatchAll xmlns="adccf511-daff-4bcb-9072-914cedbf4c7e" xsi:nil="true"/>
-    <lcf76f155ced4ddcb4097134ff3c332f xmlns="a70d3c18-0869-45a1-9f75-4b4b8f0f32be">
-      <Terms xmlns="http://schemas.microsoft.com/office/infopath/2007/PartnerControls"/>
-    </lcf76f155ced4ddcb4097134ff3c332f>
-  </documentManagement>
-</p:properties>
-</file>
-
 <file path=customXml/itemProps1.xml><?xml version="1.0" encoding="utf-8"?>
 <ds:datastoreItem xmlns:ds="http://schemas.openxmlformats.org/officeDocument/2006/customXml" ds:itemID="{81CBDEC1-3B00-44ED-AD36-0268077980BA}">
   <ds:schemaRefs>
@@ -41787,7 +41872,14 @@
 </file>
 
 <file path=customXml/itemProps2.xml><?xml version="1.0" encoding="utf-8"?>
-<ds:datastoreItem xmlns:ds="http://schemas.openxmlformats.org/officeDocument/2006/customXml" ds:itemID="{AC0E2878-6D7F-4273-865E-A5CF6E7E80D3}"/>
+<ds:datastoreItem xmlns:ds="http://schemas.openxmlformats.org/officeDocument/2006/customXml" ds:itemID="{6929C9FE-9F22-4B98-96EF-1B541B3BD0B2}">
+  <ds:schemaRefs>
+    <ds:schemaRef ds:uri="http://schemas.microsoft.com/office/2006/metadata/properties"/>
+    <ds:schemaRef ds:uri="http://schemas.microsoft.com/office/infopath/2007/PartnerControls"/>
+    <ds:schemaRef ds:uri="cb45339b-ced9-4d0d-8f64-77573914d53b"/>
+    <ds:schemaRef ds:uri="43a3ca16-9c26-4813-b83f-4aec9927b43f"/>
+  </ds:schemaRefs>
+</ds:datastoreItem>
 </file>
 
 <file path=customXml/itemProps3.xml><?xml version="1.0" encoding="utf-8"?>
@@ -41799,12 +41891,5 @@
 </file>
 
 <file path=customXml/itemProps4.xml><?xml version="1.0" encoding="utf-8"?>
-<ds:datastoreItem xmlns:ds="http://schemas.openxmlformats.org/officeDocument/2006/customXml" ds:itemID="{6929C9FE-9F22-4B98-96EF-1B541B3BD0B2}">
-  <ds:schemaRefs>
-    <ds:schemaRef ds:uri="http://schemas.microsoft.com/office/2006/metadata/properties"/>
-    <ds:schemaRef ds:uri="http://schemas.microsoft.com/office/infopath/2007/PartnerControls"/>
-    <ds:schemaRef ds:uri="cb45339b-ced9-4d0d-8f64-77573914d53b"/>
-    <ds:schemaRef ds:uri="43a3ca16-9c26-4813-b83f-4aec9927b43f"/>
-  </ds:schemaRefs>
-</ds:datastoreItem>
+<ds:datastoreItem xmlns:ds="http://schemas.openxmlformats.org/officeDocument/2006/customXml" ds:itemID="{218BC262-8C5D-419B-B29D-9AD4F9960B57}"/>
 </file>
</xml_diff>

<commit_message>
Actualizado video y cfa
</commit_message>
<xml_diff>
--- a/fuentes/CFA1_82220017_DU.docx
+++ b/fuentes/CFA1_82220017_DU.docx
@@ -3027,13 +3027,7 @@
         <w:t xml:space="preserve">en los sistemas de transporte, promoviendo entornos más eficientes, accesibles y seguros para la comunidad. </w:t>
       </w:r>
       <w:r>
-        <w:t>Así</w:t>
-      </w:r>
-      <w:r>
-        <w:t xml:space="preserve"> </w:t>
-      </w:r>
-      <w:r>
-        <w:t>mismo, busca dotar al aprendiz</w:t>
+        <w:t>Así mismo, busca dotar al aprendiz</w:t>
       </w:r>
       <w:r>
         <w:t xml:space="preserve"> </w:t>
@@ -12625,7 +12619,7 @@
           <w:color w:val="000000" w:themeColor="text1"/>
           <w:lang w:eastAsia="es-CO"/>
         </w:rPr>
-        <w:t>Garrison</w:t>
+        <w:t xml:space="preserve">Garrison, W. </w:t>
       </w:r>
       <w:proofErr w:type="spellEnd"/>
       <w:r>
@@ -12633,7 +12627,7 @@
           <w:color w:val="000000" w:themeColor="text1"/>
           <w:lang w:eastAsia="es-CO"/>
         </w:rPr>
-        <w:t>, W. L., &amp; Levinson, D. M. (2014</w:t>
+        <w:t>L., &amp; Levinson, D. M. (2014</w:t>
       </w:r>
       <w:r>
         <w:rPr>
@@ -41645,15 +41639,6 @@
 </file>
 
 <file path=customXml/item1.xml><?xml version="1.0" encoding="utf-8"?>
-<?mso-contentType ?>
-<FormTemplates xmlns="http://schemas.microsoft.com/sharepoint/v3/contenttype/forms">
-  <Display>DocumentLibraryForm</Display>
-  <Edit>DocumentLibraryForm</Edit>
-  <New>DocumentLibraryForm</New>
-</FormTemplates>
-</file>
-
-<file path=customXml/item2.xml><?xml version="1.0" encoding="utf-8"?>
 <p:properties xmlns:p="http://schemas.microsoft.com/office/2006/metadata/properties" xmlns:xsi="http://www.w3.org/2001/XMLSchema-instance" xmlns:pc="http://schemas.microsoft.com/office/infopath/2007/PartnerControls">
   <documentManagement>
     <TaxCatchAll xmlns="adccf511-daff-4bcb-9072-914cedbf4c7e" xsi:nil="true"/>
@@ -41664,11 +41649,16 @@
 </p:properties>
 </file>
 
-<file path=customXml/item3.xml><?xml version="1.0" encoding="utf-8"?>
-<b:Sources xmlns:b="http://schemas.openxmlformats.org/officeDocument/2006/bibliography" xmlns="http://schemas.openxmlformats.org/officeDocument/2006/bibliography" SelectedStyle="\APASixthEditionOfficeOnline.xsl" StyleName="APA" Version="6"/>
+<file path=customXml/item2.xml><?xml version="1.0" encoding="utf-8"?>
+<?mso-contentType ?>
+<FormTemplates xmlns="http://schemas.microsoft.com/sharepoint/v3/contenttype/forms">
+  <Display>DocumentLibraryForm</Display>
+  <Edit>DocumentLibraryForm</Edit>
+  <New>DocumentLibraryForm</New>
+</FormTemplates>
 </file>
 
-<file path=customXml/item4.xml><?xml version="1.0" encoding="utf-8"?>
+<file path=customXml/item3.xml><?xml version="1.0" encoding="utf-8"?>
 <ct:contentTypeSchema xmlns:ct="http://schemas.microsoft.com/office/2006/metadata/contentType" xmlns:ma="http://schemas.microsoft.com/office/2006/metadata/properties/metaAttributes" ct:_="" ma:_="" ma:contentTypeName="Documento" ma:contentTypeID="0x010100FC2B1768DD5A774EB396CCAB0DE361C1" ma:contentTypeVersion="11" ma:contentTypeDescription="Crear nuevo documento." ma:contentTypeScope="" ma:versionID="e4c9e5a511fbaffd8485e537f9595e10">
   <xsd:schema xmlns:xsd="http://www.w3.org/2001/XMLSchema" xmlns:xs="http://www.w3.org/2001/XMLSchema" xmlns:p="http://schemas.microsoft.com/office/2006/metadata/properties" xmlns:ns2="a70d3c18-0869-45a1-9f75-4b4b8f0f32be" xmlns:ns3="adccf511-daff-4bcb-9072-914cedbf4c7e" targetNamespace="http://schemas.microsoft.com/office/2006/metadata/properties" ma:root="true" ma:fieldsID="bbeeb7fdd5dcda06cd18867ba2c601ed" ns2:_="" ns3:_="">
     <xsd:import namespace="a70d3c18-0869-45a1-9f75-4b4b8f0f32be"/>
@@ -41863,15 +41853,11 @@
 </ct:contentTypeSchema>
 </file>
 
-<file path=customXml/itemProps1.xml><?xml version="1.0" encoding="utf-8"?>
-<ds:datastoreItem xmlns:ds="http://schemas.openxmlformats.org/officeDocument/2006/customXml" ds:itemID="{81CBDEC1-3B00-44ED-AD36-0268077980BA}">
-  <ds:schemaRefs>
-    <ds:schemaRef ds:uri="http://schemas.microsoft.com/sharepoint/v3/contenttype/forms"/>
-  </ds:schemaRefs>
-</ds:datastoreItem>
+<file path=customXml/item4.xml><?xml version="1.0" encoding="utf-8"?>
+<b:Sources xmlns:b="http://schemas.openxmlformats.org/officeDocument/2006/bibliography" xmlns="http://schemas.openxmlformats.org/officeDocument/2006/bibliography" SelectedStyle="\APASixthEditionOfficeOnline.xsl" StyleName="APA" Version="6"/>
 </file>
 
-<file path=customXml/itemProps2.xml><?xml version="1.0" encoding="utf-8"?>
+<file path=customXml/itemProps1.xml><?xml version="1.0" encoding="utf-8"?>
 <ds:datastoreItem xmlns:ds="http://schemas.openxmlformats.org/officeDocument/2006/customXml" ds:itemID="{6929C9FE-9F22-4B98-96EF-1B541B3BD0B2}">
   <ds:schemaRefs>
     <ds:schemaRef ds:uri="http://schemas.microsoft.com/office/2006/metadata/properties"/>
@@ -41882,14 +41868,22 @@
 </ds:datastoreItem>
 </file>
 
+<file path=customXml/itemProps2.xml><?xml version="1.0" encoding="utf-8"?>
+<ds:datastoreItem xmlns:ds="http://schemas.openxmlformats.org/officeDocument/2006/customXml" ds:itemID="{81CBDEC1-3B00-44ED-AD36-0268077980BA}">
+  <ds:schemaRefs>
+    <ds:schemaRef ds:uri="http://schemas.microsoft.com/sharepoint/v3/contenttype/forms"/>
+  </ds:schemaRefs>
+</ds:datastoreItem>
+</file>
+
 <file path=customXml/itemProps3.xml><?xml version="1.0" encoding="utf-8"?>
+<ds:datastoreItem xmlns:ds="http://schemas.openxmlformats.org/officeDocument/2006/customXml" ds:itemID="{7C23658B-6425-4EA9-A63C-0488E52A4E79}"/>
+</file>
+
+<file path=customXml/itemProps4.xml><?xml version="1.0" encoding="utf-8"?>
 <ds:datastoreItem xmlns:ds="http://schemas.openxmlformats.org/officeDocument/2006/customXml" ds:itemID="{E8AB44A3-7C62-4BD2-82ED-8ABC209970FA}">
   <ds:schemaRefs>
     <ds:schemaRef ds:uri="http://schemas.openxmlformats.org/officeDocument/2006/bibliography"/>
   </ds:schemaRefs>
 </ds:datastoreItem>
-</file>
-
-<file path=customXml/itemProps4.xml><?xml version="1.0" encoding="utf-8"?>
-<ds:datastoreItem xmlns:ds="http://schemas.openxmlformats.org/officeDocument/2006/customXml" ds:itemID="{218BC262-8C5D-419B-B29D-9AD4F9960B57}"/>
 </file>
</xml_diff>

<commit_message>
Ajustes de hallagos de repositorio
</commit_message>
<xml_diff>
--- a/fuentes/CFA1_82220017_DU.docx
+++ b/fuentes/CFA1_82220017_DU.docx
@@ -543,7 +543,7 @@
           <w:r>
             <w:fldChar w:fldCharType="separate"/>
           </w:r>
-          <w:hyperlink w:anchor="_Toc208571172" w:history="1">
+          <w:hyperlink w:anchor="_Toc209191645" w:history="1">
             <w:r>
               <w:rPr>
                 <w:rStyle w:val="Hipervnculo"/>
@@ -570,7 +570,7 @@
                 <w:noProof/>
                 <w:webHidden/>
               </w:rPr>
-              <w:instrText xml:space="preserve"> PAGEREF _Toc208571172 \h </w:instrText>
+              <w:instrText xml:space="preserve"> PAGEREF _Toc209191645 \h </w:instrText>
             </w:r>
             <w:r>
               <w:rPr>
@@ -616,7 +616,7 @@
               <w:lang w:eastAsia="es-MX"/>
             </w:rPr>
           </w:pPr>
-          <w:hyperlink w:anchor="_Toc208571173" w:history="1">
+          <w:hyperlink w:anchor="_Toc209191646" w:history="1">
             <w:r>
               <w:rPr>
                 <w:rStyle w:val="Hipervnculo"/>
@@ -660,7 +660,7 @@
                 <w:noProof/>
                 <w:webHidden/>
               </w:rPr>
-              <w:instrText xml:space="preserve"> PAGEREF _Toc208571173 \h </w:instrText>
+              <w:instrText xml:space="preserve"> PAGEREF _Toc209191646 \h </w:instrText>
             </w:r>
             <w:r>
               <w:rPr>
@@ -702,7 +702,7 @@
               <w:lang w:eastAsia="es-MX"/>
             </w:rPr>
           </w:pPr>
-          <w:hyperlink w:anchor="_Toc208571174" w:history="1">
+          <w:hyperlink w:anchor="_Toc209191647" w:history="1">
             <w:r>
               <w:rPr>
                 <w:rStyle w:val="Hipervnculo"/>
@@ -746,7 +746,7 @@
                 <w:noProof/>
                 <w:webHidden/>
               </w:rPr>
-              <w:instrText xml:space="preserve"> PAGEREF _Toc208571174 \h </w:instrText>
+              <w:instrText xml:space="preserve"> PAGEREF _Toc209191647 \h </w:instrText>
             </w:r>
             <w:r>
               <w:rPr>
@@ -788,7 +788,7 @@
               <w:lang w:eastAsia="es-MX"/>
             </w:rPr>
           </w:pPr>
-          <w:hyperlink w:anchor="_Toc208571175" w:history="1">
+          <w:hyperlink w:anchor="_Toc209191648" w:history="1">
             <w:r>
               <w:rPr>
                 <w:rStyle w:val="Hipervnculo"/>
@@ -832,7 +832,7 @@
                 <w:noProof/>
                 <w:webHidden/>
               </w:rPr>
-              <w:instrText xml:space="preserve"> PAGEREF _Toc208571175 \h </w:instrText>
+              <w:instrText xml:space="preserve"> PAGEREF _Toc209191648 \h </w:instrText>
             </w:r>
             <w:r>
               <w:rPr>
@@ -874,7 +874,7 @@
               <w:lang w:eastAsia="es-MX"/>
             </w:rPr>
           </w:pPr>
-          <w:hyperlink w:anchor="_Toc208571176" w:history="1">
+          <w:hyperlink w:anchor="_Toc209191649" w:history="1">
             <w:r>
               <w:rPr>
                 <w:rStyle w:val="Hipervnculo"/>
@@ -918,7 +918,7 @@
                 <w:noProof/>
                 <w:webHidden/>
               </w:rPr>
-              <w:instrText xml:space="preserve"> PAGEREF _Toc208571176 \h </w:instrText>
+              <w:instrText xml:space="preserve"> PAGEREF _Toc209191649 \h </w:instrText>
             </w:r>
             <w:r>
               <w:rPr>
@@ -960,7 +960,7 @@
               <w:lang w:eastAsia="es-MX"/>
             </w:rPr>
           </w:pPr>
-          <w:hyperlink w:anchor="_Toc208571177" w:history="1">
+          <w:hyperlink w:anchor="_Toc209191650" w:history="1">
             <w:r>
               <w:rPr>
                 <w:rStyle w:val="Hipervnculo"/>
@@ -987,7 +987,7 @@
                 <w:noProof/>
                 <w:webHidden/>
               </w:rPr>
-              <w:instrText xml:space="preserve"> PAGEREF _Toc208571177 \h </w:instrText>
+              <w:instrText xml:space="preserve"> PAGEREF _Toc209191650 \h </w:instrText>
             </w:r>
             <w:r>
               <w:rPr>
@@ -1029,7 +1029,7 @@
               <w:lang w:eastAsia="es-MX"/>
             </w:rPr>
           </w:pPr>
-          <w:hyperlink w:anchor="_Toc208571178" w:history="1">
+          <w:hyperlink w:anchor="_Toc209191651" w:history="1">
             <w:r>
               <w:rPr>
                 <w:rStyle w:val="Hipervnculo"/>
@@ -1056,7 +1056,7 @@
                 <w:noProof/>
                 <w:webHidden/>
               </w:rPr>
-              <w:instrText xml:space="preserve"> PAGEREF _Toc208571178 \h </w:instrText>
+              <w:instrText xml:space="preserve"> PAGEREF _Toc209191651 \h </w:instrText>
             </w:r>
             <w:r>
               <w:rPr>
@@ -1102,7 +1102,7 @@
               <w:lang w:eastAsia="es-MX"/>
             </w:rPr>
           </w:pPr>
-          <w:hyperlink w:anchor="_Toc208571179" w:history="1">
+          <w:hyperlink w:anchor="_Toc209191652" w:history="1">
             <w:r>
               <w:rPr>
                 <w:rStyle w:val="Hipervnculo"/>
@@ -1146,7 +1146,7 @@
                 <w:noProof/>
                 <w:webHidden/>
               </w:rPr>
-              <w:instrText xml:space="preserve"> PAGEREF _Toc208571179 \h </w:instrText>
+              <w:instrText xml:space="preserve"> PAGEREF _Toc209191652 \h </w:instrText>
             </w:r>
             <w:r>
               <w:rPr>
@@ -1188,7 +1188,7 @@
               <w:lang w:eastAsia="es-MX"/>
             </w:rPr>
           </w:pPr>
-          <w:hyperlink w:anchor="_Toc208571180" w:history="1">
+          <w:hyperlink w:anchor="_Toc209191653" w:history="1">
             <w:r>
               <w:rPr>
                 <w:rStyle w:val="Hipervnculo"/>
@@ -1215,7 +1215,7 @@
                 <w:noProof/>
                 <w:webHidden/>
               </w:rPr>
-              <w:instrText xml:space="preserve"> PAGEREF _Toc208571180 \h </w:instrText>
+              <w:instrText xml:space="preserve"> PAGEREF _Toc209191653 \h </w:instrText>
             </w:r>
             <w:r>
               <w:rPr>
@@ -1257,7 +1257,7 @@
               <w:lang w:eastAsia="es-MX"/>
             </w:rPr>
           </w:pPr>
-          <w:hyperlink w:anchor="_Toc208571181" w:history="1">
+          <w:hyperlink w:anchor="_Toc209191654" w:history="1">
             <w:r>
               <w:rPr>
                 <w:rStyle w:val="Hipervnculo"/>
@@ -1284,7 +1284,7 @@
                 <w:noProof/>
                 <w:webHidden/>
               </w:rPr>
-              <w:instrText xml:space="preserve"> PAGEREF _Toc208571181 \h </w:instrText>
+              <w:instrText xml:space="preserve"> PAGEREF _Toc209191654 \h </w:instrText>
             </w:r>
             <w:r>
               <w:rPr>
@@ -1326,7 +1326,7 @@
               <w:lang w:eastAsia="es-MX"/>
             </w:rPr>
           </w:pPr>
-          <w:hyperlink w:anchor="_Toc208571182" w:history="1">
+          <w:hyperlink w:anchor="_Toc209191655" w:history="1">
             <w:r>
               <w:rPr>
                 <w:rStyle w:val="Hipervnculo"/>
@@ -1353,7 +1353,7 @@
                 <w:noProof/>
                 <w:webHidden/>
               </w:rPr>
-              <w:instrText xml:space="preserve"> PAGEREF _Toc208571182 \h </w:instrText>
+              <w:instrText xml:space="preserve"> PAGEREF _Toc209191655 \h </w:instrText>
             </w:r>
             <w:r>
               <w:rPr>
@@ -1395,7 +1395,7 @@
               <w:lang w:eastAsia="es-MX"/>
             </w:rPr>
           </w:pPr>
-          <w:hyperlink w:anchor="_Toc208571183" w:history="1">
+          <w:hyperlink w:anchor="_Toc209191656" w:history="1">
             <w:r>
               <w:rPr>
                 <w:rStyle w:val="Hipervnculo"/>
@@ -1422,7 +1422,7 @@
                 <w:noProof/>
                 <w:webHidden/>
               </w:rPr>
-              <w:instrText xml:space="preserve"> PAGEREF _Toc208571183 \h </w:instrText>
+              <w:instrText xml:space="preserve"> PAGEREF _Toc209191656 \h </w:instrText>
             </w:r>
             <w:r>
               <w:rPr>
@@ -1468,7 +1468,7 @@
               <w:lang w:eastAsia="es-MX"/>
             </w:rPr>
           </w:pPr>
-          <w:hyperlink w:anchor="_Toc208571184" w:history="1">
+          <w:hyperlink w:anchor="_Toc209191657" w:history="1">
             <w:r>
               <w:rPr>
                 <w:rStyle w:val="Hipervnculo"/>
@@ -1515,7 +1515,7 @@
                 <w:noProof/>
                 <w:webHidden/>
               </w:rPr>
-              <w:instrText xml:space="preserve"> PAGEREF _Toc208571184 \h </w:instrText>
+              <w:instrText xml:space="preserve"> PAGEREF _Toc209191657 \h </w:instrText>
             </w:r>
             <w:r>
               <w:rPr>
@@ -1557,7 +1557,7 @@
               <w:lang w:eastAsia="es-MX"/>
             </w:rPr>
           </w:pPr>
-          <w:hyperlink w:anchor="_Toc208571185" w:history="1">
+          <w:hyperlink w:anchor="_Toc209191658" w:history="1">
             <w:r>
               <w:rPr>
                 <w:rStyle w:val="Hipervnculo"/>
@@ -1584,7 +1584,7 @@
                 <w:noProof/>
                 <w:webHidden/>
               </w:rPr>
-              <w:instrText xml:space="preserve"> PAGEREF _Toc208571185 \h </w:instrText>
+              <w:instrText xml:space="preserve"> PAGEREF _Toc209191658 \h </w:instrText>
             </w:r>
             <w:r>
               <w:rPr>
@@ -1626,7 +1626,7 @@
               <w:lang w:eastAsia="es-MX"/>
             </w:rPr>
           </w:pPr>
-          <w:hyperlink w:anchor="_Toc208571186" w:history="1">
+          <w:hyperlink w:anchor="_Toc209191659" w:history="1">
             <w:r>
               <w:rPr>
                 <w:rStyle w:val="Hipervnculo"/>
@@ -1653,7 +1653,7 @@
                 <w:noProof/>
                 <w:webHidden/>
               </w:rPr>
-              <w:instrText xml:space="preserve"> PAGEREF _Toc208571186 \h </w:instrText>
+              <w:instrText xml:space="preserve"> PAGEREF _Toc209191659 \h </w:instrText>
             </w:r>
             <w:r>
               <w:rPr>
@@ -1695,7 +1695,7 @@
               <w:lang w:eastAsia="es-MX"/>
             </w:rPr>
           </w:pPr>
-          <w:hyperlink w:anchor="_Toc208571187" w:history="1">
+          <w:hyperlink w:anchor="_Toc209191660" w:history="1">
             <w:r>
               <w:rPr>
                 <w:rStyle w:val="Hipervnculo"/>
@@ -1722,7 +1722,7 @@
                 <w:noProof/>
                 <w:webHidden/>
               </w:rPr>
-              <w:instrText xml:space="preserve"> PAGEREF _Toc208571187 \h </w:instrText>
+              <w:instrText xml:space="preserve"> PAGEREF _Toc209191660 \h </w:instrText>
             </w:r>
             <w:r>
               <w:rPr>
@@ -1768,7 +1768,7 @@
               <w:lang w:eastAsia="es-MX"/>
             </w:rPr>
           </w:pPr>
-          <w:hyperlink w:anchor="_Toc208571188" w:history="1">
+          <w:hyperlink w:anchor="_Toc209191661" w:history="1">
             <w:r>
               <w:rPr>
                 <w:rStyle w:val="Hipervnculo"/>
@@ -1791,7 +1791,7 @@
                 <w:rStyle w:val="Hipervnculo"/>
                 <w:noProof/>
               </w:rPr>
-              <w:t>Código nacional de tránsito</w:t>
+              <w:t>Código Nacional de Tránsito</w:t>
             </w:r>
             <w:r>
               <w:rPr>
@@ -1812,7 +1812,7 @@
                 <w:noProof/>
                 <w:webHidden/>
               </w:rPr>
-              <w:instrText xml:space="preserve"> PAGEREF _Toc208571188 \h </w:instrText>
+              <w:instrText xml:space="preserve"> PAGEREF _Toc209191661 \h </w:instrText>
             </w:r>
             <w:r>
               <w:rPr>
@@ -1854,7 +1854,7 @@
               <w:lang w:eastAsia="es-MX"/>
             </w:rPr>
           </w:pPr>
-          <w:hyperlink w:anchor="_Toc208571189" w:history="1">
+          <w:hyperlink w:anchor="_Toc209191662" w:history="1">
             <w:r>
               <w:rPr>
                 <w:rStyle w:val="Hipervnculo"/>
@@ -1881,7 +1881,7 @@
                 <w:noProof/>
                 <w:webHidden/>
               </w:rPr>
-              <w:instrText xml:space="preserve"> PAGEREF _Toc208571189 \h </w:instrText>
+              <w:instrText xml:space="preserve"> PAGEREF _Toc209191662 \h </w:instrText>
             </w:r>
             <w:r>
               <w:rPr>
@@ -1923,7 +1923,7 @@
               <w:lang w:eastAsia="es-MX"/>
             </w:rPr>
           </w:pPr>
-          <w:hyperlink w:anchor="_Toc208571190" w:history="1">
+          <w:hyperlink w:anchor="_Toc209191663" w:history="1">
             <w:r>
               <w:rPr>
                 <w:rStyle w:val="Hipervnculo"/>
@@ -1950,7 +1950,7 @@
                 <w:noProof/>
                 <w:webHidden/>
               </w:rPr>
-              <w:instrText xml:space="preserve"> PAGEREF _Toc208571190 \h </w:instrText>
+              <w:instrText xml:space="preserve"> PAGEREF _Toc209191663 \h </w:instrText>
             </w:r>
             <w:r>
               <w:rPr>
@@ -1992,7 +1992,7 @@
               <w:lang w:eastAsia="es-MX"/>
             </w:rPr>
           </w:pPr>
-          <w:hyperlink w:anchor="_Toc208571191" w:history="1">
+          <w:hyperlink w:anchor="_Toc209191664" w:history="1">
             <w:r>
               <w:rPr>
                 <w:rStyle w:val="Hipervnculo"/>
@@ -2019,7 +2019,7 @@
                 <w:noProof/>
                 <w:webHidden/>
               </w:rPr>
-              <w:instrText xml:space="preserve"> PAGEREF _Toc208571191 \h </w:instrText>
+              <w:instrText xml:space="preserve"> PAGEREF _Toc209191664 \h </w:instrText>
             </w:r>
             <w:r>
               <w:rPr>
@@ -2061,7 +2061,7 @@
               <w:lang w:eastAsia="es-MX"/>
             </w:rPr>
           </w:pPr>
-          <w:hyperlink w:anchor="_Toc208571192" w:history="1">
+          <w:hyperlink w:anchor="_Toc209191665" w:history="1">
             <w:r>
               <w:rPr>
                 <w:rStyle w:val="Hipervnculo"/>
@@ -2088,7 +2088,7 @@
                 <w:noProof/>
                 <w:webHidden/>
               </w:rPr>
-              <w:instrText xml:space="preserve"> PAGEREF _Toc208571192 \h </w:instrText>
+              <w:instrText xml:space="preserve"> PAGEREF _Toc209191665 \h </w:instrText>
             </w:r>
             <w:r>
               <w:rPr>
@@ -2130,7 +2130,7 @@
               <w:lang w:eastAsia="es-MX"/>
             </w:rPr>
           </w:pPr>
-          <w:hyperlink w:anchor="_Toc208571193" w:history="1">
+          <w:hyperlink w:anchor="_Toc209191666" w:history="1">
             <w:r>
               <w:rPr>
                 <w:rStyle w:val="Hipervnculo"/>
@@ -2157,7 +2157,7 @@
                 <w:noProof/>
                 <w:webHidden/>
               </w:rPr>
-              <w:instrText xml:space="preserve"> PAGEREF _Toc208571193 \h </w:instrText>
+              <w:instrText xml:space="preserve"> PAGEREF _Toc209191666 \h </w:instrText>
             </w:r>
             <w:r>
               <w:rPr>
@@ -2199,7 +2199,7 @@
               <w:lang w:eastAsia="es-MX"/>
             </w:rPr>
           </w:pPr>
-          <w:hyperlink w:anchor="_Toc208571194" w:history="1">
+          <w:hyperlink w:anchor="_Toc209191667" w:history="1">
             <w:r>
               <w:rPr>
                 <w:rStyle w:val="Hipervnculo"/>
@@ -2226,7 +2226,7 @@
                 <w:noProof/>
                 <w:webHidden/>
               </w:rPr>
-              <w:instrText xml:space="preserve"> PAGEREF _Toc208571194 \h </w:instrText>
+              <w:instrText xml:space="preserve"> PAGEREF _Toc209191667 \h </w:instrText>
             </w:r>
             <w:r>
               <w:rPr>
@@ -2272,7 +2272,7 @@
               <w:lang w:eastAsia="es-MX"/>
             </w:rPr>
           </w:pPr>
-          <w:hyperlink w:anchor="_Toc208571195" w:history="1">
+          <w:hyperlink w:anchor="_Toc209191668" w:history="1">
             <w:r>
               <w:rPr>
                 <w:rStyle w:val="Hipervnculo"/>
@@ -2295,7 +2295,7 @@
                 <w:rStyle w:val="Hipervnculo"/>
                 <w:noProof/>
               </w:rPr>
-              <w:t>Estatutos nacionales de transporte</w:t>
+              <w:t>Estatutos Nacionales de Transporte</w:t>
             </w:r>
             <w:r>
               <w:rPr>
@@ -2316,7 +2316,7 @@
                 <w:noProof/>
                 <w:webHidden/>
               </w:rPr>
-              <w:instrText xml:space="preserve"> PAGEREF _Toc208571195 \h </w:instrText>
+              <w:instrText xml:space="preserve"> PAGEREF _Toc209191668 \h </w:instrText>
             </w:r>
             <w:r>
               <w:rPr>
@@ -2358,13 +2358,13 @@
               <w:lang w:eastAsia="es-MX"/>
             </w:rPr>
           </w:pPr>
-          <w:hyperlink w:anchor="_Toc208571196" w:history="1">
+          <w:hyperlink w:anchor="_Toc209191669" w:history="1">
             <w:r>
               <w:rPr>
                 <w:rStyle w:val="Hipervnculo"/>
                 <w:noProof/>
               </w:rPr>
-              <w:t>5.1 Normas según transporte</w:t>
+              <w:t>5.1 Normas según tipo de transporte</w:t>
             </w:r>
             <w:r>
               <w:rPr>
@@ -2385,7 +2385,7 @@
                 <w:noProof/>
                 <w:webHidden/>
               </w:rPr>
-              <w:instrText xml:space="preserve"> PAGEREF _Toc208571196 \h </w:instrText>
+              <w:instrText xml:space="preserve"> PAGEREF _Toc209191669 \h </w:instrText>
             </w:r>
             <w:r>
               <w:rPr>
@@ -2427,7 +2427,7 @@
               <w:lang w:eastAsia="es-MX"/>
             </w:rPr>
           </w:pPr>
-          <w:hyperlink w:anchor="_Toc208571197" w:history="1">
+          <w:hyperlink w:anchor="_Toc209191670" w:history="1">
             <w:r>
               <w:rPr>
                 <w:rStyle w:val="Hipervnculo"/>
@@ -2454,7 +2454,7 @@
                 <w:noProof/>
                 <w:webHidden/>
               </w:rPr>
-              <w:instrText xml:space="preserve"> PAGEREF _Toc208571197 \h </w:instrText>
+              <w:instrText xml:space="preserve"> PAGEREF _Toc209191670 \h </w:instrText>
             </w:r>
             <w:r>
               <w:rPr>
@@ -2496,7 +2496,7 @@
               <w:lang w:eastAsia="es-MX"/>
             </w:rPr>
           </w:pPr>
-          <w:hyperlink w:anchor="_Toc208571198" w:history="1">
+          <w:hyperlink w:anchor="_Toc209191671" w:history="1">
             <w:r>
               <w:rPr>
                 <w:rStyle w:val="Hipervnculo"/>
@@ -2523,7 +2523,7 @@
                 <w:noProof/>
                 <w:webHidden/>
               </w:rPr>
-              <w:instrText xml:space="preserve"> PAGEREF _Toc208571198 \h </w:instrText>
+              <w:instrText xml:space="preserve"> PAGEREF _Toc209191671 \h </w:instrText>
             </w:r>
             <w:r>
               <w:rPr>
@@ -2565,7 +2565,7 @@
               <w:lang w:eastAsia="es-MX"/>
             </w:rPr>
           </w:pPr>
-          <w:hyperlink w:anchor="_Toc208571199" w:history="1">
+          <w:hyperlink w:anchor="_Toc209191672" w:history="1">
             <w:r>
               <w:rPr>
                 <w:rStyle w:val="Hipervnculo"/>
@@ -2592,7 +2592,7 @@
                 <w:noProof/>
                 <w:webHidden/>
               </w:rPr>
-              <w:instrText xml:space="preserve"> PAGEREF _Toc208571199 \h </w:instrText>
+              <w:instrText xml:space="preserve"> PAGEREF _Toc209191672 \h </w:instrText>
             </w:r>
             <w:r>
               <w:rPr>
@@ -2637,7 +2637,7 @@
               <w:lang w:eastAsia="es-MX"/>
             </w:rPr>
           </w:pPr>
-          <w:hyperlink w:anchor="_Toc208571200" w:history="1">
+          <w:hyperlink w:anchor="_Toc209191673" w:history="1">
             <w:r>
               <w:rPr>
                 <w:rStyle w:val="Hipervnculo"/>
@@ -2664,7 +2664,7 @@
                 <w:noProof/>
                 <w:webHidden/>
               </w:rPr>
-              <w:instrText xml:space="preserve"> PAGEREF _Toc208571200 \h </w:instrText>
+              <w:instrText xml:space="preserve"> PAGEREF _Toc209191673 \h </w:instrText>
             </w:r>
             <w:r>
               <w:rPr>
@@ -2709,7 +2709,7 @@
               <w:lang w:eastAsia="es-MX"/>
             </w:rPr>
           </w:pPr>
-          <w:hyperlink w:anchor="_Toc208571201" w:history="1">
+          <w:hyperlink w:anchor="_Toc209191674" w:history="1">
             <w:r>
               <w:rPr>
                 <w:rStyle w:val="Hipervnculo"/>
@@ -2736,7 +2736,7 @@
                 <w:noProof/>
                 <w:webHidden/>
               </w:rPr>
-              <w:instrText xml:space="preserve"> PAGEREF _Toc208571201 \h </w:instrText>
+              <w:instrText xml:space="preserve"> PAGEREF _Toc209191674 \h </w:instrText>
             </w:r>
             <w:r>
               <w:rPr>
@@ -2781,7 +2781,7 @@
               <w:lang w:eastAsia="es-MX"/>
             </w:rPr>
           </w:pPr>
-          <w:hyperlink w:anchor="_Toc208571202" w:history="1">
+          <w:hyperlink w:anchor="_Toc209191675" w:history="1">
             <w:r>
               <w:rPr>
                 <w:rStyle w:val="Hipervnculo"/>
@@ -2808,7 +2808,7 @@
                 <w:noProof/>
                 <w:webHidden/>
               </w:rPr>
-              <w:instrText xml:space="preserve"> PAGEREF _Toc208571202 \h </w:instrText>
+              <w:instrText xml:space="preserve"> PAGEREF _Toc209191675 \h </w:instrText>
             </w:r>
             <w:r>
               <w:rPr>
@@ -2853,7 +2853,7 @@
               <w:lang w:eastAsia="es-MX"/>
             </w:rPr>
           </w:pPr>
-          <w:hyperlink w:anchor="_Toc208571203" w:history="1">
+          <w:hyperlink w:anchor="_Toc209191676" w:history="1">
             <w:r>
               <w:rPr>
                 <w:rStyle w:val="Hipervnculo"/>
@@ -2880,7 +2880,7 @@
                 <w:noProof/>
                 <w:webHidden/>
               </w:rPr>
-              <w:instrText xml:space="preserve"> PAGEREF _Toc208571203 \h </w:instrText>
+              <w:instrText xml:space="preserve"> PAGEREF _Toc209191676 \h </w:instrText>
             </w:r>
             <w:r>
               <w:rPr>
@@ -2925,7 +2925,7 @@
               <w:lang w:eastAsia="es-MX"/>
             </w:rPr>
           </w:pPr>
-          <w:hyperlink w:anchor="_Toc208571204" w:history="1">
+          <w:hyperlink w:anchor="_Toc209191677" w:history="1">
             <w:r>
               <w:rPr>
                 <w:rStyle w:val="Hipervnculo"/>
@@ -2952,7 +2952,7 @@
                 <w:noProof/>
                 <w:webHidden/>
               </w:rPr>
-              <w:instrText xml:space="preserve"> PAGEREF _Toc208571204 \h </w:instrText>
+              <w:instrText xml:space="preserve"> PAGEREF _Toc209191677 \h </w:instrText>
             </w:r>
             <w:r>
               <w:rPr>
@@ -3009,7 +3009,7 @@
       <w:pPr>
         <w:pStyle w:val="Titulosgenerales"/>
       </w:pPr>
-      <w:bookmarkStart w:id="0" w:name="_Toc208571172"/>
+      <w:bookmarkStart w:id="0" w:name="_Toc209191645"/>
       <w:r>
         <w:lastRenderedPageBreak/>
         <w:t>Introducción</w:t>
@@ -3027,13 +3027,19 @@
         <w:t xml:space="preserve">en los sistemas de transporte, promoviendo entornos más eficientes, accesibles y seguros para la comunidad. </w:t>
       </w:r>
       <w:r>
-        <w:t>Así mismo, busca dotar al aprendiz</w:t>
+        <w:t>As</w:t>
+      </w:r>
+      <w:r>
+        <w:t>i</w:t>
+      </w:r>
+      <w:r>
+        <w:t>mismo, busca dotar al aprendiz</w:t>
       </w:r>
       <w:r>
         <w:t xml:space="preserve"> </w:t>
       </w:r>
       <w:r>
-        <w:t>al aprendiz de fundamentos que le permitan interpretar su realidad empresarial con mayor claridad y proyección</w:t>
+        <w:t>de fundamentos que le permitan interpretar su realidad empresarial con mayor claridad y proyección</w:t>
       </w:r>
       <w:r>
         <w:t>.</w:t>
@@ -3138,6 +3144,7 @@
             <w:rStyle w:val="Hipervnculo"/>
             <w:b/>
             <w:bCs/>
+            <w:color w:val="000000" w:themeColor="text1"/>
             <w:lang w:val="es-419"/>
           </w:rPr>
           <w:t>Enlace de reproducción del video</w:t>
@@ -3263,7 +3270,7 @@
       <w:pPr>
         <w:pStyle w:val="Ttulo1"/>
       </w:pPr>
-      <w:bookmarkStart w:id="1" w:name="_Toc208571173"/>
+      <w:bookmarkStart w:id="1" w:name="_Toc209191646"/>
       <w:r>
         <w:lastRenderedPageBreak/>
         <w:t>Transporte terrestre</w:t>
@@ -3300,7 +3307,7 @@
           <w:rFonts w:eastAsia="Times New Roman"/>
         </w:rPr>
       </w:pPr>
-      <w:bookmarkStart w:id="2" w:name="_Toc208571174"/>
+      <w:bookmarkStart w:id="2" w:name="_Toc209191647"/>
       <w:r>
         <w:t>Historia del transporte terrestre</w:t>
       </w:r>
@@ -3313,7 +3320,19 @@
     </w:p>
     <w:p>
       <w:r>
-        <w:t xml:space="preserve">Durante la Revolución Industrial la necesidad de mover más carga hizo que el transporte tuviese una transformación radical con la invención de la locomotora de vapor, posteriormente, el automóvil y el avión, que permitieron la conexiones más rápidas y </w:t>
+        <w:t>Durante la Revolución Industrial</w:t>
+      </w:r>
+      <w:r>
+        <w:t>,</w:t>
+      </w:r>
+      <w:r>
+        <w:t xml:space="preserve"> la necesidad de mover más carga hizo que el transporte tuviese una transformación radical con la invención de la locomotora de vapor, posteriormente, el automóvil y el avión, que permitieron la</w:t>
+      </w:r>
+      <w:r>
+        <w:t>s</w:t>
+      </w:r>
+      <w:r>
+        <w:t xml:space="preserve"> conexiones más rápidas y </w:t>
       </w:r>
       <w:r>
         <w:t>globales (</w:t>
@@ -3806,6 +3825,9 @@
               <w:t>primera Rueda hace más de 6000 año</w:t>
             </w:r>
             <w:r>
+              <w:t>s</w:t>
+            </w:r>
+            <w:r>
               <w:t>. L</w:t>
             </w:r>
             <w:r>
@@ -4423,13 +4445,14 @@
               </w:rPr>
               <w:t xml:space="preserve"> </w:t>
             </w:r>
-            <w:r>
-              <w:rPr>
-                <w:rStyle w:val="Extranjerismo"/>
-                <w:lang w:val="es-CO"/>
-              </w:rPr>
-              <w:t>Diesel</w:t>
-            </w:r>
+            <w:proofErr w:type="spellStart"/>
+            <w:r>
+              <w:t>díe</w:t>
+            </w:r>
+            <w:r>
+              <w:t>sel</w:t>
+            </w:r>
+            <w:proofErr w:type="spellEnd"/>
             <w:r>
               <w:rPr>
                 <w:rStyle w:val="Extranjerismo"/>
@@ -4642,22 +4665,50 @@
             <w:r>
               <w:t xml:space="preserve">. El </w:t>
             </w:r>
-            <w:proofErr w:type="spellStart"/>
             <w:r>
               <w:rPr>
                 <w:rStyle w:val="Extranjerismo"/>
                 <w:lang w:val="es-CO"/>
               </w:rPr>
-              <w:t>Panjar</w:t>
-            </w:r>
-            <w:proofErr w:type="spellEnd"/>
+              <w:t>Pan</w:t>
+            </w:r>
             <w:r>
               <w:rPr>
                 <w:rStyle w:val="Extranjerismo"/>
                 <w:lang w:val="es-CO"/>
               </w:rPr>
-              <w:t xml:space="preserve"> IL Evasor</w:t>
-            </w:r>
+              <w:t xml:space="preserve">hard et </w:t>
+            </w:r>
+            <w:proofErr w:type="spellStart"/>
+            <w:r>
+              <w:rPr>
+                <w:rStyle w:val="Extranjerismo"/>
+                <w:lang w:val="es-CO"/>
+              </w:rPr>
+              <w:t>Le</w:t>
+            </w:r>
+            <w:r>
+              <w:rPr>
+                <w:rStyle w:val="Extranjerismo"/>
+                <w:lang w:val="es-CO"/>
+              </w:rPr>
+              <w:t>va</w:t>
+            </w:r>
+            <w:r>
+              <w:rPr>
+                <w:rStyle w:val="Extranjerismo"/>
+                <w:lang w:val="es-CO"/>
+              </w:rPr>
+              <w:t>s</w:t>
+            </w:r>
+            <w:r>
+              <w:rPr>
+                <w:rStyle w:val="Extranjerismo"/>
+                <w:lang w:val="es-CO"/>
+              </w:rPr>
+              <w:t>sor</w:t>
+            </w:r>
+            <w:proofErr w:type="spellEnd"/>
             <w:r>
               <w:t xml:space="preserve"> de </w:t>
             </w:r>
@@ -4839,7 +4890,7 @@
           <w:numId w:val="7"/>
         </w:numPr>
       </w:pPr>
-      <w:bookmarkStart w:id="3" w:name="_Toc208571175"/>
+      <w:bookmarkStart w:id="3" w:name="_Toc209191648"/>
       <w:r>
         <w:t>Concepto del transporte terrestre</w:t>
       </w:r>
@@ -4869,7 +4920,7 @@
           <w:numId w:val="7"/>
         </w:numPr>
       </w:pPr>
-      <w:bookmarkStart w:id="4" w:name="_Toc208571176"/>
+      <w:bookmarkStart w:id="4" w:name="_Toc209191649"/>
       <w:r>
         <w:t>Tipología del transporte terrestre</w:t>
       </w:r>
@@ -5106,7 +5157,7 @@
       <w:pPr>
         <w:pStyle w:val="Ttulo2"/>
       </w:pPr>
-      <w:bookmarkStart w:id="5" w:name="_Toc208571177"/>
+      <w:bookmarkStart w:id="5" w:name="_Toc209191650"/>
       <w:r>
         <w:t>1.4 Normativa</w:t>
       </w:r>
@@ -5357,7 +5408,7 @@
       <w:pPr>
         <w:pStyle w:val="Ttulo2"/>
       </w:pPr>
-      <w:bookmarkStart w:id="6" w:name="_Toc208571178"/>
+      <w:bookmarkStart w:id="6" w:name="_Toc209191651"/>
       <w:r>
         <w:lastRenderedPageBreak/>
         <w:t>1.5 Medios de transporte</w:t>
@@ -5374,7 +5425,19 @@
         <w:rPr>
           <w:lang w:eastAsia="es-CO"/>
         </w:rPr>
-        <w:t>El transporte terrestre comprende todos aquellos vehículos que se movilizan por vías terrestres, como carreteras, autopistas, calles, senderos o vías férreas. Se clasifican principalmente en transporte de pasajeros y transporte de carga, y cada tipo presenta características técnicas y operativas específicas que deben ser consideradas en los procesos de planificación, seguimiento y evaluación. La clasificación del transporte terrestre esta de la siguiente manera:</w:t>
+        <w:t>El transporte terrestre comprende todos aquellos vehículos que se movilizan por vías terrestres, como carreteras, autopistas, calles, senderos o vías férreas. Se clasifican principalmente en transporte de pasajeros y transporte de carga, y cada tipo presenta características técnicas y operativas específicas que deben ser consideradas en los procesos de planificación, seguimiento y evaluación. La clasificación del transporte terrestre est</w:t>
+      </w:r>
+      <w:r>
+        <w:rPr>
+          <w:lang w:eastAsia="es-CO"/>
+        </w:rPr>
+        <w:t>á</w:t>
+      </w:r>
+      <w:r>
+        <w:rPr>
+          <w:lang w:eastAsia="es-CO"/>
+        </w:rPr>
+        <w:t xml:space="preserve"> de la siguiente manera:</w:t>
       </w:r>
     </w:p>
     <w:p>
@@ -5695,7 +5758,7 @@
           <w:lang w:val="es-419"/>
         </w:rPr>
       </w:pPr>
-      <w:bookmarkStart w:id="7" w:name="_Toc208571179"/>
+      <w:bookmarkStart w:id="7" w:name="_Toc209191652"/>
       <w:r>
         <w:rPr>
           <w:rStyle w:val="Extranjerismo"/>
@@ -5730,7 +5793,7 @@
       <w:pPr>
         <w:pStyle w:val="Ttulo2"/>
       </w:pPr>
-      <w:bookmarkStart w:id="8" w:name="_Toc208571180"/>
+      <w:bookmarkStart w:id="8" w:name="_Toc209191653"/>
       <w:r>
         <w:t xml:space="preserve">2.1 </w:t>
       </w:r>
@@ -5759,7 +5822,7 @@
       <w:pPr>
         <w:pStyle w:val="Ttulo2"/>
       </w:pPr>
-      <w:bookmarkStart w:id="9" w:name="_Toc208571181"/>
+      <w:bookmarkStart w:id="9" w:name="_Toc209191654"/>
       <w:r>
         <w:t xml:space="preserve">2.2 </w:t>
       </w:r>
@@ -5889,7 +5952,7 @@
       <w:pPr>
         <w:pStyle w:val="Ttulo2"/>
       </w:pPr>
-      <w:bookmarkStart w:id="10" w:name="_Toc208571182"/>
+      <w:bookmarkStart w:id="10" w:name="_Toc209191655"/>
       <w:r>
         <w:t>2.3 Riesgos viales en el e</w:t>
       </w:r>
@@ -6195,7 +6258,7 @@
       <w:pPr>
         <w:pStyle w:val="Ttulo2"/>
       </w:pPr>
-      <w:bookmarkStart w:id="11" w:name="_Toc208571183"/>
+      <w:bookmarkStart w:id="11" w:name="_Toc209191656"/>
       <w:r>
         <w:t>2.4 Clases y aspectos técnicos de vías</w:t>
       </w:r>
@@ -6488,7 +6551,7 @@
           <w:shd w:val="clear" w:color="auto" w:fill="FFFFFF"/>
         </w:rPr>
       </w:pPr>
-      <w:bookmarkStart w:id="12" w:name="_Toc208571184"/>
+      <w:bookmarkStart w:id="12" w:name="_Toc209191657"/>
       <w:r>
         <w:rPr>
           <w:bdr w:val="none" w:sz="0" w:space="0" w:color="auto" w:frame="1"/>
@@ -6529,7 +6592,7 @@
       <w:pPr>
         <w:pStyle w:val="Ttulo2"/>
       </w:pPr>
-      <w:bookmarkStart w:id="13" w:name="_Toc208571185"/>
+      <w:bookmarkStart w:id="13" w:name="_Toc209191658"/>
       <w:r>
         <w:t>3.1 Principios y valores ciudadanos</w:t>
       </w:r>
@@ -6666,15 +6729,17 @@
       </w:pPr>
       <w:r>
         <w:rPr>
-          <w:lang w:val="es-419" w:eastAsia="es-CO"/>
-        </w:rPr>
-        <w:t>Prevención</w:t>
-      </w:r>
-      <w:r>
-        <w:rPr>
-          <w:lang w:val="es-419" w:eastAsia="es-CO"/>
-        </w:rPr>
-        <w:t>: s</w:t>
+          <w:b/>
+          <w:bCs/>
+          <w:lang w:val="es-419" w:eastAsia="es-CO"/>
+        </w:rPr>
+        <w:t>Prevención:</w:t>
+      </w:r>
+      <w:r>
+        <w:rPr>
+          <w:lang w:val="es-419" w:eastAsia="es-CO"/>
+        </w:rPr>
+        <w:t xml:space="preserve"> s</w:t>
       </w:r>
       <w:r>
         <w:rPr>
@@ -6784,7 +6849,7 @@
       <w:pPr>
         <w:pStyle w:val="Ttulo2"/>
       </w:pPr>
-      <w:bookmarkStart w:id="14" w:name="_Toc208571186"/>
+      <w:bookmarkStart w:id="14" w:name="_Toc209191659"/>
       <w:r>
         <w:t>3.2 Convivencia vial</w:t>
       </w:r>
@@ -6820,7 +6885,7 @@
       <w:pPr>
         <w:pStyle w:val="Ttulo2"/>
       </w:pPr>
-      <w:bookmarkStart w:id="15" w:name="_Toc208571187"/>
+      <w:bookmarkStart w:id="15" w:name="_Toc209191660"/>
       <w:r>
         <w:t>3.3 Hábitos durante el desplazamiento por las vías como conductor, peatón o pasajero</w:t>
       </w:r>
@@ -6878,10 +6943,10 @@
       <w:pPr>
         <w:pStyle w:val="Ttulo1"/>
       </w:pPr>
-      <w:bookmarkStart w:id="16" w:name="_Toc208571188"/>
+      <w:bookmarkStart w:id="16" w:name="_Toc209191661"/>
       <w:r>
         <w:lastRenderedPageBreak/>
-        <w:t>Código nacional de tránsito</w:t>
+        <w:t>Código Nacional de Tránsito</w:t>
       </w:r>
       <w:bookmarkEnd w:id="16"/>
     </w:p>
@@ -6895,7 +6960,19 @@
         <w:rPr>
           <w:lang w:val="es-419" w:eastAsia="es-CO"/>
         </w:rPr>
-        <w:t>El Código Nacional de Tránsito Terrestre de Colombia es el marco legal que regula la circulación de personas, vehículos y animales por las vías públicas y privadas abiertas al público en el territorio nacional. Las funciones que lo rigen son: establecer normas de circulación de vehículos y peatones, regular la conducción, definir los requisitos para obtener la licencia y su renovación, prevenir accidentes de tránsito, determinar las funciones de las autoridades, imponer sanciones y multas, exigir seguros obligatorios como SOAT para proteger a las víctimas de accidentes aplicado para Colombia y regular los diferentes tipos de transporte.</w:t>
+        <w:t xml:space="preserve">El </w:t>
+      </w:r>
+      <w:r>
+        <w:rPr>
+          <w:lang w:val="es-419" w:eastAsia="es-CO"/>
+        </w:rPr>
+        <w:t>Código Nacional de Tránsito</w:t>
+      </w:r>
+      <w:r>
+        <w:rPr>
+          <w:lang w:val="es-419" w:eastAsia="es-CO"/>
+        </w:rPr>
+        <w:t xml:space="preserve"> Terrestre de Colombia es el marco legal que regula la circulación de personas, vehículos y animales por las vías públicas y privadas abiertas al público en el territorio nacional. Las funciones que lo rigen son: establecer normas de circulación de vehículos y peatones, regular la conducción, definir los requisitos para obtener la licencia y su renovación, prevenir accidentes de tránsito, determinar las funciones de las autoridades, imponer sanciones y multas, exigir seguros obligatorios como SOAT para proteger a las víctimas de accidentes aplicado para Colombia y regular los diferentes tipos de transporte.</w:t>
       </w:r>
     </w:p>
     <w:p>
@@ -7031,6 +7108,12 @@
         </w:rPr>
         <w:t>Las señales de tránsito son elementos fundamentales del sistema vial cuyo objetivo es regular, guiar e informar a los usuarios de las vías, promoviendo una movilidad segura, ordenada y eficiente. Están diseñadas conforme a normas técnicas establecidas por el Ministerio de Transporte. Su correcta interpretación y cumplimiento son esenciales para prevenir accidentes, proteger la vida de peatones y conductores, y garantizar el respeto por las normas que rigen la convivencia en el espacio público</w:t>
       </w:r>
+      <w:r>
+        <w:rPr>
+          <w:lang w:val="es-419" w:eastAsia="es-CO"/>
+        </w:rPr>
+        <w:t>.</w:t>
+      </w:r>
     </w:p>
     <w:p>
       <w:pPr>
@@ -7163,7 +7246,7 @@
       <w:pPr>
         <w:pStyle w:val="Ttulo2"/>
       </w:pPr>
-      <w:bookmarkStart w:id="17" w:name="_Toc208571189"/>
+      <w:bookmarkStart w:id="17" w:name="_Toc209191662"/>
       <w:r>
         <w:t>4.1 Principios</w:t>
       </w:r>
@@ -7179,7 +7262,19 @@
         <w:rPr>
           <w:lang w:val="es-419" w:eastAsia="es-CO"/>
         </w:rPr>
-        <w:t>Los principios del Código Nacional de Tránsito Terrestre de Colombia, establecidos en la Ley 769 de 2002, constituyen el fundamento normativo y ético que guía la regulación del comportamiento de todos los actores viales en el país. Estos principios orientan la aplicación de las normas de tránsito con el fin de garantizar la seguridad vial, proteger la vida y la integridad física de las personas, conservar el medio ambiente, y asegurar una movilidad eficiente, equitativa y ordenada.</w:t>
+        <w:t xml:space="preserve">Los principios del </w:t>
+      </w:r>
+      <w:r>
+        <w:rPr>
+          <w:lang w:val="es-419" w:eastAsia="es-CO"/>
+        </w:rPr>
+        <w:t>Código Nacional de Tránsito</w:t>
+      </w:r>
+      <w:r>
+        <w:rPr>
+          <w:lang w:val="es-419" w:eastAsia="es-CO"/>
+        </w:rPr>
+        <w:t xml:space="preserve"> Terrestre de Colombia, establecidos en la Ley 769 de 2002, constituyen el fundamento normativo y ético que guía la regulación del comportamiento de todos los actores viales en el país. Estos principios orientan la aplicación de las normas de tránsito con el fin de garantizar la seguridad vial, proteger la vida y la integridad física de las personas, conservar el medio ambiente, y asegurar una movilidad eficiente, equitativa y ordenada.</w:t>
       </w:r>
     </w:p>
     <w:p>
@@ -7204,63 +7299,7 @@
           <w:bCs/>
           <w:lang w:val="es-419" w:eastAsia="es-CO"/>
         </w:rPr>
-        <w:t>c</w:t>
-      </w:r>
-      <w:r>
-        <w:rPr>
-          <w:b/>
-          <w:bCs/>
-          <w:lang w:val="es-419" w:eastAsia="es-CO"/>
-        </w:rPr>
-        <w:t xml:space="preserve">ódigo </w:t>
-      </w:r>
-      <w:r>
-        <w:rPr>
-          <w:b/>
-          <w:bCs/>
-          <w:lang w:val="es-419" w:eastAsia="es-CO"/>
-        </w:rPr>
-        <w:t>n</w:t>
-      </w:r>
-      <w:r>
-        <w:rPr>
-          <w:b/>
-          <w:bCs/>
-          <w:lang w:val="es-419" w:eastAsia="es-CO"/>
-        </w:rPr>
-        <w:t xml:space="preserve">acional de </w:t>
-      </w:r>
-      <w:r>
-        <w:rPr>
-          <w:b/>
-          <w:bCs/>
-          <w:lang w:val="es-419" w:eastAsia="es-CO"/>
-        </w:rPr>
-        <w:t>t</w:t>
-      </w:r>
-      <w:r>
-        <w:rPr>
-          <w:b/>
-          <w:bCs/>
-          <w:lang w:val="es-419" w:eastAsia="es-CO"/>
-        </w:rPr>
-        <w:t>r</w:t>
-      </w:r>
-      <w:r>
-        <w:rPr>
-          <w:b/>
-          <w:bCs/>
-          <w:lang w:val="es-419" w:eastAsia="es-CO"/>
-        </w:rPr>
-        <w:t>á</w:t>
-      </w:r>
-      <w:r>
-        <w:rPr>
-          <w:b/>
-          <w:bCs/>
-          <w:lang w:val="es-419" w:eastAsia="es-CO"/>
-        </w:rPr>
-        <w:t>nsito</w:t>
+        <w:t>Código Nacional de Tránsito</w:t>
       </w:r>
     </w:p>
     <w:p>
@@ -7340,7 +7379,7 @@
       <w:pPr>
         <w:pStyle w:val="Ttulo2"/>
       </w:pPr>
-      <w:bookmarkStart w:id="18" w:name="_Toc208571190"/>
+      <w:bookmarkStart w:id="18" w:name="_Toc209191663"/>
       <w:r>
         <w:t>4.2 Autoridades</w:t>
       </w:r>
@@ -7356,7 +7395,19 @@
         <w:rPr>
           <w:lang w:val="es-419" w:eastAsia="es-CO"/>
         </w:rPr>
-        <w:t>Las autoridades del Código Nacional de Tránsito Terrestre son las entidades públicas y funcionarios legalmente facultados para planear, regular, controlar, sancionar y vigilar las actividades relacionadas con la circulación de personas, vehículos y animales por las vías del territorio colombiano, de acuerdo con lo establecido en la Ley 769 de 2002 y sus reformas. Estas autoridades desempeñan un papel esencial en el funcionamiento y supervisión del sistema de movilidad, pues garantizan que las normas de tránsito se cumplan, que los derechos y deberes de los actores viales se respeten, y que se promueva una movilidad segura, ordenada y sostenible.</w:t>
+        <w:t xml:space="preserve">Las autoridades del </w:t>
+      </w:r>
+      <w:r>
+        <w:rPr>
+          <w:lang w:val="es-419" w:eastAsia="es-CO"/>
+        </w:rPr>
+        <w:t>Código Nacional de Tránsito</w:t>
+      </w:r>
+      <w:r>
+        <w:rPr>
+          <w:lang w:val="es-419" w:eastAsia="es-CO"/>
+        </w:rPr>
+        <w:t xml:space="preserve"> Terrestre son las entidades públicas y funcionarios legalmente facultados para planear, regular, controlar, sancionar y vigilar las actividades relacionadas con la circulación de personas, vehículos y animales por las vías del territorio colombiano, de acuerdo con lo establecido en la Ley 769 de 2002 y sus reformas. Estas autoridades desempeñan un papel esencial en el funcionamiento y supervisión del sistema de movilidad, pues garantizan que las normas de tránsito se cumplan, que los derechos y deberes de los actores viales se respeten, y que se promueva una movilidad segura, ordenada y sostenible.</w:t>
       </w:r>
     </w:p>
     <w:p>
@@ -7494,7 +7545,7 @@
       <w:pPr>
         <w:pStyle w:val="Ttulo2"/>
       </w:pPr>
-      <w:bookmarkStart w:id="19" w:name="_Toc208571191"/>
+      <w:bookmarkStart w:id="19" w:name="_Toc209191664"/>
       <w:r>
         <w:t>4.3 Registro de información</w:t>
       </w:r>
@@ -7526,10 +7577,6 @@
         <w:t>Este proceso también es clave para alimentar sistemas tecnológicos como el RUNT (Registro Único Nacional de Tránsito), bases de datos locales de los organismos de tránsito, plataformas de monitoreo satelital (</w:t>
       </w:r>
       <w:r>
-        <w:rPr>
-          <w:rStyle w:val="Extranjerismo"/>
-          <w:lang w:val="es-419" w:eastAsia="es-CO"/>
-        </w:rPr>
         <w:t>GPS/GNSS</w:t>
       </w:r>
       <w:r>
@@ -7543,7 +7590,7 @@
       <w:pPr>
         <w:pStyle w:val="Ttulo2"/>
       </w:pPr>
-      <w:bookmarkStart w:id="20" w:name="_Toc208571192"/>
+      <w:bookmarkStart w:id="20" w:name="_Toc209191665"/>
       <w:r>
         <w:t>4.4 Licencias</w:t>
       </w:r>
@@ -7559,14 +7606,26 @@
         <w:rPr>
           <w:lang w:eastAsia="es-CO"/>
         </w:rPr>
-        <w:t>Este documento permite acreditar el tipo de vehículo a opera, cumplir con las condiciones técnicas y mecánicas adecuadas. En Colombia, las licencias de conducción se clasifican en categorías A, B y C, dependiendo del tipo de vehículo que se desee conducir y si es para servicio particular o público. Las categorías A son para motocicletas, las B para vehículos particulares (autos, camionetas, etc.), y las C para vehículos de servicio público.</w:t>
+        <w:t>Este documento permite acreditar el tipo de vehículo a opera</w:t>
+      </w:r>
+      <w:r>
+        <w:rPr>
+          <w:lang w:eastAsia="es-CO"/>
+        </w:rPr>
+        <w:t>r</w:t>
+      </w:r>
+      <w:r>
+        <w:rPr>
+          <w:lang w:eastAsia="es-CO"/>
+        </w:rPr>
+        <w:t>, cumplir con las condiciones técnicas y mecánicas adecuadas. En Colombia, las licencias de conducción se clasifican en categorías A, B y C, dependiendo del tipo de vehículo que se desee conducir y si es para servicio particular o público. Las categorías A son para motocicletas, las B para vehículos particulares (autos, camionetas, etc.), y las C para vehículos de servicio público.</w:t>
       </w:r>
     </w:p>
     <w:p>
       <w:pPr>
         <w:pStyle w:val="Ttulo2"/>
       </w:pPr>
-      <w:bookmarkStart w:id="21" w:name="_Toc208571193"/>
+      <w:bookmarkStart w:id="21" w:name="_Toc209191666"/>
       <w:r>
         <w:lastRenderedPageBreak/>
         <w:t>4.5 Condiciones del vehículo</w:t>
@@ -8387,7 +8446,7 @@
         <w:rPr>
           <w:lang w:val="es-419" w:eastAsia="es-CO"/>
         </w:rPr>
-        <w:t>Componentes mecánicos, eléctricos y electrónicos que generan generar la energía necesaria para mover un vehículo. Su función es convertir la energía del combustible (gasolina, diésel o energía eléctrica, según el tipo de motor) en energía mecánica, para así impulsar el automóvil a través del sistema de transmisión. Se encuentra integrado por:</w:t>
+        <w:t>Componentes mecánicos, eléctricos y electrónicos que generan la energía necesaria para mover un vehículo. Su función es convertir la energía del combustible (gasolina, diésel o energía eléctrica, según el tipo de motor) en energía mecánica, para así impulsar el automóvil a través del sistema de transmisión. Se encuentra integrado por:</w:t>
       </w:r>
     </w:p>
     <w:p>
@@ -8772,10 +8831,10 @@
           <w:lang w:val="es-419" w:eastAsia="es-CO"/>
         </w:rPr>
         <w:drawing>
-          <wp:inline distT="0" distB="0" distL="0" distR="0" wp14:anchorId="28643F92" wp14:editId="5DB8594D">
-            <wp:extent cx="5580549" cy="2922905"/>
-            <wp:effectExtent l="0" t="0" r="0" b="0"/>
-            <wp:docPr id="835985186" name="Imagen 1" descr="En la figura 2 se muestra un diagrama de la estructura la normativa vial y sus diferentes componentes a saber:&#10;Licencias y condiciones del vehículo:  documentos que acreditan la operación segura del vehículo.&#10;Registro de información de conductores: base de datos de conductores, vehículos y licencias. &#10;Autoridades: organismos encargados de regular y hacer cumplir las normas de transito.&#10;Código de tránsito y transporte: regula la movilidad en as vías públicas para garantizar la seguridad y eficiencia.&#10;Principios del código de tránsito: guía la seguridad vial, la protección de la vida y la convivencia ciudadana."/>
+          <wp:inline distT="0" distB="0" distL="0" distR="0" wp14:anchorId="71468864" wp14:editId="2B5226D9">
+            <wp:extent cx="5484047" cy="2874010"/>
+            <wp:effectExtent l="0" t="0" r="2540" b="0"/>
+            <wp:docPr id="1167018436" name="Gráfico 4" descr="En la figura 2 se muestra un diagrama de la estructura la normativa vial y sus diferentes componentes a saber:&#10;Licencias y condiciones del vehículo:  documentos que acreditan la operación segura del vehículo.&#10;Registro de información de conductores: base de datos de conductores, vehículos y licencias. &#10;Autoridades: organismos encargados de regular y hacer cumplir las normas de transito.&#10;Código de tránsito y transporte: regula la movilidad en as vías públicas para garantizar la seguridad y eficiencia.&#10;Principios del código de tránsito: guía la seguridad vial, la protección de la vida y la convivencia ciudadana."/>
             <wp:cNvGraphicFramePr>
               <a:graphicFrameLocks xmlns:a="http://schemas.openxmlformats.org/drawingml/2006/main" noChangeAspect="1"/>
             </wp:cNvGraphicFramePr>
@@ -8783,11 +8842,17 @@
               <a:graphicData uri="http://schemas.openxmlformats.org/drawingml/2006/picture">
                 <pic:pic xmlns:pic="http://schemas.openxmlformats.org/drawingml/2006/picture">
                   <pic:nvPicPr>
-                    <pic:cNvPr id="835985186" name="Imagen 1" descr="En la figura 2 se muestra un diagrama de la estructura la normativa vial y sus diferentes componentes a saber:&#10;Licencias y condiciones del vehículo:  documentos que acreditan la operación segura del vehículo.&#10;Registro de información de conductores: base de datos de conductores, vehículos y licencias. &#10;Autoridades: organismos encargados de regular y hacer cumplir las normas de transito.&#10;Código de tránsito y transporte: regula la movilidad en as vías públicas para garantizar la seguridad y eficiencia.&#10;Principios del código de tránsito: guía la seguridad vial, la protección de la vida y la convivencia ciudadana."/>
+                    <pic:cNvPr id="1167018436" name="Gráfico 4" descr="En la figura 2 se muestra un diagrama de la estructura la normativa vial y sus diferentes componentes a saber:&#10;Licencias y condiciones del vehículo:  documentos que acreditan la operación segura del vehículo.&#10;Registro de información de conductores: base de datos de conductores, vehículos y licencias. &#10;Autoridades: organismos encargados de regular y hacer cumplir las normas de transito.&#10;Código de tránsito y transporte: regula la movilidad en as vías públicas para garantizar la seguridad y eficiencia.&#10;Principios del código de tránsito: guía la seguridad vial, la protección de la vida y la convivencia ciudadana."/>
                     <pic:cNvPicPr/>
                   </pic:nvPicPr>
                   <pic:blipFill>
-                    <a:blip r:embed="rId18"/>
+                    <a:blip r:embed="rId18">
+                      <a:extLst>
+                        <a:ext uri="{96DAC541-7B7A-43D3-8B79-37D633B846F1}">
+                          <asvg:svgBlip xmlns:asvg="http://schemas.microsoft.com/office/drawing/2016/SVG/main" r:embed="rId19"/>
+                        </a:ext>
+                      </a:extLst>
+                    </a:blip>
                     <a:stretch>
                       <a:fillRect/>
                     </a:stretch>
@@ -8795,7 +8860,7 @@
                   <pic:spPr>
                     <a:xfrm>
                       <a:off x="0" y="0"/>
-                      <a:ext cx="5598426" cy="2932268"/>
+                      <a:ext cx="5498581" cy="2881627"/>
                     </a:xfrm>
                     <a:prstGeom prst="rect">
                       <a:avLst/>
@@ -8856,7 +8921,7 @@
         <w:rPr>
           <w:lang w:val="es-419" w:eastAsia="es-CO"/>
         </w:rPr>
-        <w:t xml:space="preserve">  documentos que acreditan la operación segura del vehículo.</w:t>
+        <w:t xml:space="preserve"> documentos que acreditan la operación segura del vehículo.</w:t>
       </w:r>
     </w:p>
     <w:p>
@@ -8956,7 +9021,39 @@
           <w:bCs/>
           <w:lang w:val="es-419" w:eastAsia="es-CO"/>
         </w:rPr>
-        <w:t>digo de tránsito y transporte:</w:t>
+        <w:t xml:space="preserve">digo de </w:t>
+      </w:r>
+      <w:r>
+        <w:rPr>
+          <w:b/>
+          <w:bCs/>
+          <w:lang w:val="es-419" w:eastAsia="es-CO"/>
+        </w:rPr>
+        <w:t>T</w:t>
+      </w:r>
+      <w:r>
+        <w:rPr>
+          <w:b/>
+          <w:bCs/>
+          <w:lang w:val="es-419" w:eastAsia="es-CO"/>
+        </w:rPr>
+        <w:t xml:space="preserve">ránsito y </w:t>
+      </w:r>
+      <w:r>
+        <w:rPr>
+          <w:b/>
+          <w:bCs/>
+          <w:lang w:val="es-419" w:eastAsia="es-CO"/>
+        </w:rPr>
+        <w:t>T</w:t>
+      </w:r>
+      <w:r>
+        <w:rPr>
+          <w:b/>
+          <w:bCs/>
+          <w:lang w:val="es-419" w:eastAsia="es-CO"/>
+        </w:rPr>
+        <w:t>ransporte:</w:t>
       </w:r>
       <w:r>
         <w:rPr>
@@ -9018,7 +9115,39 @@
           <w:bCs/>
           <w:lang w:val="es-419" w:eastAsia="es-CO"/>
         </w:rPr>
-        <w:t>Principios del código de tránsito:</w:t>
+        <w:t xml:space="preserve">Principios del </w:t>
+      </w:r>
+      <w:r>
+        <w:rPr>
+          <w:b/>
+          <w:bCs/>
+          <w:lang w:val="es-419" w:eastAsia="es-CO"/>
+        </w:rPr>
+        <w:t>C</w:t>
+      </w:r>
+      <w:r>
+        <w:rPr>
+          <w:b/>
+          <w:bCs/>
+          <w:lang w:val="es-419" w:eastAsia="es-CO"/>
+        </w:rPr>
+        <w:t xml:space="preserve">ódigo de </w:t>
+      </w:r>
+      <w:r>
+        <w:rPr>
+          <w:b/>
+          <w:bCs/>
+          <w:lang w:val="es-419" w:eastAsia="es-CO"/>
+        </w:rPr>
+        <w:t>T</w:t>
+      </w:r>
+      <w:r>
+        <w:rPr>
+          <w:b/>
+          <w:bCs/>
+          <w:lang w:val="es-419" w:eastAsia="es-CO"/>
+        </w:rPr>
+        <w:t>ránsito:</w:t>
       </w:r>
       <w:r>
         <w:rPr>
@@ -9059,7 +9188,7 @@
       <w:pPr>
         <w:pStyle w:val="Ttulo2"/>
       </w:pPr>
-      <w:bookmarkStart w:id="22" w:name="_Toc208571194"/>
+      <w:bookmarkStart w:id="22" w:name="_Toc209191667"/>
       <w:r>
         <w:lastRenderedPageBreak/>
         <w:t>4.6 Seguros y responsabilidades del vehículo</w:t>
@@ -9089,7 +9218,19 @@
         <w:rPr>
           <w:lang w:val="es-419" w:eastAsia="es-CO"/>
         </w:rPr>
-        <w:t>Responsabilidad: responde civilmente por daños ocasionales a terceros (persona -bienes), documento obligatorio.</w:t>
+        <w:t>Responsabilidad: responde civilmente por daños ocasionales a terceros (persona -</w:t>
+      </w:r>
+      <w:r>
+        <w:rPr>
+          <w:lang w:val="es-419" w:eastAsia="es-CO"/>
+        </w:rPr>
+        <w:t xml:space="preserve"> </w:t>
+      </w:r>
+      <w:r>
+        <w:rPr>
+          <w:lang w:val="es-419" w:eastAsia="es-CO"/>
+        </w:rPr>
+        <w:t>bienes), documento obligatorio.</w:t>
       </w:r>
     </w:p>
     <w:p>
@@ -9107,7 +9248,7 @@
         <w:rPr>
           <w:lang w:val="es-419" w:eastAsia="es-CO"/>
         </w:rPr>
-        <w:t>Vehículos comerciales (carga - transporte de mercancías):</w:t>
+        <w:t>SOAT o equivalente.</w:t>
       </w:r>
     </w:p>
     <w:p>
@@ -9125,7 +9266,7 @@
         <w:rPr>
           <w:lang w:val="es-419" w:eastAsia="es-CO"/>
         </w:rPr>
-        <w:t>SOAT o equivalente.</w:t>
+        <w:t>Seguro de responsabilidad civil extracontractual de mayor cobertura.</w:t>
       </w:r>
     </w:p>
     <w:p>
@@ -9143,7 +9284,19 @@
         <w:rPr>
           <w:lang w:val="es-419" w:eastAsia="es-CO"/>
         </w:rPr>
-        <w:t>Seguro de responsabilidad civil extracontractual de mayor cobertura.</w:t>
+        <w:t>Seguro de carga: permite proteger la mercancía de robo, daño o p</w:t>
+      </w:r>
+      <w:r>
+        <w:rPr>
+          <w:lang w:val="es-419" w:eastAsia="es-CO"/>
+        </w:rPr>
+        <w:t>é</w:t>
+      </w:r>
+      <w:r>
+        <w:rPr>
+          <w:lang w:val="es-419" w:eastAsia="es-CO"/>
+        </w:rPr>
+        <w:t>rdida.</w:t>
       </w:r>
     </w:p>
     <w:p>
@@ -9161,7 +9314,7 @@
         <w:rPr>
           <w:lang w:val="es-419" w:eastAsia="es-CO"/>
         </w:rPr>
-        <w:t>Seguro de carga: permite proteger la mercancía de robo, daño o perdida.</w:t>
+        <w:t>Póliza de transporte: nacional o internacional, según rutas.</w:t>
       </w:r>
     </w:p>
     <w:p>
@@ -9179,26 +9332,27 @@
         <w:rPr>
           <w:lang w:val="es-419" w:eastAsia="es-CO"/>
         </w:rPr>
-        <w:t>Póliza de transporte: nacional o internacional, según rutas.</w:t>
+        <w:t xml:space="preserve">RC (Responsabilidad </w:t>
+      </w:r>
+      <w:r>
+        <w:rPr>
+          <w:lang w:val="es-419" w:eastAsia="es-CO"/>
+        </w:rPr>
+        <w:t>C</w:t>
+      </w:r>
+      <w:r>
+        <w:rPr>
+          <w:lang w:val="es-419" w:eastAsia="es-CO"/>
+        </w:rPr>
+        <w:t>ivil) contractual y extracontractual de amplio espectro.</w:t>
       </w:r>
     </w:p>
     <w:p>
       <w:pPr>
-        <w:pStyle w:val="Prrafodelista"/>
-        <w:numPr>
-          <w:ilvl w:val="0"/>
-          <w:numId w:val="216"/>
-        </w:numPr>
-        <w:rPr>
-          <w:lang w:val="es-419" w:eastAsia="es-CO"/>
-        </w:rPr>
-      </w:pPr>
-      <w:r>
-        <w:rPr>
-          <w:lang w:val="es-419" w:eastAsia="es-CO"/>
-        </w:rPr>
-        <w:t>RC (Responsabilidad civil) contractual y extracontractual de amplio espectro.</w:t>
-      </w:r>
+        <w:rPr>
+          <w:lang w:val="es-419" w:eastAsia="es-CO"/>
+        </w:rPr>
+      </w:pPr>
     </w:p>
     <w:p>
       <w:pPr>
@@ -9216,6 +9370,7 @@
     </w:p>
     <w:p>
       <w:pPr>
+        <w:ind w:firstLine="0"/>
         <w:rPr>
           <w:lang w:val="es-419" w:eastAsia="es-CO"/>
         </w:rPr>
@@ -9223,6 +9378,7 @@
     </w:p>
     <w:p>
       <w:pPr>
+        <w:ind w:firstLine="0"/>
         <w:rPr>
           <w:lang w:val="es-419" w:eastAsia="es-CO"/>
         </w:rPr>
@@ -9960,10 +10116,22 @@
       <w:pPr>
         <w:pStyle w:val="Ttulo1"/>
       </w:pPr>
-      <w:bookmarkStart w:id="23" w:name="_Toc208571195"/>
+      <w:bookmarkStart w:id="23" w:name="_Toc209191668"/>
       <w:r>
         <w:lastRenderedPageBreak/>
-        <w:t>Estatutos nacionales de transporte</w:t>
+        <w:t xml:space="preserve">Estatutos </w:t>
+      </w:r>
+      <w:r>
+        <w:t>N</w:t>
+      </w:r>
+      <w:r>
+        <w:t xml:space="preserve">acionales de </w:t>
+      </w:r>
+      <w:r>
+        <w:t>T</w:t>
+      </w:r>
+      <w:r>
+        <w:t>ransporte</w:t>
       </w:r>
       <w:bookmarkEnd w:id="23"/>
     </w:p>
@@ -9977,7 +10145,19 @@
         <w:rPr>
           <w:lang w:val="es-419" w:eastAsia="es-CO"/>
         </w:rPr>
-        <w:t>Los Estatutos Nacionales de Transporte son el conjunto de normas jurídicas, reglamentos, decretos y leyes que regulan de manera integral las actividades relacionadas con el transporte terrestre en el territorio colombiano. Estas disposiciones establecen los principios, competencias, obligaciones y derechos de los diferentes actores del sistema de transporte: conductores, propietarios, empresas, usuarios y autoridades. Su objetivo principal es garantizar la organización, eficiencia, seguridad, sostenibilidad y legalidad en la prestación de los servicios de transporte público y privado de personas y mercancías.</w:t>
+        <w:t xml:space="preserve">Los </w:t>
+      </w:r>
+      <w:r>
+        <w:rPr>
+          <w:lang w:val="es-419" w:eastAsia="es-CO"/>
+        </w:rPr>
+        <w:t>Estatutos Nacionales de Transporte</w:t>
+      </w:r>
+      <w:r>
+        <w:rPr>
+          <w:lang w:val="es-419" w:eastAsia="es-CO"/>
+        </w:rPr>
+        <w:t>son el conjunto de normas jurídicas, reglamentos, decretos y leyes que regulan de manera integral las actividades relacionadas con el transporte terrestre en el territorio colombiano. Estas disposiciones establecen los principios, competencias, obligaciones y derechos de los diferentes actores del sistema de transporte: conductores, propietarios, empresas, usuarios y autoridades. Su objetivo principal es garantizar la organización, eficiencia, seguridad, sostenibilidad y legalidad en la prestación de los servicios de transporte público y privado de personas y mercancías.</w:t>
       </w:r>
     </w:p>
     <w:p>
@@ -10026,7 +10206,19 @@
         <w:rPr>
           <w:lang w:val="es-419" w:eastAsia="es-CO"/>
         </w:rPr>
-        <w:t>El Código Nacional de Tránsito Terrestre (Ley 769 de 2002).</w:t>
+        <w:t xml:space="preserve">El </w:t>
+      </w:r>
+      <w:r>
+        <w:rPr>
+          <w:lang w:val="es-419" w:eastAsia="es-CO"/>
+        </w:rPr>
+        <w:t>Código Nacional de Tránsito</w:t>
+      </w:r>
+      <w:r>
+        <w:rPr>
+          <w:lang w:val="es-419" w:eastAsia="es-CO"/>
+        </w:rPr>
+        <w:t xml:space="preserve"> Terrestre (Ley 769 de 2002).</w:t>
       </w:r>
     </w:p>
     <w:p>
@@ -10051,9 +10243,15 @@
       <w:pPr>
         <w:pStyle w:val="Ttulo2"/>
       </w:pPr>
-      <w:bookmarkStart w:id="24" w:name="_Toc208571196"/>
-      <w:r>
-        <w:t>5.1 Normas según transporte</w:t>
+      <w:bookmarkStart w:id="24" w:name="_Toc209191669"/>
+      <w:r>
+        <w:t xml:space="preserve">5.1 Normas según </w:t>
+      </w:r>
+      <w:r>
+        <w:t xml:space="preserve">tipo de </w:t>
+      </w:r>
+      <w:r>
+        <w:t>transporte</w:t>
       </w:r>
       <w:bookmarkEnd w:id="24"/>
     </w:p>
@@ -10100,6 +10298,36 @@
         </w:rPr>
         <w:lastRenderedPageBreak/>
         <w:t>Vehículos particulares (autos, motocicletas, camionetas)</w:t>
+      </w:r>
+    </w:p>
+    <w:p>
+      <w:pPr>
+        <w:pStyle w:val="Prrafodelista"/>
+        <w:ind w:left="1068" w:firstLine="0"/>
+        <w:rPr>
+          <w:lang w:val="es-419" w:eastAsia="es-CO"/>
+        </w:rPr>
+      </w:pPr>
+      <w:r>
+        <w:rPr>
+          <w:lang w:val="es-419" w:eastAsia="es-CO"/>
+        </w:rPr>
+        <w:t xml:space="preserve">Normatividad: reglamento de Tránsito local (municipal, estatal o nacional). </w:t>
+      </w:r>
+    </w:p>
+    <w:p>
+      <w:pPr>
+        <w:pStyle w:val="Prrafodelista"/>
+        <w:ind w:left="1068" w:firstLine="0"/>
+        <w:rPr>
+          <w:lang w:val="es-419" w:eastAsia="es-CO"/>
+        </w:rPr>
+      </w:pPr>
+      <w:r>
+        <w:rPr>
+          <w:lang w:val="es-419" w:eastAsia="es-CO"/>
+        </w:rPr>
+        <w:t>Requisitos:</w:t>
       </w:r>
     </w:p>
     <w:p>
@@ -10109,16 +10337,15 @@
           <w:ilvl w:val="0"/>
           <w:numId w:val="220"/>
         </w:numPr>
-        <w:ind w:left="1068"/>
-        <w:rPr>
-          <w:lang w:val="es-419" w:eastAsia="es-CO"/>
-        </w:rPr>
-      </w:pPr>
-      <w:r>
-        <w:rPr>
-          <w:lang w:val="es-419" w:eastAsia="es-CO"/>
-        </w:rPr>
-        <w:t xml:space="preserve">Normatividad: reglamento de Tránsito local (municipal, estatal o nacional). </w:t>
+        <w:rPr>
+          <w:lang w:val="es-419" w:eastAsia="es-CO"/>
+        </w:rPr>
+      </w:pPr>
+      <w:r>
+        <w:rPr>
+          <w:lang w:val="es-419" w:eastAsia="es-CO"/>
+        </w:rPr>
+        <w:t>Licencia vigente.</w:t>
       </w:r>
     </w:p>
     <w:p>
@@ -10128,16 +10355,21 @@
           <w:ilvl w:val="0"/>
           <w:numId w:val="220"/>
         </w:numPr>
-        <w:ind w:left="1068"/>
-        <w:rPr>
-          <w:lang w:val="es-419" w:eastAsia="es-CO"/>
-        </w:rPr>
-      </w:pPr>
-      <w:r>
-        <w:rPr>
-          <w:lang w:val="es-419" w:eastAsia="es-CO"/>
-        </w:rPr>
-        <w:t>Requisitos:</w:t>
+        <w:rPr>
+          <w:lang w:val="es-419" w:eastAsia="es-CO"/>
+        </w:rPr>
+      </w:pPr>
+      <w:r>
+        <w:rPr>
+          <w:lang w:val="es-419" w:eastAsia="es-CO"/>
+        </w:rPr>
+        <w:t>Seguro obligatorio</w:t>
+      </w:r>
+      <w:r>
+        <w:rPr>
+          <w:lang w:val="es-419" w:eastAsia="es-CO"/>
+        </w:rPr>
+        <w:t>.</w:t>
       </w:r>
     </w:p>
     <w:p>
@@ -10155,7 +10387,22 @@
         <w:rPr>
           <w:lang w:val="es-419" w:eastAsia="es-CO"/>
         </w:rPr>
-        <w:t>Licencia vigente.</w:t>
+        <w:t>Verificación vehicular, placas y tarjeta de circulación actualizadas.</w:t>
+      </w:r>
+    </w:p>
+    <w:p>
+      <w:pPr>
+        <w:pStyle w:val="Prrafodelista"/>
+        <w:ind w:left="1068" w:firstLine="0"/>
+        <w:rPr>
+          <w:lang w:val="es-419" w:eastAsia="es-CO"/>
+        </w:rPr>
+      </w:pPr>
+      <w:r>
+        <w:rPr>
+          <w:lang w:val="es-419" w:eastAsia="es-CO"/>
+        </w:rPr>
+        <w:t xml:space="preserve">Normas específicas: </w:t>
       </w:r>
     </w:p>
     <w:p>
@@ -10173,13 +10420,7 @@
         <w:rPr>
           <w:lang w:val="es-419" w:eastAsia="es-CO"/>
         </w:rPr>
-        <w:t>Seguro obligatorio</w:t>
-      </w:r>
-      <w:r>
-        <w:rPr>
-          <w:lang w:val="es-419" w:eastAsia="es-CO"/>
-        </w:rPr>
-        <w:t>.</w:t>
+        <w:t>Uso del cinturón de seguridad.</w:t>
       </w:r>
     </w:p>
     <w:p>
@@ -10197,7 +10438,7 @@
         <w:rPr>
           <w:lang w:val="es-419" w:eastAsia="es-CO"/>
         </w:rPr>
-        <w:t>Verificación vehicular, placas y tarjeta de circulación actualizadas.</w:t>
+        <w:t xml:space="preserve">Límites de velocidad. </w:t>
       </w:r>
     </w:p>
     <w:p>
@@ -10207,16 +10448,67 @@
           <w:ilvl w:val="0"/>
           <w:numId w:val="220"/>
         </w:numPr>
-        <w:ind w:left="1068"/>
-        <w:rPr>
-          <w:lang w:val="es-419" w:eastAsia="es-CO"/>
-        </w:rPr>
-      </w:pPr>
-      <w:r>
-        <w:rPr>
-          <w:lang w:val="es-419" w:eastAsia="es-CO"/>
-        </w:rPr>
-        <w:t xml:space="preserve">Normas específicas: </w:t>
+        <w:rPr>
+          <w:lang w:val="es-419" w:eastAsia="es-CO"/>
+        </w:rPr>
+      </w:pPr>
+      <w:r>
+        <w:rPr>
+          <w:lang w:val="es-419" w:eastAsia="es-CO"/>
+        </w:rPr>
+        <w:t>Prohibición de uso del celular al conducir.</w:t>
+      </w:r>
+      <w:r>
+        <w:rPr>
+          <w:lang w:val="es-419" w:eastAsia="es-CO"/>
+        </w:rPr>
+        <w:tab/>
+        <w:t xml:space="preserve"> </w:t>
+      </w:r>
+    </w:p>
+    <w:p>
+      <w:pPr>
+        <w:rPr>
+          <w:lang w:val="es-419" w:eastAsia="es-CO"/>
+        </w:rPr>
+      </w:pPr>
+      <w:r>
+        <w:rPr>
+          <w:b/>
+          <w:bCs/>
+          <w:lang w:val="es-419" w:eastAsia="es-CO"/>
+        </w:rPr>
+        <w:t>Vehículos de transporte público (taxis, autobuses)</w:t>
+      </w:r>
+    </w:p>
+    <w:p>
+      <w:pPr>
+        <w:pStyle w:val="Prrafodelista"/>
+        <w:ind w:left="1068" w:firstLine="0"/>
+        <w:rPr>
+          <w:lang w:val="es-419" w:eastAsia="es-CO"/>
+        </w:rPr>
+      </w:pPr>
+      <w:r>
+        <w:rPr>
+          <w:lang w:val="es-419" w:eastAsia="es-CO"/>
+        </w:rPr>
+        <w:t>Normatividad: Ley de Transporte Público y su reglamento correspondiente.</w:t>
+      </w:r>
+    </w:p>
+    <w:p>
+      <w:pPr>
+        <w:pStyle w:val="Prrafodelista"/>
+        <w:ind w:left="1068" w:firstLine="0"/>
+        <w:rPr>
+          <w:lang w:val="es-419" w:eastAsia="es-CO"/>
+        </w:rPr>
+      </w:pPr>
+      <w:r>
+        <w:rPr>
+          <w:lang w:val="es-419" w:eastAsia="es-CO"/>
+        </w:rPr>
+        <w:t xml:space="preserve">Requisitos:  </w:t>
       </w:r>
     </w:p>
     <w:p>
@@ -10234,7 +10526,7 @@
         <w:rPr>
           <w:lang w:val="es-419" w:eastAsia="es-CO"/>
         </w:rPr>
-        <w:t>Uso del cinturón de seguridad.</w:t>
+        <w:t>Licencia especial de conductor (tipo B, C, D o E según el país).</w:t>
       </w:r>
     </w:p>
     <w:p>
@@ -10252,7 +10544,7 @@
         <w:rPr>
           <w:lang w:val="es-419" w:eastAsia="es-CO"/>
         </w:rPr>
-        <w:t xml:space="preserve">Límites de velocidad. </w:t>
+        <w:t>Tarjeta de concesión o permiso de operación.</w:t>
       </w:r>
     </w:p>
     <w:p>
@@ -10270,29 +10562,7 @@
         <w:rPr>
           <w:lang w:val="es-419" w:eastAsia="es-CO"/>
         </w:rPr>
-        <w:t>Prohibición de uso del celular al conducir.</w:t>
-      </w:r>
-      <w:r>
-        <w:rPr>
-          <w:lang w:val="es-419" w:eastAsia="es-CO"/>
-        </w:rPr>
-        <w:tab/>
-        <w:t xml:space="preserve"> </w:t>
-      </w:r>
-    </w:p>
-    <w:p>
-      <w:pPr>
-        <w:rPr>
-          <w:lang w:val="es-419" w:eastAsia="es-CO"/>
-        </w:rPr>
-      </w:pPr>
-      <w:r>
-        <w:rPr>
-          <w:b/>
-          <w:bCs/>
-          <w:lang w:val="es-419" w:eastAsia="es-CO"/>
-        </w:rPr>
-        <w:t>Vehículos de transporte público (taxis, autobuses)</w:t>
+        <w:t>Seguro de responsabilidad civil para pasajeros.</w:t>
       </w:r>
     </w:p>
     <w:p>
@@ -10302,16 +10572,30 @@
           <w:ilvl w:val="0"/>
           <w:numId w:val="220"/>
         </w:numPr>
-        <w:ind w:left="1068"/>
-        <w:rPr>
-          <w:lang w:val="es-419" w:eastAsia="es-CO"/>
-        </w:rPr>
-      </w:pPr>
-      <w:r>
-        <w:rPr>
-          <w:lang w:val="es-419" w:eastAsia="es-CO"/>
-        </w:rPr>
-        <w:t>Normatividad: Ley de Transporte Público y su reglamento correspondiente.</w:t>
+        <w:rPr>
+          <w:lang w:val="es-419" w:eastAsia="es-CO"/>
+        </w:rPr>
+      </w:pPr>
+      <w:r>
+        <w:rPr>
+          <w:lang w:val="es-419" w:eastAsia="es-CO"/>
+        </w:rPr>
+        <w:t>Cumplimiento de rutas autorizadas y tarifas reguladas.</w:t>
+      </w:r>
+    </w:p>
+    <w:p>
+      <w:pPr>
+        <w:pStyle w:val="Prrafodelista"/>
+        <w:ind w:left="1068" w:firstLine="0"/>
+        <w:rPr>
+          <w:lang w:val="es-419" w:eastAsia="es-CO"/>
+        </w:rPr>
+      </w:pPr>
+      <w:r>
+        <w:rPr>
+          <w:lang w:val="es-419" w:eastAsia="es-CO"/>
+        </w:rPr>
+        <w:t xml:space="preserve">Normas específicas: </w:t>
       </w:r>
     </w:p>
     <w:p>
@@ -10321,16 +10605,15 @@
           <w:ilvl w:val="0"/>
           <w:numId w:val="220"/>
         </w:numPr>
-        <w:ind w:left="1068"/>
-        <w:rPr>
-          <w:lang w:val="es-419" w:eastAsia="es-CO"/>
-        </w:rPr>
-      </w:pPr>
-      <w:r>
-        <w:rPr>
-          <w:lang w:val="es-419" w:eastAsia="es-CO"/>
-        </w:rPr>
-        <w:t xml:space="preserve">Requisitos:  </w:t>
+        <w:rPr>
+          <w:lang w:val="es-419" w:eastAsia="es-CO"/>
+        </w:rPr>
+      </w:pPr>
+      <w:r>
+        <w:rPr>
+          <w:lang w:val="es-419" w:eastAsia="es-CO"/>
+        </w:rPr>
+        <w:t>Revisiones físico-mecánicas periódicas.</w:t>
       </w:r>
     </w:p>
     <w:p>
@@ -10348,174 +10631,61 @@
         <w:rPr>
           <w:lang w:val="es-419" w:eastAsia="es-CO"/>
         </w:rPr>
-        <w:t>Licencia especial de conductor (tipo B, C, D o E según el país).</w:t>
+        <w:t>Respeto de horarios y paradas.</w:t>
+      </w:r>
+      <w:r>
+        <w:rPr>
+          <w:lang w:val="es-419" w:eastAsia="es-CO"/>
+        </w:rPr>
+        <w:tab/>
+        <w:t xml:space="preserve"> </w:t>
       </w:r>
     </w:p>
     <w:p>
       <w:pPr>
-        <w:pStyle w:val="Prrafodelista"/>
-        <w:numPr>
-          <w:ilvl w:val="0"/>
-          <w:numId w:val="220"/>
-        </w:numPr>
-        <w:rPr>
-          <w:lang w:val="es-419" w:eastAsia="es-CO"/>
-        </w:rPr>
-      </w:pPr>
-      <w:r>
-        <w:rPr>
-          <w:lang w:val="es-419" w:eastAsia="es-CO"/>
-        </w:rPr>
-        <w:t>Tarjeta de concesión o permiso de operación.</w:t>
+        <w:rPr>
+          <w:b/>
+          <w:bCs/>
+          <w:lang w:val="es-419" w:eastAsia="es-CO"/>
+        </w:rPr>
+      </w:pPr>
+      <w:r>
+        <w:rPr>
+          <w:b/>
+          <w:bCs/>
+          <w:lang w:val="es-419" w:eastAsia="es-CO"/>
+        </w:rPr>
+        <w:t>Vehículos de carga (camiones, tractocamiones, grúas)</w:t>
       </w:r>
     </w:p>
     <w:p>
       <w:pPr>
         <w:pStyle w:val="Prrafodelista"/>
-        <w:numPr>
-          <w:ilvl w:val="0"/>
-          <w:numId w:val="220"/>
-        </w:numPr>
-        <w:rPr>
-          <w:lang w:val="es-419" w:eastAsia="es-CO"/>
-        </w:rPr>
-      </w:pPr>
-      <w:r>
-        <w:rPr>
-          <w:lang w:val="es-419" w:eastAsia="es-CO"/>
-        </w:rPr>
-        <w:t>Seguro de responsabilidad civil para pasajeros.</w:t>
+        <w:ind w:left="1068" w:firstLine="0"/>
+        <w:rPr>
+          <w:lang w:val="es-419" w:eastAsia="es-CO"/>
+        </w:rPr>
+      </w:pPr>
+      <w:r>
+        <w:rPr>
+          <w:lang w:val="es-419" w:eastAsia="es-CO"/>
+        </w:rPr>
+        <w:t>Normatividad: Ley de Caminos, Puentes y Autotransporte Federal (o equivalente en otros países).</w:t>
       </w:r>
     </w:p>
     <w:p>
       <w:pPr>
         <w:pStyle w:val="Prrafodelista"/>
-        <w:numPr>
-          <w:ilvl w:val="0"/>
-          <w:numId w:val="220"/>
-        </w:numPr>
-        <w:rPr>
-          <w:lang w:val="es-419" w:eastAsia="es-CO"/>
-        </w:rPr>
-      </w:pPr>
-      <w:r>
-        <w:rPr>
-          <w:lang w:val="es-419" w:eastAsia="es-CO"/>
-        </w:rPr>
-        <w:t>Cumplimiento de rutas autorizadas y tarifas reguladas.</w:t>
-      </w:r>
+        <w:ind w:left="1068" w:firstLine="0"/>
+        <w:rPr>
+          <w:lang w:val="es-419" w:eastAsia="es-CO"/>
+        </w:rPr>
+      </w:pPr>
     </w:p>
     <w:p>
       <w:pPr>
         <w:pStyle w:val="Prrafodelista"/>
-        <w:numPr>
-          <w:ilvl w:val="0"/>
-          <w:numId w:val="220"/>
-        </w:numPr>
-        <w:ind w:left="1068"/>
-        <w:rPr>
-          <w:lang w:val="es-419" w:eastAsia="es-CO"/>
-        </w:rPr>
-      </w:pPr>
-      <w:r>
-        <w:rPr>
-          <w:lang w:val="es-419" w:eastAsia="es-CO"/>
-        </w:rPr>
-        <w:t xml:space="preserve">Normas específicas: </w:t>
-      </w:r>
-    </w:p>
-    <w:p>
-      <w:pPr>
-        <w:pStyle w:val="Prrafodelista"/>
-        <w:numPr>
-          <w:ilvl w:val="0"/>
-          <w:numId w:val="220"/>
-        </w:numPr>
-        <w:rPr>
-          <w:lang w:val="es-419" w:eastAsia="es-CO"/>
-        </w:rPr>
-      </w:pPr>
-      <w:r>
-        <w:rPr>
-          <w:lang w:val="es-419" w:eastAsia="es-CO"/>
-        </w:rPr>
-        <w:t>Revisiones físico-mecánicas periódicas.</w:t>
-      </w:r>
-    </w:p>
-    <w:p>
-      <w:pPr>
-        <w:pStyle w:val="Prrafodelista"/>
-        <w:numPr>
-          <w:ilvl w:val="0"/>
-          <w:numId w:val="220"/>
-        </w:numPr>
-        <w:rPr>
-          <w:lang w:val="es-419" w:eastAsia="es-CO"/>
-        </w:rPr>
-      </w:pPr>
-      <w:r>
-        <w:rPr>
-          <w:lang w:val="es-419" w:eastAsia="es-CO"/>
-        </w:rPr>
-        <w:t>Respeto de horarios y paradas.</w:t>
-      </w:r>
-      <w:r>
-        <w:rPr>
-          <w:lang w:val="es-419" w:eastAsia="es-CO"/>
-        </w:rPr>
-        <w:tab/>
-        <w:t xml:space="preserve"> </w:t>
-      </w:r>
-    </w:p>
-    <w:p>
-      <w:pPr>
-        <w:rPr>
-          <w:b/>
-          <w:bCs/>
-          <w:lang w:val="es-419" w:eastAsia="es-CO"/>
-        </w:rPr>
-      </w:pPr>
-      <w:r>
-        <w:rPr>
-          <w:b/>
-          <w:bCs/>
-          <w:lang w:val="es-419" w:eastAsia="es-CO"/>
-        </w:rPr>
-        <w:t>Vehículos de carga (camiones, tractocamiones, grúas)</w:t>
-      </w:r>
-    </w:p>
-    <w:p>
-      <w:pPr>
-        <w:pStyle w:val="Prrafodelista"/>
-        <w:numPr>
-          <w:ilvl w:val="0"/>
-          <w:numId w:val="221"/>
-        </w:numPr>
-        <w:rPr>
-          <w:lang w:val="es-419" w:eastAsia="es-CO"/>
-        </w:rPr>
-      </w:pPr>
-      <w:r>
-        <w:rPr>
-          <w:lang w:val="es-419" w:eastAsia="es-CO"/>
-        </w:rPr>
-        <w:t>Normatividad: Ley de Caminos, Puentes y Autotransporte Federal (o equivalente en otros países).</w:t>
-      </w:r>
-    </w:p>
-    <w:p>
-      <w:pPr>
-        <w:rPr>
-          <w:lang w:val="es-419" w:eastAsia="es-CO"/>
-        </w:rPr>
-      </w:pPr>
-    </w:p>
-    <w:p>
-      <w:pPr>
-        <w:pStyle w:val="Prrafodelista"/>
-        <w:numPr>
-          <w:ilvl w:val="0"/>
-          <w:numId w:val="221"/>
-        </w:numPr>
+        <w:ind w:left="1068" w:firstLine="0"/>
         <w:rPr>
           <w:lang w:val="es-419" w:eastAsia="es-CO"/>
         </w:rPr>
@@ -10587,10 +10757,7 @@
     <w:p>
       <w:pPr>
         <w:pStyle w:val="Prrafodelista"/>
-        <w:numPr>
-          <w:ilvl w:val="0"/>
-          <w:numId w:val="221"/>
-        </w:numPr>
+        <w:ind w:left="1069" w:firstLine="0"/>
         <w:rPr>
           <w:lang w:val="es-419" w:eastAsia="es-CO"/>
         </w:rPr>
@@ -10692,9 +10859,39 @@
     <w:p>
       <w:pPr>
         <w:pStyle w:val="Prrafodelista"/>
+        <w:ind w:left="1068" w:firstLine="0"/>
+        <w:rPr>
+          <w:lang w:val="es-419" w:eastAsia="es-CO"/>
+        </w:rPr>
+      </w:pPr>
+      <w:r>
+        <w:rPr>
+          <w:lang w:val="es-419" w:eastAsia="es-CO"/>
+        </w:rPr>
+        <w:t>Normatividad: Reglamentos específicos para servicio especializado.</w:t>
+      </w:r>
+    </w:p>
+    <w:p>
+      <w:pPr>
+        <w:pStyle w:val="Prrafodelista"/>
+        <w:ind w:left="1068" w:firstLine="0"/>
+        <w:rPr>
+          <w:lang w:val="es-419" w:eastAsia="es-CO"/>
+        </w:rPr>
+      </w:pPr>
+      <w:r>
+        <w:rPr>
+          <w:lang w:val="es-419" w:eastAsia="es-CO"/>
+        </w:rPr>
+        <w:t xml:space="preserve">Requisitos: </w:t>
+      </w:r>
+    </w:p>
+    <w:p>
+      <w:pPr>
+        <w:pStyle w:val="Prrafodelista"/>
         <w:numPr>
           <w:ilvl w:val="0"/>
-          <w:numId w:val="223"/>
+          <w:numId w:val="225"/>
         </w:numPr>
         <w:rPr>
           <w:lang w:val="es-419" w:eastAsia="es-CO"/>
@@ -10704,8 +10901,123 @@
         <w:rPr>
           <w:lang w:val="es-419" w:eastAsia="es-CO"/>
         </w:rPr>
-        <w:t>Normatividad: Reglamentos específicos para servicio especializado.</w:t>
-      </w:r>
+        <w:t>Licencias especializadas.</w:t>
+      </w:r>
+    </w:p>
+    <w:p>
+      <w:pPr>
+        <w:pStyle w:val="Prrafodelista"/>
+        <w:numPr>
+          <w:ilvl w:val="0"/>
+          <w:numId w:val="225"/>
+        </w:numPr>
+        <w:rPr>
+          <w:lang w:val="es-419" w:eastAsia="es-CO"/>
+        </w:rPr>
+      </w:pPr>
+      <w:r>
+        <w:rPr>
+          <w:lang w:val="es-419" w:eastAsia="es-CO"/>
+        </w:rPr>
+        <w:t>Certificados de habilitación y protocolos de seguridad.</w:t>
+      </w:r>
+    </w:p>
+    <w:p>
+      <w:pPr>
+        <w:pStyle w:val="Prrafodelista"/>
+        <w:numPr>
+          <w:ilvl w:val="0"/>
+          <w:numId w:val="225"/>
+        </w:numPr>
+        <w:rPr>
+          <w:lang w:val="es-419" w:eastAsia="es-CO"/>
+        </w:rPr>
+      </w:pPr>
+      <w:r>
+        <w:rPr>
+          <w:lang w:val="es-419" w:eastAsia="es-CO"/>
+        </w:rPr>
+        <w:t>Equipamiento específico (luces, sirenas, botiquines).</w:t>
+      </w:r>
+    </w:p>
+    <w:p>
+      <w:pPr>
+        <w:pStyle w:val="Prrafodelista"/>
+        <w:ind w:left="1134" w:firstLine="0"/>
+        <w:rPr>
+          <w:lang w:val="es-419" w:eastAsia="es-CO"/>
+        </w:rPr>
+      </w:pPr>
+      <w:r>
+        <w:rPr>
+          <w:lang w:val="es-419" w:eastAsia="es-CO"/>
+        </w:rPr>
+        <w:t>Normas específicas:</w:t>
+      </w:r>
+    </w:p>
+    <w:p>
+      <w:pPr>
+        <w:pStyle w:val="Prrafodelista"/>
+        <w:numPr>
+          <w:ilvl w:val="3"/>
+          <w:numId w:val="226"/>
+        </w:numPr>
+        <w:rPr>
+          <w:lang w:val="es-419" w:eastAsia="es-CO"/>
+        </w:rPr>
+      </w:pPr>
+      <w:r>
+        <w:rPr>
+          <w:lang w:val="es-419" w:eastAsia="es-CO"/>
+        </w:rPr>
+        <w:t>Prioridad de paso en emergencias.</w:t>
+      </w:r>
+    </w:p>
+    <w:p>
+      <w:pPr>
+        <w:pStyle w:val="Prrafodelista"/>
+        <w:numPr>
+          <w:ilvl w:val="3"/>
+          <w:numId w:val="226"/>
+        </w:numPr>
+        <w:rPr>
+          <w:lang w:val="es-419" w:eastAsia="es-CO"/>
+        </w:rPr>
+      </w:pPr>
+      <w:r>
+        <w:rPr>
+          <w:lang w:val="es-419" w:eastAsia="es-CO"/>
+        </w:rPr>
+        <w:t>Mantenimiento preventivo obligatorio.</w:t>
+      </w:r>
+    </w:p>
+    <w:p>
+      <w:pPr>
+        <w:pStyle w:val="Prrafodelista"/>
+        <w:numPr>
+          <w:ilvl w:val="3"/>
+          <w:numId w:val="226"/>
+        </w:numPr>
+        <w:rPr>
+          <w:lang w:val="es-419" w:eastAsia="es-CO"/>
+        </w:rPr>
+      </w:pPr>
+      <w:r>
+        <w:rPr>
+          <w:lang w:val="es-419" w:eastAsia="es-CO"/>
+        </w:rPr>
+        <w:t>Supervisión de condiciones de higiene y seguridad (en transporte escolar, por ejemplo).</w:t>
+      </w:r>
+    </w:p>
+    <w:p>
+      <w:pPr>
+        <w:pStyle w:val="Ttulo2"/>
+      </w:pPr>
+      <w:bookmarkStart w:id="25" w:name="_Toc209191670"/>
+      <w:r>
+        <w:t>5.2 Límite de velocidad</w:t>
+      </w:r>
+      <w:bookmarkEnd w:id="25"/>
     </w:p>
     <w:p>
       <w:pPr>
@@ -10720,147 +11032,18 @@
       </w:pPr>
       <w:r>
         <w:rPr>
-          <w:lang w:val="es-419" w:eastAsia="es-CO"/>
-        </w:rPr>
-        <w:t xml:space="preserve">Requisitos: </w:t>
-      </w:r>
-    </w:p>
-    <w:p>
-      <w:pPr>
-        <w:pStyle w:val="Prrafodelista"/>
-        <w:numPr>
-          <w:ilvl w:val="0"/>
-          <w:numId w:val="225"/>
-        </w:numPr>
-        <w:rPr>
-          <w:lang w:val="es-419" w:eastAsia="es-CO"/>
-        </w:rPr>
-      </w:pPr>
-      <w:r>
-        <w:rPr>
-          <w:lang w:val="es-419" w:eastAsia="es-CO"/>
-        </w:rPr>
-        <w:t>Licencias especializadas.</w:t>
-      </w:r>
-    </w:p>
-    <w:p>
-      <w:pPr>
-        <w:pStyle w:val="Prrafodelista"/>
-        <w:numPr>
-          <w:ilvl w:val="0"/>
-          <w:numId w:val="225"/>
-        </w:numPr>
-        <w:rPr>
-          <w:lang w:val="es-419" w:eastAsia="es-CO"/>
-        </w:rPr>
-      </w:pPr>
-      <w:r>
-        <w:rPr>
-          <w:lang w:val="es-419" w:eastAsia="es-CO"/>
-        </w:rPr>
-        <w:t>Certificados de habilitación y protocolos de seguridad.</w:t>
-      </w:r>
-    </w:p>
-    <w:p>
-      <w:pPr>
-        <w:pStyle w:val="Prrafodelista"/>
-        <w:numPr>
-          <w:ilvl w:val="0"/>
-          <w:numId w:val="225"/>
-        </w:numPr>
-        <w:rPr>
-          <w:lang w:val="es-419" w:eastAsia="es-CO"/>
-        </w:rPr>
-      </w:pPr>
-      <w:r>
-        <w:rPr>
-          <w:lang w:val="es-419" w:eastAsia="es-CO"/>
-        </w:rPr>
-        <w:t>Equipamiento específico (luces, sirenas, botiquines).</w:t>
-      </w:r>
-    </w:p>
-    <w:p>
-      <w:pPr>
-        <w:pStyle w:val="Prrafodelista"/>
-        <w:numPr>
-          <w:ilvl w:val="0"/>
-          <w:numId w:val="225"/>
-        </w:numPr>
-        <w:ind w:left="1134"/>
-        <w:rPr>
-          <w:lang w:val="es-419" w:eastAsia="es-CO"/>
-        </w:rPr>
-      </w:pPr>
-      <w:r>
-        <w:rPr>
-          <w:lang w:val="es-419" w:eastAsia="es-CO"/>
-        </w:rPr>
-        <w:t>Normas específicas:</w:t>
-      </w:r>
-    </w:p>
-    <w:p>
-      <w:pPr>
-        <w:pStyle w:val="Prrafodelista"/>
-        <w:numPr>
-          <w:ilvl w:val="3"/>
-          <w:numId w:val="226"/>
-        </w:numPr>
-        <w:rPr>
-          <w:lang w:val="es-419" w:eastAsia="es-CO"/>
-        </w:rPr>
-      </w:pPr>
-      <w:r>
-        <w:rPr>
-          <w:lang w:val="es-419" w:eastAsia="es-CO"/>
-        </w:rPr>
-        <w:t>Prioridad de paso en emergencias.</w:t>
-      </w:r>
-    </w:p>
-    <w:p>
-      <w:pPr>
-        <w:pStyle w:val="Prrafodelista"/>
-        <w:numPr>
-          <w:ilvl w:val="3"/>
-          <w:numId w:val="226"/>
-        </w:numPr>
-        <w:rPr>
-          <w:lang w:val="es-419" w:eastAsia="es-CO"/>
-        </w:rPr>
-      </w:pPr>
-      <w:r>
-        <w:rPr>
-          <w:lang w:val="es-419" w:eastAsia="es-CO"/>
-        </w:rPr>
-        <w:t>Mantenimiento preventivo obligatorio.</w:t>
-      </w:r>
-    </w:p>
-    <w:p>
-      <w:pPr>
-        <w:pStyle w:val="Prrafodelista"/>
-        <w:numPr>
-          <w:ilvl w:val="3"/>
-          <w:numId w:val="226"/>
-        </w:numPr>
-        <w:rPr>
-          <w:lang w:val="es-419" w:eastAsia="es-CO"/>
-        </w:rPr>
-      </w:pPr>
-      <w:r>
-        <w:rPr>
-          <w:lang w:val="es-419" w:eastAsia="es-CO"/>
-        </w:rPr>
-        <w:t>Supervisión de condiciones de higiene y seguridad (en transporte escolar, por ejemplo).</w:t>
-      </w:r>
-    </w:p>
-    <w:p>
-      <w:pPr>
-        <w:pStyle w:val="Ttulo2"/>
-      </w:pPr>
-      <w:bookmarkStart w:id="25" w:name="_Toc208571197"/>
-      <w:r>
-        <w:t>5.2 Límite de velocidad</w:t>
-      </w:r>
-      <w:bookmarkEnd w:id="25"/>
+          <w:b/>
+          <w:bCs/>
+          <w:lang w:val="es-419" w:eastAsia="es-CO"/>
+        </w:rPr>
+        <w:t>Vías urbanas</w:t>
+      </w:r>
+      <w:r>
+        <w:rPr>
+          <w:lang w:val="es-419" w:eastAsia="es-CO"/>
+        </w:rPr>
+        <w:t>: máx. 60 km/h.</w:t>
+      </w:r>
     </w:p>
     <w:p>
       <w:pPr>
@@ -10879,13 +11062,13 @@
           <w:bCs/>
           <w:lang w:val="es-419" w:eastAsia="es-CO"/>
         </w:rPr>
-        <w:t>Vías urbanas</w:t>
-      </w:r>
-      <w:r>
-        <w:rPr>
-          <w:lang w:val="es-419" w:eastAsia="es-CO"/>
-        </w:rPr>
-        <w:t>: máx. 60 km/h.</w:t>
+        <w:t>Zonas escolares y residenciales</w:t>
+      </w:r>
+      <w:r>
+        <w:rPr>
+          <w:lang w:val="es-419" w:eastAsia="es-CO"/>
+        </w:rPr>
+        <w:t>: máx. 30 km/h.</w:t>
       </w:r>
     </w:p>
     <w:p>
@@ -10905,55 +11088,41 @@
           <w:bCs/>
           <w:lang w:val="es-419" w:eastAsia="es-CO"/>
         </w:rPr>
-        <w:t>Zonas escolares y residenciales</w:t>
-      </w:r>
-      <w:r>
-        <w:rPr>
-          <w:lang w:val="es-419" w:eastAsia="es-CO"/>
-        </w:rPr>
-        <w:t>: máx. 30 km/h.</w:t>
+        <w:lastRenderedPageBreak/>
+        <w:t>Carreteras nacionales</w:t>
+      </w:r>
+      <w:r>
+        <w:rPr>
+          <w:lang w:val="es-419" w:eastAsia="es-CO"/>
+        </w:rPr>
+        <w:t xml:space="preserve">: máx. 80-100 km/h </w:t>
+      </w:r>
+      <w:r>
+        <w:rPr>
+          <w:lang w:val="es-419" w:eastAsia="es-CO"/>
+        </w:rPr>
+        <w:t>e</w:t>
+      </w:r>
+      <w:r>
+        <w:rPr>
+          <w:lang w:val="es-419" w:eastAsia="es-CO"/>
+        </w:rPr>
+        <w:t>stos pueden modificarse según señalización oficial.</w:t>
       </w:r>
     </w:p>
     <w:p>
-      <w:pPr>
-        <w:pStyle w:val="Prrafodelista"/>
-        <w:numPr>
-          <w:ilvl w:val="0"/>
-          <w:numId w:val="223"/>
-        </w:numPr>
-        <w:rPr>
-          <w:lang w:val="es-419" w:eastAsia="es-CO"/>
-        </w:rPr>
-      </w:pPr>
-      <w:r>
-        <w:rPr>
-          <w:b/>
-          <w:bCs/>
-          <w:lang w:val="es-419" w:eastAsia="es-CO"/>
-        </w:rPr>
-        <w:lastRenderedPageBreak/>
-        <w:t>Carreteras nacionales</w:t>
-      </w:r>
-      <w:r>
-        <w:rPr>
-          <w:lang w:val="es-419" w:eastAsia="es-CO"/>
-        </w:rPr>
-        <w:t>: máx. 80-100 km/h Estos pueden modificarse según señalización oficial.</w:t>
+      <w:r>
+        <w:t>Todo depende del país donde establezcan las normas.</w:t>
+      </w:r>
+      <w:r>
+        <w:tab/>
       </w:r>
     </w:p>
     <w:p>
-      <w:r>
-        <w:t>Todo depende del país donde establezcan las normas.</w:t>
-      </w:r>
-      <w:r>
-        <w:tab/>
-      </w:r>
-    </w:p>
-    <w:p>
       <w:pPr>
         <w:pStyle w:val="Ttulo2"/>
       </w:pPr>
-      <w:bookmarkStart w:id="26" w:name="_Toc208571198"/>
+      <w:bookmarkStart w:id="26" w:name="_Toc209191671"/>
       <w:r>
         <w:t>5.3 Tipos de infracción</w:t>
       </w:r>
@@ -10961,7 +11130,13 @@
     </w:p>
     <w:p>
       <w:r>
-        <w:t>Los tipos de infracción se establece según los tipos: A, B, C, D Y E, desde las leves a las más graves.</w:t>
+        <w:t xml:space="preserve">Los tipos de infracción se establece según los tipos: A, B, C, D </w:t>
+      </w:r>
+      <w:r>
+        <w:t>y</w:t>
+      </w:r>
+      <w:r>
+        <w:t xml:space="preserve"> E, desde las leves a las más graves.</w:t>
       </w:r>
     </w:p>
     <w:p>
@@ -11007,7 +11182,7 @@
       <w:pPr>
         <w:pStyle w:val="Ttulo2"/>
       </w:pPr>
-      <w:bookmarkStart w:id="27" w:name="_Toc208571199"/>
+      <w:bookmarkStart w:id="27" w:name="_Toc209191672"/>
       <w:r>
         <w:t>5.4 Sanciones</w:t>
       </w:r>
@@ -11095,7 +11270,7 @@
                     <pic:cNvPicPr/>
                   </pic:nvPicPr>
                   <pic:blipFill>
-                    <a:blip r:embed="rId19"/>
+                    <a:blip r:embed="rId20"/>
                     <a:stretch>
                       <a:fillRect/>
                     </a:stretch>
@@ -11125,7 +11300,7 @@
           <w:lang w:val="es-419" w:eastAsia="es-CO"/>
         </w:rPr>
       </w:pPr>
-      <w:hyperlink r:id="rId20" w:history="1">
+      <w:hyperlink r:id="rId21" w:history="1">
         <w:r>
           <w:rPr>
             <w:rStyle w:val="Hipervnculo"/>
@@ -11321,7 +11496,7 @@
       <w:pPr>
         <w:pStyle w:val="Titulosgenerales"/>
       </w:pPr>
-      <w:bookmarkStart w:id="28" w:name="_Toc208571200"/>
+      <w:bookmarkStart w:id="28" w:name="_Toc209191673"/>
       <w:r>
         <w:lastRenderedPageBreak/>
         <w:t>Síntesis</w:t>
@@ -11341,7 +11516,43 @@
         <w:rPr>
           <w:lang w:val="es-419" w:eastAsia="es-CO"/>
         </w:rPr>
-        <w:t xml:space="preserve">El componente formativo Movilidad Inteligente y Circulación Segura, abarca la integralidad del transporte terrestre, desde su historia y concepto hasta su tipología, la normativa que lo rige y los diversos medios de transporte utilizados. Asimismo, se profundiza en la infraestructura vial, detallando su definición, la nomenclatura de la jurisdicción, los riesgos viales del entorno, y las clases y aspectos técnicos de vías. </w:t>
+        <w:t xml:space="preserve">El componente formativo Movilidad </w:t>
+      </w:r>
+      <w:r>
+        <w:rPr>
+          <w:lang w:val="es-419" w:eastAsia="es-CO"/>
+        </w:rPr>
+        <w:t>i</w:t>
+      </w:r>
+      <w:r>
+        <w:rPr>
+          <w:lang w:val="es-419" w:eastAsia="es-CO"/>
+        </w:rPr>
+        <w:t xml:space="preserve">nteligente y </w:t>
+      </w:r>
+      <w:r>
+        <w:rPr>
+          <w:lang w:val="es-419" w:eastAsia="es-CO"/>
+        </w:rPr>
+        <w:t>c</w:t>
+      </w:r>
+      <w:r>
+        <w:rPr>
+          <w:lang w:val="es-419" w:eastAsia="es-CO"/>
+        </w:rPr>
+        <w:t xml:space="preserve">irculación </w:t>
+      </w:r>
+      <w:r>
+        <w:rPr>
+          <w:lang w:val="es-419" w:eastAsia="es-CO"/>
+        </w:rPr>
+        <w:t>s</w:t>
+      </w:r>
+      <w:r>
+        <w:rPr>
+          <w:lang w:val="es-419" w:eastAsia="es-CO"/>
+        </w:rPr>
+        <w:t xml:space="preserve">egura, abarca la integralidad del transporte terrestre, desde su historia y concepto hasta su tipología, la normativa que lo rige y los diversos medios de transporte utilizados. Asimismo, se profundiza en la infraestructura vial, detallando su definición, la nomenclatura de la jurisdicción, los riesgos viales del entorno, y las clases y aspectos técnicos de vías. </w:t>
       </w:r>
     </w:p>
     <w:p>
@@ -11354,7 +11565,73 @@
         <w:rPr>
           <w:lang w:val="es-419" w:eastAsia="es-CO"/>
         </w:rPr>
-        <w:t>Un pilar fundamental es la educación vial, que promueve principios, valores ciudadanos, la convivencia vial y hábitos seguros al desplazarse como conductor, peatón o pasajero. Por tal razón, se analiza el Código Nacional de Tránsito, sus principios, autoridades, registro de información de conductores, licencias y condiciones del vehículo, y los seguros y responsabilidades del vehículo, culminando con los estatus nacionales del transporte, las normas según tipo de transporte, límites de velocidad</w:t>
+        <w:t xml:space="preserve">Un pilar fundamental es la educación vial, que promueve principios, valores ciudadanos, la convivencia vial y hábitos seguros al desplazarse como conductor, peatón o pasajero. Por tal razón, se analiza el </w:t>
+      </w:r>
+      <w:r>
+        <w:rPr>
+          <w:lang w:val="es-419" w:eastAsia="es-CO"/>
+        </w:rPr>
+        <w:t>Código Nacional de Tránsito</w:t>
+      </w:r>
+      <w:r>
+        <w:rPr>
+          <w:lang w:val="es-419" w:eastAsia="es-CO"/>
+        </w:rPr>
+        <w:t xml:space="preserve">, sus principios, autoridades, registro de información de conductores, licencias y condiciones del vehículo, y los seguros y responsabilidades del vehículo, culminando con los </w:t>
+      </w:r>
+      <w:r>
+        <w:rPr>
+          <w:lang w:val="es-419" w:eastAsia="es-CO"/>
+        </w:rPr>
+        <w:t>Estatuto</w:t>
+      </w:r>
+      <w:r>
+        <w:rPr>
+          <w:lang w:val="es-419" w:eastAsia="es-CO"/>
+        </w:rPr>
+        <w:t>s</w:t>
+      </w:r>
+      <w:r>
+        <w:rPr>
+          <w:lang w:val="es-419" w:eastAsia="es-CO"/>
+        </w:rPr>
+        <w:t xml:space="preserve"> </w:t>
+      </w:r>
+      <w:r>
+        <w:rPr>
+          <w:lang w:val="es-419" w:eastAsia="es-CO"/>
+        </w:rPr>
+        <w:t>N</w:t>
+      </w:r>
+      <w:r>
+        <w:rPr>
+          <w:lang w:val="es-419" w:eastAsia="es-CO"/>
+        </w:rPr>
+        <w:t>acional</w:t>
+      </w:r>
+      <w:r>
+        <w:rPr>
+          <w:lang w:val="es-419" w:eastAsia="es-CO"/>
+        </w:rPr>
+        <w:t>es</w:t>
+      </w:r>
+      <w:r>
+        <w:rPr>
+          <w:lang w:val="es-419" w:eastAsia="es-CO"/>
+        </w:rPr>
+        <w:t xml:space="preserve"> de </w:t>
+      </w:r>
+      <w:r>
+        <w:rPr>
+          <w:lang w:val="es-419" w:eastAsia="es-CO"/>
+        </w:rPr>
+        <w:t>T</w:t>
+      </w:r>
+      <w:r>
+        <w:rPr>
+          <w:lang w:val="es-419" w:eastAsia="es-CO"/>
+        </w:rPr>
+        <w:t>ransporte, las normas según tipo de transporte, límites de velocidad</w:t>
       </w:r>
       <w:r>
         <w:rPr>
@@ -11372,19 +11649,20 @@
     <w:p>
       <w:pPr>
         <w:rPr>
+          <w:lang w:val="es-419" w:eastAsia="es-CO"/>
+        </w:rPr>
+      </w:pPr>
+      <w:r>
+        <w:rPr>
           <w:noProof/>
-        </w:rPr>
-      </w:pPr>
-      <w:r>
-        <w:rPr>
-          <w:noProof/>
+          <w:lang w:val="es-419" w:eastAsia="es-CO"/>
         </w:rPr>
         <w:lastRenderedPageBreak/>
         <w:drawing>
-          <wp:inline distT="0" distB="0" distL="0" distR="0" wp14:anchorId="0A017FDB" wp14:editId="4F30E069">
-            <wp:extent cx="5641168" cy="3939540"/>
+          <wp:inline distT="0" distB="0" distL="0" distR="0" wp14:anchorId="57887841" wp14:editId="1C31DED5">
+            <wp:extent cx="5539105" cy="3865487"/>
             <wp:effectExtent l="0" t="0" r="0" b="0"/>
-            <wp:docPr id="2008060315" name="Imagen 1" descr="En la síntesis del componente formativo “ Movilidad inteligente y circulación segura” se describe un análisis profundo de la integración tecnológica y gestión de la operación del transporte."/>
+            <wp:docPr id="770980872" name="Gráfico 5" descr="En la síntesis del componente formativo “ Movilidad inteligente y circulación segura” se describe un análisis profundo de la integración tecnológica y gestión de la operación del transporte."/>
             <wp:cNvGraphicFramePr>
               <a:graphicFrameLocks xmlns:a="http://schemas.openxmlformats.org/drawingml/2006/main" noChangeAspect="1"/>
             </wp:cNvGraphicFramePr>
@@ -11392,11 +11670,17 @@
               <a:graphicData uri="http://schemas.openxmlformats.org/drawingml/2006/picture">
                 <pic:pic xmlns:pic="http://schemas.openxmlformats.org/drawingml/2006/picture">
                   <pic:nvPicPr>
-                    <pic:cNvPr id="2008060315" name="Imagen 1" descr="En la síntesis del componente formativo “ Movilidad inteligente y circulación segura” se describe un análisis profundo de la integración tecnológica y gestión de la operación del transporte."/>
+                    <pic:cNvPr id="770980872" name="Gráfico 5" descr="En la síntesis del componente formativo “ Movilidad inteligente y circulación segura” se describe un análisis profundo de la integración tecnológica y gestión de la operación del transporte."/>
                     <pic:cNvPicPr/>
                   </pic:nvPicPr>
                   <pic:blipFill>
-                    <a:blip r:embed="rId21"/>
+                    <a:blip r:embed="rId22">
+                      <a:extLst>
+                        <a:ext uri="{96DAC541-7B7A-43D3-8B79-37D633B846F1}">
+                          <asvg:svgBlip xmlns:asvg="http://schemas.microsoft.com/office/drawing/2016/SVG/main" r:embed="rId23"/>
+                        </a:ext>
+                      </a:extLst>
+                    </a:blip>
                     <a:stretch>
                       <a:fillRect/>
                     </a:stretch>
@@ -11404,7 +11688,7 @@
                   <pic:spPr>
                     <a:xfrm>
                       <a:off x="0" y="0"/>
-                      <a:ext cx="5651128" cy="3946495"/>
+                      <a:ext cx="5556031" cy="3877299"/>
                     </a:xfrm>
                     <a:prstGeom prst="rect">
                       <a:avLst/>
@@ -11419,17 +11703,24 @@
     </w:p>
     <w:p>
       <w:pPr>
-        <w:ind w:firstLine="0"/>
-        <w:rPr>
-          <w:lang w:val="es-419" w:eastAsia="es-CO"/>
+        <w:rPr>
+          <w:noProof/>
         </w:rPr>
       </w:pPr>
     </w:p>
     <w:p>
       <w:pPr>
+        <w:ind w:firstLine="0"/>
+        <w:rPr>
+          <w:lang w:val="es-419" w:eastAsia="es-CO"/>
+        </w:rPr>
+      </w:pPr>
+    </w:p>
+    <w:p>
+      <w:pPr>
         <w:pStyle w:val="Titulosgenerales"/>
       </w:pPr>
-      <w:bookmarkStart w:id="29" w:name="_Toc208571201"/>
+      <w:bookmarkStart w:id="29" w:name="_Toc209191674"/>
       <w:r>
         <w:lastRenderedPageBreak/>
         <w:t>Glosario</w:t>
@@ -12056,7 +12347,7 @@
       <w:pPr>
         <w:pStyle w:val="Titulosgenerales"/>
       </w:pPr>
-      <w:bookmarkStart w:id="30" w:name="_Toc208571202"/>
+      <w:bookmarkStart w:id="30" w:name="_Toc209191675"/>
       <w:r>
         <w:lastRenderedPageBreak/>
         <w:t>Material complementario</w:t>
@@ -12220,7 +12511,7 @@
               </w:rPr>
               <w:t xml:space="preserve">Álvarez, J. L. (s.f.). Carreteras inteligentes: Qué son y cómo funcionan [Video]. Tuteorica.com. </w:t>
             </w:r>
-            <w:hyperlink r:id="rId22" w:tgtFrame="_new" w:history="1">
+            <w:hyperlink r:id="rId24" w:tgtFrame="_new" w:history="1">
               <w:r>
                 <w:rPr>
                   <w:rStyle w:val="Hipervnculo"/>
@@ -12277,7 +12568,7 @@
                 <w:szCs w:val="28"/>
               </w:rPr>
             </w:pPr>
-            <w:hyperlink r:id="rId23">
+            <w:hyperlink r:id="rId25">
               <w:r>
                 <w:rPr>
                   <w:rStyle w:val="Hipervnculo"/>
@@ -12372,7 +12663,7 @@
                 <w:lang w:val="es-419" w:eastAsia="es-CO"/>
               </w:rPr>
             </w:pPr>
-            <w:hyperlink r:id="rId24" w:history="1">
+            <w:hyperlink r:id="rId26" w:history="1">
               <w:r>
                 <w:rPr>
                   <w:rStyle w:val="Hipervnculo"/>
@@ -12487,7 +12778,7 @@
                 <w:lang w:val="es-419" w:eastAsia="es-CO"/>
               </w:rPr>
             </w:pPr>
-            <w:hyperlink r:id="rId25" w:history="1">
+            <w:hyperlink r:id="rId27" w:history="1">
               <w:r>
                 <w:rPr>
                   <w:rStyle w:val="Hipervnculo"/>
@@ -12521,7 +12812,7 @@
       <w:pPr>
         <w:pStyle w:val="Titulosgenerales"/>
       </w:pPr>
-      <w:bookmarkStart w:id="31" w:name="_Toc208571203"/>
+      <w:bookmarkStart w:id="31" w:name="_Toc209191676"/>
       <w:r>
         <w:lastRenderedPageBreak/>
         <w:t>Referencias bibliográficas</w:t>
@@ -12573,7 +12864,21 @@
           <w:color w:val="000000" w:themeColor="text1"/>
           <w:lang w:eastAsia="es-CO"/>
         </w:rPr>
-        <w:t>Congreso de la República de Colombia. (2002). Ley 769 de 2002: Por la cual se expide el Código Nacional de Tránsito Terrestre y se dictan otras disposiciones. Diario Oficial de Colombia.</w:t>
+        <w:t xml:space="preserve">Congreso de la República de Colombia. (2002). Ley 769 de 2002: Por la cual se expide el </w:t>
+      </w:r>
+      <w:r>
+        <w:rPr>
+          <w:color w:val="000000" w:themeColor="text1"/>
+          <w:lang w:eastAsia="es-CO"/>
+        </w:rPr>
+        <w:t>Código Nacional de Tránsito</w:t>
+      </w:r>
+      <w:r>
+        <w:rPr>
+          <w:color w:val="000000" w:themeColor="text1"/>
+          <w:lang w:eastAsia="es-CO"/>
+        </w:rPr>
+        <w:t xml:space="preserve"> Terrestre y se dictan otras disposiciones. Diario Oficial de Colombia.</w:t>
       </w:r>
     </w:p>
     <w:p>
@@ -12619,7 +12924,7 @@
           <w:color w:val="000000" w:themeColor="text1"/>
           <w:lang w:eastAsia="es-CO"/>
         </w:rPr>
-        <w:t xml:space="preserve">Garrison, W. </w:t>
+        <w:t>Garrison</w:t>
       </w:r>
       <w:proofErr w:type="spellEnd"/>
       <w:r>
@@ -12627,7 +12932,7 @@
           <w:color w:val="000000" w:themeColor="text1"/>
           <w:lang w:eastAsia="es-CO"/>
         </w:rPr>
-        <w:t>L., &amp; Levinson, D. M. (2014</w:t>
+        <w:t>, W. L., &amp; Levinson, D. M. (2014</w:t>
       </w:r>
       <w:r>
         <w:rPr>
@@ -12727,7 +13032,7 @@
         </w:rPr>
         <w:t xml:space="preserve">ONU. (2020). Plan Mundial para el Decenio de Acción para la Seguridad Vial 2021-2030. </w:t>
       </w:r>
-      <w:hyperlink r:id="rId26" w:history="1">
+      <w:hyperlink r:id="rId28" w:history="1">
         <w:r>
           <w:rPr>
             <w:rStyle w:val="Hipervnculo"/>
@@ -12765,7 +13070,7 @@
       <w:pPr>
         <w:rPr>
           <w:color w:val="000000" w:themeColor="text1"/>
-          <w:lang w:eastAsia="es-CO"/>
+          <w:lang w:val="en-US" w:eastAsia="es-CO"/>
         </w:rPr>
       </w:pPr>
       <w:r>
@@ -12782,204 +13087,213 @@
         </w:rPr>
         <w:t xml:space="preserve"> </w:t>
       </w:r>
-      <w:r>
+      <w:hyperlink r:id="rId29" w:history="1">
+        <w:r>
+          <w:rPr>
+            <w:rStyle w:val="Hipervnculo"/>
+            <w:lang w:val="en-US" w:eastAsia="es-CO"/>
+          </w:rPr>
+          <w:t>https://www.paho.org</w:t>
+        </w:r>
+      </w:hyperlink>
+      <w:r>
+        <w:rPr>
+          <w:color w:val="000000" w:themeColor="text1"/>
+          <w:lang w:val="en-US" w:eastAsia="es-CO"/>
+        </w:rPr>
+        <w:t>.</w:t>
+      </w:r>
+    </w:p>
+    <w:p>
+      <w:pPr>
         <w:rPr>
           <w:color w:val="000000" w:themeColor="text1"/>
           <w:lang w:eastAsia="es-CO"/>
         </w:rPr>
-        <w:t>https://www.paho.org.</w:t>
+      </w:pPr>
+      <w:proofErr w:type="spellStart"/>
+      <w:r>
+        <w:rPr>
+          <w:color w:val="000000" w:themeColor="text1"/>
+          <w:lang w:val="en-US" w:eastAsia="es-CO"/>
+        </w:rPr>
+        <w:t>Ortúzar</w:t>
+      </w:r>
+      <w:proofErr w:type="spellEnd"/>
+      <w:r>
+        <w:rPr>
+          <w:color w:val="000000" w:themeColor="text1"/>
+          <w:lang w:val="en-US" w:eastAsia="es-CO"/>
+        </w:rPr>
+        <w:t xml:space="preserve">, J. de D., &amp; Willumsen, L. G. (2011). </w:t>
+      </w:r>
+      <w:r>
+        <w:rPr>
+          <w:rStyle w:val="Extranjerismo"/>
+          <w:lang w:eastAsia="es-CO"/>
+        </w:rPr>
+        <w:t>Modelling Transport (</w:t>
+      </w:r>
+      <w:r>
+        <w:rPr>
+          <w:color w:val="000000" w:themeColor="text1"/>
+          <w:lang w:val="en-US" w:eastAsia="es-CO"/>
+        </w:rPr>
+        <w:t xml:space="preserve">4th ed.). </w:t>
+      </w:r>
+      <w:r>
+        <w:rPr>
+          <w:color w:val="000000" w:themeColor="text1"/>
+          <w:lang w:eastAsia="es-CO"/>
+        </w:rPr>
+        <w:t>Wiley. (Ortúzar. J de D., 2011).</w:t>
       </w:r>
     </w:p>
     <w:p>
       <w:pPr>
         <w:rPr>
           <w:color w:val="000000" w:themeColor="text1"/>
+          <w:lang w:val="en-US" w:eastAsia="es-CO"/>
+        </w:rPr>
+      </w:pPr>
+      <w:r>
+        <w:rPr>
+          <w:color w:val="000000" w:themeColor="text1"/>
           <w:lang w:eastAsia="es-CO"/>
         </w:rPr>
-      </w:pPr>
-      <w:proofErr w:type="spellStart"/>
+        <w:t xml:space="preserve">Pons, L. (Coord.). (2017). Tráfico y seguridad vial: Una visión multidisciplinar. </w:t>
+      </w:r>
       <w:r>
         <w:rPr>
           <w:color w:val="000000" w:themeColor="text1"/>
           <w:lang w:val="en-US" w:eastAsia="es-CO"/>
         </w:rPr>
-        <w:t>Ortúzar</w:t>
-      </w:r>
-      <w:proofErr w:type="spellEnd"/>
+        <w:t xml:space="preserve">Editorial </w:t>
+      </w:r>
+      <w:proofErr w:type="spellStart"/>
       <w:r>
         <w:rPr>
           <w:color w:val="000000" w:themeColor="text1"/>
           <w:lang w:val="en-US" w:eastAsia="es-CO"/>
         </w:rPr>
-        <w:t xml:space="preserve">, J. de D., &amp; Willumsen, L. G. (2011). </w:t>
+        <w:t>Dykinson</w:t>
+      </w:r>
+      <w:proofErr w:type="spellEnd"/>
+      <w:r>
+        <w:rPr>
+          <w:color w:val="000000" w:themeColor="text1"/>
+          <w:lang w:val="en-US" w:eastAsia="es-CO"/>
+        </w:rPr>
+        <w:t>.</w:t>
+      </w:r>
+    </w:p>
+    <w:p>
+      <w:pPr>
+        <w:rPr>
+          <w:color w:val="000000" w:themeColor="text1"/>
+          <w:lang w:eastAsia="es-CO"/>
+        </w:rPr>
+      </w:pPr>
+      <w:r>
+        <w:rPr>
+          <w:color w:val="000000" w:themeColor="text1"/>
+          <w:lang w:val="en-US" w:eastAsia="es-CO"/>
+        </w:rPr>
+        <w:t>Rodr</w:t>
+      </w:r>
+      <w:r>
+        <w:rPr>
+          <w:color w:val="000000" w:themeColor="text1"/>
+          <w:lang w:val="en-US" w:eastAsia="es-CO"/>
+        </w:rPr>
+        <w:t>í</w:t>
+      </w:r>
+      <w:r>
+        <w:rPr>
+          <w:color w:val="000000" w:themeColor="text1"/>
+          <w:lang w:val="en-US" w:eastAsia="es-CO"/>
+        </w:rPr>
+        <w:t>guez, J.-P. (2020</w:t>
       </w:r>
       <w:r>
         <w:rPr>
           <w:rStyle w:val="Extranjerismo"/>
           <w:lang w:eastAsia="es-CO"/>
         </w:rPr>
-        <w:t>Modelling Transport (</w:t>
-      </w:r>
-      <w:r>
+        <w:t xml:space="preserve">). The Geography of Transport Systems (5th ed.). </w:t>
+      </w:r>
+      <w:r>
+        <w:rPr>
+          <w:rStyle w:val="Extranjerismo"/>
+          <w:lang w:val="es-CO" w:eastAsia="es-CO"/>
+        </w:rPr>
+        <w:t>Routledge</w:t>
+      </w:r>
+      <w:r>
+        <w:rPr>
+          <w:color w:val="000000" w:themeColor="text1"/>
+          <w:lang w:eastAsia="es-CO"/>
+        </w:rPr>
+        <w:t>.</w:t>
+      </w:r>
+    </w:p>
+    <w:p>
+      <w:pPr>
         <w:rPr>
           <w:color w:val="000000" w:themeColor="text1"/>
           <w:lang w:val="en-US" w:eastAsia="es-CO"/>
         </w:rPr>
-        <w:t xml:space="preserve">4th ed.). </w:t>
-      </w:r>
+      </w:pPr>
       <w:r>
         <w:rPr>
           <w:color w:val="000000" w:themeColor="text1"/>
           <w:lang w:eastAsia="es-CO"/>
         </w:rPr>
-        <w:t>Wiley. (Ortúzar. J de D., 2011).</w:t>
+        <w:t xml:space="preserve">Sánchez, R. (2019). Movilidad urbana sostenible: Conceptos, planificación y gestión. </w:t>
+      </w:r>
+      <w:r>
+        <w:rPr>
+          <w:color w:val="000000" w:themeColor="text1"/>
+          <w:lang w:val="en-US" w:eastAsia="es-CO"/>
+        </w:rPr>
+        <w:t xml:space="preserve">Editorial </w:t>
+      </w:r>
+      <w:proofErr w:type="spellStart"/>
+      <w:r>
+        <w:rPr>
+          <w:color w:val="000000" w:themeColor="text1"/>
+          <w:lang w:val="en-US" w:eastAsia="es-CO"/>
+        </w:rPr>
+        <w:t>Reverté</w:t>
+      </w:r>
+      <w:proofErr w:type="spellEnd"/>
+      <w:r>
+        <w:rPr>
+          <w:color w:val="000000" w:themeColor="text1"/>
+          <w:lang w:val="en-US" w:eastAsia="es-CO"/>
+        </w:rPr>
+        <w:t>.</w:t>
       </w:r>
     </w:p>
     <w:p>
       <w:pPr>
         <w:rPr>
-          <w:color w:val="000000" w:themeColor="text1"/>
-          <w:lang w:val="en-US" w:eastAsia="es-CO"/>
-        </w:rPr>
-      </w:pPr>
-      <w:r>
-        <w:rPr>
-          <w:color w:val="000000" w:themeColor="text1"/>
+          <w:rStyle w:val="Extranjerismo"/>
+        </w:rPr>
+      </w:pPr>
+      <w:r>
+        <w:rPr>
+          <w:rStyle w:val="Extranjerismo"/>
           <w:lang w:eastAsia="es-CO"/>
         </w:rPr>
-        <w:t xml:space="preserve">Pons, L. (Coord.). (2017). Tráfico y seguridad vial: Una visión multidisciplinar. </w:t>
-      </w:r>
-      <w:r>
-        <w:rPr>
-          <w:color w:val="000000" w:themeColor="text1"/>
-          <w:lang w:val="en-US" w:eastAsia="es-CO"/>
-        </w:rPr>
-        <w:t xml:space="preserve">Editorial </w:t>
-      </w:r>
-      <w:proofErr w:type="spellStart"/>
-      <w:r>
-        <w:rPr>
-          <w:color w:val="000000" w:themeColor="text1"/>
-          <w:lang w:val="en-US" w:eastAsia="es-CO"/>
-        </w:rPr>
-        <w:t>Dykinson</w:t>
-      </w:r>
-      <w:proofErr w:type="spellEnd"/>
-      <w:r>
-        <w:rPr>
-          <w:color w:val="000000" w:themeColor="text1"/>
-          <w:lang w:val="en-US" w:eastAsia="es-CO"/>
-        </w:rPr>
-        <w:t>.</w:t>
+        <w:t>World Health Organization (WHO). (2018). Global status report on road safety 2018. WHO.</w:t>
       </w:r>
     </w:p>
     <w:p>
       <w:pPr>
-        <w:rPr>
-          <w:color w:val="000000" w:themeColor="text1"/>
-          <w:lang w:eastAsia="es-CO"/>
-        </w:rPr>
-      </w:pPr>
-      <w:r>
-        <w:rPr>
-          <w:color w:val="000000" w:themeColor="text1"/>
-          <w:lang w:val="en-US" w:eastAsia="es-CO"/>
-        </w:rPr>
-        <w:t>Rodr</w:t>
-      </w:r>
-      <w:r>
-        <w:rPr>
-          <w:color w:val="000000" w:themeColor="text1"/>
-          <w:lang w:val="en-US" w:eastAsia="es-CO"/>
-        </w:rPr>
-        <w:t>í</w:t>
-      </w:r>
-      <w:r>
-        <w:rPr>
-          <w:color w:val="000000" w:themeColor="text1"/>
-          <w:lang w:val="en-US" w:eastAsia="es-CO"/>
-        </w:rPr>
-        <w:t>guez, J.-P. (2020</w:t>
-      </w:r>
-      <w:r>
-        <w:rPr>
-          <w:rStyle w:val="Extranjerismo"/>
-          <w:lang w:eastAsia="es-CO"/>
-        </w:rPr>
-        <w:t xml:space="preserve">). The Geography of Transport Systems (5th ed.). </w:t>
-      </w:r>
-      <w:r>
-        <w:rPr>
-          <w:rStyle w:val="Extranjerismo"/>
-          <w:lang w:val="es-CO" w:eastAsia="es-CO"/>
-        </w:rPr>
-        <w:t>Routledge</w:t>
-      </w:r>
-      <w:r>
-        <w:rPr>
-          <w:color w:val="000000" w:themeColor="text1"/>
-          <w:lang w:eastAsia="es-CO"/>
-        </w:rPr>
-        <w:t>.</w:t>
-      </w:r>
-    </w:p>
-    <w:p>
-      <w:pPr>
-        <w:rPr>
-          <w:color w:val="000000" w:themeColor="text1"/>
-          <w:lang w:val="en-US" w:eastAsia="es-CO"/>
-        </w:rPr>
-      </w:pPr>
-      <w:r>
-        <w:rPr>
-          <w:color w:val="000000" w:themeColor="text1"/>
-          <w:lang w:eastAsia="es-CO"/>
-        </w:rPr>
-        <w:t xml:space="preserve">Sánchez, R. (2019). Movilidad urbana sostenible: Conceptos, planificación y gestión. </w:t>
-      </w:r>
-      <w:r>
-        <w:rPr>
-          <w:color w:val="000000" w:themeColor="text1"/>
-          <w:lang w:val="en-US" w:eastAsia="es-CO"/>
-        </w:rPr>
-        <w:t xml:space="preserve">Editorial </w:t>
-      </w:r>
-      <w:proofErr w:type="spellStart"/>
-      <w:r>
-        <w:rPr>
-          <w:color w:val="000000" w:themeColor="text1"/>
-          <w:lang w:val="en-US" w:eastAsia="es-CO"/>
-        </w:rPr>
-        <w:t>Reverté</w:t>
-      </w:r>
-      <w:proofErr w:type="spellEnd"/>
-      <w:r>
-        <w:rPr>
-          <w:color w:val="000000" w:themeColor="text1"/>
-          <w:lang w:val="en-US" w:eastAsia="es-CO"/>
-        </w:rPr>
-        <w:t>.</w:t>
-      </w:r>
-    </w:p>
-    <w:p>
-      <w:pPr>
-        <w:rPr>
-          <w:rStyle w:val="Extranjerismo"/>
-        </w:rPr>
-      </w:pPr>
-      <w:r>
-        <w:rPr>
-          <w:rStyle w:val="Extranjerismo"/>
-          <w:lang w:eastAsia="es-CO"/>
-        </w:rPr>
-        <w:t>World Health Organization (WHO). (2018). Global status report on road safety 2018. WHO.</w:t>
-      </w:r>
-    </w:p>
-    <w:p>
-      <w:pPr>
         <w:pStyle w:val="Titulosgenerales"/>
       </w:pPr>
-      <w:bookmarkStart w:id="32" w:name="_Toc208571204"/>
+      <w:bookmarkStart w:id="32" w:name="_Toc209191677"/>
       <w:r>
         <w:lastRenderedPageBreak/>
         <w:t>C</w:t>
@@ -14056,8 +14370,8 @@
       </w:pPr>
     </w:p>
     <w:sectPr>
-      <w:headerReference w:type="default" r:id="rId27"/>
-      <w:footerReference w:type="default" r:id="rId28"/>
+      <w:headerReference w:type="default" r:id="rId30"/>
+      <w:footerReference w:type="default" r:id="rId31"/>
       <w:pgSz w:w="12240" w:h="15840"/>
       <w:pgMar w:top="1701" w:right="1134" w:bottom="1134" w:left="1134" w:header="709" w:footer="737" w:gutter="0"/>
       <w:pgNumType w:start="1"/>
@@ -31151,7 +31465,7 @@
       <w:lvlText w:val=""/>
       <w:lvlJc w:val="left"/>
       <w:pPr>
-        <w:ind w:left="1429" w:hanging="360"/>
+        <w:ind w:left="720" w:hanging="360"/>
       </w:pPr>
       <w:rPr>
         <w:rFonts w:ascii="Symbol" w:hAnsi="Symbol" w:hint="default"/>
@@ -31167,7 +31481,7 @@
       <w:lvlText w:val="o"/>
       <w:lvlJc w:val="left"/>
       <w:pPr>
-        <w:ind w:left="2149" w:hanging="360"/>
+        <w:ind w:left="1440" w:hanging="360"/>
       </w:pPr>
       <w:rPr>
         <w:rFonts w:ascii="Courier New" w:hAnsi="Courier New" w:cs="Courier New" w:hint="default"/>
@@ -31179,7 +31493,7 @@
       <w:lvlText w:val=""/>
       <w:lvlJc w:val="left"/>
       <w:pPr>
-        <w:ind w:left="2869" w:hanging="360"/>
+        <w:ind w:left="2160" w:hanging="360"/>
       </w:pPr>
       <w:rPr>
         <w:rFonts w:ascii="Wingdings" w:hAnsi="Wingdings" w:hint="default"/>
@@ -31191,7 +31505,7 @@
       <w:lvlText w:val=""/>
       <w:lvlJc w:val="left"/>
       <w:pPr>
-        <w:ind w:left="3589" w:hanging="360"/>
+        <w:ind w:left="2880" w:hanging="360"/>
       </w:pPr>
       <w:rPr>
         <w:rFonts w:ascii="Symbol" w:hAnsi="Symbol" w:hint="default"/>
@@ -31203,7 +31517,7 @@
       <w:lvlText w:val="o"/>
       <w:lvlJc w:val="left"/>
       <w:pPr>
-        <w:ind w:left="4309" w:hanging="360"/>
+        <w:ind w:left="3600" w:hanging="360"/>
       </w:pPr>
       <w:rPr>
         <w:rFonts w:ascii="Courier New" w:hAnsi="Courier New" w:cs="Courier New" w:hint="default"/>
@@ -31215,7 +31529,7 @@
       <w:lvlText w:val=""/>
       <w:lvlJc w:val="left"/>
       <w:pPr>
-        <w:ind w:left="5029" w:hanging="360"/>
+        <w:ind w:left="4320" w:hanging="360"/>
       </w:pPr>
       <w:rPr>
         <w:rFonts w:ascii="Wingdings" w:hAnsi="Wingdings" w:hint="default"/>
@@ -31227,7 +31541,7 @@
       <w:lvlText w:val=""/>
       <w:lvlJc w:val="left"/>
       <w:pPr>
-        <w:ind w:left="5749" w:hanging="360"/>
+        <w:ind w:left="5040" w:hanging="360"/>
       </w:pPr>
       <w:rPr>
         <w:rFonts w:ascii="Symbol" w:hAnsi="Symbol" w:hint="default"/>
@@ -31239,7 +31553,7 @@
       <w:lvlText w:val="o"/>
       <w:lvlJc w:val="left"/>
       <w:pPr>
-        <w:ind w:left="6469" w:hanging="360"/>
+        <w:ind w:left="5760" w:hanging="360"/>
       </w:pPr>
       <w:rPr>
         <w:rFonts w:ascii="Courier New" w:hAnsi="Courier New" w:cs="Courier New" w:hint="default"/>
@@ -31251,7 +31565,7 @@
       <w:lvlText w:val=""/>
       <w:lvlJc w:val="left"/>
       <w:pPr>
-        <w:ind w:left="7189" w:hanging="360"/>
+        <w:ind w:left="6480" w:hanging="360"/>
       </w:pPr>
       <w:rPr>
         <w:rFonts w:ascii="Wingdings" w:hAnsi="Wingdings" w:hint="default"/>
@@ -40485,7 +40799,6 @@
   <w:style w:type="character" w:default="1" w:styleId="Fuentedeprrafopredeter">
     <w:name w:val="Default Paragraph Font"/>
     <w:uiPriority w:val="1"/>
-    <w:semiHidden/>
     <w:unhideWhenUsed/>
   </w:style>
   <w:style w:type="table" w:default="1" w:styleId="Tablanormal">
@@ -41639,17 +41952,6 @@
 </file>
 
 <file path=customXml/item1.xml><?xml version="1.0" encoding="utf-8"?>
-<p:properties xmlns:p="http://schemas.microsoft.com/office/2006/metadata/properties" xmlns:xsi="http://www.w3.org/2001/XMLSchema-instance" xmlns:pc="http://schemas.microsoft.com/office/infopath/2007/PartnerControls">
-  <documentManagement>
-    <TaxCatchAll xmlns="adccf511-daff-4bcb-9072-914cedbf4c7e" xsi:nil="true"/>
-    <lcf76f155ced4ddcb4097134ff3c332f xmlns="a70d3c18-0869-45a1-9f75-4b4b8f0f32be">
-      <Terms xmlns="http://schemas.microsoft.com/office/infopath/2007/PartnerControls"/>
-    </lcf76f155ced4ddcb4097134ff3c332f>
-  </documentManagement>
-</p:properties>
-</file>
-
-<file path=customXml/item2.xml><?xml version="1.0" encoding="utf-8"?>
 <?mso-contentType ?>
 <FormTemplates xmlns="http://schemas.microsoft.com/sharepoint/v3/contenttype/forms">
   <Display>DocumentLibraryForm</Display>
@@ -41658,27 +41960,31 @@
 </FormTemplates>
 </file>
 
-<file path=customXml/item3.xml><?xml version="1.0" encoding="utf-8"?>
-<ct:contentTypeSchema xmlns:ct="http://schemas.microsoft.com/office/2006/metadata/contentType" xmlns:ma="http://schemas.microsoft.com/office/2006/metadata/properties/metaAttributes" ct:_="" ma:_="" ma:contentTypeName="Documento" ma:contentTypeID="0x010100FC2B1768DD5A774EB396CCAB0DE361C1" ma:contentTypeVersion="11" ma:contentTypeDescription="Crear nuevo documento." ma:contentTypeScope="" ma:versionID="e4c9e5a511fbaffd8485e537f9595e10">
-  <xsd:schema xmlns:xsd="http://www.w3.org/2001/XMLSchema" xmlns:xs="http://www.w3.org/2001/XMLSchema" xmlns:p="http://schemas.microsoft.com/office/2006/metadata/properties" xmlns:ns2="a70d3c18-0869-45a1-9f75-4b4b8f0f32be" xmlns:ns3="adccf511-daff-4bcb-9072-914cedbf4c7e" targetNamespace="http://schemas.microsoft.com/office/2006/metadata/properties" ma:root="true" ma:fieldsID="bbeeb7fdd5dcda06cd18867ba2c601ed" ns2:_="" ns3:_="">
-    <xsd:import namespace="a70d3c18-0869-45a1-9f75-4b4b8f0f32be"/>
-    <xsd:import namespace="adccf511-daff-4bcb-9072-914cedbf4c7e"/>
+<file path=customXml/item2.xml><?xml version="1.0" encoding="utf-8"?>
+<ct:contentTypeSchema xmlns:ct="http://schemas.microsoft.com/office/2006/metadata/contentType" xmlns:ma="http://schemas.microsoft.com/office/2006/metadata/properties/metaAttributes" ct:_="" ma:_="" ma:contentTypeName="Documento" ma:contentTypeID="0x01010049282E1EDBE9234EA9E6D38F720E265F" ma:contentTypeVersion="15" ma:contentTypeDescription="Crear nuevo documento." ma:contentTypeScope="" ma:versionID="b31c7aa9eaf043a08b87120b3c4916e3">
+  <xsd:schema xmlns:xsd="http://www.w3.org/2001/XMLSchema" xmlns:xs="http://www.w3.org/2001/XMLSchema" xmlns:p="http://schemas.microsoft.com/office/2006/metadata/properties" xmlns:ns2="cb45339b-ced9-4d0d-8f64-77573914d53b" xmlns:ns3="43a3ca16-9c26-4813-b83f-4aec9927b43f" targetNamespace="http://schemas.microsoft.com/office/2006/metadata/properties" ma:root="true" ma:fieldsID="3533d065b04d75c457075bc55f1f5315" ns2:_="" ns3:_="">
+    <xsd:import namespace="cb45339b-ced9-4d0d-8f64-77573914d53b"/>
+    <xsd:import namespace="43a3ca16-9c26-4813-b83f-4aec9927b43f"/>
     <xsd:element name="properties">
       <xsd:complexType>
         <xsd:sequence>
           <xsd:element name="documentManagement">
             <xsd:complexType>
               <xsd:all>
-                <xsd:element ref="ns2:MediaServiceMetadata" minOccurs="0"/>
-                <xsd:element ref="ns2:MediaServiceFastMetadata" minOccurs="0"/>
-                <xsd:element ref="ns2:MediaServiceSearchProperties" minOccurs="0"/>
-                <xsd:element ref="ns2:MediaServiceDateTaken" minOccurs="0"/>
-                <xsd:element ref="ns2:MediaServiceGenerationTime" minOccurs="0"/>
-                <xsd:element ref="ns2:MediaServiceEventHashCode" minOccurs="0"/>
-                <xsd:element ref="ns2:MediaLengthInSeconds" minOccurs="0"/>
-                <xsd:element ref="ns2:lcf76f155ced4ddcb4097134ff3c332f" minOccurs="0"/>
-                <xsd:element ref="ns3:TaxCatchAll" minOccurs="0"/>
-                <xsd:element ref="ns2:MediaServiceOCR" minOccurs="0"/>
+                <xsd:element ref="ns2:SharedWithUsers" minOccurs="0"/>
+                <xsd:element ref="ns2:SharedWithDetails" minOccurs="0"/>
+                <xsd:element ref="ns3:MediaServiceMetadata" minOccurs="0"/>
+                <xsd:element ref="ns3:MediaServiceFastMetadata" minOccurs="0"/>
+                <xsd:element ref="ns3:MediaServiceDateTaken" minOccurs="0"/>
+                <xsd:element ref="ns3:MediaServiceObjectDetectorVersions" minOccurs="0"/>
+                <xsd:element ref="ns3:MediaLengthInSeconds" minOccurs="0"/>
+                <xsd:element ref="ns3:MediaServiceLocation" minOccurs="0"/>
+                <xsd:element ref="ns3:MediaServiceGenerationTime" minOccurs="0"/>
+                <xsd:element ref="ns3:MediaServiceEventHashCode" minOccurs="0"/>
+                <xsd:element ref="ns3:lcf76f155ced4ddcb4097134ff3c332f" minOccurs="0"/>
+                <xsd:element ref="ns2:TaxCatchAll" minOccurs="0"/>
+                <xsd:element ref="ns3:MediaServiceOCR" minOccurs="0"/>
+                <xsd:element ref="ns3:MediaServiceSearchProperties" minOccurs="0"/>
               </xsd:all>
             </xsd:complexType>
           </xsd:element>
@@ -41686,35 +41992,66 @@
       </xsd:complexType>
     </xsd:element>
   </xsd:schema>
-  <xsd:schema xmlns:xsd="http://www.w3.org/2001/XMLSchema" xmlns:xs="http://www.w3.org/2001/XMLSchema" xmlns:dms="http://schemas.microsoft.com/office/2006/documentManagement/types" xmlns:pc="http://schemas.microsoft.com/office/infopath/2007/PartnerControls" targetNamespace="a70d3c18-0869-45a1-9f75-4b4b8f0f32be" elementFormDefault="qualified">
+  <xsd:schema xmlns:xsd="http://www.w3.org/2001/XMLSchema" xmlns:xs="http://www.w3.org/2001/XMLSchema" xmlns:dms="http://schemas.microsoft.com/office/2006/documentManagement/types" xmlns:pc="http://schemas.microsoft.com/office/infopath/2007/PartnerControls" targetNamespace="cb45339b-ced9-4d0d-8f64-77573914d53b" elementFormDefault="qualified">
     <xsd:import namespace="http://schemas.microsoft.com/office/2006/documentManagement/types"/>
     <xsd:import namespace="http://schemas.microsoft.com/office/infopath/2007/PartnerControls"/>
-    <xsd:element name="MediaServiceMetadata" ma:index="8" nillable="true" ma:displayName="MediaServiceMetadata" ma:hidden="true" ma:internalName="MediaServiceMetadata" ma:readOnly="true">
+    <xsd:element name="SharedWithUsers" ma:index="8" nillable="true" ma:displayName="Compartido con" ma:internalName="SharedWithUsers" ma:readOnly="true">
+      <xsd:complexType>
+        <xsd:complexContent>
+          <xsd:extension base="dms:UserMulti">
+            <xsd:sequence>
+              <xsd:element name="UserInfo" minOccurs="0" maxOccurs="unbounded">
+                <xsd:complexType>
+                  <xsd:sequence>
+                    <xsd:element name="DisplayName" type="xsd:string" minOccurs="0"/>
+                    <xsd:element name="AccountId" type="dms:UserId" minOccurs="0" nillable="true"/>
+                    <xsd:element name="AccountType" type="xsd:string" minOccurs="0"/>
+                  </xsd:sequence>
+                </xsd:complexType>
+              </xsd:element>
+            </xsd:sequence>
+          </xsd:extension>
+        </xsd:complexContent>
+      </xsd:complexType>
+    </xsd:element>
+    <xsd:element name="SharedWithDetails" ma:index="9" nillable="true" ma:displayName="Detalles de uso compartido" ma:internalName="SharedWithDetails" ma:readOnly="true">
+      <xsd:simpleType>
+        <xsd:restriction base="dms:Note">
+          <xsd:maxLength value="255"/>
+        </xsd:restriction>
+      </xsd:simpleType>
+    </xsd:element>
+    <xsd:element name="TaxCatchAll" ma:index="20" nillable="true" ma:displayName="Taxonomy Catch All Column" ma:hidden="true" ma:list="{2f40a149-578b-41a1-8845-c88bc1831770}" ma:internalName="TaxCatchAll" ma:showField="CatchAllData" ma:web="cb45339b-ced9-4d0d-8f64-77573914d53b">
+      <xsd:complexType>
+        <xsd:complexContent>
+          <xsd:extension base="dms:MultiChoiceLookup">
+            <xsd:sequence>
+              <xsd:element name="Value" type="dms:Lookup" maxOccurs="unbounded" minOccurs="0" nillable="true"/>
+            </xsd:sequence>
+          </xsd:extension>
+        </xsd:complexContent>
+      </xsd:complexType>
+    </xsd:element>
+  </xsd:schema>
+  <xsd:schema xmlns:xsd="http://www.w3.org/2001/XMLSchema" xmlns:xs="http://www.w3.org/2001/XMLSchema" xmlns:dms="http://schemas.microsoft.com/office/2006/documentManagement/types" xmlns:pc="http://schemas.microsoft.com/office/infopath/2007/PartnerControls" targetNamespace="43a3ca16-9c26-4813-b83f-4aec9927b43f" elementFormDefault="qualified">
+    <xsd:import namespace="http://schemas.microsoft.com/office/2006/documentManagement/types"/>
+    <xsd:import namespace="http://schemas.microsoft.com/office/infopath/2007/PartnerControls"/>
+    <xsd:element name="MediaServiceMetadata" ma:index="10" nillable="true" ma:displayName="MediaServiceMetadata" ma:hidden="true" ma:internalName="MediaServiceMetadata" ma:readOnly="true">
       <xsd:simpleType>
         <xsd:restriction base="dms:Note"/>
       </xsd:simpleType>
     </xsd:element>
-    <xsd:element name="MediaServiceFastMetadata" ma:index="9" nillable="true" ma:displayName="MediaServiceFastMetadata" ma:hidden="true" ma:internalName="MediaServiceFastMetadata" ma:readOnly="true">
+    <xsd:element name="MediaServiceFastMetadata" ma:index="11" nillable="true" ma:displayName="MediaServiceFastMetadata" ma:hidden="true" ma:internalName="MediaServiceFastMetadata" ma:readOnly="true">
       <xsd:simpleType>
         <xsd:restriction base="dms:Note"/>
       </xsd:simpleType>
     </xsd:element>
-    <xsd:element name="MediaServiceSearchProperties" ma:index="10" nillable="true" ma:displayName="MediaServiceSearchProperties" ma:hidden="true" ma:internalName="MediaServiceSearchProperties" ma:readOnly="true">
-      <xsd:simpleType>
-        <xsd:restriction base="dms:Note"/>
-      </xsd:simpleType>
-    </xsd:element>
-    <xsd:element name="MediaServiceDateTaken" ma:index="11" nillable="true" ma:displayName="MediaServiceDateTaken" ma:hidden="true" ma:indexed="true" ma:internalName="MediaServiceDateTaken" ma:readOnly="true">
+    <xsd:element name="MediaServiceDateTaken" ma:index="12" nillable="true" ma:displayName="MediaServiceDateTaken" ma:hidden="true" ma:indexed="true" ma:internalName="MediaServiceDateTaken" ma:readOnly="true">
       <xsd:simpleType>
         <xsd:restriction base="dms:Text"/>
       </xsd:simpleType>
     </xsd:element>
-    <xsd:element name="MediaServiceGenerationTime" ma:index="12" nillable="true" ma:displayName="MediaServiceGenerationTime" ma:hidden="true" ma:internalName="MediaServiceGenerationTime" ma:readOnly="true">
-      <xsd:simpleType>
-        <xsd:restriction base="dms:Text"/>
-      </xsd:simpleType>
-    </xsd:element>
-    <xsd:element name="MediaServiceEventHashCode" ma:index="13" nillable="true" ma:displayName="MediaServiceEventHashCode" ma:hidden="true" ma:internalName="MediaServiceEventHashCode" ma:readOnly="true">
+    <xsd:element name="MediaServiceObjectDetectorVersions" ma:index="13" nillable="true" ma:displayName="MediaServiceObjectDetectorVersions" ma:hidden="true" ma:indexed="true" ma:internalName="MediaServiceObjectDetectorVersions" ma:readOnly="true">
       <xsd:simpleType>
         <xsd:restriction base="dms:Text"/>
       </xsd:simpleType>
@@ -41724,34 +42061,39 @@
         <xsd:restriction base="dms:Unknown"/>
       </xsd:simpleType>
     </xsd:element>
-    <xsd:element name="lcf76f155ced4ddcb4097134ff3c332f" ma:index="16" nillable="true" ma:taxonomy="true" ma:internalName="lcf76f155ced4ddcb4097134ff3c332f" ma:taxonomyFieldName="MediaServiceImageTags" ma:displayName="Etiquetas de imagen" ma:readOnly="false" ma:fieldId="{5cf76f15-5ced-4ddc-b409-7134ff3c332f}" ma:taxonomyMulti="true" ma:sspId="d33c8c81-5745-4931-bcc4-c2aeafe86780" ma:termSetId="09814cd3-568e-fe90-9814-8d621ff8fb84" ma:anchorId="fba54fb3-c3e1-fe81-a776-ca4b69148c4d" ma:open="true" ma:isKeyword="false">
+    <xsd:element name="MediaServiceLocation" ma:index="15" nillable="true" ma:displayName="Location" ma:indexed="true" ma:internalName="MediaServiceLocation" ma:readOnly="true">
+      <xsd:simpleType>
+        <xsd:restriction base="dms:Text"/>
+      </xsd:simpleType>
+    </xsd:element>
+    <xsd:element name="MediaServiceGenerationTime" ma:index="16" nillable="true" ma:displayName="MediaServiceGenerationTime" ma:hidden="true" ma:internalName="MediaServiceGenerationTime" ma:readOnly="true">
+      <xsd:simpleType>
+        <xsd:restriction base="dms:Text"/>
+      </xsd:simpleType>
+    </xsd:element>
+    <xsd:element name="MediaServiceEventHashCode" ma:index="17" nillable="true" ma:displayName="MediaServiceEventHashCode" ma:hidden="true" ma:internalName="MediaServiceEventHashCode" ma:readOnly="true">
+      <xsd:simpleType>
+        <xsd:restriction base="dms:Text"/>
+      </xsd:simpleType>
+    </xsd:element>
+    <xsd:element name="lcf76f155ced4ddcb4097134ff3c332f" ma:index="19" nillable="true" ma:taxonomy="true" ma:internalName="lcf76f155ced4ddcb4097134ff3c332f" ma:taxonomyFieldName="MediaServiceImageTags" ma:displayName="Etiquetas de imagen" ma:readOnly="false" ma:fieldId="{5cf76f15-5ced-4ddc-b409-7134ff3c332f}" ma:taxonomyMulti="true" ma:sspId="d33c8c81-5745-4931-bcc4-c2aeafe86780" ma:termSetId="09814cd3-568e-fe90-9814-8d621ff8fb84" ma:anchorId="fba54fb3-c3e1-fe81-a776-ca4b69148c4d" ma:open="true" ma:isKeyword="false">
       <xsd:complexType>
         <xsd:sequence>
           <xsd:element ref="pc:Terms" minOccurs="0" maxOccurs="1"/>
         </xsd:sequence>
       </xsd:complexType>
     </xsd:element>
-    <xsd:element name="MediaServiceOCR" ma:index="18" nillable="true" ma:displayName="Extracted Text" ma:internalName="MediaServiceOCR" ma:readOnly="true">
+    <xsd:element name="MediaServiceOCR" ma:index="21" nillable="true" ma:displayName="Extracted Text" ma:internalName="MediaServiceOCR" ma:readOnly="true">
       <xsd:simpleType>
         <xsd:restriction base="dms:Note">
           <xsd:maxLength value="255"/>
         </xsd:restriction>
       </xsd:simpleType>
     </xsd:element>
-  </xsd:schema>
-  <xsd:schema xmlns:xsd="http://www.w3.org/2001/XMLSchema" xmlns:xs="http://www.w3.org/2001/XMLSchema" xmlns:dms="http://schemas.microsoft.com/office/2006/documentManagement/types" xmlns:pc="http://schemas.microsoft.com/office/infopath/2007/PartnerControls" targetNamespace="adccf511-daff-4bcb-9072-914cedbf4c7e" elementFormDefault="qualified">
-    <xsd:import namespace="http://schemas.microsoft.com/office/2006/documentManagement/types"/>
-    <xsd:import namespace="http://schemas.microsoft.com/office/infopath/2007/PartnerControls"/>
-    <xsd:element name="TaxCatchAll" ma:index="17" nillable="true" ma:displayName="Taxonomy Catch All Column" ma:hidden="true" ma:list="{d55fdbc5-1632-489d-aeea-ba6fd7407963}" ma:internalName="TaxCatchAll" ma:showField="CatchAllData" ma:web="adccf511-daff-4bcb-9072-914cedbf4c7e">
-      <xsd:complexType>
-        <xsd:complexContent>
-          <xsd:extension base="dms:MultiChoiceLookup">
-            <xsd:sequence>
-              <xsd:element name="Value" type="dms:Lookup" maxOccurs="unbounded" minOccurs="0" nillable="true"/>
-            </xsd:sequence>
-          </xsd:extension>
-        </xsd:complexContent>
-      </xsd:complexType>
+    <xsd:element name="MediaServiceSearchProperties" ma:index="22" nillable="true" ma:displayName="MediaServiceSearchProperties" ma:hidden="true" ma:internalName="MediaServiceSearchProperties" ma:readOnly="true">
+      <xsd:simpleType>
+        <xsd:restriction base="dms:Note"/>
+      </xsd:simpleType>
     </xsd:element>
   </xsd:schema>
   <xsd:schema xmlns="http://schemas.openxmlformats.org/package/2006/metadata/core-properties" xmlns:xsd="http://www.w3.org/2001/XMLSchema" xmlns:xsi="http://www.w3.org/2001/XMLSchema-instance" xmlns:dc="http://purl.org/dc/elements/1.1/" xmlns:dcterms="http://purl.org/dc/terms/" xmlns:odoc="http://schemas.microsoft.com/internal/obd" targetNamespace="http://schemas.openxmlformats.org/package/2006/metadata/core-properties" elementFormDefault="qualified" attributeFormDefault="unqualified" blockDefault="#all">
@@ -41853,11 +42195,57 @@
 </ct:contentTypeSchema>
 </file>
 
-<file path=customXml/item4.xml><?xml version="1.0" encoding="utf-8"?>
+<file path=customXml/item3.xml><?xml version="1.0" encoding="utf-8"?>
 <b:Sources xmlns:b="http://schemas.openxmlformats.org/officeDocument/2006/bibliography" xmlns="http://schemas.openxmlformats.org/officeDocument/2006/bibliography" SelectedStyle="\APASixthEditionOfficeOnline.xsl" StyleName="APA" Version="6"/>
 </file>
 
+<file path=customXml/item4.xml><?xml version="1.0" encoding="utf-8"?>
+<p:properties xmlns:p="http://schemas.microsoft.com/office/2006/metadata/properties" xmlns:xsi="http://www.w3.org/2001/XMLSchema-instance" xmlns:pc="http://schemas.microsoft.com/office/infopath/2007/PartnerControls">
+  <documentManagement>
+    <TaxCatchAll xmlns="cb45339b-ced9-4d0d-8f64-77573914d53b" xsi:nil="true"/>
+    <lcf76f155ced4ddcb4097134ff3c332f xmlns="43a3ca16-9c26-4813-b83f-4aec9927b43f">
+      <Terms xmlns="http://schemas.microsoft.com/office/infopath/2007/PartnerControls"/>
+    </lcf76f155ced4ddcb4097134ff3c332f>
+  </documentManagement>
+</p:properties>
+</file>
+
 <file path=customXml/itemProps1.xml><?xml version="1.0" encoding="utf-8"?>
+<ds:datastoreItem xmlns:ds="http://schemas.openxmlformats.org/officeDocument/2006/customXml" ds:itemID="{81CBDEC1-3B00-44ED-AD36-0268077980BA}">
+  <ds:schemaRefs>
+    <ds:schemaRef ds:uri="http://schemas.microsoft.com/sharepoint/v3/contenttype/forms"/>
+  </ds:schemaRefs>
+</ds:datastoreItem>
+</file>
+
+<file path=customXml/itemProps2.xml><?xml version="1.0" encoding="utf-8"?>
+<ds:datastoreItem xmlns:ds="http://schemas.openxmlformats.org/officeDocument/2006/customXml" ds:itemID="{DF43E046-DB0C-42D1-8C73-AE38B52F1ED7}">
+  <ds:schemaRefs>
+    <ds:schemaRef ds:uri="http://schemas.microsoft.com/office/2006/metadata/contentType"/>
+    <ds:schemaRef ds:uri="http://schemas.microsoft.com/office/2006/metadata/properties/metaAttributes"/>
+    <ds:schemaRef ds:uri="http://www.w3.org/2001/XMLSchema"/>
+    <ds:schemaRef ds:uri="http://schemas.microsoft.com/office/2006/metadata/properties"/>
+    <ds:schemaRef ds:uri="cb45339b-ced9-4d0d-8f64-77573914d53b"/>
+    <ds:schemaRef ds:uri="43a3ca16-9c26-4813-b83f-4aec9927b43f"/>
+    <ds:schemaRef ds:uri="http://schemas.microsoft.com/office/2006/documentManagement/types"/>
+    <ds:schemaRef ds:uri="http://schemas.microsoft.com/office/infopath/2007/PartnerControls"/>
+    <ds:schemaRef ds:uri="http://schemas.openxmlformats.org/package/2006/metadata/core-properties"/>
+    <ds:schemaRef ds:uri="http://purl.org/dc/elements/1.1/"/>
+    <ds:schemaRef ds:uri="http://purl.org/dc/terms/"/>
+    <ds:schemaRef ds:uri="http://schemas.microsoft.com/internal/obd"/>
+  </ds:schemaRefs>
+</ds:datastoreItem>
+</file>
+
+<file path=customXml/itemProps3.xml><?xml version="1.0" encoding="utf-8"?>
+<ds:datastoreItem xmlns:ds="http://schemas.openxmlformats.org/officeDocument/2006/customXml" ds:itemID="{E8AB44A3-7C62-4BD2-82ED-8ABC209970FA}">
+  <ds:schemaRefs>
+    <ds:schemaRef ds:uri="http://schemas.openxmlformats.org/officeDocument/2006/bibliography"/>
+  </ds:schemaRefs>
+</ds:datastoreItem>
+</file>
+
+<file path=customXml/itemProps4.xml><?xml version="1.0" encoding="utf-8"?>
 <ds:datastoreItem xmlns:ds="http://schemas.openxmlformats.org/officeDocument/2006/customXml" ds:itemID="{6929C9FE-9F22-4B98-96EF-1B541B3BD0B2}">
   <ds:schemaRefs>
     <ds:schemaRef ds:uri="http://schemas.microsoft.com/office/2006/metadata/properties"/>
@@ -41866,24 +42254,4 @@
     <ds:schemaRef ds:uri="43a3ca16-9c26-4813-b83f-4aec9927b43f"/>
   </ds:schemaRefs>
 </ds:datastoreItem>
-</file>
-
-<file path=customXml/itemProps2.xml><?xml version="1.0" encoding="utf-8"?>
-<ds:datastoreItem xmlns:ds="http://schemas.openxmlformats.org/officeDocument/2006/customXml" ds:itemID="{81CBDEC1-3B00-44ED-AD36-0268077980BA}">
-  <ds:schemaRefs>
-    <ds:schemaRef ds:uri="http://schemas.microsoft.com/sharepoint/v3/contenttype/forms"/>
-  </ds:schemaRefs>
-</ds:datastoreItem>
-</file>
-
-<file path=customXml/itemProps3.xml><?xml version="1.0" encoding="utf-8"?>
-<ds:datastoreItem xmlns:ds="http://schemas.openxmlformats.org/officeDocument/2006/customXml" ds:itemID="{7C23658B-6425-4EA9-A63C-0488E52A4E79}"/>
-</file>
-
-<file path=customXml/itemProps4.xml><?xml version="1.0" encoding="utf-8"?>
-<ds:datastoreItem xmlns:ds="http://schemas.openxmlformats.org/officeDocument/2006/customXml" ds:itemID="{E8AB44A3-7C62-4BD2-82ED-8ABC209970FA}">
-  <ds:schemaRefs>
-    <ds:schemaRef ds:uri="http://schemas.openxmlformats.org/officeDocument/2006/bibliography"/>
-  </ds:schemaRefs>
-</ds:datastoreItem>
 </file>
</xml_diff>

<commit_message>
Hallazgos de repositorio continuacion
</commit_message>
<xml_diff>
--- a/fuentes/CFA1_82220017_DU.docx
+++ b/fuentes/CFA1_82220017_DU.docx
@@ -4663,49 +4663,22 @@
               <w:t>construyó el primer automóvil de cuatro ruedas</w:t>
             </w:r>
             <w:r>
-              <w:t xml:space="preserve">. El </w:t>
-            </w:r>
-            <w:r>
-              <w:rPr>
-                <w:rStyle w:val="Extranjerismo"/>
-                <w:lang w:val="es-CO"/>
-              </w:rPr>
-              <w:t>Pan</w:t>
-            </w:r>
-            <w:r>
-              <w:rPr>
-                <w:rStyle w:val="Extranjerismo"/>
-                <w:lang w:val="es-CO"/>
-              </w:rPr>
+              <w:t>. El Pan</w:t>
+            </w:r>
+            <w:r>
               <w:t xml:space="preserve">hard et </w:t>
             </w:r>
             <w:proofErr w:type="spellStart"/>
             <w:r>
-              <w:rPr>
-                <w:rStyle w:val="Extranjerismo"/>
-                <w:lang w:val="es-CO"/>
-              </w:rPr>
               <w:t>Le</w:t>
             </w:r>
             <w:r>
-              <w:rPr>
-                <w:rStyle w:val="Extranjerismo"/>
-                <w:lang w:val="es-CO"/>
-              </w:rPr>
               <w:t>va</w:t>
             </w:r>
             <w:r>
-              <w:rPr>
-                <w:rStyle w:val="Extranjerismo"/>
-                <w:lang w:val="es-CO"/>
-              </w:rPr>
               <w:t>s</w:t>
             </w:r>
             <w:r>
-              <w:rPr>
-                <w:rStyle w:val="Extranjerismo"/>
-                <w:lang w:val="es-CO"/>
-              </w:rPr>
               <w:t>sor</w:t>
             </w:r>
             <w:proofErr w:type="spellEnd"/>
@@ -5316,36 +5289,6 @@
       </w:r>
       <w:r>
         <w:t>stablecen los procedimientos para la vigilancia y el control, así como las sanciones ante el incumplimiento de las normas (multas, suspensiones, inmovilizaciones, etc.).</w:t>
-      </w:r>
-    </w:p>
-    <w:p>
-      <w:pPr>
-        <w:pStyle w:val="Prrafodelista"/>
-        <w:numPr>
-          <w:ilvl w:val="0"/>
-          <w:numId w:val="189"/>
-        </w:numPr>
-        <w:rPr>
-          <w:b/>
-          <w:bCs/>
-        </w:rPr>
-      </w:pPr>
-      <w:r>
-        <w:rPr>
-          <w:b/>
-          <w:bCs/>
-        </w:rPr>
-        <w:t>Jurisdicción municipal o distrital</w:t>
-      </w:r>
-      <w:r>
-        <w:rPr>
-          <w:b/>
-          <w:bCs/>
-        </w:rPr>
-        <w:t xml:space="preserve">: </w:t>
-      </w:r>
-      <w:r>
-        <w:t>calles, avenidas urbanas y rutas locales a cargo de alcaldías o secretarías de movilidad.</w:t>
       </w:r>
     </w:p>
     <w:p>
@@ -6389,7 +6332,7 @@
           <w:b/>
           <w:bCs/>
         </w:rPr>
-        <w:t>Aspectos técnicos de las vías</w:t>
+        <w:t>Aspectos técnicos de vías</w:t>
       </w:r>
     </w:p>
     <w:p>
@@ -9218,7 +9161,7 @@
         <w:rPr>
           <w:lang w:val="es-419" w:eastAsia="es-CO"/>
         </w:rPr>
-        <w:t>Responsabilidad: responde civilmente por daños ocasionales a terceros (persona -</w:t>
+        <w:t>Responsabilidad: responde civilmente por daños ocasionales a terceros (persona</w:t>
       </w:r>
       <w:r>
         <w:rPr>
@@ -9230,7 +9173,30 @@
         <w:rPr>
           <w:lang w:val="es-419" w:eastAsia="es-CO"/>
         </w:rPr>
+        <w:t xml:space="preserve"> – </w:t>
+      </w:r>
+      <w:r>
+        <w:rPr>
+          <w:lang w:val="es-419" w:eastAsia="es-CO"/>
+        </w:rPr>
         <w:t>bienes), documento obligatorio.</w:t>
+      </w:r>
+    </w:p>
+    <w:p>
+      <w:pPr>
+        <w:rPr>
+          <w:b/>
+          <w:bCs/>
+          <w:lang w:val="es-419" w:eastAsia="es-CO"/>
+        </w:rPr>
+      </w:pPr>
+      <w:r>
+        <w:rPr>
+          <w:b/>
+          <w:bCs/>
+          <w:lang w:val="es-419" w:eastAsia="es-CO"/>
+        </w:rPr>
+        <w:t>Vehículos comerciales (carga – transporte de mercancías):</w:t>
       </w:r>
     </w:p>
     <w:p>
@@ -9389,7 +9355,6 @@
         <w:pStyle w:val="Tabla"/>
       </w:pPr>
       <w:r>
-        <w:lastRenderedPageBreak/>
         <w:t>Seguro y responsabilidades del vehículo</w:t>
       </w:r>
     </w:p>
@@ -10868,7 +10833,19 @@
         <w:rPr>
           <w:lang w:val="es-419" w:eastAsia="es-CO"/>
         </w:rPr>
-        <w:t>Normatividad: Reglamentos específicos para servicio especializado.</w:t>
+        <w:t xml:space="preserve">Normatividad: </w:t>
+      </w:r>
+      <w:r>
+        <w:rPr>
+          <w:lang w:val="es-419" w:eastAsia="es-CO"/>
+        </w:rPr>
+        <w:t>r</w:t>
+      </w:r>
+      <w:r>
+        <w:rPr>
+          <w:lang w:val="es-419" w:eastAsia="es-CO"/>
+        </w:rPr>
+        <w:t>eglamentos específicos para servicio especializado.</w:t>
       </w:r>
     </w:p>
     <w:p>
@@ -11534,7 +11511,7 @@
         <w:rPr>
           <w:lang w:val="es-419" w:eastAsia="es-CO"/>
         </w:rPr>
-        <w:t>c</w:t>
+        <w:t>C</w:t>
       </w:r>
       <w:r>
         <w:rPr>
@@ -11546,7 +11523,7 @@
         <w:rPr>
           <w:lang w:val="es-419" w:eastAsia="es-CO"/>
         </w:rPr>
-        <w:t>s</w:t>
+        <w:t>S</w:t>
       </w:r>
       <w:r>
         <w:rPr>
@@ -13144,9 +13121,16 @@
       <w:r>
         <w:rPr>
           <w:color w:val="000000" w:themeColor="text1"/>
+          <w:lang w:val="en-US" w:eastAsia="es-CO"/>
+        </w:rPr>
+        <w:t xml:space="preserve">Wiley. </w:t>
+      </w:r>
+      <w:r>
+        <w:rPr>
+          <w:color w:val="000000" w:themeColor="text1"/>
           <w:lang w:eastAsia="es-CO"/>
         </w:rPr>
-        <w:t>Wiley. (Ortúzar. J de D., 2011).</w:t>
+        <w:t>(Ortúzar. J de D., 2011).</w:t>
       </w:r>
     </w:p>
     <w:p>
@@ -41952,15 +41936,6 @@
 </file>
 
 <file path=customXml/item1.xml><?xml version="1.0" encoding="utf-8"?>
-<?mso-contentType ?>
-<FormTemplates xmlns="http://schemas.microsoft.com/sharepoint/v3/contenttype/forms">
-  <Display>DocumentLibraryForm</Display>
-  <Edit>DocumentLibraryForm</Edit>
-  <New>DocumentLibraryForm</New>
-</FormTemplates>
-</file>
-
-<file path=customXml/item2.xml><?xml version="1.0" encoding="utf-8"?>
 <ct:contentTypeSchema xmlns:ct="http://schemas.microsoft.com/office/2006/metadata/contentType" xmlns:ma="http://schemas.microsoft.com/office/2006/metadata/properties/metaAttributes" ct:_="" ma:_="" ma:contentTypeName="Documento" ma:contentTypeID="0x01010049282E1EDBE9234EA9E6D38F720E265F" ma:contentTypeVersion="15" ma:contentTypeDescription="Crear nuevo documento." ma:contentTypeScope="" ma:versionID="b31c7aa9eaf043a08b87120b3c4916e3">
   <xsd:schema xmlns:xsd="http://www.w3.org/2001/XMLSchema" xmlns:xs="http://www.w3.org/2001/XMLSchema" xmlns:p="http://schemas.microsoft.com/office/2006/metadata/properties" xmlns:ns2="cb45339b-ced9-4d0d-8f64-77573914d53b" xmlns:ns3="43a3ca16-9c26-4813-b83f-4aec9927b43f" targetNamespace="http://schemas.microsoft.com/office/2006/metadata/properties" ma:root="true" ma:fieldsID="3533d065b04d75c457075bc55f1f5315" ns2:_="" ns3:_="">
     <xsd:import namespace="cb45339b-ced9-4d0d-8f64-77573914d53b"/>
@@ -42195,11 +42170,16 @@
 </ct:contentTypeSchema>
 </file>
 
-<file path=customXml/item3.xml><?xml version="1.0" encoding="utf-8"?>
-<b:Sources xmlns:b="http://schemas.openxmlformats.org/officeDocument/2006/bibliography" xmlns="http://schemas.openxmlformats.org/officeDocument/2006/bibliography" SelectedStyle="\APASixthEditionOfficeOnline.xsl" StyleName="APA" Version="6"/>
+<file path=customXml/item2.xml><?xml version="1.0" encoding="utf-8"?>
+<?mso-contentType ?>
+<FormTemplates xmlns="http://schemas.microsoft.com/sharepoint/v3/contenttype/forms">
+  <Display>DocumentLibraryForm</Display>
+  <Edit>DocumentLibraryForm</Edit>
+  <New>DocumentLibraryForm</New>
+</FormTemplates>
 </file>
 
-<file path=customXml/item4.xml><?xml version="1.0" encoding="utf-8"?>
+<file path=customXml/item3.xml><?xml version="1.0" encoding="utf-8"?>
 <p:properties xmlns:p="http://schemas.microsoft.com/office/2006/metadata/properties" xmlns:xsi="http://www.w3.org/2001/XMLSchema-instance" xmlns:pc="http://schemas.microsoft.com/office/infopath/2007/PartnerControls">
   <documentManagement>
     <TaxCatchAll xmlns="cb45339b-ced9-4d0d-8f64-77573914d53b" xsi:nil="true"/>
@@ -42210,15 +42190,11 @@
 </p:properties>
 </file>
 
-<file path=customXml/itemProps1.xml><?xml version="1.0" encoding="utf-8"?>
-<ds:datastoreItem xmlns:ds="http://schemas.openxmlformats.org/officeDocument/2006/customXml" ds:itemID="{81CBDEC1-3B00-44ED-AD36-0268077980BA}">
-  <ds:schemaRefs>
-    <ds:schemaRef ds:uri="http://schemas.microsoft.com/sharepoint/v3/contenttype/forms"/>
-  </ds:schemaRefs>
-</ds:datastoreItem>
+<file path=customXml/item4.xml><?xml version="1.0" encoding="utf-8"?>
+<b:Sources xmlns:b="http://schemas.openxmlformats.org/officeDocument/2006/bibliography" xmlns="http://schemas.openxmlformats.org/officeDocument/2006/bibliography" SelectedStyle="\APASixthEditionOfficeOnline.xsl" StyleName="APA" Version="6"/>
 </file>
 
-<file path=customXml/itemProps2.xml><?xml version="1.0" encoding="utf-8"?>
+<file path=customXml/itemProps1.xml><?xml version="1.0" encoding="utf-8"?>
 <ds:datastoreItem xmlns:ds="http://schemas.openxmlformats.org/officeDocument/2006/customXml" ds:itemID="{DF43E046-DB0C-42D1-8C73-AE38B52F1ED7}">
   <ds:schemaRefs>
     <ds:schemaRef ds:uri="http://schemas.microsoft.com/office/2006/metadata/contentType"/>
@@ -42237,15 +42213,15 @@
 </ds:datastoreItem>
 </file>
 
-<file path=customXml/itemProps3.xml><?xml version="1.0" encoding="utf-8"?>
-<ds:datastoreItem xmlns:ds="http://schemas.openxmlformats.org/officeDocument/2006/customXml" ds:itemID="{E8AB44A3-7C62-4BD2-82ED-8ABC209970FA}">
+<file path=customXml/itemProps2.xml><?xml version="1.0" encoding="utf-8"?>
+<ds:datastoreItem xmlns:ds="http://schemas.openxmlformats.org/officeDocument/2006/customXml" ds:itemID="{81CBDEC1-3B00-44ED-AD36-0268077980BA}">
   <ds:schemaRefs>
-    <ds:schemaRef ds:uri="http://schemas.openxmlformats.org/officeDocument/2006/bibliography"/>
+    <ds:schemaRef ds:uri="http://schemas.microsoft.com/sharepoint/v3/contenttype/forms"/>
   </ds:schemaRefs>
 </ds:datastoreItem>
 </file>
 
-<file path=customXml/itemProps4.xml><?xml version="1.0" encoding="utf-8"?>
+<file path=customXml/itemProps3.xml><?xml version="1.0" encoding="utf-8"?>
 <ds:datastoreItem xmlns:ds="http://schemas.openxmlformats.org/officeDocument/2006/customXml" ds:itemID="{6929C9FE-9F22-4B98-96EF-1B541B3BD0B2}">
   <ds:schemaRefs>
     <ds:schemaRef ds:uri="http://schemas.microsoft.com/office/2006/metadata/properties"/>
@@ -42254,4 +42230,12 @@
     <ds:schemaRef ds:uri="43a3ca16-9c26-4813-b83f-4aec9927b43f"/>
   </ds:schemaRefs>
 </ds:datastoreItem>
+</file>
+
+<file path=customXml/itemProps4.xml><?xml version="1.0" encoding="utf-8"?>
+<ds:datastoreItem xmlns:ds="http://schemas.openxmlformats.org/officeDocument/2006/customXml" ds:itemID="{E8AB44A3-7C62-4BD2-82ED-8ABC209970FA}">
+  <ds:schemaRefs>
+    <ds:schemaRef ds:uri="http://schemas.openxmlformats.org/officeDocument/2006/bibliography"/>
+  </ds:schemaRefs>
+</ds:datastoreItem>
 </file>
</xml_diff>

<commit_message>
Actualizado CFA y sintesis
</commit_message>
<xml_diff>
--- a/fuentes/CFA1_82220017_DU.docx
+++ b/fuentes/CFA1_82220017_DU.docx
@@ -9167,13 +9167,7 @@
         <w:rPr>
           <w:lang w:val="es-419" w:eastAsia="es-CO"/>
         </w:rPr>
-        <w:t xml:space="preserve"> </w:t>
-      </w:r>
-      <w:r>
-        <w:rPr>
-          <w:lang w:val="es-419" w:eastAsia="es-CO"/>
-        </w:rPr>
-        <w:t xml:space="preserve"> – </w:t>
+        <w:t xml:space="preserve">  – </w:t>
       </w:r>
       <w:r>
         <w:rPr>
@@ -11499,7 +11493,7 @@
         <w:rPr>
           <w:lang w:val="es-419" w:eastAsia="es-CO"/>
         </w:rPr>
-        <w:t>i</w:t>
+        <w:t>I</w:t>
       </w:r>
       <w:r>
         <w:rPr>
@@ -40783,6 +40777,7 @@
   <w:style w:type="character" w:default="1" w:styleId="Fuentedeprrafopredeter">
     <w:name w:val="Default Paragraph Font"/>
     <w:uiPriority w:val="1"/>
+    <w:semiHidden/>
     <w:unhideWhenUsed/>
   </w:style>
   <w:style w:type="table" w:default="1" w:styleId="Tablanormal">
@@ -41936,30 +41931,46 @@
 </file>
 
 <file path=customXml/item1.xml><?xml version="1.0" encoding="utf-8"?>
-<ct:contentTypeSchema xmlns:ct="http://schemas.microsoft.com/office/2006/metadata/contentType" xmlns:ma="http://schemas.microsoft.com/office/2006/metadata/properties/metaAttributes" ct:_="" ma:_="" ma:contentTypeName="Documento" ma:contentTypeID="0x01010049282E1EDBE9234EA9E6D38F720E265F" ma:contentTypeVersion="15" ma:contentTypeDescription="Crear nuevo documento." ma:contentTypeScope="" ma:versionID="b31c7aa9eaf043a08b87120b3c4916e3">
-  <xsd:schema xmlns:xsd="http://www.w3.org/2001/XMLSchema" xmlns:xs="http://www.w3.org/2001/XMLSchema" xmlns:p="http://schemas.microsoft.com/office/2006/metadata/properties" xmlns:ns2="cb45339b-ced9-4d0d-8f64-77573914d53b" xmlns:ns3="43a3ca16-9c26-4813-b83f-4aec9927b43f" targetNamespace="http://schemas.microsoft.com/office/2006/metadata/properties" ma:root="true" ma:fieldsID="3533d065b04d75c457075bc55f1f5315" ns2:_="" ns3:_="">
-    <xsd:import namespace="cb45339b-ced9-4d0d-8f64-77573914d53b"/>
-    <xsd:import namespace="43a3ca16-9c26-4813-b83f-4aec9927b43f"/>
+<p:properties xmlns:p="http://schemas.microsoft.com/office/2006/metadata/properties" xmlns:xsi="http://www.w3.org/2001/XMLSchema-instance" xmlns:pc="http://schemas.microsoft.com/office/infopath/2007/PartnerControls">
+  <documentManagement>
+    <TaxCatchAll xmlns="adccf511-daff-4bcb-9072-914cedbf4c7e" xsi:nil="true"/>
+    <lcf76f155ced4ddcb4097134ff3c332f xmlns="a70d3c18-0869-45a1-9f75-4b4b8f0f32be">
+      <Terms xmlns="http://schemas.microsoft.com/office/infopath/2007/PartnerControls"/>
+    </lcf76f155ced4ddcb4097134ff3c332f>
+  </documentManagement>
+</p:properties>
+</file>
+
+<file path=customXml/item2.xml><?xml version="1.0" encoding="utf-8"?>
+<?mso-contentType ?>
+<FormTemplates xmlns="http://schemas.microsoft.com/sharepoint/v3/contenttype/forms">
+  <Display>DocumentLibraryForm</Display>
+  <Edit>DocumentLibraryForm</Edit>
+  <New>DocumentLibraryForm</New>
+</FormTemplates>
+</file>
+
+<file path=customXml/item3.xml><?xml version="1.0" encoding="utf-8"?>
+<ct:contentTypeSchema xmlns:ct="http://schemas.microsoft.com/office/2006/metadata/contentType" xmlns:ma="http://schemas.microsoft.com/office/2006/metadata/properties/metaAttributes" ct:_="" ma:_="" ma:contentTypeName="Documento" ma:contentTypeID="0x010100FC2B1768DD5A774EB396CCAB0DE361C1" ma:contentTypeVersion="11" ma:contentTypeDescription="Crear nuevo documento." ma:contentTypeScope="" ma:versionID="e4c9e5a511fbaffd8485e537f9595e10">
+  <xsd:schema xmlns:xsd="http://www.w3.org/2001/XMLSchema" xmlns:xs="http://www.w3.org/2001/XMLSchema" xmlns:p="http://schemas.microsoft.com/office/2006/metadata/properties" xmlns:ns2="a70d3c18-0869-45a1-9f75-4b4b8f0f32be" xmlns:ns3="adccf511-daff-4bcb-9072-914cedbf4c7e" targetNamespace="http://schemas.microsoft.com/office/2006/metadata/properties" ma:root="true" ma:fieldsID="bbeeb7fdd5dcda06cd18867ba2c601ed" ns2:_="" ns3:_="">
+    <xsd:import namespace="a70d3c18-0869-45a1-9f75-4b4b8f0f32be"/>
+    <xsd:import namespace="adccf511-daff-4bcb-9072-914cedbf4c7e"/>
     <xsd:element name="properties">
       <xsd:complexType>
         <xsd:sequence>
           <xsd:element name="documentManagement">
             <xsd:complexType>
               <xsd:all>
-                <xsd:element ref="ns2:SharedWithUsers" minOccurs="0"/>
-                <xsd:element ref="ns2:SharedWithDetails" minOccurs="0"/>
-                <xsd:element ref="ns3:MediaServiceMetadata" minOccurs="0"/>
-                <xsd:element ref="ns3:MediaServiceFastMetadata" minOccurs="0"/>
-                <xsd:element ref="ns3:MediaServiceDateTaken" minOccurs="0"/>
-                <xsd:element ref="ns3:MediaServiceObjectDetectorVersions" minOccurs="0"/>
-                <xsd:element ref="ns3:MediaLengthInSeconds" minOccurs="0"/>
-                <xsd:element ref="ns3:MediaServiceLocation" minOccurs="0"/>
-                <xsd:element ref="ns3:MediaServiceGenerationTime" minOccurs="0"/>
-                <xsd:element ref="ns3:MediaServiceEventHashCode" minOccurs="0"/>
-                <xsd:element ref="ns3:lcf76f155ced4ddcb4097134ff3c332f" minOccurs="0"/>
-                <xsd:element ref="ns2:TaxCatchAll" minOccurs="0"/>
-                <xsd:element ref="ns3:MediaServiceOCR" minOccurs="0"/>
-                <xsd:element ref="ns3:MediaServiceSearchProperties" minOccurs="0"/>
+                <xsd:element ref="ns2:MediaServiceMetadata" minOccurs="0"/>
+                <xsd:element ref="ns2:MediaServiceFastMetadata" minOccurs="0"/>
+                <xsd:element ref="ns2:MediaServiceSearchProperties" minOccurs="0"/>
+                <xsd:element ref="ns2:MediaServiceDateTaken" minOccurs="0"/>
+                <xsd:element ref="ns2:MediaServiceGenerationTime" minOccurs="0"/>
+                <xsd:element ref="ns2:MediaServiceEventHashCode" minOccurs="0"/>
+                <xsd:element ref="ns2:MediaLengthInSeconds" minOccurs="0"/>
+                <xsd:element ref="ns2:lcf76f155ced4ddcb4097134ff3c332f" minOccurs="0"/>
+                <xsd:element ref="ns3:TaxCatchAll" minOccurs="0"/>
+                <xsd:element ref="ns2:MediaServiceOCR" minOccurs="0"/>
               </xsd:all>
             </xsd:complexType>
           </xsd:element>
@@ -41967,36 +41978,63 @@
       </xsd:complexType>
     </xsd:element>
   </xsd:schema>
-  <xsd:schema xmlns:xsd="http://www.w3.org/2001/XMLSchema" xmlns:xs="http://www.w3.org/2001/XMLSchema" xmlns:dms="http://schemas.microsoft.com/office/2006/documentManagement/types" xmlns:pc="http://schemas.microsoft.com/office/infopath/2007/PartnerControls" targetNamespace="cb45339b-ced9-4d0d-8f64-77573914d53b" elementFormDefault="qualified">
+  <xsd:schema xmlns:xsd="http://www.w3.org/2001/XMLSchema" xmlns:xs="http://www.w3.org/2001/XMLSchema" xmlns:dms="http://schemas.microsoft.com/office/2006/documentManagement/types" xmlns:pc="http://schemas.microsoft.com/office/infopath/2007/PartnerControls" targetNamespace="a70d3c18-0869-45a1-9f75-4b4b8f0f32be" elementFormDefault="qualified">
     <xsd:import namespace="http://schemas.microsoft.com/office/2006/documentManagement/types"/>
     <xsd:import namespace="http://schemas.microsoft.com/office/infopath/2007/PartnerControls"/>
-    <xsd:element name="SharedWithUsers" ma:index="8" nillable="true" ma:displayName="Compartido con" ma:internalName="SharedWithUsers" ma:readOnly="true">
+    <xsd:element name="MediaServiceMetadata" ma:index="8" nillable="true" ma:displayName="MediaServiceMetadata" ma:hidden="true" ma:internalName="MediaServiceMetadata" ma:readOnly="true">
+      <xsd:simpleType>
+        <xsd:restriction base="dms:Note"/>
+      </xsd:simpleType>
+    </xsd:element>
+    <xsd:element name="MediaServiceFastMetadata" ma:index="9" nillable="true" ma:displayName="MediaServiceFastMetadata" ma:hidden="true" ma:internalName="MediaServiceFastMetadata" ma:readOnly="true">
+      <xsd:simpleType>
+        <xsd:restriction base="dms:Note"/>
+      </xsd:simpleType>
+    </xsd:element>
+    <xsd:element name="MediaServiceSearchProperties" ma:index="10" nillable="true" ma:displayName="MediaServiceSearchProperties" ma:hidden="true" ma:internalName="MediaServiceSearchProperties" ma:readOnly="true">
+      <xsd:simpleType>
+        <xsd:restriction base="dms:Note"/>
+      </xsd:simpleType>
+    </xsd:element>
+    <xsd:element name="MediaServiceDateTaken" ma:index="11" nillable="true" ma:displayName="MediaServiceDateTaken" ma:hidden="true" ma:indexed="true" ma:internalName="MediaServiceDateTaken" ma:readOnly="true">
+      <xsd:simpleType>
+        <xsd:restriction base="dms:Text"/>
+      </xsd:simpleType>
+    </xsd:element>
+    <xsd:element name="MediaServiceGenerationTime" ma:index="12" nillable="true" ma:displayName="MediaServiceGenerationTime" ma:hidden="true" ma:internalName="MediaServiceGenerationTime" ma:readOnly="true">
+      <xsd:simpleType>
+        <xsd:restriction base="dms:Text"/>
+      </xsd:simpleType>
+    </xsd:element>
+    <xsd:element name="MediaServiceEventHashCode" ma:index="13" nillable="true" ma:displayName="MediaServiceEventHashCode" ma:hidden="true" ma:internalName="MediaServiceEventHashCode" ma:readOnly="true">
+      <xsd:simpleType>
+        <xsd:restriction base="dms:Text"/>
+      </xsd:simpleType>
+    </xsd:element>
+    <xsd:element name="MediaLengthInSeconds" ma:index="14" nillable="true" ma:displayName="MediaLengthInSeconds" ma:hidden="true" ma:internalName="MediaLengthInSeconds" ma:readOnly="true">
+      <xsd:simpleType>
+        <xsd:restriction base="dms:Unknown"/>
+      </xsd:simpleType>
+    </xsd:element>
+    <xsd:element name="lcf76f155ced4ddcb4097134ff3c332f" ma:index="16" nillable="true" ma:taxonomy="true" ma:internalName="lcf76f155ced4ddcb4097134ff3c332f" ma:taxonomyFieldName="MediaServiceImageTags" ma:displayName="Etiquetas de imagen" ma:readOnly="false" ma:fieldId="{5cf76f15-5ced-4ddc-b409-7134ff3c332f}" ma:taxonomyMulti="true" ma:sspId="d33c8c81-5745-4931-bcc4-c2aeafe86780" ma:termSetId="09814cd3-568e-fe90-9814-8d621ff8fb84" ma:anchorId="fba54fb3-c3e1-fe81-a776-ca4b69148c4d" ma:open="true" ma:isKeyword="false">
       <xsd:complexType>
-        <xsd:complexContent>
-          <xsd:extension base="dms:UserMulti">
-            <xsd:sequence>
-              <xsd:element name="UserInfo" minOccurs="0" maxOccurs="unbounded">
-                <xsd:complexType>
-                  <xsd:sequence>
-                    <xsd:element name="DisplayName" type="xsd:string" minOccurs="0"/>
-                    <xsd:element name="AccountId" type="dms:UserId" minOccurs="0" nillable="true"/>
-                    <xsd:element name="AccountType" type="xsd:string" minOccurs="0"/>
-                  </xsd:sequence>
-                </xsd:complexType>
-              </xsd:element>
-            </xsd:sequence>
-          </xsd:extension>
-        </xsd:complexContent>
+        <xsd:sequence>
+          <xsd:element ref="pc:Terms" minOccurs="0" maxOccurs="1"/>
+        </xsd:sequence>
       </xsd:complexType>
     </xsd:element>
-    <xsd:element name="SharedWithDetails" ma:index="9" nillable="true" ma:displayName="Detalles de uso compartido" ma:internalName="SharedWithDetails" ma:readOnly="true">
+    <xsd:element name="MediaServiceOCR" ma:index="18" nillable="true" ma:displayName="Extracted Text" ma:internalName="MediaServiceOCR" ma:readOnly="true">
       <xsd:simpleType>
         <xsd:restriction base="dms:Note">
           <xsd:maxLength value="255"/>
         </xsd:restriction>
       </xsd:simpleType>
     </xsd:element>
-    <xsd:element name="TaxCatchAll" ma:index="20" nillable="true" ma:displayName="Taxonomy Catch All Column" ma:hidden="true" ma:list="{2f40a149-578b-41a1-8845-c88bc1831770}" ma:internalName="TaxCatchAll" ma:showField="CatchAllData" ma:web="cb45339b-ced9-4d0d-8f64-77573914d53b">
+  </xsd:schema>
+  <xsd:schema xmlns:xsd="http://www.w3.org/2001/XMLSchema" xmlns:xs="http://www.w3.org/2001/XMLSchema" xmlns:dms="http://schemas.microsoft.com/office/2006/documentManagement/types" xmlns:pc="http://schemas.microsoft.com/office/infopath/2007/PartnerControls" targetNamespace="adccf511-daff-4bcb-9072-914cedbf4c7e" elementFormDefault="qualified">
+    <xsd:import namespace="http://schemas.microsoft.com/office/2006/documentManagement/types"/>
+    <xsd:import namespace="http://schemas.microsoft.com/office/infopath/2007/PartnerControls"/>
+    <xsd:element name="TaxCatchAll" ma:index="17" nillable="true" ma:displayName="Taxonomy Catch All Column" ma:hidden="true" ma:list="{d55fdbc5-1632-489d-aeea-ba6fd7407963}" ma:internalName="TaxCatchAll" ma:showField="CatchAllData" ma:web="adccf511-daff-4bcb-9072-914cedbf4c7e">
       <xsd:complexType>
         <xsd:complexContent>
           <xsd:extension base="dms:MultiChoiceLookup">
@@ -42006,69 +42044,6 @@
           </xsd:extension>
         </xsd:complexContent>
       </xsd:complexType>
-    </xsd:element>
-  </xsd:schema>
-  <xsd:schema xmlns:xsd="http://www.w3.org/2001/XMLSchema" xmlns:xs="http://www.w3.org/2001/XMLSchema" xmlns:dms="http://schemas.microsoft.com/office/2006/documentManagement/types" xmlns:pc="http://schemas.microsoft.com/office/infopath/2007/PartnerControls" targetNamespace="43a3ca16-9c26-4813-b83f-4aec9927b43f" elementFormDefault="qualified">
-    <xsd:import namespace="http://schemas.microsoft.com/office/2006/documentManagement/types"/>
-    <xsd:import namespace="http://schemas.microsoft.com/office/infopath/2007/PartnerControls"/>
-    <xsd:element name="MediaServiceMetadata" ma:index="10" nillable="true" ma:displayName="MediaServiceMetadata" ma:hidden="true" ma:internalName="MediaServiceMetadata" ma:readOnly="true">
-      <xsd:simpleType>
-        <xsd:restriction base="dms:Note"/>
-      </xsd:simpleType>
-    </xsd:element>
-    <xsd:element name="MediaServiceFastMetadata" ma:index="11" nillable="true" ma:displayName="MediaServiceFastMetadata" ma:hidden="true" ma:internalName="MediaServiceFastMetadata" ma:readOnly="true">
-      <xsd:simpleType>
-        <xsd:restriction base="dms:Note"/>
-      </xsd:simpleType>
-    </xsd:element>
-    <xsd:element name="MediaServiceDateTaken" ma:index="12" nillable="true" ma:displayName="MediaServiceDateTaken" ma:hidden="true" ma:indexed="true" ma:internalName="MediaServiceDateTaken" ma:readOnly="true">
-      <xsd:simpleType>
-        <xsd:restriction base="dms:Text"/>
-      </xsd:simpleType>
-    </xsd:element>
-    <xsd:element name="MediaServiceObjectDetectorVersions" ma:index="13" nillable="true" ma:displayName="MediaServiceObjectDetectorVersions" ma:hidden="true" ma:indexed="true" ma:internalName="MediaServiceObjectDetectorVersions" ma:readOnly="true">
-      <xsd:simpleType>
-        <xsd:restriction base="dms:Text"/>
-      </xsd:simpleType>
-    </xsd:element>
-    <xsd:element name="MediaLengthInSeconds" ma:index="14" nillable="true" ma:displayName="MediaLengthInSeconds" ma:hidden="true" ma:internalName="MediaLengthInSeconds" ma:readOnly="true">
-      <xsd:simpleType>
-        <xsd:restriction base="dms:Unknown"/>
-      </xsd:simpleType>
-    </xsd:element>
-    <xsd:element name="MediaServiceLocation" ma:index="15" nillable="true" ma:displayName="Location" ma:indexed="true" ma:internalName="MediaServiceLocation" ma:readOnly="true">
-      <xsd:simpleType>
-        <xsd:restriction base="dms:Text"/>
-      </xsd:simpleType>
-    </xsd:element>
-    <xsd:element name="MediaServiceGenerationTime" ma:index="16" nillable="true" ma:displayName="MediaServiceGenerationTime" ma:hidden="true" ma:internalName="MediaServiceGenerationTime" ma:readOnly="true">
-      <xsd:simpleType>
-        <xsd:restriction base="dms:Text"/>
-      </xsd:simpleType>
-    </xsd:element>
-    <xsd:element name="MediaServiceEventHashCode" ma:index="17" nillable="true" ma:displayName="MediaServiceEventHashCode" ma:hidden="true" ma:internalName="MediaServiceEventHashCode" ma:readOnly="true">
-      <xsd:simpleType>
-        <xsd:restriction base="dms:Text"/>
-      </xsd:simpleType>
-    </xsd:element>
-    <xsd:element name="lcf76f155ced4ddcb4097134ff3c332f" ma:index="19" nillable="true" ma:taxonomy="true" ma:internalName="lcf76f155ced4ddcb4097134ff3c332f" ma:taxonomyFieldName="MediaServiceImageTags" ma:displayName="Etiquetas de imagen" ma:readOnly="false" ma:fieldId="{5cf76f15-5ced-4ddc-b409-7134ff3c332f}" ma:taxonomyMulti="true" ma:sspId="d33c8c81-5745-4931-bcc4-c2aeafe86780" ma:termSetId="09814cd3-568e-fe90-9814-8d621ff8fb84" ma:anchorId="fba54fb3-c3e1-fe81-a776-ca4b69148c4d" ma:open="true" ma:isKeyword="false">
-      <xsd:complexType>
-        <xsd:sequence>
-          <xsd:element ref="pc:Terms" minOccurs="0" maxOccurs="1"/>
-        </xsd:sequence>
-      </xsd:complexType>
-    </xsd:element>
-    <xsd:element name="MediaServiceOCR" ma:index="21" nillable="true" ma:displayName="Extracted Text" ma:internalName="MediaServiceOCR" ma:readOnly="true">
-      <xsd:simpleType>
-        <xsd:restriction base="dms:Note">
-          <xsd:maxLength value="255"/>
-        </xsd:restriction>
-      </xsd:simpleType>
-    </xsd:element>
-    <xsd:element name="MediaServiceSearchProperties" ma:index="22" nillable="true" ma:displayName="MediaServiceSearchProperties" ma:hidden="true" ma:internalName="MediaServiceSearchProperties" ma:readOnly="true">
-      <xsd:simpleType>
-        <xsd:restriction base="dms:Note"/>
-      </xsd:simpleType>
     </xsd:element>
   </xsd:schema>
   <xsd:schema xmlns="http://schemas.openxmlformats.org/package/2006/metadata/core-properties" xmlns:xsd="http://www.w3.org/2001/XMLSchema" xmlns:xsi="http://www.w3.org/2001/XMLSchema-instance" xmlns:dc="http://purl.org/dc/elements/1.1/" xmlns:dcterms="http://purl.org/dc/terms/" xmlns:odoc="http://schemas.microsoft.com/internal/obd" targetNamespace="http://schemas.openxmlformats.org/package/2006/metadata/core-properties" elementFormDefault="qualified" attributeFormDefault="unqualified" blockDefault="#all">
@@ -42170,45 +42145,17 @@
 </ct:contentTypeSchema>
 </file>
 
-<file path=customXml/item2.xml><?xml version="1.0" encoding="utf-8"?>
-<?mso-contentType ?>
-<FormTemplates xmlns="http://schemas.microsoft.com/sharepoint/v3/contenttype/forms">
-  <Display>DocumentLibraryForm</Display>
-  <Edit>DocumentLibraryForm</Edit>
-  <New>DocumentLibraryForm</New>
-</FormTemplates>
-</file>
-
-<file path=customXml/item3.xml><?xml version="1.0" encoding="utf-8"?>
-<p:properties xmlns:p="http://schemas.microsoft.com/office/2006/metadata/properties" xmlns:xsi="http://www.w3.org/2001/XMLSchema-instance" xmlns:pc="http://schemas.microsoft.com/office/infopath/2007/PartnerControls">
-  <documentManagement>
-    <TaxCatchAll xmlns="cb45339b-ced9-4d0d-8f64-77573914d53b" xsi:nil="true"/>
-    <lcf76f155ced4ddcb4097134ff3c332f xmlns="43a3ca16-9c26-4813-b83f-4aec9927b43f">
-      <Terms xmlns="http://schemas.microsoft.com/office/infopath/2007/PartnerControls"/>
-    </lcf76f155ced4ddcb4097134ff3c332f>
-  </documentManagement>
-</p:properties>
-</file>
-
 <file path=customXml/item4.xml><?xml version="1.0" encoding="utf-8"?>
 <b:Sources xmlns:b="http://schemas.openxmlformats.org/officeDocument/2006/bibliography" xmlns="http://schemas.openxmlformats.org/officeDocument/2006/bibliography" SelectedStyle="\APASixthEditionOfficeOnline.xsl" StyleName="APA" Version="6"/>
 </file>
 
 <file path=customXml/itemProps1.xml><?xml version="1.0" encoding="utf-8"?>
-<ds:datastoreItem xmlns:ds="http://schemas.openxmlformats.org/officeDocument/2006/customXml" ds:itemID="{DF43E046-DB0C-42D1-8C73-AE38B52F1ED7}">
+<ds:datastoreItem xmlns:ds="http://schemas.openxmlformats.org/officeDocument/2006/customXml" ds:itemID="{6929C9FE-9F22-4B98-96EF-1B541B3BD0B2}">
   <ds:schemaRefs>
-    <ds:schemaRef ds:uri="http://schemas.microsoft.com/office/2006/metadata/contentType"/>
-    <ds:schemaRef ds:uri="http://schemas.microsoft.com/office/2006/metadata/properties/metaAttributes"/>
-    <ds:schemaRef ds:uri="http://www.w3.org/2001/XMLSchema"/>
     <ds:schemaRef ds:uri="http://schemas.microsoft.com/office/2006/metadata/properties"/>
+    <ds:schemaRef ds:uri="http://schemas.microsoft.com/office/infopath/2007/PartnerControls"/>
     <ds:schemaRef ds:uri="cb45339b-ced9-4d0d-8f64-77573914d53b"/>
     <ds:schemaRef ds:uri="43a3ca16-9c26-4813-b83f-4aec9927b43f"/>
-    <ds:schemaRef ds:uri="http://schemas.microsoft.com/office/2006/documentManagement/types"/>
-    <ds:schemaRef ds:uri="http://schemas.microsoft.com/office/infopath/2007/PartnerControls"/>
-    <ds:schemaRef ds:uri="http://schemas.openxmlformats.org/package/2006/metadata/core-properties"/>
-    <ds:schemaRef ds:uri="http://purl.org/dc/elements/1.1/"/>
-    <ds:schemaRef ds:uri="http://purl.org/dc/terms/"/>
-    <ds:schemaRef ds:uri="http://schemas.microsoft.com/internal/obd"/>
   </ds:schemaRefs>
 </ds:datastoreItem>
 </file>
@@ -42222,14 +42169,7 @@
 </file>
 
 <file path=customXml/itemProps3.xml><?xml version="1.0" encoding="utf-8"?>
-<ds:datastoreItem xmlns:ds="http://schemas.openxmlformats.org/officeDocument/2006/customXml" ds:itemID="{6929C9FE-9F22-4B98-96EF-1B541B3BD0B2}">
-  <ds:schemaRefs>
-    <ds:schemaRef ds:uri="http://schemas.microsoft.com/office/2006/metadata/properties"/>
-    <ds:schemaRef ds:uri="http://schemas.microsoft.com/office/infopath/2007/PartnerControls"/>
-    <ds:schemaRef ds:uri="cb45339b-ced9-4d0d-8f64-77573914d53b"/>
-    <ds:schemaRef ds:uri="43a3ca16-9c26-4813-b83f-4aec9927b43f"/>
-  </ds:schemaRefs>
-</ds:datastoreItem>
+<ds:datastoreItem xmlns:ds="http://schemas.openxmlformats.org/officeDocument/2006/customXml" ds:itemID="{46F2523D-B053-4C67-A68E-E60914B38C5B}"/>
 </file>
 
 <file path=customXml/itemProps4.xml><?xml version="1.0" encoding="utf-8"?>

</xml_diff>

<commit_message>
Actualizado CFA y sintesis 2
</commit_message>
<xml_diff>
--- a/fuentes/CFA1_82220017_DU.docx
+++ b/fuentes/CFA1_82220017_DU.docx
@@ -11493,7 +11493,7 @@
         <w:rPr>
           <w:lang w:val="es-419" w:eastAsia="es-CO"/>
         </w:rPr>
-        <w:t>I</w:t>
+        <w:t>i</w:t>
       </w:r>
       <w:r>
         <w:rPr>
@@ -11505,7 +11505,7 @@
         <w:rPr>
           <w:lang w:val="es-419" w:eastAsia="es-CO"/>
         </w:rPr>
-        <w:t>C</w:t>
+        <w:t>c</w:t>
       </w:r>
       <w:r>
         <w:rPr>
@@ -11517,7 +11517,7 @@
         <w:rPr>
           <w:lang w:val="es-419" w:eastAsia="es-CO"/>
         </w:rPr>
-        <w:t>S</w:t>
+        <w:t>s</w:t>
       </w:r>
       <w:r>
         <w:rPr>
@@ -41931,26 +41931,6 @@
 </file>
 
 <file path=customXml/item1.xml><?xml version="1.0" encoding="utf-8"?>
-<p:properties xmlns:p="http://schemas.microsoft.com/office/2006/metadata/properties" xmlns:xsi="http://www.w3.org/2001/XMLSchema-instance" xmlns:pc="http://schemas.microsoft.com/office/infopath/2007/PartnerControls">
-  <documentManagement>
-    <TaxCatchAll xmlns="adccf511-daff-4bcb-9072-914cedbf4c7e" xsi:nil="true"/>
-    <lcf76f155ced4ddcb4097134ff3c332f xmlns="a70d3c18-0869-45a1-9f75-4b4b8f0f32be">
-      <Terms xmlns="http://schemas.microsoft.com/office/infopath/2007/PartnerControls"/>
-    </lcf76f155ced4ddcb4097134ff3c332f>
-  </documentManagement>
-</p:properties>
-</file>
-
-<file path=customXml/item2.xml><?xml version="1.0" encoding="utf-8"?>
-<?mso-contentType ?>
-<FormTemplates xmlns="http://schemas.microsoft.com/sharepoint/v3/contenttype/forms">
-  <Display>DocumentLibraryForm</Display>
-  <Edit>DocumentLibraryForm</Edit>
-  <New>DocumentLibraryForm</New>
-</FormTemplates>
-</file>
-
-<file path=customXml/item3.xml><?xml version="1.0" encoding="utf-8"?>
 <ct:contentTypeSchema xmlns:ct="http://schemas.microsoft.com/office/2006/metadata/contentType" xmlns:ma="http://schemas.microsoft.com/office/2006/metadata/properties/metaAttributes" ct:_="" ma:_="" ma:contentTypeName="Documento" ma:contentTypeID="0x010100FC2B1768DD5A774EB396CCAB0DE361C1" ma:contentTypeVersion="11" ma:contentTypeDescription="Crear nuevo documento." ma:contentTypeScope="" ma:versionID="e4c9e5a511fbaffd8485e537f9595e10">
   <xsd:schema xmlns:xsd="http://www.w3.org/2001/XMLSchema" xmlns:xs="http://www.w3.org/2001/XMLSchema" xmlns:p="http://schemas.microsoft.com/office/2006/metadata/properties" xmlns:ns2="a70d3c18-0869-45a1-9f75-4b4b8f0f32be" xmlns:ns3="adccf511-daff-4bcb-9072-914cedbf4c7e" targetNamespace="http://schemas.microsoft.com/office/2006/metadata/properties" ma:root="true" ma:fieldsID="bbeeb7fdd5dcda06cd18867ba2c601ed" ns2:_="" ns3:_="">
     <xsd:import namespace="a70d3c18-0869-45a1-9f75-4b4b8f0f32be"/>
@@ -42145,19 +42125,32 @@
 </ct:contentTypeSchema>
 </file>
 
+<file path=customXml/item2.xml><?xml version="1.0" encoding="utf-8"?>
+<?mso-contentType ?>
+<FormTemplates xmlns="http://schemas.microsoft.com/sharepoint/v3/contenttype/forms">
+  <Display>DocumentLibraryForm</Display>
+  <Edit>DocumentLibraryForm</Edit>
+  <New>DocumentLibraryForm</New>
+</FormTemplates>
+</file>
+
+<file path=customXml/item3.xml><?xml version="1.0" encoding="utf-8"?>
+<p:properties xmlns:p="http://schemas.microsoft.com/office/2006/metadata/properties" xmlns:xsi="http://www.w3.org/2001/XMLSchema-instance" xmlns:pc="http://schemas.microsoft.com/office/infopath/2007/PartnerControls">
+  <documentManagement>
+    <TaxCatchAll xmlns="adccf511-daff-4bcb-9072-914cedbf4c7e" xsi:nil="true"/>
+    <lcf76f155ced4ddcb4097134ff3c332f xmlns="a70d3c18-0869-45a1-9f75-4b4b8f0f32be">
+      <Terms xmlns="http://schemas.microsoft.com/office/infopath/2007/PartnerControls"/>
+    </lcf76f155ced4ddcb4097134ff3c332f>
+  </documentManagement>
+</p:properties>
+</file>
+
 <file path=customXml/item4.xml><?xml version="1.0" encoding="utf-8"?>
 <b:Sources xmlns:b="http://schemas.openxmlformats.org/officeDocument/2006/bibliography" xmlns="http://schemas.openxmlformats.org/officeDocument/2006/bibliography" SelectedStyle="\APASixthEditionOfficeOnline.xsl" StyleName="APA" Version="6"/>
 </file>
 
 <file path=customXml/itemProps1.xml><?xml version="1.0" encoding="utf-8"?>
-<ds:datastoreItem xmlns:ds="http://schemas.openxmlformats.org/officeDocument/2006/customXml" ds:itemID="{6929C9FE-9F22-4B98-96EF-1B541B3BD0B2}">
-  <ds:schemaRefs>
-    <ds:schemaRef ds:uri="http://schemas.microsoft.com/office/2006/metadata/properties"/>
-    <ds:schemaRef ds:uri="http://schemas.microsoft.com/office/infopath/2007/PartnerControls"/>
-    <ds:schemaRef ds:uri="cb45339b-ced9-4d0d-8f64-77573914d53b"/>
-    <ds:schemaRef ds:uri="43a3ca16-9c26-4813-b83f-4aec9927b43f"/>
-  </ds:schemaRefs>
-</ds:datastoreItem>
+<ds:datastoreItem xmlns:ds="http://schemas.openxmlformats.org/officeDocument/2006/customXml" ds:itemID="{E06FCE6A-3594-48BA-B2FE-1F881051FADF}"/>
 </file>
 
 <file path=customXml/itemProps2.xml><?xml version="1.0" encoding="utf-8"?>
@@ -42169,7 +42162,14 @@
 </file>
 
 <file path=customXml/itemProps3.xml><?xml version="1.0" encoding="utf-8"?>
-<ds:datastoreItem xmlns:ds="http://schemas.openxmlformats.org/officeDocument/2006/customXml" ds:itemID="{46F2523D-B053-4C67-A68E-E60914B38C5B}"/>
+<ds:datastoreItem xmlns:ds="http://schemas.openxmlformats.org/officeDocument/2006/customXml" ds:itemID="{6929C9FE-9F22-4B98-96EF-1B541B3BD0B2}">
+  <ds:schemaRefs>
+    <ds:schemaRef ds:uri="http://schemas.microsoft.com/office/2006/metadata/properties"/>
+    <ds:schemaRef ds:uri="http://schemas.microsoft.com/office/infopath/2007/PartnerControls"/>
+    <ds:schemaRef ds:uri="cb45339b-ced9-4d0d-8f64-77573914d53b"/>
+    <ds:schemaRef ds:uri="43a3ca16-9c26-4813-b83f-4aec9927b43f"/>
+  </ds:schemaRefs>
+</ds:datastoreItem>
 </file>
 
 <file path=customXml/itemProps4.xml><?xml version="1.0" encoding="utf-8"?>

</xml_diff>